<commit_message>
docs(buch-galaga): Kapitel 1 "Das erste Fenster" (Word + lauffaehiger Code)
Buch um Kapitel 1 erweitert: SCREEN/Spielschleife (WHILE/QUITREQUESTED/FLIP)/
CLS/PLOT + scrollender Sternenhimmel (CONST/DIM-Arrays/FOR/RANDINT), schrittweise
aufgebaut mit farbigen Code-Bloecken, Inline-Code, Tipp-Kasten, Screenshot,
Zusammenfassung + Uebungen. Lauffaehiger Stand code/kap01/fenster.gb (gbrt
--check clean, Screenshot kap01_fenster.png). build_book.js: codeBlock()/pmix()-
Helfer. docx validiert (PASSED) + alle Seiten per LibreOffice/PyMuPDF visuell
geprueft.

Co-Authored-By: Claude Opus 4.8 <noreply@anthropic.com>
</commit_message>
<xml_diff>
--- a/buch-galaga/buch/GameBasic-Buch.docx
+++ b/buch-galaga/buch/GameBasic-Buch.docx
@@ -1392,6 +1392,1158 @@
         </w:tc>
       </w:tr>
     </w:tbl>
+    <w:p>
+      <w:r>
+        <w:br w:type="page"/>
+      </w:r>
+    </w:p>
+    <w:p>
+      <w:pPr>
+        <w:pStyle w:val="Heading1"/>
+        <w:pBdr>
+          <w:bottom w:val="single" w:color="1B6CA8" w:sz="12" w:space="4"/>
+        </w:pBdr>
+        <w:spacing w:after="80" w:before="320"/>
+      </w:pPr>
+      <w:r>
+        <w:t xml:space="preserve">Kapitel 1: Das erste Fenster</w:t>
+      </w:r>
+    </w:p>
+    <w:tbl>
+      <w:tblPr>
+        <w:tblW w:type="dxa" w:w="9360"/>
+        <w:tblBorders>
+          <w:top w:val="single" w:color="auto" w:sz="4"/>
+          <w:left w:val="single" w:color="auto" w:sz="4"/>
+          <w:bottom w:val="single" w:color="auto" w:sz="4"/>
+          <w:right w:val="single" w:color="auto" w:sz="4"/>
+          <w:insideH w:val="single" w:color="auto" w:sz="4"/>
+          <w:insideV w:val="single" w:color="auto" w:sz="4"/>
+        </w:tblBorders>
+      </w:tblPr>
+      <w:tblGrid>
+        <w:gridCol w:w="9360"/>
+      </w:tblGrid>
+      <w:tr>
+        <w:tc>
+          <w:tcPr>
+            <w:tcW w:type="dxa" w:w="9360"/>
+            <w:tcBorders>
+              <w:top w:val="single" w:color="9CC8E6" w:sz="6"/>
+              <w:left w:val="single" w:color="9CC8E6" w:sz="6"/>
+              <w:bottom w:val="single" w:color="9CC8E6" w:sz="6"/>
+              <w:right w:val="single" w:color="9CC8E6" w:sz="6"/>
+            </w:tcBorders>
+            <w:shd w:fill="E7F2FA" w:val="clear"/>
+            <w:tcMar>
+              <w:top w:type="dxa" w:w="120"/>
+              <w:left w:type="dxa" w:w="160"/>
+              <w:bottom w:type="dxa" w:w="120"/>
+              <w:right w:type="dxa" w:w="160"/>
+            </w:tcMar>
+          </w:tcPr>
+          <w:p>
+            <w:pPr>
+              <w:spacing w:after="40"/>
+            </w:pPr>
+            <w:r>
+              <w:rPr>
+                <w:b/>
+                <w:bCs/>
+                <w:color w:val="1B6CA8"/>
+                <w:sz w:val="22"/>
+                <w:szCs w:val="22"/>
+              </w:rPr>
+              <w:t xml:space="preserve">In diesem Kapitel</w:t>
+            </w:r>
+          </w:p>
+          <w:p>
+            <w:r>
+              <w:rPr>
+                <w:sz w:val="22"/>
+                <w:szCs w:val="22"/>
+              </w:rPr>
+              <w:t xml:space="preserve">Du öffnest dein allererstes GameBasic-Fenster, lernst die „Spielschleife“ kennen und zauberst einen scrollenden Sternenhimmel – die Bühne, auf der später unser Raumschiff kämpft.</w:t>
+            </w:r>
+          </w:p>
+        </w:tc>
+      </w:tr>
+    </w:tbl>
+    <w:p>
+      <w:pPr>
+        <w:pStyle w:val="Heading2"/>
+      </w:pPr>
+      <w:r>
+        <w:t xml:space="preserve">Ein Fenster öffnen</w:t>
+      </w:r>
+    </w:p>
+    <w:p>
+      <w:pPr>
+        <w:spacing w:after="140"/>
+      </w:pPr>
+      <w:r>
+        <w:rPr>
+          <w:sz w:val="22"/>
+          <w:szCs w:val="22"/>
+        </w:rPr>
+        <w:t xml:space="preserve">Jedes Spiel braucht ein Fenster. In GameBasic genügt dafür eine einzige Zeile:</w:t>
+      </w:r>
+    </w:p>
+    <w:p>
+      <w:pPr>
+        <w:pBdr>
+          <w:left w:val="single" w:color="1B6CA8" w:sz="18" w:space="6"/>
+        </w:pBdr>
+        <w:shd w:fill="F4F4F4" w:val="clear"/>
+        <w:spacing w:after="160" w:before="80"/>
+        <w:ind w:left="120"/>
+      </w:pPr>
+      <w:r>
+        <w:rPr>
+          <w:rFonts w:ascii="Consolas" w:cs="Consolas" w:eastAsia="Consolas" w:hAnsi="Consolas"/>
+          <w:sz w:val="19"/>
+          <w:szCs w:val="19"/>
+        </w:rPr>
+        <w:t xml:space="preserve">SCREEN(480, 640, "Mein Galaga")</w:t>
+      </w:r>
+    </w:p>
+    <w:p>
+      <w:pPr>
+        <w:spacing w:after="140"/>
+      </w:pPr>
+      <w:r>
+        <w:rPr>
+          <w:sz w:val="22"/>
+          <w:szCs w:val="22"/>
+        </w:rPr>
+        <w:t xml:space="preserve">Der Befehl </w:t>
+      </w:r>
+      <w:r>
+        <w:rPr>
+          <w:rFonts w:ascii="Consolas" w:cs="Consolas" w:eastAsia="Consolas" w:hAnsi="Consolas"/>
+          <w:sz w:val="21"/>
+          <w:szCs w:val="21"/>
+        </w:rPr>
+        <w:t xml:space="preserve">SCREEN</w:t>
+      </w:r>
+      <w:r>
+        <w:rPr>
+          <w:sz w:val="22"/>
+          <w:szCs w:val="22"/>
+        </w:rPr>
+        <w:t xml:space="preserve"> öffnet ein Fenster: zuerst die Breite (480), dann die Höhe (640), dann der Titel in der Fensterleiste. Wir wählen ein </w:t>
+      </w:r>
+      <w:r>
+        <w:rPr>
+          <w:sz w:val="22"/>
+          <w:szCs w:val="22"/>
+        </w:rPr>
+        <w:t xml:space="preserve">Hochformat</w:t>
+      </w:r>
+      <w:r>
+        <w:rPr>
+          <w:sz w:val="22"/>
+          <w:szCs w:val="22"/>
+        </w:rPr>
+        <w:t xml:space="preserve"> – schmal und hoch, wie ein Arcade-Automat.</w:t>
+      </w:r>
+    </w:p>
+    <w:p>
+      <w:pPr>
+        <w:pStyle w:val="Heading2"/>
+      </w:pPr>
+      <w:r>
+        <w:t xml:space="preserve">Die Spielschleife</w:t>
+      </w:r>
+    </w:p>
+    <w:p>
+      <w:pPr>
+        <w:spacing w:after="140"/>
+      </w:pPr>
+      <w:r>
+        <w:rPr>
+          <w:sz w:val="22"/>
+          <w:szCs w:val="22"/>
+        </w:rPr>
+        <w:t xml:space="preserve">Ein Spiel steht nie still: viele Male pro Sekunde wird das Bild neu gezeichnet und angezeigt. Das erledigt eine Schleife, die so lange läuft, bis du das Fenster schliesst:</w:t>
+      </w:r>
+    </w:p>
+    <w:p>
+      <w:pPr>
+        <w:pBdr>
+          <w:left w:val="single" w:color="1B6CA8" w:sz="18" w:space="6"/>
+        </w:pBdr>
+        <w:shd w:fill="F4F4F4" w:val="clear"/>
+        <w:spacing w:after="160" w:before="80"/>
+        <w:ind w:left="120"/>
+      </w:pPr>
+      <w:r>
+        <w:rPr>
+          <w:rFonts w:ascii="Consolas" w:cs="Consolas" w:eastAsia="Consolas" w:hAnsi="Consolas"/>
+          <w:sz w:val="19"/>
+          <w:szCs w:val="19"/>
+        </w:rPr>
+        <w:t xml:space="preserve">WHILE NOT QUITREQUESTED()</w:t>
+      </w:r>
+      <w:r>
+        <w:rPr>
+          <w:rFonts w:ascii="Consolas" w:cs="Consolas" w:eastAsia="Consolas" w:hAnsi="Consolas"/>
+          <w:sz w:val="19"/>
+          <w:szCs w:val="19"/>
+        </w:rPr>
+        <w:br/>
+        <w:t xml:space="preserve">    ' ... hier wird gezeichnet ...</w:t>
+      </w:r>
+      <w:r>
+        <w:rPr>
+          <w:rFonts w:ascii="Consolas" w:cs="Consolas" w:eastAsia="Consolas" w:hAnsi="Consolas"/>
+          <w:sz w:val="19"/>
+          <w:szCs w:val="19"/>
+        </w:rPr>
+        <w:br/>
+        <w:t xml:space="preserve">    FLIP()</w:t>
+      </w:r>
+      <w:r>
+        <w:rPr>
+          <w:rFonts w:ascii="Consolas" w:cs="Consolas" w:eastAsia="Consolas" w:hAnsi="Consolas"/>
+          <w:sz w:val="19"/>
+          <w:szCs w:val="19"/>
+        </w:rPr>
+        <w:br/>
+        <w:t xml:space="preserve">WEND</w:t>
+      </w:r>
+    </w:p>
+    <w:p>
+      <w:pPr>
+        <w:spacing w:after="140"/>
+      </w:pPr>
+      <w:r>
+        <w:rPr>
+          <w:sz w:val="22"/>
+          <w:szCs w:val="22"/>
+        </w:rPr>
+        <w:t xml:space="preserve"/>
+      </w:r>
+      <w:r>
+        <w:rPr>
+          <w:rFonts w:ascii="Consolas" w:cs="Consolas" w:eastAsia="Consolas" w:hAnsi="Consolas"/>
+          <w:sz w:val="21"/>
+          <w:szCs w:val="21"/>
+        </w:rPr>
+        <w:t xml:space="preserve">WHILE</w:t>
+      </w:r>
+      <w:r>
+        <w:rPr>
+          <w:sz w:val="22"/>
+          <w:szCs w:val="22"/>
+        </w:rPr>
+        <w:t xml:space="preserve"> … </w:t>
+      </w:r>
+      <w:r>
+        <w:rPr>
+          <w:rFonts w:ascii="Consolas" w:cs="Consolas" w:eastAsia="Consolas" w:hAnsi="Consolas"/>
+          <w:sz w:val="21"/>
+          <w:szCs w:val="21"/>
+        </w:rPr>
+        <w:t xml:space="preserve">WEND</w:t>
+      </w:r>
+      <w:r>
+        <w:rPr>
+          <w:sz w:val="22"/>
+          <w:szCs w:val="22"/>
+        </w:rPr>
+        <w:t xml:space="preserve"> wiederholt alles dazwischen immer wieder. </w:t>
+      </w:r>
+      <w:r>
+        <w:rPr>
+          <w:rFonts w:ascii="Consolas" w:cs="Consolas" w:eastAsia="Consolas" w:hAnsi="Consolas"/>
+          <w:sz w:val="21"/>
+          <w:szCs w:val="21"/>
+        </w:rPr>
+        <w:t xml:space="preserve">QUITREQUESTED()</w:t>
+      </w:r>
+      <w:r>
+        <w:rPr>
+          <w:sz w:val="22"/>
+          <w:szCs w:val="22"/>
+        </w:rPr>
+        <w:t xml:space="preserve"> wird erst wahr, wenn du auf das Schliessen-Kreuz klickst. Und </w:t>
+      </w:r>
+      <w:r>
+        <w:rPr>
+          <w:rFonts w:ascii="Consolas" w:cs="Consolas" w:eastAsia="Consolas" w:hAnsi="Consolas"/>
+          <w:sz w:val="21"/>
+          <w:szCs w:val="21"/>
+        </w:rPr>
+        <w:t xml:space="preserve">FLIP()</w:t>
+      </w:r>
+      <w:r>
+        <w:rPr>
+          <w:sz w:val="22"/>
+          <w:szCs w:val="22"/>
+        </w:rPr>
+        <w:t xml:space="preserve"> zeigt das fertig gezeichnete Bild an – erst wird im Hintergrund gemalt, dann in einem Rutsch umgeschaltet. So flackert nichts.</w:t>
+      </w:r>
+    </w:p>
+    <w:p>
+      <w:pPr>
+        <w:pStyle w:val="Heading2"/>
+      </w:pPr>
+      <w:r>
+        <w:t xml:space="preserve">Das Bild löschen</w:t>
+      </w:r>
+    </w:p>
+    <w:p>
+      <w:pPr>
+        <w:spacing w:after="140"/>
+      </w:pPr>
+      <w:r>
+        <w:rPr>
+          <w:sz w:val="22"/>
+          <w:szCs w:val="22"/>
+        </w:rPr>
+        <w:t xml:space="preserve">Am Anfang jedes Durchlaufs wischen wir das alte Bild weg – mit </w:t>
+      </w:r>
+      <w:r>
+        <w:rPr>
+          <w:rFonts w:ascii="Consolas" w:cs="Consolas" w:eastAsia="Consolas" w:hAnsi="Consolas"/>
+          <w:sz w:val="21"/>
+          <w:szCs w:val="21"/>
+        </w:rPr>
+        <w:t xml:space="preserve">CLS</w:t>
+      </w:r>
+      <w:r>
+        <w:rPr>
+          <w:sz w:val="22"/>
+          <w:szCs w:val="22"/>
+        </w:rPr>
+        <w:t xml:space="preserve"> (engl. „clear screen“) und einer Farbe:</w:t>
+      </w:r>
+    </w:p>
+    <w:p>
+      <w:pPr>
+        <w:pBdr>
+          <w:left w:val="single" w:color="1B6CA8" w:sz="18" w:space="6"/>
+        </w:pBdr>
+        <w:shd w:fill="F4F4F4" w:val="clear"/>
+        <w:spacing w:after="160" w:before="80"/>
+        <w:ind w:left="120"/>
+      </w:pPr>
+      <w:r>
+        <w:rPr>
+          <w:rFonts w:ascii="Consolas" w:cs="Consolas" w:eastAsia="Consolas" w:hAnsi="Consolas"/>
+          <w:sz w:val="19"/>
+          <w:szCs w:val="19"/>
+        </w:rPr>
+        <w:t xml:space="preserve">CLS(&amp;H05060F)        ' dunkles Weltraum-Blau</w:t>
+      </w:r>
+    </w:p>
+    <w:p>
+      <w:pPr>
+        <w:spacing w:after="140"/>
+      </w:pPr>
+      <w:r>
+        <w:rPr>
+          <w:sz w:val="22"/>
+          <w:szCs w:val="22"/>
+        </w:rPr>
+        <w:t xml:space="preserve">Farben schreibt man als </w:t>
+      </w:r>
+      <w:r>
+        <w:rPr>
+          <w:rFonts w:ascii="Consolas" w:cs="Consolas" w:eastAsia="Consolas" w:hAnsi="Consolas"/>
+          <w:sz w:val="21"/>
+          <w:szCs w:val="21"/>
+        </w:rPr>
+        <w:t xml:space="preserve">&amp;Hrrggbb</w:t>
+      </w:r>
+      <w:r>
+        <w:rPr>
+          <w:sz w:val="22"/>
+          <w:szCs w:val="22"/>
+        </w:rPr>
+        <w:t xml:space="preserve"> – je zwei Stellen für Rot, Grün, Blau. </w:t>
+      </w:r>
+      <w:r>
+        <w:rPr>
+          <w:rFonts w:ascii="Consolas" w:cs="Consolas" w:eastAsia="Consolas" w:hAnsi="Consolas"/>
+          <w:sz w:val="21"/>
+          <w:szCs w:val="21"/>
+        </w:rPr>
+        <w:t xml:space="preserve">&amp;H05060F</w:t>
+      </w:r>
+      <w:r>
+        <w:rPr>
+          <w:sz w:val="22"/>
+          <w:szCs w:val="22"/>
+        </w:rPr>
+        <w:t xml:space="preserve"> ist ein sehr dunkles Blau, perfekt fürs All.</w:t>
+      </w:r>
+    </w:p>
+    <w:p>
+      <w:pPr>
+        <w:pStyle w:val="Heading2"/>
+      </w:pPr>
+      <w:r>
+        <w:t xml:space="preserve">Ein Sternenhimmel</w:t>
+      </w:r>
+    </w:p>
+    <w:p>
+      <w:pPr>
+        <w:spacing w:after="140"/>
+      </w:pPr>
+      <w:r>
+        <w:rPr>
+          <w:sz w:val="22"/>
+          <w:szCs w:val="22"/>
+        </w:rPr>
+        <w:t xml:space="preserve">Sterne sind einfach viele leuchtende Punkte. Wir merken uns ihre Positionen in zwei Listen (sogenannten Arrays) – eine für x, eine für y – und verteilen sie zu Beginn zufällig:</w:t>
+      </w:r>
+    </w:p>
+    <w:p>
+      <w:pPr>
+        <w:pBdr>
+          <w:left w:val="single" w:color="1B6CA8" w:sz="18" w:space="6"/>
+        </w:pBdr>
+        <w:shd w:fill="F4F4F4" w:val="clear"/>
+        <w:spacing w:after="160" w:before="80"/>
+        <w:ind w:left="120"/>
+      </w:pPr>
+      <w:r>
+        <w:rPr>
+          <w:rFonts w:ascii="Consolas" w:cs="Consolas" w:eastAsia="Consolas" w:hAnsi="Consolas"/>
+          <w:sz w:val="19"/>
+          <w:szCs w:val="19"/>
+        </w:rPr>
+        <w:t xml:space="preserve">CONST NSTARS AS INTEGER = 60</w:t>
+      </w:r>
+      <w:r>
+        <w:rPr>
+          <w:rFonts w:ascii="Consolas" w:cs="Consolas" w:eastAsia="Consolas" w:hAnsi="Consolas"/>
+          <w:sz w:val="19"/>
+          <w:szCs w:val="19"/>
+        </w:rPr>
+        <w:br/>
+        <w:t xml:space="preserve">DIM starX[NSTARS] AS INTEGER</w:t>
+      </w:r>
+      <w:r>
+        <w:rPr>
+          <w:rFonts w:ascii="Consolas" w:cs="Consolas" w:eastAsia="Consolas" w:hAnsi="Consolas"/>
+          <w:sz w:val="19"/>
+          <w:szCs w:val="19"/>
+        </w:rPr>
+        <w:br/>
+        <w:t xml:space="preserve">DIM starY[NSTARS] AS INTEGER</w:t>
+      </w:r>
+      <w:r>
+        <w:rPr>
+          <w:rFonts w:ascii="Consolas" w:cs="Consolas" w:eastAsia="Consolas" w:hAnsi="Consolas"/>
+          <w:sz w:val="19"/>
+          <w:szCs w:val="19"/>
+        </w:rPr>
+        <w:br/>
+        <w:t xml:space="preserve"/>
+      </w:r>
+      <w:r>
+        <w:rPr>
+          <w:rFonts w:ascii="Consolas" w:cs="Consolas" w:eastAsia="Consolas" w:hAnsi="Consolas"/>
+          <w:sz w:val="19"/>
+          <w:szCs w:val="19"/>
+        </w:rPr>
+        <w:br/>
+        <w:t xml:space="preserve">DIM i AS INTEGER</w:t>
+      </w:r>
+      <w:r>
+        <w:rPr>
+          <w:rFonts w:ascii="Consolas" w:cs="Consolas" w:eastAsia="Consolas" w:hAnsi="Consolas"/>
+          <w:sz w:val="19"/>
+          <w:szCs w:val="19"/>
+        </w:rPr>
+        <w:br/>
+        <w:t xml:space="preserve">FOR i = 0 TO NSTARS - 1</w:t>
+      </w:r>
+      <w:r>
+        <w:rPr>
+          <w:rFonts w:ascii="Consolas" w:cs="Consolas" w:eastAsia="Consolas" w:hAnsi="Consolas"/>
+          <w:sz w:val="19"/>
+          <w:szCs w:val="19"/>
+        </w:rPr>
+        <w:br/>
+        <w:t xml:space="preserve">    starX[i] = RANDINT(0, 479)</w:t>
+      </w:r>
+      <w:r>
+        <w:rPr>
+          <w:rFonts w:ascii="Consolas" w:cs="Consolas" w:eastAsia="Consolas" w:hAnsi="Consolas"/>
+          <w:sz w:val="19"/>
+          <w:szCs w:val="19"/>
+        </w:rPr>
+        <w:br/>
+        <w:t xml:space="preserve">    starY[i] = RANDINT(0, 639)</w:t>
+      </w:r>
+      <w:r>
+        <w:rPr>
+          <w:rFonts w:ascii="Consolas" w:cs="Consolas" w:eastAsia="Consolas" w:hAnsi="Consolas"/>
+          <w:sz w:val="19"/>
+          <w:szCs w:val="19"/>
+        </w:rPr>
+        <w:br/>
+        <w:t xml:space="preserve">NEXT i</w:t>
+      </w:r>
+    </w:p>
+    <w:p>
+      <w:pPr>
+        <w:spacing w:after="140"/>
+      </w:pPr>
+      <w:r>
+        <w:rPr>
+          <w:sz w:val="22"/>
+          <w:szCs w:val="22"/>
+        </w:rPr>
+        <w:t xml:space="preserve"/>
+      </w:r>
+      <w:r>
+        <w:rPr>
+          <w:rFonts w:ascii="Consolas" w:cs="Consolas" w:eastAsia="Consolas" w:hAnsi="Consolas"/>
+          <w:sz w:val="21"/>
+          <w:szCs w:val="21"/>
+        </w:rPr>
+        <w:t xml:space="preserve">CONST</w:t>
+      </w:r>
+      <w:r>
+        <w:rPr>
+          <w:sz w:val="22"/>
+          <w:szCs w:val="22"/>
+        </w:rPr>
+        <w:t xml:space="preserve"> ist ein fester Wert, der sich nie ändert (hier: 60 Sterne). </w:t>
+      </w:r>
+      <w:r>
+        <w:rPr>
+          <w:rFonts w:ascii="Consolas" w:cs="Consolas" w:eastAsia="Consolas" w:hAnsi="Consolas"/>
+          <w:sz w:val="21"/>
+          <w:szCs w:val="21"/>
+        </w:rPr>
+        <w:t xml:space="preserve">DIM starX[NSTARS]</w:t>
+      </w:r>
+      <w:r>
+        <w:rPr>
+          <w:sz w:val="22"/>
+          <w:szCs w:val="22"/>
+        </w:rPr>
+        <w:t xml:space="preserve"> legt eine Liste mit 60 Plätzen an. Die </w:t>
+      </w:r>
+      <w:r>
+        <w:rPr>
+          <w:rFonts w:ascii="Consolas" w:cs="Consolas" w:eastAsia="Consolas" w:hAnsi="Consolas"/>
+          <w:sz w:val="21"/>
+          <w:szCs w:val="21"/>
+        </w:rPr>
+        <w:t xml:space="preserve">FOR</w:t>
+      </w:r>
+      <w:r>
+        <w:rPr>
+          <w:sz w:val="22"/>
+          <w:szCs w:val="22"/>
+        </w:rPr>
+        <w:t xml:space="preserve">-Schleife läuft von 0 bis 59 und gibt jedem Stern mit </w:t>
+      </w:r>
+      <w:r>
+        <w:rPr>
+          <w:rFonts w:ascii="Consolas" w:cs="Consolas" w:eastAsia="Consolas" w:hAnsi="Consolas"/>
+          <w:sz w:val="21"/>
+          <w:szCs w:val="21"/>
+        </w:rPr>
+        <w:t xml:space="preserve">RANDINT(min, max)</w:t>
+      </w:r>
+      <w:r>
+        <w:rPr>
+          <w:sz w:val="22"/>
+          <w:szCs w:val="22"/>
+        </w:rPr>
+        <w:t xml:space="preserve"> eine zufällige Position.</w:t>
+      </w:r>
+    </w:p>
+    <w:p>
+      <w:pPr>
+        <w:spacing w:after="140"/>
+      </w:pPr>
+      <w:r>
+        <w:rPr>
+          <w:sz w:val="22"/>
+          <w:szCs w:val="22"/>
+        </w:rPr>
+        <w:t xml:space="preserve">In der Spielschleife lassen wir die Sterne nach unten fallen. Wer unten herausfällt, taucht oben neu auf:</w:t>
+      </w:r>
+    </w:p>
+    <w:p>
+      <w:pPr>
+        <w:pBdr>
+          <w:left w:val="single" w:color="1B6CA8" w:sz="18" w:space="6"/>
+        </w:pBdr>
+        <w:shd w:fill="F4F4F4" w:val="clear"/>
+        <w:spacing w:after="160" w:before="80"/>
+        <w:ind w:left="120"/>
+      </w:pPr>
+      <w:r>
+        <w:rPr>
+          <w:rFonts w:ascii="Consolas" w:cs="Consolas" w:eastAsia="Consolas" w:hAnsi="Consolas"/>
+          <w:sz w:val="19"/>
+          <w:szCs w:val="19"/>
+        </w:rPr>
+        <w:t xml:space="preserve">FOR i = 0 TO NSTARS - 1</w:t>
+      </w:r>
+      <w:r>
+        <w:rPr>
+          <w:rFonts w:ascii="Consolas" w:cs="Consolas" w:eastAsia="Consolas" w:hAnsi="Consolas"/>
+          <w:sz w:val="19"/>
+          <w:szCs w:val="19"/>
+        </w:rPr>
+        <w:br/>
+        <w:t xml:space="preserve">    starY[i] = starY[i] + 2</w:t>
+      </w:r>
+      <w:r>
+        <w:rPr>
+          <w:rFonts w:ascii="Consolas" w:cs="Consolas" w:eastAsia="Consolas" w:hAnsi="Consolas"/>
+          <w:sz w:val="19"/>
+          <w:szCs w:val="19"/>
+        </w:rPr>
+        <w:br/>
+        <w:t xml:space="preserve">    IF starY[i] &gt; 639 THEN starY[i] = 0 : starX[i] = RANDINT(0, 479)</w:t>
+      </w:r>
+      <w:r>
+        <w:rPr>
+          <w:rFonts w:ascii="Consolas" w:cs="Consolas" w:eastAsia="Consolas" w:hAnsi="Consolas"/>
+          <w:sz w:val="19"/>
+          <w:szCs w:val="19"/>
+        </w:rPr>
+        <w:br/>
+        <w:t xml:space="preserve">    PLOT(starX[i], starY[i], &amp;HFFFFFF)</w:t>
+      </w:r>
+      <w:r>
+        <w:rPr>
+          <w:rFonts w:ascii="Consolas" w:cs="Consolas" w:eastAsia="Consolas" w:hAnsi="Consolas"/>
+          <w:sz w:val="19"/>
+          <w:szCs w:val="19"/>
+        </w:rPr>
+        <w:br/>
+        <w:t xml:space="preserve">NEXT i</w:t>
+      </w:r>
+    </w:p>
+    <w:p>
+      <w:pPr>
+        <w:spacing w:after="140"/>
+      </w:pPr>
+      <w:r>
+        <w:rPr>
+          <w:sz w:val="22"/>
+          <w:szCs w:val="22"/>
+        </w:rPr>
+        <w:t xml:space="preserve"/>
+      </w:r>
+      <w:r>
+        <w:rPr>
+          <w:rFonts w:ascii="Consolas" w:cs="Consolas" w:eastAsia="Consolas" w:hAnsi="Consolas"/>
+          <w:sz w:val="21"/>
+          <w:szCs w:val="21"/>
+        </w:rPr>
+        <w:t xml:space="preserve">PLOT(x, y, farbe)</w:t>
+      </w:r>
+      <w:r>
+        <w:rPr>
+          <w:sz w:val="22"/>
+          <w:szCs w:val="22"/>
+        </w:rPr>
+        <w:t xml:space="preserve"> zeichnet einen einzelnen Punkt – hier in Weiss (</w:t>
+      </w:r>
+      <w:r>
+        <w:rPr>
+          <w:rFonts w:ascii="Consolas" w:cs="Consolas" w:eastAsia="Consolas" w:hAnsi="Consolas"/>
+          <w:sz w:val="21"/>
+          <w:szCs w:val="21"/>
+        </w:rPr>
+        <w:t xml:space="preserve">&amp;HFFFFFF</w:t>
+      </w:r>
+      <w:r>
+        <w:rPr>
+          <w:sz w:val="22"/>
+          <w:szCs w:val="22"/>
+        </w:rPr>
+        <w:t xml:space="preserve">). Die Zeile mit </w:t>
+      </w:r>
+      <w:r>
+        <w:rPr>
+          <w:rFonts w:ascii="Consolas" w:cs="Consolas" w:eastAsia="Consolas" w:hAnsi="Consolas"/>
+          <w:sz w:val="21"/>
+          <w:szCs w:val="21"/>
+        </w:rPr>
+        <w:t xml:space="preserve">IF</w:t>
+      </w:r>
+      <w:r>
+        <w:rPr>
+          <w:sz w:val="22"/>
+          <w:szCs w:val="22"/>
+        </w:rPr>
+        <w:t xml:space="preserve"> setzt einen Stern zurück nach oben, sobald er unten austritt – und gibt ihm gleich eine neue x-Position.</w:t>
+      </w:r>
+    </w:p>
+    <w:p>
+      <w:pPr>
+        <w:pStyle w:val="Heading2"/>
+      </w:pPr>
+      <w:r>
+        <w:t xml:space="preserve">Das ganze Programm</w:t>
+      </w:r>
+    </w:p>
+    <w:p>
+      <w:pPr>
+        <w:spacing w:after="140"/>
+      </w:pPr>
+      <w:r>
+        <w:rPr>
+          <w:sz w:val="22"/>
+          <w:szCs w:val="22"/>
+        </w:rPr>
+        <w:t xml:space="preserve">Setzt man alles zusammen, ergibt sich dein erstes vollständiges GameBasic-Programm. Tippe es ab und starte es:</w:t>
+      </w:r>
+    </w:p>
+    <w:p>
+      <w:pPr>
+        <w:pBdr>
+          <w:left w:val="single" w:color="1B6CA8" w:sz="18" w:space="6"/>
+        </w:pBdr>
+        <w:shd w:fill="F4F4F4" w:val="clear"/>
+        <w:spacing w:after="160" w:before="80"/>
+        <w:ind w:left="120"/>
+      </w:pPr>
+      <w:r>
+        <w:rPr>
+          <w:rFonts w:ascii="Consolas" w:cs="Consolas" w:eastAsia="Consolas" w:hAnsi="Consolas"/>
+          <w:sz w:val="19"/>
+          <w:szCs w:val="19"/>
+        </w:rPr>
+        <w:t xml:space="preserve">SCREEN(480, 640, "Mein Galaga - Kapitel 1")</w:t>
+      </w:r>
+      <w:r>
+        <w:rPr>
+          <w:rFonts w:ascii="Consolas" w:cs="Consolas" w:eastAsia="Consolas" w:hAnsi="Consolas"/>
+          <w:sz w:val="19"/>
+          <w:szCs w:val="19"/>
+        </w:rPr>
+        <w:br/>
+        <w:t xml:space="preserve"/>
+      </w:r>
+      <w:r>
+        <w:rPr>
+          <w:rFonts w:ascii="Consolas" w:cs="Consolas" w:eastAsia="Consolas" w:hAnsi="Consolas"/>
+          <w:sz w:val="19"/>
+          <w:szCs w:val="19"/>
+        </w:rPr>
+        <w:br/>
+        <w:t xml:space="preserve">CONST NSTARS AS INTEGER = 60</w:t>
+      </w:r>
+      <w:r>
+        <w:rPr>
+          <w:rFonts w:ascii="Consolas" w:cs="Consolas" w:eastAsia="Consolas" w:hAnsi="Consolas"/>
+          <w:sz w:val="19"/>
+          <w:szCs w:val="19"/>
+        </w:rPr>
+        <w:br/>
+        <w:t xml:space="preserve">DIM starX[NSTARS] AS INTEGER</w:t>
+      </w:r>
+      <w:r>
+        <w:rPr>
+          <w:rFonts w:ascii="Consolas" w:cs="Consolas" w:eastAsia="Consolas" w:hAnsi="Consolas"/>
+          <w:sz w:val="19"/>
+          <w:szCs w:val="19"/>
+        </w:rPr>
+        <w:br/>
+        <w:t xml:space="preserve">DIM starY[NSTARS] AS INTEGER</w:t>
+      </w:r>
+      <w:r>
+        <w:rPr>
+          <w:rFonts w:ascii="Consolas" w:cs="Consolas" w:eastAsia="Consolas" w:hAnsi="Consolas"/>
+          <w:sz w:val="19"/>
+          <w:szCs w:val="19"/>
+        </w:rPr>
+        <w:br/>
+        <w:t xml:space="preserve">DIM i AS INTEGER</w:t>
+      </w:r>
+      <w:r>
+        <w:rPr>
+          <w:rFonts w:ascii="Consolas" w:cs="Consolas" w:eastAsia="Consolas" w:hAnsi="Consolas"/>
+          <w:sz w:val="19"/>
+          <w:szCs w:val="19"/>
+        </w:rPr>
+        <w:br/>
+        <w:t xml:space="preserve">FOR i = 0 TO NSTARS - 1</w:t>
+      </w:r>
+      <w:r>
+        <w:rPr>
+          <w:rFonts w:ascii="Consolas" w:cs="Consolas" w:eastAsia="Consolas" w:hAnsi="Consolas"/>
+          <w:sz w:val="19"/>
+          <w:szCs w:val="19"/>
+        </w:rPr>
+        <w:br/>
+        <w:t xml:space="preserve">    starX[i] = RANDINT(0, 479)</w:t>
+      </w:r>
+      <w:r>
+        <w:rPr>
+          <w:rFonts w:ascii="Consolas" w:cs="Consolas" w:eastAsia="Consolas" w:hAnsi="Consolas"/>
+          <w:sz w:val="19"/>
+          <w:szCs w:val="19"/>
+        </w:rPr>
+        <w:br/>
+        <w:t xml:space="preserve">    starY[i] = RANDINT(0, 639)</w:t>
+      </w:r>
+      <w:r>
+        <w:rPr>
+          <w:rFonts w:ascii="Consolas" w:cs="Consolas" w:eastAsia="Consolas" w:hAnsi="Consolas"/>
+          <w:sz w:val="19"/>
+          <w:szCs w:val="19"/>
+        </w:rPr>
+        <w:br/>
+        <w:t xml:space="preserve">NEXT i</w:t>
+      </w:r>
+      <w:r>
+        <w:rPr>
+          <w:rFonts w:ascii="Consolas" w:cs="Consolas" w:eastAsia="Consolas" w:hAnsi="Consolas"/>
+          <w:sz w:val="19"/>
+          <w:szCs w:val="19"/>
+        </w:rPr>
+        <w:br/>
+        <w:t xml:space="preserve"/>
+      </w:r>
+      <w:r>
+        <w:rPr>
+          <w:rFonts w:ascii="Consolas" w:cs="Consolas" w:eastAsia="Consolas" w:hAnsi="Consolas"/>
+          <w:sz w:val="19"/>
+          <w:szCs w:val="19"/>
+        </w:rPr>
+        <w:br/>
+        <w:t xml:space="preserve">WHILE NOT QUITREQUESTED()</w:t>
+      </w:r>
+      <w:r>
+        <w:rPr>
+          <w:rFonts w:ascii="Consolas" w:cs="Consolas" w:eastAsia="Consolas" w:hAnsi="Consolas"/>
+          <w:sz w:val="19"/>
+          <w:szCs w:val="19"/>
+        </w:rPr>
+        <w:br/>
+        <w:t xml:space="preserve">    CLS(&amp;H05060F)</w:t>
+      </w:r>
+      <w:r>
+        <w:rPr>
+          <w:rFonts w:ascii="Consolas" w:cs="Consolas" w:eastAsia="Consolas" w:hAnsi="Consolas"/>
+          <w:sz w:val="19"/>
+          <w:szCs w:val="19"/>
+        </w:rPr>
+        <w:br/>
+        <w:t xml:space="preserve">    FOR i = 0 TO NSTARS - 1</w:t>
+      </w:r>
+      <w:r>
+        <w:rPr>
+          <w:rFonts w:ascii="Consolas" w:cs="Consolas" w:eastAsia="Consolas" w:hAnsi="Consolas"/>
+          <w:sz w:val="19"/>
+          <w:szCs w:val="19"/>
+        </w:rPr>
+        <w:br/>
+        <w:t xml:space="preserve">        starY[i] = starY[i] + 2</w:t>
+      </w:r>
+      <w:r>
+        <w:rPr>
+          <w:rFonts w:ascii="Consolas" w:cs="Consolas" w:eastAsia="Consolas" w:hAnsi="Consolas"/>
+          <w:sz w:val="19"/>
+          <w:szCs w:val="19"/>
+        </w:rPr>
+        <w:br/>
+        <w:t xml:space="preserve">        IF starY[i] &gt; 639 THEN starY[i] = 0 : starX[i] = RANDINT(0, 479)</w:t>
+      </w:r>
+      <w:r>
+        <w:rPr>
+          <w:rFonts w:ascii="Consolas" w:cs="Consolas" w:eastAsia="Consolas" w:hAnsi="Consolas"/>
+          <w:sz w:val="19"/>
+          <w:szCs w:val="19"/>
+        </w:rPr>
+        <w:br/>
+        <w:t xml:space="preserve">        PLOT(starX[i], starY[i], &amp;HFFFFFF)</w:t>
+      </w:r>
+      <w:r>
+        <w:rPr>
+          <w:rFonts w:ascii="Consolas" w:cs="Consolas" w:eastAsia="Consolas" w:hAnsi="Consolas"/>
+          <w:sz w:val="19"/>
+          <w:szCs w:val="19"/>
+        </w:rPr>
+        <w:br/>
+        <w:t xml:space="preserve">    NEXT i</w:t>
+      </w:r>
+      <w:r>
+        <w:rPr>
+          <w:rFonts w:ascii="Consolas" w:cs="Consolas" w:eastAsia="Consolas" w:hAnsi="Consolas"/>
+          <w:sz w:val="19"/>
+          <w:szCs w:val="19"/>
+        </w:rPr>
+        <w:br/>
+        <w:t xml:space="preserve">    FLIP()</w:t>
+      </w:r>
+      <w:r>
+        <w:rPr>
+          <w:rFonts w:ascii="Consolas" w:cs="Consolas" w:eastAsia="Consolas" w:hAnsi="Consolas"/>
+          <w:sz w:val="19"/>
+          <w:szCs w:val="19"/>
+        </w:rPr>
+        <w:br/>
+        <w:t xml:space="preserve">WEND</w:t>
+      </w:r>
+    </w:p>
+    <w:p>
+      <w:pPr>
+        <w:spacing w:after="40" w:before="120"/>
+        <w:jc w:val="center"/>
+      </w:pPr>
+      <w:r>
+        <w:drawing>
+          <wp:inline distT="0" distB="0" distL="0" distR="0">
+            <wp:extent cx="2857500" cy="3810000"/>
+            <wp:effectExtent t="0" r="0" b="0" l="0"/>
+            <wp:docPr id="1" name="kap01_fenster.png" descr="Dein erstes Fenster: ein scrollender Sternenhimmel." title="Dein erstes Fenster: ein scrollender Sternenhimmel."/>
+            <wp:cNvGraphicFramePr>
+              <a:graphicFrameLocks xmlns:a="http://schemas.openxmlformats.org/drawingml/2006/main" noChangeAspect="1"/>
+            </wp:cNvGraphicFramePr>
+            <a:graphic xmlns:a="http://schemas.openxmlformats.org/drawingml/2006/main">
+              <a:graphicData uri="http://schemas.openxmlformats.org/drawingml/2006/picture">
+                <pic:pic xmlns:pic="http://schemas.openxmlformats.org/drawingml/2006/picture">
+                  <pic:nvPicPr>
+                    <pic:cNvPr id="0" name="" descr=""/>
+                    <pic:cNvPicPr>
+                      <a:picLocks noChangeAspect="1" noChangeArrowheads="1"/>
+                    </pic:cNvPicPr>
+                  </pic:nvPicPr>
+                  <pic:blipFill>
+                    <a:blip r:embed="rId15" cstate="none"/>
+                    <a:srcRect/>
+                    <a:stretch>
+                      <a:fillRect/>
+                    </a:stretch>
+                  </pic:blipFill>
+                  <pic:spPr bwMode="auto">
+                    <a:xfrm>
+                      <a:off x="0" y="0"/>
+                      <a:ext cx="2857500" cy="3810000"/>
+                    </a:xfrm>
+                    <a:prstGeom prst="rect">
+                      <a:avLst/>
+                    </a:prstGeom>
+                  </pic:spPr>
+                </pic:pic>
+              </a:graphicData>
+            </a:graphic>
+          </wp:inline>
+        </w:drawing>
+      </w:r>
+    </w:p>
+    <w:p>
+      <w:pPr>
+        <w:spacing w:after="200"/>
+        <w:jc w:val="center"/>
+      </w:pPr>
+      <w:r>
+        <w:rPr>
+          <w:i/>
+          <w:iCs/>
+          <w:color w:val="6A6A6A"/>
+          <w:sz w:val="18"/>
+          <w:szCs w:val="18"/>
+        </w:rPr>
+        <w:t xml:space="preserve">Dein erstes Fenster: ein scrollender Sternenhimmel.</w:t>
+      </w:r>
+    </w:p>
+    <w:p>
+      <w:pPr>
+        <w:pStyle w:val="Heading2"/>
+      </w:pPr>
+      <w:r>
+        <w:t xml:space="preserve">Was du gelernt hast</w:t>
+      </w:r>
+    </w:p>
+    <w:p>
+      <w:pPr>
+        <w:pStyle w:val="ListParagraph"/>
+        <w:numPr>
+          <w:ilvl w:val="0"/>
+          <w:numId w:val="2"/>
+        </w:numPr>
+        <w:spacing w:after="60"/>
+      </w:pPr>
+      <w:r>
+        <w:rPr>
+          <w:b/>
+          <w:bCs/>
+          <w:sz w:val="22"/>
+          <w:szCs w:val="22"/>
+        </w:rPr>
+        <w:t xml:space="preserve">SCREEN </w:t>
+      </w:r>
+      <w:r>
+        <w:rPr>
+          <w:sz w:val="22"/>
+          <w:szCs w:val="22"/>
+        </w:rPr>
+        <w:t xml:space="preserve">öffnet ein Fenster (Breite, Höhe, Titel).</w:t>
+      </w:r>
+    </w:p>
+    <w:p>
+      <w:pPr>
+        <w:pStyle w:val="ListParagraph"/>
+        <w:numPr>
+          <w:ilvl w:val="0"/>
+          <w:numId w:val="2"/>
+        </w:numPr>
+        <w:spacing w:after="60"/>
+      </w:pPr>
+      <w:r>
+        <w:rPr>
+          <w:b/>
+          <w:bCs/>
+          <w:sz w:val="22"/>
+          <w:szCs w:val="22"/>
+        </w:rPr>
+        <w:t xml:space="preserve">WHILE … WEND + FLIP </w:t>
+      </w:r>
+      <w:r>
+        <w:rPr>
+          <w:sz w:val="22"/>
+          <w:szCs w:val="22"/>
+        </w:rPr>
+        <w:t xml:space="preserve">bilden die Spielschleife, die das Bild immer wieder neu anzeigt.</w:t>
+      </w:r>
+    </w:p>
+    <w:p>
+      <w:pPr>
+        <w:pStyle w:val="ListParagraph"/>
+        <w:numPr>
+          <w:ilvl w:val="0"/>
+          <w:numId w:val="2"/>
+        </w:numPr>
+        <w:spacing w:after="60"/>
+      </w:pPr>
+      <w:r>
+        <w:rPr>
+          <w:b/>
+          <w:bCs/>
+          <w:sz w:val="22"/>
+          <w:szCs w:val="22"/>
+        </w:rPr>
+        <w:t xml:space="preserve">CLS </w:t>
+      </w:r>
+      <w:r>
+        <w:rPr>
+          <w:sz w:val="22"/>
+          <w:szCs w:val="22"/>
+        </w:rPr>
+        <w:t xml:space="preserve">löscht das Bild, PLOT zeichnet einen Punkt – Farben als &amp;Hrrggbb.</w:t>
+      </w:r>
+    </w:p>
+    <w:p>
+      <w:pPr>
+        <w:pStyle w:val="ListParagraph"/>
+        <w:numPr>
+          <w:ilvl w:val="0"/>
+          <w:numId w:val="2"/>
+        </w:numPr>
+        <w:spacing w:after="60"/>
+      </w:pPr>
+      <w:r>
+        <w:rPr>
+          <w:b/>
+          <w:bCs/>
+          <w:sz w:val="22"/>
+          <w:szCs w:val="22"/>
+        </w:rPr>
+        <w:t xml:space="preserve">CONST, DIM und FOR </w:t>
+      </w:r>
+      <w:r>
+        <w:rPr>
+          <w:sz w:val="22"/>
+          <w:szCs w:val="22"/>
+        </w:rPr>
+        <w:t xml:space="preserve">speichern und verarbeiten viele Werte (hier: 60 Sterne).</w:t>
+      </w:r>
+    </w:p>
+    <w:p>
+      <w:pPr>
+        <w:pStyle w:val="Heading2"/>
+      </w:pPr>
+      <w:r>
+        <w:t xml:space="preserve">Übung</w:t>
+      </w:r>
+    </w:p>
+    <w:p>
+      <w:pPr>
+        <w:pStyle w:val="ListParagraph"/>
+        <w:numPr>
+          <w:ilvl w:val="0"/>
+          <w:numId w:val="2"/>
+        </w:numPr>
+        <w:spacing w:after="60"/>
+      </w:pPr>
+      <w:r>
+        <w:rPr>
+          <w:sz w:val="22"/>
+          <w:szCs w:val="22"/>
+        </w:rPr>
+        <w:t xml:space="preserve">Ändere die Fenstergrösse und die Sternenfarbe. Was passiert?</w:t>
+      </w:r>
+    </w:p>
+    <w:p>
+      <w:pPr>
+        <w:pStyle w:val="ListParagraph"/>
+        <w:numPr>
+          <w:ilvl w:val="0"/>
+          <w:numId w:val="2"/>
+        </w:numPr>
+        <w:spacing w:after="60"/>
+      </w:pPr>
+      <w:r>
+        <w:rPr>
+          <w:sz w:val="22"/>
+          <w:szCs w:val="22"/>
+        </w:rPr>
+        <w:t xml:space="preserve">Lass die Sterne schneller fallen (grössere Zahl statt + 2).</w:t>
+      </w:r>
+    </w:p>
+    <w:p>
+      <w:pPr>
+        <w:pStyle w:val="ListParagraph"/>
+        <w:numPr>
+          <w:ilvl w:val="0"/>
+          <w:numId w:val="2"/>
+        </w:numPr>
+        <w:spacing w:after="60"/>
+      </w:pPr>
+      <w:r>
+        <w:rPr>
+          <w:sz w:val="22"/>
+          <w:szCs w:val="22"/>
+        </w:rPr>
+        <w:t xml:space="preserve">Erhöhe NSTARS auf 200 – ein dichteres Weltall.</w:t>
+      </w:r>
+    </w:p>
+    <w:p>
+      <w:pPr>
+        <w:pStyle w:val="ListParagraph"/>
+        <w:numPr>
+          <w:ilvl w:val="0"/>
+          <w:numId w:val="2"/>
+        </w:numPr>
+        <w:spacing w:after="60"/>
+      </w:pPr>
+      <w:r>
+        <w:rPr>
+          <w:sz w:val="22"/>
+          <w:szCs w:val="22"/>
+        </w:rPr>
+        <w:t xml:space="preserve">Zusatz: Gib manchen Sternen mit einer zweiten Geschwindigkeit mehr Tiefe (Tipp: ein drittes Array für das Tempo).</w:t>
+      </w:r>
+    </w:p>
     <w:sectPr>
       <w:footerReference w:type="default" r:id="rId7"/>
       <w:pgSz w:w="12240" w:h="15840" w:orient="portrait"/>

</xml_diff>

<commit_message>
docs(buch-galaga): Kapitel 2 "Das Schiff" (Bild laden, zeichnen, steuern)
Buch um Kapitel 2 erweitert: LOADIMAGE (Typ IMAGE, relativer Pfad), DRAWIMAGE,
KEYPRESSED (Pfeile/A-D mit OR), Rand-Begrenzung per IF -- schrittweise mit
Code-Bloecken, Inline-Code, Tipp-Kasten, Screenshot, Zusammenfassung + Uebungen.
Lauffaehiger Stand code/kap02/schiff.gb (gbrt --check clean, Screenshot). docx
validiert (PASSED) + Seiten per LibreOffice/PyMuPDF visuell geprueft (12 Seiten).

Co-Authored-By: Claude Opus 4.8 <noreply@anthropic.com>
</commit_message>
<xml_diff>
--- a/buch-galaga/buch/GameBasic-Buch.docx
+++ b/buch-galaga/buch/GameBasic-Buch.docx
@@ -2542,6 +2542,1104 @@
           <w:szCs w:val="22"/>
         </w:rPr>
         <w:t xml:space="preserve">Zusatz: Gib manchen Sternen mit einer zweiten Geschwindigkeit mehr Tiefe (Tipp: ein drittes Array für das Tempo).</w:t>
+      </w:r>
+    </w:p>
+    <w:p>
+      <w:r>
+        <w:br w:type="page"/>
+      </w:r>
+    </w:p>
+    <w:p>
+      <w:pPr>
+        <w:pStyle w:val="Heading1"/>
+        <w:pBdr>
+          <w:bottom w:val="single" w:color="1B6CA8" w:sz="12" w:space="4"/>
+        </w:pBdr>
+        <w:spacing w:after="80" w:before="320"/>
+      </w:pPr>
+      <w:r>
+        <w:t xml:space="preserve">Kapitel 2: Das Schiff</w:t>
+      </w:r>
+    </w:p>
+    <w:tbl>
+      <w:tblPr>
+        <w:tblW w:type="dxa" w:w="9360"/>
+        <w:tblBorders>
+          <w:top w:val="single" w:color="auto" w:sz="4"/>
+          <w:left w:val="single" w:color="auto" w:sz="4"/>
+          <w:bottom w:val="single" w:color="auto" w:sz="4"/>
+          <w:right w:val="single" w:color="auto" w:sz="4"/>
+          <w:insideH w:val="single" w:color="auto" w:sz="4"/>
+          <w:insideV w:val="single" w:color="auto" w:sz="4"/>
+        </w:tblBorders>
+      </w:tblPr>
+      <w:tblGrid>
+        <w:gridCol w:w="9360"/>
+      </w:tblGrid>
+      <w:tr>
+        <w:tc>
+          <w:tcPr>
+            <w:tcW w:type="dxa" w:w="9360"/>
+            <w:tcBorders>
+              <w:top w:val="single" w:color="9CC8E6" w:sz="6"/>
+              <w:left w:val="single" w:color="9CC8E6" w:sz="6"/>
+              <w:bottom w:val="single" w:color="9CC8E6" w:sz="6"/>
+              <w:right w:val="single" w:color="9CC8E6" w:sz="6"/>
+            </w:tcBorders>
+            <w:shd w:fill="E7F2FA" w:val="clear"/>
+            <w:tcMar>
+              <w:top w:type="dxa" w:w="120"/>
+              <w:left w:type="dxa" w:w="160"/>
+              <w:bottom w:type="dxa" w:w="120"/>
+              <w:right w:type="dxa" w:w="160"/>
+            </w:tcMar>
+          </w:tcPr>
+          <w:p>
+            <w:pPr>
+              <w:spacing w:after="40"/>
+            </w:pPr>
+            <w:r>
+              <w:rPr>
+                <w:b/>
+                <w:bCs/>
+                <w:color w:val="1B6CA8"/>
+                <w:sz w:val="22"/>
+                <w:szCs w:val="22"/>
+              </w:rPr>
+              <w:t xml:space="preserve">In diesem Kapitel</w:t>
+            </w:r>
+          </w:p>
+          <w:p>
+            <w:r>
+              <w:rPr>
+                <w:sz w:val="22"/>
+                <w:szCs w:val="22"/>
+              </w:rPr>
+              <w:t xml:space="preserve">Du holst dein Raumschiff auf den Bildschirm: ein fertiges Bild laden, an die richtige Stelle zeichnen und mit den Pfeiltasten nach links und rechts steuern.</w:t>
+            </w:r>
+          </w:p>
+        </w:tc>
+      </w:tr>
+    </w:tbl>
+    <w:p>
+      <w:pPr>
+        <w:pStyle w:val="Heading2"/>
+      </w:pPr>
+      <w:r>
+        <w:t xml:space="preserve">Ein Bild laden</w:t>
+      </w:r>
+    </w:p>
+    <w:p>
+      <w:pPr>
+        <w:spacing w:after="140"/>
+      </w:pPr>
+      <w:r>
+        <w:rPr>
+          <w:sz w:val="22"/>
+          <w:szCs w:val="22"/>
+        </w:rPr>
+        <w:t xml:space="preserve">Das Raumschiff ist ein kleines Bild (ein „Sprite“). Im nächsten Kapitel zeichnest du es selbst – fürs Erste nehmen wir das mitgelieferte. Ein Bild laden wir mit LOADIMAGE und merken es uns in einer Variablen vom Typ IMAGE:</w:t>
+      </w:r>
+    </w:p>
+    <w:p>
+      <w:pPr>
+        <w:pBdr>
+          <w:left w:val="single" w:color="1B6CA8" w:sz="18" w:space="6"/>
+        </w:pBdr>
+        <w:shd w:fill="F4F4F4" w:val="clear"/>
+        <w:spacing w:after="160" w:before="80"/>
+        <w:ind w:left="120"/>
+      </w:pPr>
+      <w:r>
+        <w:rPr>
+          <w:rFonts w:ascii="Consolas" w:cs="Consolas" w:eastAsia="Consolas" w:hAnsi="Consolas"/>
+          <w:sz w:val="19"/>
+          <w:szCs w:val="19"/>
+        </w:rPr>
+        <w:t xml:space="preserve">DIM shipImg AS IMAGE</w:t>
+      </w:r>
+      <w:r>
+        <w:rPr>
+          <w:rFonts w:ascii="Consolas" w:cs="Consolas" w:eastAsia="Consolas" w:hAnsi="Consolas"/>
+          <w:sz w:val="19"/>
+          <w:szCs w:val="19"/>
+        </w:rPr>
+        <w:br/>
+        <w:t xml:space="preserve">shipImg = LOADIMAGE("../../assets/sprites/player.png")</w:t>
+      </w:r>
+    </w:p>
+    <w:p>
+      <w:pPr>
+        <w:spacing w:after="140"/>
+      </w:pPr>
+      <w:r>
+        <w:rPr>
+          <w:sz w:val="22"/>
+          <w:szCs w:val="22"/>
+        </w:rPr>
+        <w:t xml:space="preserve">Der Pfad ist </w:t>
+      </w:r>
+      <w:r>
+        <w:rPr>
+          <w:sz w:val="22"/>
+          <w:szCs w:val="22"/>
+        </w:rPr>
+        <w:t xml:space="preserve">relativ zu deiner Programmdatei</w:t>
+      </w:r>
+      <w:r>
+        <w:rPr>
+          <w:sz w:val="22"/>
+          <w:szCs w:val="22"/>
+        </w:rPr>
+        <w:t xml:space="preserve">. Liegt dein Code in </w:t>
+      </w:r>
+      <w:r>
+        <w:rPr>
+          <w:rFonts w:ascii="Consolas" w:cs="Consolas" w:eastAsia="Consolas" w:hAnsi="Consolas"/>
+          <w:sz w:val="21"/>
+          <w:szCs w:val="21"/>
+        </w:rPr>
+        <w:t xml:space="preserve">code/kap02/</w:t>
+      </w:r>
+      <w:r>
+        <w:rPr>
+          <w:sz w:val="22"/>
+          <w:szCs w:val="22"/>
+        </w:rPr>
+        <w:t xml:space="preserve"> und das Bild in </w:t>
+      </w:r>
+      <w:r>
+        <w:rPr>
+          <w:rFonts w:ascii="Consolas" w:cs="Consolas" w:eastAsia="Consolas" w:hAnsi="Consolas"/>
+          <w:sz w:val="21"/>
+          <w:szCs w:val="21"/>
+        </w:rPr>
+        <w:t xml:space="preserve">assets/sprites/</w:t>
+      </w:r>
+      <w:r>
+        <w:rPr>
+          <w:sz w:val="22"/>
+          <w:szCs w:val="22"/>
+        </w:rPr>
+        <w:t xml:space="preserve">, führen die zwei </w:t>
+      </w:r>
+      <w:r>
+        <w:rPr>
+          <w:rFonts w:ascii="Consolas" w:cs="Consolas" w:eastAsia="Consolas" w:hAnsi="Consolas"/>
+          <w:sz w:val="21"/>
+          <w:szCs w:val="21"/>
+        </w:rPr>
+        <w:t xml:space="preserve">..</w:t>
+      </w:r>
+      <w:r>
+        <w:rPr>
+          <w:sz w:val="22"/>
+          <w:szCs w:val="22"/>
+        </w:rPr>
+        <w:t xml:space="preserve"> zwei Ordner nach oben. </w:t>
+      </w:r>
+      <w:r>
+        <w:rPr>
+          <w:rFonts w:ascii="Consolas" w:cs="Consolas" w:eastAsia="Consolas" w:hAnsi="Consolas"/>
+          <w:sz w:val="21"/>
+          <w:szCs w:val="21"/>
+        </w:rPr>
+        <w:t xml:space="preserve">DIM</w:t>
+      </w:r>
+      <w:r>
+        <w:rPr>
+          <w:sz w:val="22"/>
+          <w:szCs w:val="22"/>
+        </w:rPr>
+        <w:t xml:space="preserve"> legt eine neue Variable an – hier vom Typ </w:t>
+      </w:r>
+      <w:r>
+        <w:rPr>
+          <w:rFonts w:ascii="Consolas" w:cs="Consolas" w:eastAsia="Consolas" w:hAnsi="Consolas"/>
+          <w:sz w:val="21"/>
+          <w:szCs w:val="21"/>
+        </w:rPr>
+        <w:t xml:space="preserve">IMAGE</w:t>
+      </w:r>
+      <w:r>
+        <w:rPr>
+          <w:sz w:val="22"/>
+          <w:szCs w:val="22"/>
+        </w:rPr>
+        <w:t xml:space="preserve"> (ein Bild).</w:t>
+      </w:r>
+    </w:p>
+    <w:p>
+      <w:pPr>
+        <w:pStyle w:val="Heading2"/>
+      </w:pPr>
+      <w:r>
+        <w:t xml:space="preserve">Das Schiff zeichnen</w:t>
+      </w:r>
+    </w:p>
+    <w:p>
+      <w:pPr>
+        <w:spacing w:after="140"/>
+      </w:pPr>
+      <w:r>
+        <w:rPr>
+          <w:sz w:val="22"/>
+          <w:szCs w:val="22"/>
+        </w:rPr>
+        <w:t xml:space="preserve">Wo soll das Schiff stehen? Wir merken uns seine Position in zwei Variablen und starten unten in der Mitte. Gezeichnet wird mit DRAWIMAGE:</w:t>
+      </w:r>
+    </w:p>
+    <w:p>
+      <w:pPr>
+        <w:pBdr>
+          <w:left w:val="single" w:color="1B6CA8" w:sz="18" w:space="6"/>
+        </w:pBdr>
+        <w:shd w:fill="F4F4F4" w:val="clear"/>
+        <w:spacing w:after="160" w:before="80"/>
+        <w:ind w:left="120"/>
+      </w:pPr>
+      <w:r>
+        <w:rPr>
+          <w:rFonts w:ascii="Consolas" w:cs="Consolas" w:eastAsia="Consolas" w:hAnsi="Consolas"/>
+          <w:sz w:val="19"/>
+          <w:szCs w:val="19"/>
+        </w:rPr>
+        <w:t xml:space="preserve">DIM shipX AS INTEGER</w:t>
+      </w:r>
+      <w:r>
+        <w:rPr>
+          <w:rFonts w:ascii="Consolas" w:cs="Consolas" w:eastAsia="Consolas" w:hAnsi="Consolas"/>
+          <w:sz w:val="19"/>
+          <w:szCs w:val="19"/>
+        </w:rPr>
+        <w:br/>
+        <w:t xml:space="preserve">DIM shipY AS INTEGER</w:t>
+      </w:r>
+      <w:r>
+        <w:rPr>
+          <w:rFonts w:ascii="Consolas" w:cs="Consolas" w:eastAsia="Consolas" w:hAnsi="Consolas"/>
+          <w:sz w:val="19"/>
+          <w:szCs w:val="19"/>
+        </w:rPr>
+        <w:br/>
+        <w:t xml:space="preserve">shipX = 232</w:t>
+      </w:r>
+      <w:r>
+        <w:rPr>
+          <w:rFonts w:ascii="Consolas" w:cs="Consolas" w:eastAsia="Consolas" w:hAnsi="Consolas"/>
+          <w:sz w:val="19"/>
+          <w:szCs w:val="19"/>
+        </w:rPr>
+        <w:br/>
+        <w:t xml:space="preserve">shipY = 560</w:t>
+      </w:r>
+      <w:r>
+        <w:rPr>
+          <w:rFonts w:ascii="Consolas" w:cs="Consolas" w:eastAsia="Consolas" w:hAnsi="Consolas"/>
+          <w:sz w:val="19"/>
+          <w:szCs w:val="19"/>
+        </w:rPr>
+        <w:br/>
+        <w:t xml:space="preserve"/>
+      </w:r>
+      <w:r>
+        <w:rPr>
+          <w:rFonts w:ascii="Consolas" w:cs="Consolas" w:eastAsia="Consolas" w:hAnsi="Consolas"/>
+          <w:sz w:val="19"/>
+          <w:szCs w:val="19"/>
+        </w:rPr>
+        <w:br/>
+        <w:t xml:space="preserve">' ... in der Spielschleife: ...</w:t>
+      </w:r>
+      <w:r>
+        <w:rPr>
+          <w:rFonts w:ascii="Consolas" w:cs="Consolas" w:eastAsia="Consolas" w:hAnsi="Consolas"/>
+          <w:sz w:val="19"/>
+          <w:szCs w:val="19"/>
+        </w:rPr>
+        <w:br/>
+        <w:t xml:space="preserve">DRAWIMAGE(shipImg, shipX, shipY)</w:t>
+      </w:r>
+    </w:p>
+    <w:p>
+      <w:pPr>
+        <w:spacing w:after="140"/>
+      </w:pPr>
+      <w:r>
+        <w:rPr>
+          <w:sz w:val="22"/>
+          <w:szCs w:val="22"/>
+        </w:rPr>
+        <w:t xml:space="preserve"/>
+      </w:r>
+      <w:r>
+        <w:rPr>
+          <w:rFonts w:ascii="Consolas" w:cs="Consolas" w:eastAsia="Consolas" w:hAnsi="Consolas"/>
+          <w:sz w:val="21"/>
+          <w:szCs w:val="21"/>
+        </w:rPr>
+        <w:t xml:space="preserve">DRAWIMAGE(bild, x, y)</w:t>
+      </w:r>
+      <w:r>
+        <w:rPr>
+          <w:sz w:val="22"/>
+          <w:szCs w:val="22"/>
+        </w:rPr>
+        <w:t xml:space="preserve"> malt das Bild an die Position (x, y) – gemessen von der oberen linken Ecke. Bei einem 480 Pixel breiten Fenster und einem 16 Pixel breiten Schiff liegt die Mitte bei </w:t>
+      </w:r>
+      <w:r>
+        <w:rPr>
+          <w:rFonts w:ascii="Consolas" w:cs="Consolas" w:eastAsia="Consolas" w:hAnsi="Consolas"/>
+          <w:sz w:val="21"/>
+          <w:szCs w:val="21"/>
+        </w:rPr>
+        <w:t xml:space="preserve">(480 - 16) / 2 = 232</w:t>
+      </w:r>
+      <w:r>
+        <w:rPr>
+          <w:sz w:val="22"/>
+          <w:szCs w:val="22"/>
+        </w:rPr>
+        <w:t xml:space="preserve">.</w:t>
+      </w:r>
+    </w:p>
+    <w:p>
+      <w:pPr>
+        <w:pStyle w:val="Heading2"/>
+      </w:pPr>
+      <w:r>
+        <w:t xml:space="preserve">Mit der Tastatur bewegen</w:t>
+      </w:r>
+    </w:p>
+    <w:p>
+      <w:pPr>
+        <w:spacing w:after="140"/>
+      </w:pPr>
+      <w:r>
+        <w:rPr>
+          <w:sz w:val="22"/>
+          <w:szCs w:val="22"/>
+        </w:rPr>
+        <w:t xml:space="preserve">Tasten fragen wir mit </w:t>
+      </w:r>
+      <w:r>
+        <w:rPr>
+          <w:rFonts w:ascii="Consolas" w:cs="Consolas" w:eastAsia="Consolas" w:hAnsi="Consolas"/>
+          <w:sz w:val="21"/>
+          <w:szCs w:val="21"/>
+        </w:rPr>
+        <w:t xml:space="preserve">KEYPRESSED</w:t>
+      </w:r>
+      <w:r>
+        <w:rPr>
+          <w:sz w:val="22"/>
+          <w:szCs w:val="22"/>
+        </w:rPr>
+        <w:t xml:space="preserve"> ab. Ist eine Taste gedrückt, verschieben wir das Schiff – nach links kleiner, nach rechts grösser:</w:t>
+      </w:r>
+    </w:p>
+    <w:p>
+      <w:pPr>
+        <w:pBdr>
+          <w:left w:val="single" w:color="1B6CA8" w:sz="18" w:space="6"/>
+        </w:pBdr>
+        <w:shd w:fill="F4F4F4" w:val="clear"/>
+        <w:spacing w:after="160" w:before="80"/>
+        <w:ind w:left="120"/>
+      </w:pPr>
+      <w:r>
+        <w:rPr>
+          <w:rFonts w:ascii="Consolas" w:cs="Consolas" w:eastAsia="Consolas" w:hAnsi="Consolas"/>
+          <w:sz w:val="19"/>
+          <w:szCs w:val="19"/>
+        </w:rPr>
+        <w:t xml:space="preserve">IF KEYPRESSED(KEY_LEFT)  OR KEYPRESSED(KEY_A) THEN shipX = shipX - 4</w:t>
+      </w:r>
+      <w:r>
+        <w:rPr>
+          <w:rFonts w:ascii="Consolas" w:cs="Consolas" w:eastAsia="Consolas" w:hAnsi="Consolas"/>
+          <w:sz w:val="19"/>
+          <w:szCs w:val="19"/>
+        </w:rPr>
+        <w:br/>
+        <w:t xml:space="preserve">IF KEYPRESSED(KEY_RIGHT) OR KEYPRESSED(KEY_D) THEN shipX = shipX + 4</w:t>
+      </w:r>
+    </w:p>
+    <w:p>
+      <w:pPr>
+        <w:spacing w:after="140"/>
+      </w:pPr>
+      <w:r>
+        <w:rPr>
+          <w:sz w:val="22"/>
+          <w:szCs w:val="22"/>
+        </w:rPr>
+        <w:t xml:space="preserve">Mit </w:t>
+      </w:r>
+      <w:r>
+        <w:rPr>
+          <w:rFonts w:ascii="Consolas" w:cs="Consolas" w:eastAsia="Consolas" w:hAnsi="Consolas"/>
+          <w:sz w:val="21"/>
+          <w:szCs w:val="21"/>
+        </w:rPr>
+        <w:t xml:space="preserve">OR</w:t>
+      </w:r>
+      <w:r>
+        <w:rPr>
+          <w:sz w:val="22"/>
+          <w:szCs w:val="22"/>
+        </w:rPr>
+        <w:t xml:space="preserve"> akzeptieren wir zwei Tasten gleichzeitig: die Pfeiltasten </w:t>
+      </w:r>
+      <w:r>
+        <w:rPr>
+          <w:sz w:val="22"/>
+          <w:szCs w:val="22"/>
+        </w:rPr>
+        <w:t xml:space="preserve">oder</w:t>
+      </w:r>
+      <w:r>
+        <w:rPr>
+          <w:sz w:val="22"/>
+          <w:szCs w:val="22"/>
+        </w:rPr>
+        <w:t xml:space="preserve"> A und D. Die </w:t>
+      </w:r>
+      <w:r>
+        <w:rPr>
+          <w:rFonts w:ascii="Consolas" w:cs="Consolas" w:eastAsia="Consolas" w:hAnsi="Consolas"/>
+          <w:sz w:val="21"/>
+          <w:szCs w:val="21"/>
+        </w:rPr>
+        <w:t xml:space="preserve">4</w:t>
+      </w:r>
+      <w:r>
+        <w:rPr>
+          <w:sz w:val="22"/>
+          <w:szCs w:val="22"/>
+        </w:rPr>
+        <w:t xml:space="preserve"> ist die Geschwindigkeit – grösser = schneller.</w:t>
+      </w:r>
+    </w:p>
+    <w:p>
+      <w:pPr>
+        <w:pStyle w:val="Heading2"/>
+      </w:pPr>
+      <w:r>
+        <w:t xml:space="preserve">Am Rand anhalten</w:t>
+      </w:r>
+    </w:p>
+    <w:p>
+      <w:pPr>
+        <w:spacing w:after="140"/>
+      </w:pPr>
+      <w:r>
+        <w:rPr>
+          <w:sz w:val="22"/>
+          <w:szCs w:val="22"/>
+        </w:rPr>
+        <w:t xml:space="preserve">Ohne Grenzen würde das Schiff aus dem Bild fliegen. Zwei kurze Prüfungen halten es im Fenster:</w:t>
+      </w:r>
+    </w:p>
+    <w:p>
+      <w:pPr>
+        <w:pBdr>
+          <w:left w:val="single" w:color="1B6CA8" w:sz="18" w:space="6"/>
+        </w:pBdr>
+        <w:shd w:fill="F4F4F4" w:val="clear"/>
+        <w:spacing w:after="160" w:before="80"/>
+        <w:ind w:left="120"/>
+      </w:pPr>
+      <w:r>
+        <w:rPr>
+          <w:rFonts w:ascii="Consolas" w:cs="Consolas" w:eastAsia="Consolas" w:hAnsi="Consolas"/>
+          <w:sz w:val="19"/>
+          <w:szCs w:val="19"/>
+        </w:rPr>
+        <w:t xml:space="preserve">IF shipX &lt; 0 THEN shipX = 0</w:t>
+      </w:r>
+      <w:r>
+        <w:rPr>
+          <w:rFonts w:ascii="Consolas" w:cs="Consolas" w:eastAsia="Consolas" w:hAnsi="Consolas"/>
+          <w:sz w:val="19"/>
+          <w:szCs w:val="19"/>
+        </w:rPr>
+        <w:br/>
+        <w:t xml:space="preserve">IF shipX &gt; 464 THEN shipX = 464</w:t>
+      </w:r>
+    </w:p>
+    <w:p>
+      <w:pPr>
+        <w:spacing w:after="140"/>
+      </w:pPr>
+      <w:r>
+        <w:rPr>
+          <w:sz w:val="22"/>
+          <w:szCs w:val="22"/>
+        </w:rPr>
+        <w:t xml:space="preserve"/>
+      </w:r>
+      <w:r>
+        <w:rPr>
+          <w:rFonts w:ascii="Consolas" w:cs="Consolas" w:eastAsia="Consolas" w:hAnsi="Consolas"/>
+          <w:sz w:val="21"/>
+          <w:szCs w:val="21"/>
+        </w:rPr>
+        <w:t xml:space="preserve">464</w:t>
+      </w:r>
+      <w:r>
+        <w:rPr>
+          <w:sz w:val="22"/>
+          <w:szCs w:val="22"/>
+        </w:rPr>
+        <w:t xml:space="preserve"> ist </w:t>
+      </w:r>
+      <w:r>
+        <w:rPr>
+          <w:rFonts w:ascii="Consolas" w:cs="Consolas" w:eastAsia="Consolas" w:hAnsi="Consolas"/>
+          <w:sz w:val="21"/>
+          <w:szCs w:val="21"/>
+        </w:rPr>
+        <w:t xml:space="preserve">480 - 16</w:t>
+      </w:r>
+      <w:r>
+        <w:rPr>
+          <w:sz w:val="22"/>
+          <w:szCs w:val="22"/>
+        </w:rPr>
+        <w:t xml:space="preserve"> – so bleibt das ganze Schiff sichtbar, auch ganz rechts.</w:t>
+      </w:r>
+    </w:p>
+    <w:p>
+      <w:pPr>
+        <w:pStyle w:val="Heading2"/>
+      </w:pPr>
+      <w:r>
+        <w:t xml:space="preserve">Das ganze Programm</w:t>
+      </w:r>
+    </w:p>
+    <w:p>
+      <w:pPr>
+        <w:spacing w:after="140"/>
+      </w:pPr>
+      <w:r>
+        <w:rPr>
+          <w:sz w:val="22"/>
+          <w:szCs w:val="22"/>
+        </w:rPr>
+        <w:t xml:space="preserve">Zusammengesetzt – auf dem Sternenhimmel aus Kapitel 1:</w:t>
+      </w:r>
+    </w:p>
+    <w:p>
+      <w:pPr>
+        <w:pBdr>
+          <w:left w:val="single" w:color="1B6CA8" w:sz="18" w:space="6"/>
+        </w:pBdr>
+        <w:shd w:fill="F4F4F4" w:val="clear"/>
+        <w:spacing w:after="160" w:before="80"/>
+        <w:ind w:left="120"/>
+      </w:pPr>
+      <w:r>
+        <w:rPr>
+          <w:rFonts w:ascii="Consolas" w:cs="Consolas" w:eastAsia="Consolas" w:hAnsi="Consolas"/>
+          <w:sz w:val="19"/>
+          <w:szCs w:val="19"/>
+        </w:rPr>
+        <w:t xml:space="preserve">SCREEN(480, 640, "Mein Galaga - Kapitel 2")</w:t>
+      </w:r>
+      <w:r>
+        <w:rPr>
+          <w:rFonts w:ascii="Consolas" w:cs="Consolas" w:eastAsia="Consolas" w:hAnsi="Consolas"/>
+          <w:sz w:val="19"/>
+          <w:szCs w:val="19"/>
+        </w:rPr>
+        <w:br/>
+        <w:t xml:space="preserve"/>
+      </w:r>
+      <w:r>
+        <w:rPr>
+          <w:rFonts w:ascii="Consolas" w:cs="Consolas" w:eastAsia="Consolas" w:hAnsi="Consolas"/>
+          <w:sz w:val="19"/>
+          <w:szCs w:val="19"/>
+        </w:rPr>
+        <w:br/>
+        <w:t xml:space="preserve">CONST NSTARS AS INTEGER = 60</w:t>
+      </w:r>
+      <w:r>
+        <w:rPr>
+          <w:rFonts w:ascii="Consolas" w:cs="Consolas" w:eastAsia="Consolas" w:hAnsi="Consolas"/>
+          <w:sz w:val="19"/>
+          <w:szCs w:val="19"/>
+        </w:rPr>
+        <w:br/>
+        <w:t xml:space="preserve">DIM starX[NSTARS] AS INTEGER</w:t>
+      </w:r>
+      <w:r>
+        <w:rPr>
+          <w:rFonts w:ascii="Consolas" w:cs="Consolas" w:eastAsia="Consolas" w:hAnsi="Consolas"/>
+          <w:sz w:val="19"/>
+          <w:szCs w:val="19"/>
+        </w:rPr>
+        <w:br/>
+        <w:t xml:space="preserve">DIM starY[NSTARS] AS INTEGER</w:t>
+      </w:r>
+      <w:r>
+        <w:rPr>
+          <w:rFonts w:ascii="Consolas" w:cs="Consolas" w:eastAsia="Consolas" w:hAnsi="Consolas"/>
+          <w:sz w:val="19"/>
+          <w:szCs w:val="19"/>
+        </w:rPr>
+        <w:br/>
+        <w:t xml:space="preserve">DIM i AS INTEGER</w:t>
+      </w:r>
+      <w:r>
+        <w:rPr>
+          <w:rFonts w:ascii="Consolas" w:cs="Consolas" w:eastAsia="Consolas" w:hAnsi="Consolas"/>
+          <w:sz w:val="19"/>
+          <w:szCs w:val="19"/>
+        </w:rPr>
+        <w:br/>
+        <w:t xml:space="preserve">FOR i = 0 TO NSTARS - 1</w:t>
+      </w:r>
+      <w:r>
+        <w:rPr>
+          <w:rFonts w:ascii="Consolas" w:cs="Consolas" w:eastAsia="Consolas" w:hAnsi="Consolas"/>
+          <w:sz w:val="19"/>
+          <w:szCs w:val="19"/>
+        </w:rPr>
+        <w:br/>
+        <w:t xml:space="preserve">    starX[i] = RANDINT(0, 479)</w:t>
+      </w:r>
+      <w:r>
+        <w:rPr>
+          <w:rFonts w:ascii="Consolas" w:cs="Consolas" w:eastAsia="Consolas" w:hAnsi="Consolas"/>
+          <w:sz w:val="19"/>
+          <w:szCs w:val="19"/>
+        </w:rPr>
+        <w:br/>
+        <w:t xml:space="preserve">    starY[i] = RANDINT(0, 639)</w:t>
+      </w:r>
+      <w:r>
+        <w:rPr>
+          <w:rFonts w:ascii="Consolas" w:cs="Consolas" w:eastAsia="Consolas" w:hAnsi="Consolas"/>
+          <w:sz w:val="19"/>
+          <w:szCs w:val="19"/>
+        </w:rPr>
+        <w:br/>
+        <w:t xml:space="preserve">NEXT i</w:t>
+      </w:r>
+      <w:r>
+        <w:rPr>
+          <w:rFonts w:ascii="Consolas" w:cs="Consolas" w:eastAsia="Consolas" w:hAnsi="Consolas"/>
+          <w:sz w:val="19"/>
+          <w:szCs w:val="19"/>
+        </w:rPr>
+        <w:br/>
+        <w:t xml:space="preserve"/>
+      </w:r>
+      <w:r>
+        <w:rPr>
+          <w:rFonts w:ascii="Consolas" w:cs="Consolas" w:eastAsia="Consolas" w:hAnsi="Consolas"/>
+          <w:sz w:val="19"/>
+          <w:szCs w:val="19"/>
+        </w:rPr>
+        <w:br/>
+        <w:t xml:space="preserve">DIM shipImg AS IMAGE</w:t>
+      </w:r>
+      <w:r>
+        <w:rPr>
+          <w:rFonts w:ascii="Consolas" w:cs="Consolas" w:eastAsia="Consolas" w:hAnsi="Consolas"/>
+          <w:sz w:val="19"/>
+          <w:szCs w:val="19"/>
+        </w:rPr>
+        <w:br/>
+        <w:t xml:space="preserve">shipImg = LOADIMAGE("../../assets/sprites/player.png")</w:t>
+      </w:r>
+      <w:r>
+        <w:rPr>
+          <w:rFonts w:ascii="Consolas" w:cs="Consolas" w:eastAsia="Consolas" w:hAnsi="Consolas"/>
+          <w:sz w:val="19"/>
+          <w:szCs w:val="19"/>
+        </w:rPr>
+        <w:br/>
+        <w:t xml:space="preserve">DIM shipX AS INTEGER : DIM shipY AS INTEGER</w:t>
+      </w:r>
+      <w:r>
+        <w:rPr>
+          <w:rFonts w:ascii="Consolas" w:cs="Consolas" w:eastAsia="Consolas" w:hAnsi="Consolas"/>
+          <w:sz w:val="19"/>
+          <w:szCs w:val="19"/>
+        </w:rPr>
+        <w:br/>
+        <w:t xml:space="preserve">shipX = 232 : shipY = 560</w:t>
+      </w:r>
+      <w:r>
+        <w:rPr>
+          <w:rFonts w:ascii="Consolas" w:cs="Consolas" w:eastAsia="Consolas" w:hAnsi="Consolas"/>
+          <w:sz w:val="19"/>
+          <w:szCs w:val="19"/>
+        </w:rPr>
+        <w:br/>
+        <w:t xml:space="preserve"/>
+      </w:r>
+      <w:r>
+        <w:rPr>
+          <w:rFonts w:ascii="Consolas" w:cs="Consolas" w:eastAsia="Consolas" w:hAnsi="Consolas"/>
+          <w:sz w:val="19"/>
+          <w:szCs w:val="19"/>
+        </w:rPr>
+        <w:br/>
+        <w:t xml:space="preserve">WHILE NOT QUITREQUESTED()</w:t>
+      </w:r>
+      <w:r>
+        <w:rPr>
+          <w:rFonts w:ascii="Consolas" w:cs="Consolas" w:eastAsia="Consolas" w:hAnsi="Consolas"/>
+          <w:sz w:val="19"/>
+          <w:szCs w:val="19"/>
+        </w:rPr>
+        <w:br/>
+        <w:t xml:space="preserve">    CLS(&amp;H05060F)</w:t>
+      </w:r>
+      <w:r>
+        <w:rPr>
+          <w:rFonts w:ascii="Consolas" w:cs="Consolas" w:eastAsia="Consolas" w:hAnsi="Consolas"/>
+          <w:sz w:val="19"/>
+          <w:szCs w:val="19"/>
+        </w:rPr>
+        <w:br/>
+        <w:t xml:space="preserve">    FOR i = 0 TO NSTARS - 1</w:t>
+      </w:r>
+      <w:r>
+        <w:rPr>
+          <w:rFonts w:ascii="Consolas" w:cs="Consolas" w:eastAsia="Consolas" w:hAnsi="Consolas"/>
+          <w:sz w:val="19"/>
+          <w:szCs w:val="19"/>
+        </w:rPr>
+        <w:br/>
+        <w:t xml:space="preserve">        starY[i] = starY[i] + 2</w:t>
+      </w:r>
+      <w:r>
+        <w:rPr>
+          <w:rFonts w:ascii="Consolas" w:cs="Consolas" w:eastAsia="Consolas" w:hAnsi="Consolas"/>
+          <w:sz w:val="19"/>
+          <w:szCs w:val="19"/>
+        </w:rPr>
+        <w:br/>
+        <w:t xml:space="preserve">        IF starY[i] &gt; 639 THEN starY[i] = 0 : starX[i] = RANDINT(0, 479)</w:t>
+      </w:r>
+      <w:r>
+        <w:rPr>
+          <w:rFonts w:ascii="Consolas" w:cs="Consolas" w:eastAsia="Consolas" w:hAnsi="Consolas"/>
+          <w:sz w:val="19"/>
+          <w:szCs w:val="19"/>
+        </w:rPr>
+        <w:br/>
+        <w:t xml:space="preserve">        PLOT(starX[i], starY[i], &amp;HFFFFFF)</w:t>
+      </w:r>
+      <w:r>
+        <w:rPr>
+          <w:rFonts w:ascii="Consolas" w:cs="Consolas" w:eastAsia="Consolas" w:hAnsi="Consolas"/>
+          <w:sz w:val="19"/>
+          <w:szCs w:val="19"/>
+        </w:rPr>
+        <w:br/>
+        <w:t xml:space="preserve">    NEXT i</w:t>
+      </w:r>
+      <w:r>
+        <w:rPr>
+          <w:rFonts w:ascii="Consolas" w:cs="Consolas" w:eastAsia="Consolas" w:hAnsi="Consolas"/>
+          <w:sz w:val="19"/>
+          <w:szCs w:val="19"/>
+        </w:rPr>
+        <w:br/>
+        <w:t xml:space="preserve">    IF KEYPRESSED(KEY_LEFT)  OR KEYPRESSED(KEY_A) THEN shipX = shipX - 4</w:t>
+      </w:r>
+      <w:r>
+        <w:rPr>
+          <w:rFonts w:ascii="Consolas" w:cs="Consolas" w:eastAsia="Consolas" w:hAnsi="Consolas"/>
+          <w:sz w:val="19"/>
+          <w:szCs w:val="19"/>
+        </w:rPr>
+        <w:br/>
+        <w:t xml:space="preserve">    IF KEYPRESSED(KEY_RIGHT) OR KEYPRESSED(KEY_D) THEN shipX = shipX + 4</w:t>
+      </w:r>
+      <w:r>
+        <w:rPr>
+          <w:rFonts w:ascii="Consolas" w:cs="Consolas" w:eastAsia="Consolas" w:hAnsi="Consolas"/>
+          <w:sz w:val="19"/>
+          <w:szCs w:val="19"/>
+        </w:rPr>
+        <w:br/>
+        <w:t xml:space="preserve">    IF shipX &lt; 0 THEN shipX = 0</w:t>
+      </w:r>
+      <w:r>
+        <w:rPr>
+          <w:rFonts w:ascii="Consolas" w:cs="Consolas" w:eastAsia="Consolas" w:hAnsi="Consolas"/>
+          <w:sz w:val="19"/>
+          <w:szCs w:val="19"/>
+        </w:rPr>
+        <w:br/>
+        <w:t xml:space="preserve">    IF shipX &gt; 464 THEN shipX = 464</w:t>
+      </w:r>
+      <w:r>
+        <w:rPr>
+          <w:rFonts w:ascii="Consolas" w:cs="Consolas" w:eastAsia="Consolas" w:hAnsi="Consolas"/>
+          <w:sz w:val="19"/>
+          <w:szCs w:val="19"/>
+        </w:rPr>
+        <w:br/>
+        <w:t xml:space="preserve">    DRAWIMAGE(shipImg, shipX, shipY)</w:t>
+      </w:r>
+      <w:r>
+        <w:rPr>
+          <w:rFonts w:ascii="Consolas" w:cs="Consolas" w:eastAsia="Consolas" w:hAnsi="Consolas"/>
+          <w:sz w:val="19"/>
+          <w:szCs w:val="19"/>
+        </w:rPr>
+        <w:br/>
+        <w:t xml:space="preserve">    FLIP()</w:t>
+      </w:r>
+      <w:r>
+        <w:rPr>
+          <w:rFonts w:ascii="Consolas" w:cs="Consolas" w:eastAsia="Consolas" w:hAnsi="Consolas"/>
+          <w:sz w:val="19"/>
+          <w:szCs w:val="19"/>
+        </w:rPr>
+        <w:br/>
+        <w:t xml:space="preserve">WEND</w:t>
+      </w:r>
+    </w:p>
+    <w:p>
+      <w:pPr>
+        <w:spacing w:after="40" w:before="120"/>
+        <w:jc w:val="center"/>
+      </w:pPr>
+      <w:r>
+        <w:drawing>
+          <wp:inline distT="0" distB="0" distL="0" distR="0">
+            <wp:extent cx="2857500" cy="3810000"/>
+            <wp:effectExtent t="0" r="0" b="0" l="0"/>
+            <wp:docPr id="1" name="kap02_schiff.png" descr="Dein Raumschiff steht startbereit – mit den Pfeiltasten fliegt es nach links und rechts." title="Dein Raumschiff steht startbereit – mit den Pfeiltasten fliegt es nach links und rechts."/>
+            <wp:cNvGraphicFramePr>
+              <a:graphicFrameLocks xmlns:a="http://schemas.openxmlformats.org/drawingml/2006/main" noChangeAspect="1"/>
+            </wp:cNvGraphicFramePr>
+            <a:graphic xmlns:a="http://schemas.openxmlformats.org/drawingml/2006/main">
+              <a:graphicData uri="http://schemas.openxmlformats.org/drawingml/2006/picture">
+                <pic:pic xmlns:pic="http://schemas.openxmlformats.org/drawingml/2006/picture">
+                  <pic:nvPicPr>
+                    <pic:cNvPr id="0" name="" descr=""/>
+                    <pic:cNvPicPr>
+                      <a:picLocks noChangeAspect="1" noChangeArrowheads="1"/>
+                    </pic:cNvPicPr>
+                  </pic:nvPicPr>
+                  <pic:blipFill>
+                    <a:blip r:embed="rId16" cstate="none"/>
+                    <a:srcRect/>
+                    <a:stretch>
+                      <a:fillRect/>
+                    </a:stretch>
+                  </pic:blipFill>
+                  <pic:spPr bwMode="auto">
+                    <a:xfrm>
+                      <a:off x="0" y="0"/>
+                      <a:ext cx="2857500" cy="3810000"/>
+                    </a:xfrm>
+                    <a:prstGeom prst="rect">
+                      <a:avLst/>
+                    </a:prstGeom>
+                  </pic:spPr>
+                </pic:pic>
+              </a:graphicData>
+            </a:graphic>
+          </wp:inline>
+        </w:drawing>
+      </w:r>
+    </w:p>
+    <w:p>
+      <w:pPr>
+        <w:spacing w:after="200"/>
+        <w:jc w:val="center"/>
+      </w:pPr>
+      <w:r>
+        <w:rPr>
+          <w:i/>
+          <w:iCs/>
+          <w:color w:val="6A6A6A"/>
+          <w:sz w:val="18"/>
+          <w:szCs w:val="18"/>
+        </w:rPr>
+        <w:t xml:space="preserve">Dein Raumschiff steht startbereit – mit den Pfeiltasten fliegt es nach links und rechts.</w:t>
+      </w:r>
+    </w:p>
+    <w:p>
+      <w:pPr>
+        <w:pStyle w:val="Heading2"/>
+      </w:pPr>
+      <w:r>
+        <w:t xml:space="preserve">Was du gelernt hast</w:t>
+      </w:r>
+    </w:p>
+    <w:p>
+      <w:pPr>
+        <w:pStyle w:val="ListParagraph"/>
+        <w:numPr>
+          <w:ilvl w:val="0"/>
+          <w:numId w:val="2"/>
+        </w:numPr>
+        <w:spacing w:after="60"/>
+      </w:pPr>
+      <w:r>
+        <w:rPr>
+          <w:b/>
+          <w:bCs/>
+          <w:sz w:val="22"/>
+          <w:szCs w:val="22"/>
+        </w:rPr>
+        <w:t xml:space="preserve">LOADIMAGE </w:t>
+      </w:r>
+      <w:r>
+        <w:rPr>
+          <w:sz w:val="22"/>
+          <w:szCs w:val="22"/>
+        </w:rPr>
+        <w:t xml:space="preserve">lädt ein Bild in eine Variable vom Typ IMAGE (Pfad relativ zur Programmdatei).</w:t>
+      </w:r>
+    </w:p>
+    <w:p>
+      <w:pPr>
+        <w:pStyle w:val="ListParagraph"/>
+        <w:numPr>
+          <w:ilvl w:val="0"/>
+          <w:numId w:val="2"/>
+        </w:numPr>
+        <w:spacing w:after="60"/>
+      </w:pPr>
+      <w:r>
+        <w:rPr>
+          <w:b/>
+          <w:bCs/>
+          <w:sz w:val="22"/>
+          <w:szCs w:val="22"/>
+        </w:rPr>
+        <w:t xml:space="preserve">DRAWIMAGE </w:t>
+      </w:r>
+      <w:r>
+        <w:rPr>
+          <w:sz w:val="22"/>
+          <w:szCs w:val="22"/>
+        </w:rPr>
+        <w:t xml:space="preserve">zeichnet das Bild an einer Position (x, y).</w:t>
+      </w:r>
+    </w:p>
+    <w:p>
+      <w:pPr>
+        <w:pStyle w:val="ListParagraph"/>
+        <w:numPr>
+          <w:ilvl w:val="0"/>
+          <w:numId w:val="2"/>
+        </w:numPr>
+        <w:spacing w:after="60"/>
+      </w:pPr>
+      <w:r>
+        <w:rPr>
+          <w:b/>
+          <w:bCs/>
+          <w:sz w:val="22"/>
+          <w:szCs w:val="22"/>
+        </w:rPr>
+        <w:t xml:space="preserve">KEYPRESSED </w:t>
+      </w:r>
+      <w:r>
+        <w:rPr>
+          <w:sz w:val="22"/>
+          <w:szCs w:val="22"/>
+        </w:rPr>
+        <w:t xml:space="preserve">fragt Tasten ab; mit OR akzeptierst du mehrere Tasten.</w:t>
+      </w:r>
+    </w:p>
+    <w:p>
+      <w:pPr>
+        <w:pStyle w:val="ListParagraph"/>
+        <w:numPr>
+          <w:ilvl w:val="0"/>
+          <w:numId w:val="2"/>
+        </w:numPr>
+        <w:spacing w:after="60"/>
+      </w:pPr>
+      <w:r>
+        <w:rPr>
+          <w:b/>
+          <w:bCs/>
+          <w:sz w:val="22"/>
+          <w:szCs w:val="22"/>
+        </w:rPr>
+        <w:t xml:space="preserve">Grenzen mit IF </w:t>
+      </w:r>
+      <w:r>
+        <w:rPr>
+          <w:sz w:val="22"/>
+          <w:szCs w:val="22"/>
+        </w:rPr>
+        <w:t xml:space="preserve">halten das Schiff im sichtbaren Bereich.</w:t>
+      </w:r>
+    </w:p>
+    <w:p>
+      <w:pPr>
+        <w:pStyle w:val="Heading2"/>
+      </w:pPr>
+      <w:r>
+        <w:t xml:space="preserve">Übung</w:t>
+      </w:r>
+    </w:p>
+    <w:p>
+      <w:pPr>
+        <w:pStyle w:val="ListParagraph"/>
+        <w:numPr>
+          <w:ilvl w:val="0"/>
+          <w:numId w:val="2"/>
+        </w:numPr>
+        <w:spacing w:after="60"/>
+      </w:pPr>
+      <w:r>
+        <w:rPr>
+          <w:sz w:val="22"/>
+          <w:szCs w:val="22"/>
+        </w:rPr>
+        <w:t xml:space="preserve">Mach das Schiff schneller oder langsamer (ändere die 4).</w:t>
+      </w:r>
+    </w:p>
+    <w:p>
+      <w:pPr>
+        <w:pStyle w:val="ListParagraph"/>
+        <w:numPr>
+          <w:ilvl w:val="0"/>
+          <w:numId w:val="2"/>
+        </w:numPr>
+        <w:spacing w:after="60"/>
+      </w:pPr>
+      <w:r>
+        <w:rPr>
+          <w:sz w:val="22"/>
+          <w:szCs w:val="22"/>
+        </w:rPr>
+        <w:t xml:space="preserve">Erlaube auch Bewegung nach oben und unten (KEY_UP / KEY_DOWN, mit shipY) – und begrenze sie.</w:t>
+      </w:r>
+    </w:p>
+    <w:p>
+      <w:pPr>
+        <w:pStyle w:val="ListParagraph"/>
+        <w:numPr>
+          <w:ilvl w:val="0"/>
+          <w:numId w:val="2"/>
+        </w:numPr>
+        <w:spacing w:after="60"/>
+      </w:pPr>
+      <w:r>
+        <w:rPr>
+          <w:sz w:val="22"/>
+          <w:szCs w:val="22"/>
+        </w:rPr>
+        <w:t xml:space="preserve">Setze das Schiff an eine andere Startposition.</w:t>
       </w:r>
     </w:p>
     <w:sectPr>

</xml_diff>

<commit_message>
docs(buch-galaga): Kapitel 3 "Sprites selbst zeichnen" (gbsprites)
Werkzeug-Kapitel zum Pixel-Editor gbsprites: was ein Sprite ist (Pixel-Raster),
Werkzeuge (Stift/Radierer/Fueller/Pipette/Symmetrie), Schiff zeichnen (nummerierte
Schritte), Animation mit 2 Frames + Onion-Skin, Export (.gbsprite + PNG/Sheet),
im Spiel via LOADIMAGE/DRAWIMAGE. Lehr-Bilder per PIL erzeugt (Pixel-Raster des
Schiffs, 2 Frames nebeneinander, Sprite-Uebersicht). num3-Numbering ergaenzt.
docx validiert (PASSED), 15 Seiten, visuell geprueft.

Co-Authored-By: Claude Opus 4.8 <noreply@anthropic.com>
</commit_message>
<xml_diff>
--- a/buch-galaga/buch/GameBasic-Buch.docx
+++ b/buch-galaga/buch/GameBasic-Buch.docx
@@ -3642,6 +3642,998 @@
         <w:t xml:space="preserve">Setze das Schiff an eine andere Startposition.</w:t>
       </w:r>
     </w:p>
+    <w:p>
+      <w:r>
+        <w:br w:type="page"/>
+      </w:r>
+    </w:p>
+    <w:p>
+      <w:pPr>
+        <w:pStyle w:val="Heading1"/>
+        <w:pBdr>
+          <w:bottom w:val="single" w:color="1B6CA8" w:sz="12" w:space="4"/>
+        </w:pBdr>
+        <w:spacing w:after="80" w:before="320"/>
+      </w:pPr>
+      <w:r>
+        <w:t xml:space="preserve">Kapitel 3: Sprites selbst zeichnen</w:t>
+      </w:r>
+    </w:p>
+    <w:tbl>
+      <w:tblPr>
+        <w:tblW w:type="dxa" w:w="9360"/>
+        <w:tblBorders>
+          <w:top w:val="single" w:color="auto" w:sz="4"/>
+          <w:left w:val="single" w:color="auto" w:sz="4"/>
+          <w:bottom w:val="single" w:color="auto" w:sz="4"/>
+          <w:right w:val="single" w:color="auto" w:sz="4"/>
+          <w:insideH w:val="single" w:color="auto" w:sz="4"/>
+          <w:insideV w:val="single" w:color="auto" w:sz="4"/>
+        </w:tblBorders>
+      </w:tblPr>
+      <w:tblGrid>
+        <w:gridCol w:w="9360"/>
+      </w:tblGrid>
+      <w:tr>
+        <w:tc>
+          <w:tcPr>
+            <w:tcW w:type="dxa" w:w="9360"/>
+            <w:tcBorders>
+              <w:top w:val="single" w:color="9CC8E6" w:sz="6"/>
+              <w:left w:val="single" w:color="9CC8E6" w:sz="6"/>
+              <w:bottom w:val="single" w:color="9CC8E6" w:sz="6"/>
+              <w:right w:val="single" w:color="9CC8E6" w:sz="6"/>
+            </w:tcBorders>
+            <w:shd w:fill="E7F2FA" w:val="clear"/>
+            <w:tcMar>
+              <w:top w:type="dxa" w:w="120"/>
+              <w:left w:type="dxa" w:w="160"/>
+              <w:bottom w:type="dxa" w:w="120"/>
+              <w:right w:type="dxa" w:w="160"/>
+            </w:tcMar>
+          </w:tcPr>
+          <w:p>
+            <w:pPr>
+              <w:spacing w:after="40"/>
+            </w:pPr>
+            <w:r>
+              <w:rPr>
+                <w:b/>
+                <w:bCs/>
+                <w:color w:val="1B6CA8"/>
+                <w:sz w:val="22"/>
+                <w:szCs w:val="22"/>
+              </w:rPr>
+              <w:t xml:space="preserve">In diesem Kapitel</w:t>
+            </w:r>
+          </w:p>
+          <w:p>
+            <w:r>
+              <w:rPr>
+                <w:sz w:val="22"/>
+                <w:szCs w:val="22"/>
+              </w:rPr>
+              <w:t xml:space="preserve">Du lernst den mitgelieferten Pixel-Editor gbsprites kennen und zeichnest deine eigene Grafik: das Raumschiff und einen Gegner mit Flügelschlag-Animation. Wer lieber sofort weiterprogrammiert, nimmt einfach die fertigen Sprites aus dem assets-Ordner – beides funktioniert.</w:t>
+            </w:r>
+          </w:p>
+        </w:tc>
+      </w:tr>
+    </w:tbl>
+    <w:p>
+      <w:pPr>
+        <w:pStyle w:val="Heading2"/>
+      </w:pPr>
+      <w:r>
+        <w:t xml:space="preserve">Was ist ein Sprite?</w:t>
+      </w:r>
+    </w:p>
+    <w:p>
+      <w:pPr>
+        <w:spacing w:after="140"/>
+      </w:pPr>
+      <w:r>
+        <w:rPr>
+          <w:sz w:val="22"/>
+          <w:szCs w:val="22"/>
+        </w:rPr>
+        <w:t xml:space="preserve">Ein Sprite ist ein kleines Bild aus einzelnen farbigen Pixeln – wie kariertes Papier, bei dem jedes Kästchen eine Farbe bekommt. Unser Schiff ist nur 16 × 16 Pixel gross. Stark vergrössert sieht man die einzelnen Pixel deutlich:</w:t>
+      </w:r>
+    </w:p>
+    <w:p>
+      <w:pPr>
+        <w:spacing w:after="40" w:before="120"/>
+        <w:jc w:val="center"/>
+      </w:pPr>
+      <w:r>
+        <w:drawing>
+          <wp:inline distT="0" distB="0" distL="0" distR="0">
+            <wp:extent cx="2667000" cy="2667000"/>
+            <wp:effectExtent t="0" r="0" b="0" l="0"/>
+            <wp:docPr id="1" name="kap03_pixelraster.png" descr="Das Raumschiff als Pixel-Raster – jedes Kästchen ist ein Pixel." title="Das Raumschiff als Pixel-Raster – jedes Kästchen ist ein Pixel."/>
+            <wp:cNvGraphicFramePr>
+              <a:graphicFrameLocks xmlns:a="http://schemas.openxmlformats.org/drawingml/2006/main" noChangeAspect="1"/>
+            </wp:cNvGraphicFramePr>
+            <a:graphic xmlns:a="http://schemas.openxmlformats.org/drawingml/2006/main">
+              <a:graphicData uri="http://schemas.openxmlformats.org/drawingml/2006/picture">
+                <pic:pic xmlns:pic="http://schemas.openxmlformats.org/drawingml/2006/picture">
+                  <pic:nvPicPr>
+                    <pic:cNvPr id="0" name="" descr=""/>
+                    <pic:cNvPicPr>
+                      <a:picLocks noChangeAspect="1" noChangeArrowheads="1"/>
+                    </pic:cNvPicPr>
+                  </pic:nvPicPr>
+                  <pic:blipFill>
+                    <a:blip r:embed="rId17" cstate="none"/>
+                    <a:srcRect/>
+                    <a:stretch>
+                      <a:fillRect/>
+                    </a:stretch>
+                  </pic:blipFill>
+                  <pic:spPr bwMode="auto">
+                    <a:xfrm>
+                      <a:off x="0" y="0"/>
+                      <a:ext cx="2667000" cy="2667000"/>
+                    </a:xfrm>
+                    <a:prstGeom prst="rect">
+                      <a:avLst/>
+                    </a:prstGeom>
+                  </pic:spPr>
+                </pic:pic>
+              </a:graphicData>
+            </a:graphic>
+          </wp:inline>
+        </w:drawing>
+      </w:r>
+    </w:p>
+    <w:p>
+      <w:pPr>
+        <w:spacing w:after="200"/>
+        <w:jc w:val="center"/>
+      </w:pPr>
+      <w:r>
+        <w:rPr>
+          <w:i/>
+          <w:iCs/>
+          <w:color w:val="6A6A6A"/>
+          <w:sz w:val="18"/>
+          <w:szCs w:val="18"/>
+        </w:rPr>
+        <w:t xml:space="preserve">Das Raumschiff als Pixel-Raster – jedes Kästchen ist ein Pixel.</w:t>
+      </w:r>
+    </w:p>
+    <w:p>
+      <w:pPr>
+        <w:pStyle w:val="Heading2"/>
+      </w:pPr>
+      <w:r>
+        <w:t xml:space="preserve">Der Sprite-Editor gbsprites</w:t>
+      </w:r>
+    </w:p>
+    <w:p>
+      <w:pPr>
+        <w:spacing w:after="140"/>
+      </w:pPr>
+      <w:r>
+        <w:rPr>
+          <w:sz w:val="22"/>
+          <w:szCs w:val="22"/>
+        </w:rPr>
+        <w:t xml:space="preserve">GameBasic bringt einen eigenen Pixel-Editor mit. Du startest ihn mit dem Befehl </w:t>
+      </w:r>
+      <w:r>
+        <w:rPr>
+          <w:rFonts w:ascii="Consolas" w:cs="Consolas" w:eastAsia="Consolas" w:hAnsi="Consolas"/>
+          <w:sz w:val="21"/>
+          <w:szCs w:val="21"/>
+        </w:rPr>
+        <w:t xml:space="preserve">gbsprites</w:t>
+      </w:r>
+      <w:r>
+        <w:rPr>
+          <w:sz w:val="22"/>
+          <w:szCs w:val="22"/>
+        </w:rPr>
+        <w:t xml:space="preserve"> – entweder leer für ein neues Bild oder mit einer Datei: </w:t>
+      </w:r>
+      <w:r>
+        <w:rPr>
+          <w:rFonts w:ascii="Consolas" w:cs="Consolas" w:eastAsia="Consolas" w:hAnsi="Consolas"/>
+          <w:sz w:val="21"/>
+          <w:szCs w:val="21"/>
+        </w:rPr>
+        <w:t xml:space="preserve">gbsprites player.png</w:t>
+      </w:r>
+      <w:r>
+        <w:rPr>
+          <w:sz w:val="22"/>
+          <w:szCs w:val="22"/>
+        </w:rPr>
+        <w:t xml:space="preserve">.</w:t>
+      </w:r>
+    </w:p>
+    <w:p>
+      <w:pPr>
+        <w:spacing w:after="140"/>
+      </w:pPr>
+      <w:r>
+        <w:rPr>
+          <w:sz w:val="22"/>
+          <w:szCs w:val="22"/>
+        </w:rPr>
+        <w:t xml:space="preserve">Die wichtigsten Werkzeuge:</w:t>
+      </w:r>
+    </w:p>
+    <w:p>
+      <w:pPr>
+        <w:pStyle w:val="ListParagraph"/>
+        <w:numPr>
+          <w:ilvl w:val="0"/>
+          <w:numId w:val="2"/>
+        </w:numPr>
+        <w:spacing w:after="60"/>
+      </w:pPr>
+      <w:r>
+        <w:rPr>
+          <w:b/>
+          <w:bCs/>
+          <w:sz w:val="22"/>
+          <w:szCs w:val="22"/>
+        </w:rPr>
+        <w:t xml:space="preserve">Stift </w:t>
+      </w:r>
+      <w:r>
+        <w:rPr>
+          <w:sz w:val="22"/>
+          <w:szCs w:val="22"/>
+        </w:rPr>
+        <w:t xml:space="preserve">setzt einzelne Pixel in der gewählten Farbe.</w:t>
+      </w:r>
+    </w:p>
+    <w:p>
+      <w:pPr>
+        <w:pStyle w:val="ListParagraph"/>
+        <w:numPr>
+          <w:ilvl w:val="0"/>
+          <w:numId w:val="2"/>
+        </w:numPr>
+        <w:spacing w:after="60"/>
+      </w:pPr>
+      <w:r>
+        <w:rPr>
+          <w:b/>
+          <w:bCs/>
+          <w:sz w:val="22"/>
+          <w:szCs w:val="22"/>
+        </w:rPr>
+        <w:t xml:space="preserve">Radierer </w:t>
+      </w:r>
+      <w:r>
+        <w:rPr>
+          <w:sz w:val="22"/>
+          <w:szCs w:val="22"/>
+        </w:rPr>
+        <w:t xml:space="preserve">löscht Pixel (macht sie durchsichtig).</w:t>
+      </w:r>
+    </w:p>
+    <w:p>
+      <w:pPr>
+        <w:pStyle w:val="ListParagraph"/>
+        <w:numPr>
+          <w:ilvl w:val="0"/>
+          <w:numId w:val="2"/>
+        </w:numPr>
+        <w:spacing w:after="60"/>
+      </w:pPr>
+      <w:r>
+        <w:rPr>
+          <w:b/>
+          <w:bCs/>
+          <w:sz w:val="22"/>
+          <w:szCs w:val="22"/>
+        </w:rPr>
+        <w:t xml:space="preserve">Füller (Eimer) </w:t>
+      </w:r>
+      <w:r>
+        <w:rPr>
+          <w:sz w:val="22"/>
+          <w:szCs w:val="22"/>
+        </w:rPr>
+        <w:t xml:space="preserve">füllt eine zusammenhängende Fläche.</w:t>
+      </w:r>
+    </w:p>
+    <w:p>
+      <w:pPr>
+        <w:pStyle w:val="ListParagraph"/>
+        <w:numPr>
+          <w:ilvl w:val="0"/>
+          <w:numId w:val="2"/>
+        </w:numPr>
+        <w:spacing w:after="60"/>
+      </w:pPr>
+      <w:r>
+        <w:rPr>
+          <w:b/>
+          <w:bCs/>
+          <w:sz w:val="22"/>
+          <w:szCs w:val="22"/>
+        </w:rPr>
+        <w:t xml:space="preserve">Pipette </w:t>
+      </w:r>
+      <w:r>
+        <w:rPr>
+          <w:sz w:val="22"/>
+          <w:szCs w:val="22"/>
+        </w:rPr>
+        <w:t xml:space="preserve">übernimmt eine Farbe aus dem Bild.</w:t>
+      </w:r>
+    </w:p>
+    <w:p>
+      <w:pPr>
+        <w:pStyle w:val="ListParagraph"/>
+        <w:numPr>
+          <w:ilvl w:val="0"/>
+          <w:numId w:val="2"/>
+        </w:numPr>
+        <w:spacing w:after="60"/>
+      </w:pPr>
+      <w:r>
+        <w:rPr>
+          <w:b/>
+          <w:bCs/>
+          <w:sz w:val="22"/>
+          <w:szCs w:val="22"/>
+        </w:rPr>
+        <w:t xml:space="preserve">Palette </w:t>
+      </w:r>
+      <w:r>
+        <w:rPr>
+          <w:sz w:val="22"/>
+          <w:szCs w:val="22"/>
+        </w:rPr>
+        <w:t xml:space="preserve">deine Farbauswahl – Klick wählt die aktive Farbe.</w:t>
+      </w:r>
+    </w:p>
+    <w:p>
+      <w:pPr>
+        <w:pStyle w:val="ListParagraph"/>
+        <w:numPr>
+          <w:ilvl w:val="0"/>
+          <w:numId w:val="2"/>
+        </w:numPr>
+        <w:spacing w:after="60"/>
+      </w:pPr>
+      <w:r>
+        <w:rPr>
+          <w:b/>
+          <w:bCs/>
+          <w:sz w:val="22"/>
+          <w:szCs w:val="22"/>
+        </w:rPr>
+        <w:t xml:space="preserve">Symmetrie X </w:t>
+      </w:r>
+      <w:r>
+        <w:rPr>
+          <w:sz w:val="22"/>
+          <w:szCs w:val="22"/>
+        </w:rPr>
+        <w:t xml:space="preserve">spiegelt deine Striche links/rechts – ideal für ein symmetrisches Raumschiff: du zeichnest nur die Hälfte.</w:t>
+      </w:r>
+    </w:p>
+    <w:p>
+      <w:pPr>
+        <w:pStyle w:val="Heading2"/>
+      </w:pPr>
+      <w:r>
+        <w:t xml:space="preserve">Das Schiff zeichnen</w:t>
+      </w:r>
+    </w:p>
+    <w:p>
+      <w:pPr>
+        <w:spacing w:after="140"/>
+      </w:pPr>
+      <w:r>
+        <w:rPr>
+          <w:sz w:val="22"/>
+          <w:szCs w:val="22"/>
+        </w:rPr>
+        <w:t xml:space="preserve">So gehst du vor:</w:t>
+      </w:r>
+    </w:p>
+    <w:p>
+      <w:pPr>
+        <w:pStyle w:val="ListParagraph"/>
+        <w:numPr>
+          <w:ilvl w:val="0"/>
+          <w:numId w:val="3"/>
+        </w:numPr>
+        <w:spacing w:after="60"/>
+      </w:pPr>
+      <w:r>
+        <w:rPr>
+          <w:sz w:val="22"/>
+          <w:szCs w:val="22"/>
+        </w:rPr>
+        <w:t xml:space="preserve">Neues Bild mit 16 × 16 Pixeln anlegen.</w:t>
+      </w:r>
+    </w:p>
+    <w:p>
+      <w:pPr>
+        <w:pStyle w:val="ListParagraph"/>
+        <w:numPr>
+          <w:ilvl w:val="0"/>
+          <w:numId w:val="3"/>
+        </w:numPr>
+        <w:spacing w:after="60"/>
+      </w:pPr>
+      <w:r>
+        <w:rPr>
+          <w:sz w:val="22"/>
+          <w:szCs w:val="22"/>
+        </w:rPr>
+        <w:t xml:space="preserve">Symmetrie X einschalten – dann genügt es, die linke Hälfte zu malen.</w:t>
+      </w:r>
+    </w:p>
+    <w:p>
+      <w:pPr>
+        <w:pStyle w:val="ListParagraph"/>
+        <w:numPr>
+          <w:ilvl w:val="0"/>
+          <w:numId w:val="3"/>
+        </w:numPr>
+        <w:spacing w:after="60"/>
+      </w:pPr>
+      <w:r>
+        <w:rPr>
+          <w:sz w:val="22"/>
+          <w:szCs w:val="22"/>
+        </w:rPr>
+        <w:t xml:space="preserve">Mit dem Stift die Umrisse (hell) setzen, dann den Rumpf (blau) füllen.</w:t>
+      </w:r>
+    </w:p>
+    <w:p>
+      <w:pPr>
+        <w:pStyle w:val="ListParagraph"/>
+        <w:numPr>
+          <w:ilvl w:val="0"/>
+          <w:numId w:val="3"/>
+        </w:numPr>
+        <w:spacing w:after="60"/>
+      </w:pPr>
+      <w:r>
+        <w:rPr>
+          <w:sz w:val="22"/>
+          <w:szCs w:val="22"/>
+        </w:rPr>
+        <w:t xml:space="preserve">Ein gelbes Cockpit in die Mitte, rote Triebwerke nach unten – fertig.</w:t>
+      </w:r>
+    </w:p>
+    <w:tbl>
+      <w:tblPr>
+        <w:tblW w:type="dxa" w:w="9360"/>
+        <w:tblBorders>
+          <w:top w:val="single" w:color="auto" w:sz="4"/>
+          <w:left w:val="single" w:color="auto" w:sz="4"/>
+          <w:bottom w:val="single" w:color="auto" w:sz="4"/>
+          <w:right w:val="single" w:color="auto" w:sz="4"/>
+          <w:insideH w:val="single" w:color="auto" w:sz="4"/>
+          <w:insideV w:val="single" w:color="auto" w:sz="4"/>
+        </w:tblBorders>
+      </w:tblPr>
+      <w:tblGrid>
+        <w:gridCol w:w="9360"/>
+      </w:tblGrid>
+      <w:tr>
+        <w:tc>
+          <w:tcPr>
+            <w:tcW w:type="dxa" w:w="9360"/>
+            <w:tcBorders>
+              <w:top w:val="single" w:color="9CC8E6" w:sz="6"/>
+              <w:left w:val="single" w:color="9CC8E6" w:sz="6"/>
+              <w:bottom w:val="single" w:color="9CC8E6" w:sz="6"/>
+              <w:right w:val="single" w:color="9CC8E6" w:sz="6"/>
+            </w:tcBorders>
+            <w:shd w:fill="E7F2FA" w:val="clear"/>
+            <w:tcMar>
+              <w:top w:type="dxa" w:w="120"/>
+              <w:left w:type="dxa" w:w="160"/>
+              <w:bottom w:type="dxa" w:w="120"/>
+              <w:right w:type="dxa" w:w="160"/>
+            </w:tcMar>
+          </w:tcPr>
+          <w:p>
+            <w:pPr>
+              <w:spacing w:after="40"/>
+            </w:pPr>
+            <w:r>
+              <w:rPr>
+                <w:b/>
+                <w:bCs/>
+                <w:color w:val="1B6CA8"/>
+                <w:sz w:val="22"/>
+                <w:szCs w:val="22"/>
+              </w:rPr>
+              <w:t xml:space="preserve">Tipp</w:t>
+            </w:r>
+          </w:p>
+          <w:p>
+            <w:r>
+              <w:rPr>
+                <w:sz w:val="22"/>
+                <w:szCs w:val="22"/>
+              </w:rPr>
+              <w:t xml:space="preserve">Weniger ist mehr: Bei 16 × 16 Pixeln zählt jedes Kästchen. Wenige klare Farben wirken besser als viele Details.</w:t>
+            </w:r>
+          </w:p>
+        </w:tc>
+      </w:tr>
+    </w:tbl>
+    <w:p>
+      <w:pPr>
+        <w:pStyle w:val="Heading2"/>
+      </w:pPr>
+      <w:r>
+        <w:t xml:space="preserve">Animation mit Frames</w:t>
+      </w:r>
+    </w:p>
+    <w:p>
+      <w:pPr>
+        <w:spacing w:after="140"/>
+      </w:pPr>
+      <w:r>
+        <w:rPr>
+          <w:sz w:val="22"/>
+          <w:szCs w:val="22"/>
+        </w:rPr>
+        <w:t xml:space="preserve">Ein Gegner wirkt lebendig, wenn er mit den Flügeln schlägt. Dafür zeichnest du mehrere Einzelbilder, sogenannte Frames, und das Spiel zeigt sie schnell nacheinander. Unser Gegner braucht nur zwei Frames – Flügel oben, Flügel unten:</w:t>
+      </w:r>
+    </w:p>
+    <w:p>
+      <w:pPr>
+        <w:spacing w:after="40" w:before="120"/>
+        <w:jc w:val="center"/>
+      </w:pPr>
+      <w:r>
+        <w:drawing>
+          <wp:inline distT="0" distB="0" distL="0" distR="0">
+            <wp:extent cx="3429000" cy="1866900"/>
+            <wp:effectExtent t="0" r="0" b="0" l="0"/>
+            <wp:docPr id="1" name="kap03_frames.png" descr="Zwei Frames ergeben den Flügelschlag – schnell abgewechselt wirkt es wie Bewegung." title="Zwei Frames ergeben den Flügelschlag – schnell abgewechselt wirkt es wie Bewegung."/>
+            <wp:cNvGraphicFramePr>
+              <a:graphicFrameLocks xmlns:a="http://schemas.openxmlformats.org/drawingml/2006/main" noChangeAspect="1"/>
+            </wp:cNvGraphicFramePr>
+            <a:graphic xmlns:a="http://schemas.openxmlformats.org/drawingml/2006/main">
+              <a:graphicData uri="http://schemas.openxmlformats.org/drawingml/2006/picture">
+                <pic:pic xmlns:pic="http://schemas.openxmlformats.org/drawingml/2006/picture">
+                  <pic:nvPicPr>
+                    <pic:cNvPr id="0" name="" descr=""/>
+                    <pic:cNvPicPr>
+                      <a:picLocks noChangeAspect="1" noChangeArrowheads="1"/>
+                    </pic:cNvPicPr>
+                  </pic:nvPicPr>
+                  <pic:blipFill>
+                    <a:blip r:embed="rId18" cstate="none"/>
+                    <a:srcRect/>
+                    <a:stretch>
+                      <a:fillRect/>
+                    </a:stretch>
+                  </pic:blipFill>
+                  <pic:spPr bwMode="auto">
+                    <a:xfrm>
+                      <a:off x="0" y="0"/>
+                      <a:ext cx="3429000" cy="1866900"/>
+                    </a:xfrm>
+                    <a:prstGeom prst="rect">
+                      <a:avLst/>
+                    </a:prstGeom>
+                  </pic:spPr>
+                </pic:pic>
+              </a:graphicData>
+            </a:graphic>
+          </wp:inline>
+        </w:drawing>
+      </w:r>
+    </w:p>
+    <w:p>
+      <w:pPr>
+        <w:spacing w:after="200"/>
+        <w:jc w:val="center"/>
+      </w:pPr>
+      <w:r>
+        <w:rPr>
+          <w:i/>
+          <w:iCs/>
+          <w:color w:val="6A6A6A"/>
+          <w:sz w:val="18"/>
+          <w:szCs w:val="18"/>
+        </w:rPr>
+        <w:t xml:space="preserve">Zwei Frames ergeben den Flügelschlag – schnell abgewechselt wirkt es wie Bewegung.</w:t>
+      </w:r>
+    </w:p>
+    <w:p>
+      <w:pPr>
+        <w:spacing w:after="140"/>
+      </w:pPr>
+      <w:r>
+        <w:rPr>
+          <w:sz w:val="22"/>
+          <w:szCs w:val="22"/>
+        </w:rPr>
+        <w:t xml:space="preserve">Im Editor legst du über die Frame-Liste ein zweites Bild an. Die </w:t>
+      </w:r>
+      <w:r>
+        <w:rPr>
+          <w:sz w:val="22"/>
+          <w:szCs w:val="22"/>
+        </w:rPr>
+        <w:t xml:space="preserve">Zwiebelschalen-Ansicht</w:t>
+      </w:r>
+      <w:r>
+        <w:rPr>
+          <w:sz w:val="22"/>
+          <w:szCs w:val="22"/>
+        </w:rPr>
+        <w:t xml:space="preserve"> (Onion-Skin) zeigt das vorige Frame blass im Hintergrund – so triffst du die Bewegung leichter.</w:t>
+      </w:r>
+    </w:p>
+    <w:p>
+      <w:pPr>
+        <w:pStyle w:val="Heading2"/>
+      </w:pPr>
+      <w:r>
+        <w:t xml:space="preserve">Speichern und exportieren</w:t>
+      </w:r>
+    </w:p>
+    <w:p>
+      <w:pPr>
+        <w:spacing w:after="140"/>
+      </w:pPr>
+      <w:r>
+        <w:rPr>
+          <w:sz w:val="22"/>
+          <w:szCs w:val="22"/>
+        </w:rPr>
+        <w:t xml:space="preserve">Speichere dein Werk als </w:t>
+      </w:r>
+      <w:r>
+        <w:rPr>
+          <w:rFonts w:ascii="Consolas" w:cs="Consolas" w:eastAsia="Consolas" w:hAnsi="Consolas"/>
+          <w:sz w:val="21"/>
+          <w:szCs w:val="21"/>
+        </w:rPr>
+        <w:t xml:space="preserve">.gbsprite</w:t>
+      </w:r>
+      <w:r>
+        <w:rPr>
+          <w:sz w:val="22"/>
+          <w:szCs w:val="22"/>
+        </w:rPr>
+        <w:t xml:space="preserve"> – so kannst du es später weiter bearbeiten (mit allen Frames). Fürs Spiel exportierst du zusätzlich ein </w:t>
+      </w:r>
+      <w:r>
+        <w:rPr>
+          <w:rFonts w:ascii="Consolas" w:cs="Consolas" w:eastAsia="Consolas" w:hAnsi="Consolas"/>
+          <w:sz w:val="21"/>
+          <w:szCs w:val="21"/>
+        </w:rPr>
+        <w:t xml:space="preserve">PNG</w:t>
+      </w:r>
+      <w:r>
+        <w:rPr>
+          <w:sz w:val="22"/>
+          <w:szCs w:val="22"/>
+        </w:rPr>
+        <w:t xml:space="preserve">: ein einzelnes Bild beim Schiff, oder bei mehreren Frames ein </w:t>
+      </w:r>
+      <w:r>
+        <w:rPr>
+          <w:sz w:val="22"/>
+          <w:szCs w:val="22"/>
+        </w:rPr>
+        <w:t xml:space="preserve">Sheet</w:t>
+      </w:r>
+      <w:r>
+        <w:rPr>
+          <w:sz w:val="22"/>
+          <w:szCs w:val="22"/>
+        </w:rPr>
+        <w:t xml:space="preserve"> (alle Frames nebeneinander in einem Bild).</w:t>
+      </w:r>
+    </w:p>
+    <w:p>
+      <w:pPr>
+        <w:spacing w:after="140"/>
+      </w:pPr>
+      <w:r>
+        <w:rPr>
+          <w:sz w:val="22"/>
+          <w:szCs w:val="22"/>
+        </w:rPr>
+        <w:t xml:space="preserve">Genau diese PNGs liegen schon fertig im Projekt – das sind die Sprites, die wir verwenden:</w:t>
+      </w:r>
+    </w:p>
+    <w:p>
+      <w:pPr>
+        <w:spacing w:after="40" w:before="120"/>
+        <w:jc w:val="center"/>
+      </w:pPr>
+      <w:r>
+        <w:drawing>
+          <wp:inline distT="0" distB="0" distL="0" distR="0">
+            <wp:extent cx="4381500" cy="590550"/>
+            <wp:effectExtent t="0" r="0" b="0" l="0"/>
+            <wp:docPr id="1" name="kap03_alle_sprites.png" descr="Unsere Sprites: Schiff, drei Gegner (je 2 Frames), Schuss und Bombe." title="Unsere Sprites: Schiff, drei Gegner (je 2 Frames), Schuss und Bombe."/>
+            <wp:cNvGraphicFramePr>
+              <a:graphicFrameLocks xmlns:a="http://schemas.openxmlformats.org/drawingml/2006/main" noChangeAspect="1"/>
+            </wp:cNvGraphicFramePr>
+            <a:graphic xmlns:a="http://schemas.openxmlformats.org/drawingml/2006/main">
+              <a:graphicData uri="http://schemas.openxmlformats.org/drawingml/2006/picture">
+                <pic:pic xmlns:pic="http://schemas.openxmlformats.org/drawingml/2006/picture">
+                  <pic:nvPicPr>
+                    <pic:cNvPr id="0" name="" descr=""/>
+                    <pic:cNvPicPr>
+                      <a:picLocks noChangeAspect="1" noChangeArrowheads="1"/>
+                    </pic:cNvPicPr>
+                  </pic:nvPicPr>
+                  <pic:blipFill>
+                    <a:blip r:embed="rId19" cstate="none"/>
+                    <a:srcRect/>
+                    <a:stretch>
+                      <a:fillRect/>
+                    </a:stretch>
+                  </pic:blipFill>
+                  <pic:spPr bwMode="auto">
+                    <a:xfrm>
+                      <a:off x="0" y="0"/>
+                      <a:ext cx="4381500" cy="590550"/>
+                    </a:xfrm>
+                    <a:prstGeom prst="rect">
+                      <a:avLst/>
+                    </a:prstGeom>
+                  </pic:spPr>
+                </pic:pic>
+              </a:graphicData>
+            </a:graphic>
+          </wp:inline>
+        </w:drawing>
+      </w:r>
+    </w:p>
+    <w:p>
+      <w:pPr>
+        <w:spacing w:after="200"/>
+        <w:jc w:val="center"/>
+      </w:pPr>
+      <w:r>
+        <w:rPr>
+          <w:i/>
+          <w:iCs/>
+          <w:color w:val="6A6A6A"/>
+          <w:sz w:val="18"/>
+          <w:szCs w:val="18"/>
+        </w:rPr>
+        <w:t xml:space="preserve">Unsere Sprites: Schiff, drei Gegner (je 2 Frames), Schuss und Bombe.</w:t>
+      </w:r>
+    </w:p>
+    <w:p>
+      <w:pPr>
+        <w:pStyle w:val="Heading2"/>
+      </w:pPr>
+      <w:r>
+        <w:t xml:space="preserve">Im Spiel verwenden</w:t>
+      </w:r>
+    </w:p>
+    <w:p>
+      <w:pPr>
+        <w:spacing w:after="140"/>
+      </w:pPr>
+      <w:r>
+        <w:rPr>
+          <w:sz w:val="22"/>
+          <w:szCs w:val="22"/>
+        </w:rPr>
+        <w:t xml:space="preserve">Im Spiel lädst du dein PNG genau wie in Kapitel 2 mit </w:t>
+      </w:r>
+      <w:r>
+        <w:rPr>
+          <w:rFonts w:ascii="Consolas" w:cs="Consolas" w:eastAsia="Consolas" w:hAnsi="Consolas"/>
+          <w:sz w:val="21"/>
+          <w:szCs w:val="21"/>
+        </w:rPr>
+        <w:t xml:space="preserve">LOADIMAGE</w:t>
+      </w:r>
+      <w:r>
+        <w:rPr>
+          <w:sz w:val="22"/>
+          <w:szCs w:val="22"/>
+        </w:rPr>
+        <w:t xml:space="preserve"> und zeichnest es mit </w:t>
+      </w:r>
+      <w:r>
+        <w:rPr>
+          <w:rFonts w:ascii="Consolas" w:cs="Consolas" w:eastAsia="Consolas" w:hAnsi="Consolas"/>
+          <w:sz w:val="21"/>
+          <w:szCs w:val="21"/>
+        </w:rPr>
+        <w:t xml:space="preserve">DRAWIMAGE</w:t>
+      </w:r>
+      <w:r>
+        <w:rPr>
+          <w:sz w:val="22"/>
+          <w:szCs w:val="22"/>
+        </w:rPr>
+        <w:t xml:space="preserve">. Zeichnest du das Schiff um, ändert sich sofort dein Spiel – ohne eine Zeile Code anzufassen.</w:t>
+      </w:r>
+    </w:p>
+    <w:p>
+      <w:pPr>
+        <w:pStyle w:val="Heading2"/>
+      </w:pPr>
+      <w:r>
+        <w:t xml:space="preserve">Was du gelernt hast</w:t>
+      </w:r>
+    </w:p>
+    <w:p>
+      <w:pPr>
+        <w:pStyle w:val="ListParagraph"/>
+        <w:numPr>
+          <w:ilvl w:val="0"/>
+          <w:numId w:val="2"/>
+        </w:numPr>
+        <w:spacing w:after="60"/>
+      </w:pPr>
+      <w:r>
+        <w:rPr>
+          <w:b/>
+          <w:bCs/>
+          <w:sz w:val="22"/>
+          <w:szCs w:val="22"/>
+        </w:rPr>
+        <w:t xml:space="preserve">Sprite </w:t>
+      </w:r>
+      <w:r>
+        <w:rPr>
+          <w:sz w:val="22"/>
+          <w:szCs w:val="22"/>
+        </w:rPr>
+        <w:t xml:space="preserve">= kleines Bild aus einzelnen Pixeln (hier 16 × 16).</w:t>
+      </w:r>
+    </w:p>
+    <w:p>
+      <w:pPr>
+        <w:pStyle w:val="ListParagraph"/>
+        <w:numPr>
+          <w:ilvl w:val="0"/>
+          <w:numId w:val="2"/>
+        </w:numPr>
+        <w:spacing w:after="60"/>
+      </w:pPr>
+      <w:r>
+        <w:rPr>
+          <w:b/>
+          <w:bCs/>
+          <w:sz w:val="22"/>
+          <w:szCs w:val="22"/>
+        </w:rPr>
+        <w:t xml:space="preserve">gbsprites </w:t>
+      </w:r>
+      <w:r>
+        <w:rPr>
+          <w:sz w:val="22"/>
+          <w:szCs w:val="22"/>
+        </w:rPr>
+        <w:t xml:space="preserve">= der Pixel-Editor mit Stift, Füller, Pipette und Symmetrie.</w:t>
+      </w:r>
+    </w:p>
+    <w:p>
+      <w:pPr>
+        <w:pStyle w:val="ListParagraph"/>
+        <w:numPr>
+          <w:ilvl w:val="0"/>
+          <w:numId w:val="2"/>
+        </w:numPr>
+        <w:spacing w:after="60"/>
+      </w:pPr>
+      <w:r>
+        <w:rPr>
+          <w:b/>
+          <w:bCs/>
+          <w:sz w:val="22"/>
+          <w:szCs w:val="22"/>
+        </w:rPr>
+        <w:t xml:space="preserve">Frames </w:t>
+      </w:r>
+      <w:r>
+        <w:rPr>
+          <w:sz w:val="22"/>
+          <w:szCs w:val="22"/>
+        </w:rPr>
+        <w:t xml:space="preserve">= mehrere Einzelbilder ergeben eine Animation (Onion-Skin hilft).</w:t>
+      </w:r>
+    </w:p>
+    <w:p>
+      <w:pPr>
+        <w:pStyle w:val="ListParagraph"/>
+        <w:numPr>
+          <w:ilvl w:val="0"/>
+          <w:numId w:val="2"/>
+        </w:numPr>
+        <w:spacing w:after="60"/>
+      </w:pPr>
+      <w:r>
+        <w:rPr>
+          <w:b/>
+          <w:bCs/>
+          <w:sz w:val="22"/>
+          <w:szCs w:val="22"/>
+        </w:rPr>
+        <w:t xml:space="preserve">Export </w:t>
+      </w:r>
+      <w:r>
+        <w:rPr>
+          <w:sz w:val="22"/>
+          <w:szCs w:val="22"/>
+        </w:rPr>
+        <w:t xml:space="preserve">= .gbsprite zum Weiterbearbeiten, PNG/Sheet fürs Spiel.</w:t>
+      </w:r>
+    </w:p>
+    <w:p>
+      <w:pPr>
+        <w:pStyle w:val="Heading2"/>
+      </w:pPr>
+      <w:r>
+        <w:t xml:space="preserve">Übung</w:t>
+      </w:r>
+    </w:p>
+    <w:p>
+      <w:pPr>
+        <w:pStyle w:val="ListParagraph"/>
+        <w:numPr>
+          <w:ilvl w:val="0"/>
+          <w:numId w:val="2"/>
+        </w:numPr>
+        <w:spacing w:after="60"/>
+      </w:pPr>
+      <w:r>
+        <w:rPr>
+          <w:sz w:val="22"/>
+          <w:szCs w:val="22"/>
+        </w:rPr>
+        <w:t xml:space="preserve">Öffne ein vorhandenes Sprite (z. B. player.png) in gbsprites und färbe es um.</w:t>
+      </w:r>
+    </w:p>
+    <w:p>
+      <w:pPr>
+        <w:pStyle w:val="ListParagraph"/>
+        <w:numPr>
+          <w:ilvl w:val="0"/>
+          <w:numId w:val="2"/>
+        </w:numPr>
+        <w:spacing w:after="60"/>
+      </w:pPr>
+      <w:r>
+        <w:rPr>
+          <w:sz w:val="22"/>
+          <w:szCs w:val="22"/>
+        </w:rPr>
+        <w:t xml:space="preserve">Zeichne deinen eigenen Gegner mit zwei Frames.</w:t>
+      </w:r>
+    </w:p>
+    <w:p>
+      <w:pPr>
+        <w:pStyle w:val="ListParagraph"/>
+        <w:numPr>
+          <w:ilvl w:val="0"/>
+          <w:numId w:val="2"/>
+        </w:numPr>
+        <w:spacing w:after="60"/>
+      </w:pPr>
+      <w:r>
+        <w:rPr>
+          <w:sz w:val="22"/>
+          <w:szCs w:val="22"/>
+        </w:rPr>
+        <w:t xml:space="preserve">Exportiere ihn als PNG und tausche ihn testweise im Spiel ein.</w:t>
+      </w:r>
+    </w:p>
     <w:sectPr>
       <w:footerReference w:type="default" r:id="rId7"/>
       <w:pgSz w:w="12240" w:h="15840" w:orient="portrait"/>
@@ -3858,6 +4850,18 @@
       </w:pPr>
     </w:lvl>
   </w:abstractNum>
+  <w:abstractNum w:abstractNumId="3" w15:restartNumberingAfterBreak="0">
+    <w:multiLevelType w:val="hybridMultilevel"/>
+    <w:lvl w:ilvl="0" w15:tentative="1">
+      <w:start w:val="1"/>
+      <w:numFmt w:val="decimal"/>
+      <w:lvlText w:val="%1."/>
+      <w:lvlJc w:val="left"/>
+      <w:pPr>
+        <w:ind w:left="540" w:hanging="280"/>
+      </w:pPr>
+    </w:lvl>
+  </w:abstractNum>
   <w:num w:numId="1">
     <w:abstractNumId w:val="1"/>
     <w:lvlOverride w:ilvl="0">
@@ -3866,6 +4870,12 @@
   </w:num>
   <w:num w:numId="2">
     <w:abstractNumId w:val="2"/>
+    <w:lvlOverride w:ilvl="0">
+      <w:startOverride w:val="1"/>
+    </w:lvlOverride>
+  </w:num>
+  <w:num w:numId="3">
+    <w:abstractNumId w:val="3"/>
     <w:lvlOverride w:ilvl="0">
       <w:startOverride w:val="1"/>
     </w:lvlOverride>

</xml_diff>

<commit_message>
docs(buch-galaga): Kapitel 4 "Schiessen" (Bullet-Pool, Flankenerkennung)
Code-Kapitel: Pool aus festen Plaetzen (ARRAY bx/by/bAlive, BOOLEAN), Feuern mit
Flankenerkennung (firing AND NOT prevShoot) + freier-Platz-Suche per FOR/BREAK,
Schuesse nach oben + Platz-Freigabe am oberen Rand. Code-Bloecke, Inline-Code,
Tipp, Screenshot, Zusammenfassung + Uebungen. Lauffaehiger Stand
code/kap04/schiessen.gb (gbrt --check clean, Auto-Feuer-Screenshot). docx
validiert (PASSED), 18 Seiten, visuell geprueft.

Co-Authored-By: Claude Opus 4.8 <noreply@anthropic.com>
</commit_message>
<xml_diff>
--- a/buch-galaga/buch/GameBasic-Buch.docx
+++ b/buch-galaga/buch/GameBasic-Buch.docx
@@ -4632,6 +4632,1284 @@
           <w:szCs w:val="22"/>
         </w:rPr>
         <w:t xml:space="preserve">Exportiere ihn als PNG und tausche ihn testweise im Spiel ein.</w:t>
+      </w:r>
+    </w:p>
+    <w:p>
+      <w:r>
+        <w:br w:type="page"/>
+      </w:r>
+    </w:p>
+    <w:p>
+      <w:pPr>
+        <w:pStyle w:val="Heading1"/>
+        <w:pBdr>
+          <w:bottom w:val="single" w:color="1B6CA8" w:sz="12" w:space="4"/>
+        </w:pBdr>
+        <w:spacing w:after="80" w:before="320"/>
+      </w:pPr>
+      <w:r>
+        <w:t xml:space="preserve">Kapitel 4: Schiessen</w:t>
+      </w:r>
+    </w:p>
+    <w:tbl>
+      <w:tblPr>
+        <w:tblW w:type="dxa" w:w="9360"/>
+        <w:tblBorders>
+          <w:top w:val="single" w:color="auto" w:sz="4"/>
+          <w:left w:val="single" w:color="auto" w:sz="4"/>
+          <w:bottom w:val="single" w:color="auto" w:sz="4"/>
+          <w:right w:val="single" w:color="auto" w:sz="4"/>
+          <w:insideH w:val="single" w:color="auto" w:sz="4"/>
+          <w:insideV w:val="single" w:color="auto" w:sz="4"/>
+        </w:tblBorders>
+      </w:tblPr>
+      <w:tblGrid>
+        <w:gridCol w:w="9360"/>
+      </w:tblGrid>
+      <w:tr>
+        <w:tc>
+          <w:tcPr>
+            <w:tcW w:type="dxa" w:w="9360"/>
+            <w:tcBorders>
+              <w:top w:val="single" w:color="9CC8E6" w:sz="6"/>
+              <w:left w:val="single" w:color="9CC8E6" w:sz="6"/>
+              <w:bottom w:val="single" w:color="9CC8E6" w:sz="6"/>
+              <w:right w:val="single" w:color="9CC8E6" w:sz="6"/>
+            </w:tcBorders>
+            <w:shd w:fill="E7F2FA" w:val="clear"/>
+            <w:tcMar>
+              <w:top w:type="dxa" w:w="120"/>
+              <w:left w:type="dxa" w:w="160"/>
+              <w:bottom w:type="dxa" w:w="120"/>
+              <w:right w:type="dxa" w:w="160"/>
+            </w:tcMar>
+          </w:tcPr>
+          <w:p>
+            <w:pPr>
+              <w:spacing w:after="40"/>
+            </w:pPr>
+            <w:r>
+              <w:rPr>
+                <w:b/>
+                <w:bCs/>
+                <w:color w:val="1B6CA8"/>
+                <w:sz w:val="22"/>
+                <w:szCs w:val="22"/>
+              </w:rPr>
+              <w:t xml:space="preserve">In diesem Kapitel</w:t>
+            </w:r>
+          </w:p>
+          <w:p>
+            <w:r>
+              <w:rPr>
+                <w:sz w:val="22"/>
+                <w:szCs w:val="22"/>
+              </w:rPr>
+              <w:t xml:space="preserve">Dein Schiff bekommt Feuerkraft. Du lernst einen „Pool“ kennen – einen festen Vorrat an Schüssen, den wir clever wiederverwenden – und feuerst genau einen Schuss pro Tastendruck.</w:t>
+            </w:r>
+          </w:p>
+        </w:tc>
+      </w:tr>
+    </w:tbl>
+    <w:p>
+      <w:pPr>
+        <w:pStyle w:val="Heading2"/>
+      </w:pPr>
+      <w:r>
+        <w:t xml:space="preserve">Viele Schüsse verwalten: der Pool</w:t>
+      </w:r>
+    </w:p>
+    <w:p>
+      <w:pPr>
+        <w:spacing w:after="140"/>
+      </w:pPr>
+      <w:r>
+        <w:rPr>
+          <w:sz w:val="22"/>
+          <w:szCs w:val="22"/>
+        </w:rPr>
+        <w:t xml:space="preserve">Ein Schuss hat eine Position und fliegt, oder er fliegt gerade nicht. Statt ständig neue Schüsse zu erzeugen und wegzuwerfen, legen wir einen festen Vorrat an – einen Pool. Drei Listen beschreiben alle Schüsse zugleich:</w:t>
+      </w:r>
+    </w:p>
+    <w:p>
+      <w:pPr>
+        <w:pBdr>
+          <w:left w:val="single" w:color="1B6CA8" w:sz="18" w:space="6"/>
+        </w:pBdr>
+        <w:shd w:fill="F4F4F4" w:val="clear"/>
+        <w:spacing w:after="160" w:before="80"/>
+        <w:ind w:left="120"/>
+      </w:pPr>
+      <w:r>
+        <w:rPr>
+          <w:rFonts w:ascii="Consolas" w:cs="Consolas" w:eastAsia="Consolas" w:hAnsi="Consolas"/>
+          <w:sz w:val="19"/>
+          <w:szCs w:val="19"/>
+        </w:rPr>
+        <w:t xml:space="preserve">DIM bulletImg AS IMAGE</w:t>
+      </w:r>
+      <w:r>
+        <w:rPr>
+          <w:rFonts w:ascii="Consolas" w:cs="Consolas" w:eastAsia="Consolas" w:hAnsi="Consolas"/>
+          <w:sz w:val="19"/>
+          <w:szCs w:val="19"/>
+        </w:rPr>
+        <w:br/>
+        <w:t xml:space="preserve">bulletImg = LOADIMAGE("../../assets/sprites/bullet.png")</w:t>
+      </w:r>
+      <w:r>
+        <w:rPr>
+          <w:rFonts w:ascii="Consolas" w:cs="Consolas" w:eastAsia="Consolas" w:hAnsi="Consolas"/>
+          <w:sz w:val="19"/>
+          <w:szCs w:val="19"/>
+        </w:rPr>
+        <w:br/>
+        <w:t xml:space="preserve">CONST NBULLET AS INTEGER = 5</w:t>
+      </w:r>
+      <w:r>
+        <w:rPr>
+          <w:rFonts w:ascii="Consolas" w:cs="Consolas" w:eastAsia="Consolas" w:hAnsi="Consolas"/>
+          <w:sz w:val="19"/>
+          <w:szCs w:val="19"/>
+        </w:rPr>
+        <w:br/>
+        <w:t xml:space="preserve">DIM bx[NBULLET] AS INTEGER          ' x-Position</w:t>
+      </w:r>
+      <w:r>
+        <w:rPr>
+          <w:rFonts w:ascii="Consolas" w:cs="Consolas" w:eastAsia="Consolas" w:hAnsi="Consolas"/>
+          <w:sz w:val="19"/>
+          <w:szCs w:val="19"/>
+        </w:rPr>
+        <w:br/>
+        <w:t xml:space="preserve">DIM by[NBULLET] AS INTEGER          ' y-Position</w:t>
+      </w:r>
+      <w:r>
+        <w:rPr>
+          <w:rFonts w:ascii="Consolas" w:cs="Consolas" w:eastAsia="Consolas" w:hAnsi="Consolas"/>
+          <w:sz w:val="19"/>
+          <w:szCs w:val="19"/>
+        </w:rPr>
+        <w:br/>
+        <w:t xml:space="preserve">DIM bAlive[NBULLET] AS BOOLEAN      ' fliegt dieser Schuss?</w:t>
+      </w:r>
+      <w:r>
+        <w:rPr>
+          <w:rFonts w:ascii="Consolas" w:cs="Consolas" w:eastAsia="Consolas" w:hAnsi="Consolas"/>
+          <w:sz w:val="19"/>
+          <w:szCs w:val="19"/>
+        </w:rPr>
+        <w:br/>
+        <w:t xml:space="preserve">FOR i = 0 TO NBULLET - 1 : bAlive[i] = FALSE : NEXT i</w:t>
+      </w:r>
+    </w:p>
+    <w:p>
+      <w:pPr>
+        <w:spacing w:after="140"/>
+      </w:pPr>
+      <w:r>
+        <w:rPr>
+          <w:sz w:val="22"/>
+          <w:szCs w:val="22"/>
+        </w:rPr>
+        <w:t xml:space="preserve"/>
+      </w:r>
+      <w:r>
+        <w:rPr>
+          <w:rFonts w:ascii="Consolas" w:cs="Consolas" w:eastAsia="Consolas" w:hAnsi="Consolas"/>
+          <w:sz w:val="21"/>
+          <w:szCs w:val="21"/>
+        </w:rPr>
+        <w:t xml:space="preserve">bAlive</w:t>
+      </w:r>
+      <w:r>
+        <w:rPr>
+          <w:sz w:val="22"/>
+          <w:szCs w:val="22"/>
+        </w:rPr>
+        <w:t xml:space="preserve"> ist vom Typ </w:t>
+      </w:r>
+      <w:r>
+        <w:rPr>
+          <w:rFonts w:ascii="Consolas" w:cs="Consolas" w:eastAsia="Consolas" w:hAnsi="Consolas"/>
+          <w:sz w:val="21"/>
+          <w:szCs w:val="21"/>
+        </w:rPr>
+        <w:t xml:space="preserve">BOOLEAN</w:t>
+      </w:r>
+      <w:r>
+        <w:rPr>
+          <w:sz w:val="22"/>
+          <w:szCs w:val="22"/>
+        </w:rPr>
+        <w:t xml:space="preserve"> – das ist ein Ja/Nein-Wert (</w:t>
+      </w:r>
+      <w:r>
+        <w:rPr>
+          <w:rFonts w:ascii="Consolas" w:cs="Consolas" w:eastAsia="Consolas" w:hAnsi="Consolas"/>
+          <w:sz w:val="21"/>
+          <w:szCs w:val="21"/>
+        </w:rPr>
+        <w:t xml:space="preserve">TRUE</w:t>
+      </w:r>
+      <w:r>
+        <w:rPr>
+          <w:sz w:val="22"/>
+          <w:szCs w:val="22"/>
+        </w:rPr>
+        <w:t xml:space="preserve"> oder </w:t>
+      </w:r>
+      <w:r>
+        <w:rPr>
+          <w:rFonts w:ascii="Consolas" w:cs="Consolas" w:eastAsia="Consolas" w:hAnsi="Consolas"/>
+          <w:sz w:val="21"/>
+          <w:szCs w:val="21"/>
+        </w:rPr>
+        <w:t xml:space="preserve">FALSE</w:t>
+      </w:r>
+      <w:r>
+        <w:rPr>
+          <w:sz w:val="22"/>
+          <w:szCs w:val="22"/>
+        </w:rPr>
+        <w:t xml:space="preserve">). So wissen wir für jeden der 5 Plätze, ob dort gerade ein Schuss unterwegs ist. Am Anfang fliegt keiner.</w:t>
+      </w:r>
+    </w:p>
+    <w:p>
+      <w:pPr>
+        <w:pStyle w:val="Heading2"/>
+      </w:pPr>
+      <w:r>
+        <w:t xml:space="preserve">Feuern auf Tastendruck</w:t>
+      </w:r>
+    </w:p>
+    <w:p>
+      <w:pPr>
+        <w:spacing w:after="140"/>
+      </w:pPr>
+      <w:r>
+        <w:rPr>
+          <w:sz w:val="22"/>
+          <w:szCs w:val="22"/>
+        </w:rPr>
+        <w:t xml:space="preserve">Beim Feuern suchen wir einen freien Platz im Pool und starten dort einen Schuss. Wichtig: Wir wollen nicht bei gehaltener Taste pausenlos schiessen, sondern einen Schuss pro Druck. Dafür merken wir uns, ob die Taste schon im Bild davor gedrückt war:</w:t>
+      </w:r>
+    </w:p>
+    <w:p>
+      <w:pPr>
+        <w:pBdr>
+          <w:left w:val="single" w:color="1B6CA8" w:sz="18" w:space="6"/>
+        </w:pBdr>
+        <w:shd w:fill="F4F4F4" w:val="clear"/>
+        <w:spacing w:after="160" w:before="80"/>
+        <w:ind w:left="120"/>
+      </w:pPr>
+      <w:r>
+        <w:rPr>
+          <w:rFonts w:ascii="Consolas" w:cs="Consolas" w:eastAsia="Consolas" w:hAnsi="Consolas"/>
+          <w:sz w:val="19"/>
+          <w:szCs w:val="19"/>
+        </w:rPr>
+        <w:t xml:space="preserve">DIM firing AS BOOLEAN : firing = KEYPRESSED(KEY_SPACE)</w:t>
+      </w:r>
+      <w:r>
+        <w:rPr>
+          <w:rFonts w:ascii="Consolas" w:cs="Consolas" w:eastAsia="Consolas" w:hAnsi="Consolas"/>
+          <w:sz w:val="19"/>
+          <w:szCs w:val="19"/>
+        </w:rPr>
+        <w:br/>
+        <w:t xml:space="preserve">IF firing AND NOT prevShoot THEN</w:t>
+      </w:r>
+      <w:r>
+        <w:rPr>
+          <w:rFonts w:ascii="Consolas" w:cs="Consolas" w:eastAsia="Consolas" w:hAnsi="Consolas"/>
+          <w:sz w:val="19"/>
+          <w:szCs w:val="19"/>
+        </w:rPr>
+        <w:br/>
+        <w:t xml:space="preserve">    DIM s AS INTEGER</w:t>
+      </w:r>
+      <w:r>
+        <w:rPr>
+          <w:rFonts w:ascii="Consolas" w:cs="Consolas" w:eastAsia="Consolas" w:hAnsi="Consolas"/>
+          <w:sz w:val="19"/>
+          <w:szCs w:val="19"/>
+        </w:rPr>
+        <w:br/>
+        <w:t xml:space="preserve">    FOR s = 0 TO NBULLET - 1</w:t>
+      </w:r>
+      <w:r>
+        <w:rPr>
+          <w:rFonts w:ascii="Consolas" w:cs="Consolas" w:eastAsia="Consolas" w:hAnsi="Consolas"/>
+          <w:sz w:val="19"/>
+          <w:szCs w:val="19"/>
+        </w:rPr>
+        <w:br/>
+        <w:t xml:space="preserve">        IF NOT bAlive[s] THEN</w:t>
+      </w:r>
+      <w:r>
+        <w:rPr>
+          <w:rFonts w:ascii="Consolas" w:cs="Consolas" w:eastAsia="Consolas" w:hAnsi="Consolas"/>
+          <w:sz w:val="19"/>
+          <w:szCs w:val="19"/>
+        </w:rPr>
+        <w:br/>
+        <w:t xml:space="preserve">            bAlive[s] = TRUE : bx[s] = shipX + 5 : by[s] = shipY - 4</w:t>
+      </w:r>
+      <w:r>
+        <w:rPr>
+          <w:rFonts w:ascii="Consolas" w:cs="Consolas" w:eastAsia="Consolas" w:hAnsi="Consolas"/>
+          <w:sz w:val="19"/>
+          <w:szCs w:val="19"/>
+        </w:rPr>
+        <w:br/>
+        <w:t xml:space="preserve">            BREAK</w:t>
+      </w:r>
+      <w:r>
+        <w:rPr>
+          <w:rFonts w:ascii="Consolas" w:cs="Consolas" w:eastAsia="Consolas" w:hAnsi="Consolas"/>
+          <w:sz w:val="19"/>
+          <w:szCs w:val="19"/>
+        </w:rPr>
+        <w:br/>
+        <w:t xml:space="preserve">        END IF</w:t>
+      </w:r>
+      <w:r>
+        <w:rPr>
+          <w:rFonts w:ascii="Consolas" w:cs="Consolas" w:eastAsia="Consolas" w:hAnsi="Consolas"/>
+          <w:sz w:val="19"/>
+          <w:szCs w:val="19"/>
+        </w:rPr>
+        <w:br/>
+        <w:t xml:space="preserve">    NEXT s</w:t>
+      </w:r>
+      <w:r>
+        <w:rPr>
+          <w:rFonts w:ascii="Consolas" w:cs="Consolas" w:eastAsia="Consolas" w:hAnsi="Consolas"/>
+          <w:sz w:val="19"/>
+          <w:szCs w:val="19"/>
+        </w:rPr>
+        <w:br/>
+        <w:t xml:space="preserve">END IF</w:t>
+      </w:r>
+      <w:r>
+        <w:rPr>
+          <w:rFonts w:ascii="Consolas" w:cs="Consolas" w:eastAsia="Consolas" w:hAnsi="Consolas"/>
+          <w:sz w:val="19"/>
+          <w:szCs w:val="19"/>
+        </w:rPr>
+        <w:br/>
+        <w:t xml:space="preserve">prevShoot = firing</w:t>
+      </w:r>
+    </w:p>
+    <w:p>
+      <w:pPr>
+        <w:spacing w:after="140"/>
+      </w:pPr>
+      <w:r>
+        <w:rPr>
+          <w:sz w:val="22"/>
+          <w:szCs w:val="22"/>
+        </w:rPr>
+        <w:t xml:space="preserve"/>
+      </w:r>
+      <w:r>
+        <w:rPr>
+          <w:rFonts w:ascii="Consolas" w:cs="Consolas" w:eastAsia="Consolas" w:hAnsi="Consolas"/>
+          <w:sz w:val="21"/>
+          <w:szCs w:val="21"/>
+        </w:rPr>
+        <w:t xml:space="preserve">firing AND NOT prevShoot</w:t>
+      </w:r>
+      <w:r>
+        <w:rPr>
+          <w:sz w:val="22"/>
+          <w:szCs w:val="22"/>
+        </w:rPr>
+        <w:t xml:space="preserve"> ist nur im ersten Bild des Drückens wahr – das nennt man Flankenerkennung. Die </w:t>
+      </w:r>
+      <w:r>
+        <w:rPr>
+          <w:rFonts w:ascii="Consolas" w:cs="Consolas" w:eastAsia="Consolas" w:hAnsi="Consolas"/>
+          <w:sz w:val="21"/>
+          <w:szCs w:val="21"/>
+        </w:rPr>
+        <w:t xml:space="preserve">FOR</w:t>
+      </w:r>
+      <w:r>
+        <w:rPr>
+          <w:sz w:val="22"/>
+          <w:szCs w:val="22"/>
+        </w:rPr>
+        <w:t xml:space="preserve">-Schleife sucht den ersten freien Platz; </w:t>
+      </w:r>
+      <w:r>
+        <w:rPr>
+          <w:rFonts w:ascii="Consolas" w:cs="Consolas" w:eastAsia="Consolas" w:hAnsi="Consolas"/>
+          <w:sz w:val="21"/>
+          <w:szCs w:val="21"/>
+        </w:rPr>
+        <w:t xml:space="preserve">BREAK</w:t>
+      </w:r>
+      <w:r>
+        <w:rPr>
+          <w:sz w:val="22"/>
+          <w:szCs w:val="22"/>
+        </w:rPr>
+        <w:t xml:space="preserve"> verlässt die Schleife sofort, sobald einer gefunden ist. Der Schuss startet knapp über dem Schiff.</w:t>
+      </w:r>
+    </w:p>
+    <w:p>
+      <w:pPr>
+        <w:pStyle w:val="Heading2"/>
+      </w:pPr>
+      <w:r>
+        <w:t xml:space="preserve">Schüsse bewegen und zeichnen</w:t>
+      </w:r>
+    </w:p>
+    <w:p>
+      <w:pPr>
+        <w:spacing w:after="140"/>
+      </w:pPr>
+      <w:r>
+        <w:rPr>
+          <w:sz w:val="22"/>
+          <w:szCs w:val="22"/>
+        </w:rPr>
+        <w:t xml:space="preserve">Jeden Frame lassen wir alle fliegenden Schüsse nach oben wandern. Verlässt einer oben das Bild, wird sein Platz wieder frei:</w:t>
+      </w:r>
+    </w:p>
+    <w:p>
+      <w:pPr>
+        <w:pBdr>
+          <w:left w:val="single" w:color="1B6CA8" w:sz="18" w:space="6"/>
+        </w:pBdr>
+        <w:shd w:fill="F4F4F4" w:val="clear"/>
+        <w:spacing w:after="160" w:before="80"/>
+        <w:ind w:left="120"/>
+      </w:pPr>
+      <w:r>
+        <w:rPr>
+          <w:rFonts w:ascii="Consolas" w:cs="Consolas" w:eastAsia="Consolas" w:hAnsi="Consolas"/>
+          <w:sz w:val="19"/>
+          <w:szCs w:val="19"/>
+        </w:rPr>
+        <w:t xml:space="preserve">FOR i = 0 TO NBULLET - 1</w:t>
+      </w:r>
+      <w:r>
+        <w:rPr>
+          <w:rFonts w:ascii="Consolas" w:cs="Consolas" w:eastAsia="Consolas" w:hAnsi="Consolas"/>
+          <w:sz w:val="19"/>
+          <w:szCs w:val="19"/>
+        </w:rPr>
+        <w:br/>
+        <w:t xml:space="preserve">    IF bAlive[i] THEN</w:t>
+      </w:r>
+      <w:r>
+        <w:rPr>
+          <w:rFonts w:ascii="Consolas" w:cs="Consolas" w:eastAsia="Consolas" w:hAnsi="Consolas"/>
+          <w:sz w:val="19"/>
+          <w:szCs w:val="19"/>
+        </w:rPr>
+        <w:br/>
+        <w:t xml:space="preserve">        by[i] = by[i] - 8</w:t>
+      </w:r>
+      <w:r>
+        <w:rPr>
+          <w:rFonts w:ascii="Consolas" w:cs="Consolas" w:eastAsia="Consolas" w:hAnsi="Consolas"/>
+          <w:sz w:val="19"/>
+          <w:szCs w:val="19"/>
+        </w:rPr>
+        <w:br/>
+        <w:t xml:space="preserve">        IF by[i] &lt; -8 THEN bAlive[i] = FALSE</w:t>
+      </w:r>
+      <w:r>
+        <w:rPr>
+          <w:rFonts w:ascii="Consolas" w:cs="Consolas" w:eastAsia="Consolas" w:hAnsi="Consolas"/>
+          <w:sz w:val="19"/>
+          <w:szCs w:val="19"/>
+        </w:rPr>
+        <w:br/>
+        <w:t xml:space="preserve">        DRAWIMAGE(bulletImg, bx[i], by[i])</w:t>
+      </w:r>
+      <w:r>
+        <w:rPr>
+          <w:rFonts w:ascii="Consolas" w:cs="Consolas" w:eastAsia="Consolas" w:hAnsi="Consolas"/>
+          <w:sz w:val="19"/>
+          <w:szCs w:val="19"/>
+        </w:rPr>
+        <w:br/>
+        <w:t xml:space="preserve">    END IF</w:t>
+      </w:r>
+      <w:r>
+        <w:rPr>
+          <w:rFonts w:ascii="Consolas" w:cs="Consolas" w:eastAsia="Consolas" w:hAnsi="Consolas"/>
+          <w:sz w:val="19"/>
+          <w:szCs w:val="19"/>
+        </w:rPr>
+        <w:br/>
+        <w:t xml:space="preserve">NEXT i</w:t>
+      </w:r>
+    </w:p>
+    <w:p>
+      <w:pPr>
+        <w:spacing w:after="140"/>
+      </w:pPr>
+      <w:r>
+        <w:rPr>
+          <w:sz w:val="22"/>
+          <w:szCs w:val="22"/>
+        </w:rPr>
+        <w:t xml:space="preserve">Kleiner </w:t>
+      </w:r>
+      <w:r>
+        <w:rPr>
+          <w:rFonts w:ascii="Consolas" w:cs="Consolas" w:eastAsia="Consolas" w:hAnsi="Consolas"/>
+          <w:sz w:val="21"/>
+          <w:szCs w:val="21"/>
+        </w:rPr>
+        <w:t xml:space="preserve">by[i] - 8</w:t>
+      </w:r>
+      <w:r>
+        <w:rPr>
+          <w:sz w:val="22"/>
+          <w:szCs w:val="22"/>
+        </w:rPr>
+        <w:t xml:space="preserve"> bedeutet weiter oben (in der Grafik wächst y nach unten). Sobald </w:t>
+      </w:r>
+      <w:r>
+        <w:rPr>
+          <w:rFonts w:ascii="Consolas" w:cs="Consolas" w:eastAsia="Consolas" w:hAnsi="Consolas"/>
+          <w:sz w:val="21"/>
+          <w:szCs w:val="21"/>
+        </w:rPr>
+        <w:t xml:space="preserve">by[i] &lt; -8</w:t>
+      </w:r>
+      <w:r>
+        <w:rPr>
+          <w:sz w:val="22"/>
+          <w:szCs w:val="22"/>
+        </w:rPr>
+        <w:t xml:space="preserve"> ist der Schuss oben raus und sein Platz im Pool steht dem nächsten Schuss zur Verfügung.</w:t>
+      </w:r>
+    </w:p>
+    <w:p>
+      <w:pPr>
+        <w:pStyle w:val="Heading2"/>
+      </w:pPr>
+      <w:r>
+        <w:t xml:space="preserve">Das ganze Programm</w:t>
+      </w:r>
+    </w:p>
+    <w:p>
+      <w:pPr>
+        <w:pBdr>
+          <w:left w:val="single" w:color="1B6CA8" w:sz="18" w:space="6"/>
+        </w:pBdr>
+        <w:shd w:fill="F4F4F4" w:val="clear"/>
+        <w:spacing w:after="160" w:before="80"/>
+        <w:ind w:left="120"/>
+      </w:pPr>
+      <w:r>
+        <w:rPr>
+          <w:rFonts w:ascii="Consolas" w:cs="Consolas" w:eastAsia="Consolas" w:hAnsi="Consolas"/>
+          <w:sz w:val="19"/>
+          <w:szCs w:val="19"/>
+        </w:rPr>
+        <w:t xml:space="preserve">SCREEN(480, 640, "Mein Galaga - Kapitel 4")</w:t>
+      </w:r>
+      <w:r>
+        <w:rPr>
+          <w:rFonts w:ascii="Consolas" w:cs="Consolas" w:eastAsia="Consolas" w:hAnsi="Consolas"/>
+          <w:sz w:val="19"/>
+          <w:szCs w:val="19"/>
+        </w:rPr>
+        <w:br/>
+        <w:t xml:space="preserve">CONST NSTARS AS INTEGER = 60</w:t>
+      </w:r>
+      <w:r>
+        <w:rPr>
+          <w:rFonts w:ascii="Consolas" w:cs="Consolas" w:eastAsia="Consolas" w:hAnsi="Consolas"/>
+          <w:sz w:val="19"/>
+          <w:szCs w:val="19"/>
+        </w:rPr>
+        <w:br/>
+        <w:t xml:space="preserve">DIM starX[NSTARS] AS INTEGER : DIM starY[NSTARS] AS INTEGER</w:t>
+      </w:r>
+      <w:r>
+        <w:rPr>
+          <w:rFonts w:ascii="Consolas" w:cs="Consolas" w:eastAsia="Consolas" w:hAnsi="Consolas"/>
+          <w:sz w:val="19"/>
+          <w:szCs w:val="19"/>
+        </w:rPr>
+        <w:br/>
+        <w:t xml:space="preserve">DIM i AS INTEGER</w:t>
+      </w:r>
+      <w:r>
+        <w:rPr>
+          <w:rFonts w:ascii="Consolas" w:cs="Consolas" w:eastAsia="Consolas" w:hAnsi="Consolas"/>
+          <w:sz w:val="19"/>
+          <w:szCs w:val="19"/>
+        </w:rPr>
+        <w:br/>
+        <w:t xml:space="preserve">FOR i = 0 TO NSTARS - 1</w:t>
+      </w:r>
+      <w:r>
+        <w:rPr>
+          <w:rFonts w:ascii="Consolas" w:cs="Consolas" w:eastAsia="Consolas" w:hAnsi="Consolas"/>
+          <w:sz w:val="19"/>
+          <w:szCs w:val="19"/>
+        </w:rPr>
+        <w:br/>
+        <w:t xml:space="preserve">    starX[i] = RANDINT(0, 479) : starY[i] = RANDINT(0, 639)</w:t>
+      </w:r>
+      <w:r>
+        <w:rPr>
+          <w:rFonts w:ascii="Consolas" w:cs="Consolas" w:eastAsia="Consolas" w:hAnsi="Consolas"/>
+          <w:sz w:val="19"/>
+          <w:szCs w:val="19"/>
+        </w:rPr>
+        <w:br/>
+        <w:t xml:space="preserve">NEXT i</w:t>
+      </w:r>
+      <w:r>
+        <w:rPr>
+          <w:rFonts w:ascii="Consolas" w:cs="Consolas" w:eastAsia="Consolas" w:hAnsi="Consolas"/>
+          <w:sz w:val="19"/>
+          <w:szCs w:val="19"/>
+        </w:rPr>
+        <w:br/>
+        <w:t xml:space="preserve"/>
+      </w:r>
+      <w:r>
+        <w:rPr>
+          <w:rFonts w:ascii="Consolas" w:cs="Consolas" w:eastAsia="Consolas" w:hAnsi="Consolas"/>
+          <w:sz w:val="19"/>
+          <w:szCs w:val="19"/>
+        </w:rPr>
+        <w:br/>
+        <w:t xml:space="preserve">DIM shipImg AS IMAGE</w:t>
+      </w:r>
+      <w:r>
+        <w:rPr>
+          <w:rFonts w:ascii="Consolas" w:cs="Consolas" w:eastAsia="Consolas" w:hAnsi="Consolas"/>
+          <w:sz w:val="19"/>
+          <w:szCs w:val="19"/>
+        </w:rPr>
+        <w:br/>
+        <w:t xml:space="preserve">shipImg = LOADIMAGE("../../assets/sprites/player.png")</w:t>
+      </w:r>
+      <w:r>
+        <w:rPr>
+          <w:rFonts w:ascii="Consolas" w:cs="Consolas" w:eastAsia="Consolas" w:hAnsi="Consolas"/>
+          <w:sz w:val="19"/>
+          <w:szCs w:val="19"/>
+        </w:rPr>
+        <w:br/>
+        <w:t xml:space="preserve">DIM shipX AS INTEGER : DIM shipY AS INTEGER</w:t>
+      </w:r>
+      <w:r>
+        <w:rPr>
+          <w:rFonts w:ascii="Consolas" w:cs="Consolas" w:eastAsia="Consolas" w:hAnsi="Consolas"/>
+          <w:sz w:val="19"/>
+          <w:szCs w:val="19"/>
+        </w:rPr>
+        <w:br/>
+        <w:t xml:space="preserve">shipX = 232 : shipY = 560</w:t>
+      </w:r>
+      <w:r>
+        <w:rPr>
+          <w:rFonts w:ascii="Consolas" w:cs="Consolas" w:eastAsia="Consolas" w:hAnsi="Consolas"/>
+          <w:sz w:val="19"/>
+          <w:szCs w:val="19"/>
+        </w:rPr>
+        <w:br/>
+        <w:t xml:space="preserve"/>
+      </w:r>
+      <w:r>
+        <w:rPr>
+          <w:rFonts w:ascii="Consolas" w:cs="Consolas" w:eastAsia="Consolas" w:hAnsi="Consolas"/>
+          <w:sz w:val="19"/>
+          <w:szCs w:val="19"/>
+        </w:rPr>
+        <w:br/>
+        <w:t xml:space="preserve">DIM bulletImg AS IMAGE</w:t>
+      </w:r>
+      <w:r>
+        <w:rPr>
+          <w:rFonts w:ascii="Consolas" w:cs="Consolas" w:eastAsia="Consolas" w:hAnsi="Consolas"/>
+          <w:sz w:val="19"/>
+          <w:szCs w:val="19"/>
+        </w:rPr>
+        <w:br/>
+        <w:t xml:space="preserve">bulletImg = LOADIMAGE("../../assets/sprites/bullet.png")</w:t>
+      </w:r>
+      <w:r>
+        <w:rPr>
+          <w:rFonts w:ascii="Consolas" w:cs="Consolas" w:eastAsia="Consolas" w:hAnsi="Consolas"/>
+          <w:sz w:val="19"/>
+          <w:szCs w:val="19"/>
+        </w:rPr>
+        <w:br/>
+        <w:t xml:space="preserve">CONST NBULLET AS INTEGER = 5</w:t>
+      </w:r>
+      <w:r>
+        <w:rPr>
+          <w:rFonts w:ascii="Consolas" w:cs="Consolas" w:eastAsia="Consolas" w:hAnsi="Consolas"/>
+          <w:sz w:val="19"/>
+          <w:szCs w:val="19"/>
+        </w:rPr>
+        <w:br/>
+        <w:t xml:space="preserve">DIM bx[NBULLET] AS INTEGER : DIM by[NBULLET] AS INTEGER</w:t>
+      </w:r>
+      <w:r>
+        <w:rPr>
+          <w:rFonts w:ascii="Consolas" w:cs="Consolas" w:eastAsia="Consolas" w:hAnsi="Consolas"/>
+          <w:sz w:val="19"/>
+          <w:szCs w:val="19"/>
+        </w:rPr>
+        <w:br/>
+        <w:t xml:space="preserve">DIM bAlive[NBULLET] AS BOOLEAN</w:t>
+      </w:r>
+      <w:r>
+        <w:rPr>
+          <w:rFonts w:ascii="Consolas" w:cs="Consolas" w:eastAsia="Consolas" w:hAnsi="Consolas"/>
+          <w:sz w:val="19"/>
+          <w:szCs w:val="19"/>
+        </w:rPr>
+        <w:br/>
+        <w:t xml:space="preserve">FOR i = 0 TO NBULLET - 1 : bAlive[i] = FALSE : NEXT i</w:t>
+      </w:r>
+      <w:r>
+        <w:rPr>
+          <w:rFonts w:ascii="Consolas" w:cs="Consolas" w:eastAsia="Consolas" w:hAnsi="Consolas"/>
+          <w:sz w:val="19"/>
+          <w:szCs w:val="19"/>
+        </w:rPr>
+        <w:br/>
+        <w:t xml:space="preserve">DIM prevShoot AS BOOLEAN</w:t>
+      </w:r>
+      <w:r>
+        <w:rPr>
+          <w:rFonts w:ascii="Consolas" w:cs="Consolas" w:eastAsia="Consolas" w:hAnsi="Consolas"/>
+          <w:sz w:val="19"/>
+          <w:szCs w:val="19"/>
+        </w:rPr>
+        <w:br/>
+        <w:t xml:space="preserve"/>
+      </w:r>
+      <w:r>
+        <w:rPr>
+          <w:rFonts w:ascii="Consolas" w:cs="Consolas" w:eastAsia="Consolas" w:hAnsi="Consolas"/>
+          <w:sz w:val="19"/>
+          <w:szCs w:val="19"/>
+        </w:rPr>
+        <w:br/>
+        <w:t xml:space="preserve">WHILE NOT QUITREQUESTED()</w:t>
+      </w:r>
+      <w:r>
+        <w:rPr>
+          <w:rFonts w:ascii="Consolas" w:cs="Consolas" w:eastAsia="Consolas" w:hAnsi="Consolas"/>
+          <w:sz w:val="19"/>
+          <w:szCs w:val="19"/>
+        </w:rPr>
+        <w:br/>
+        <w:t xml:space="preserve">    CLS(&amp;H05060F)</w:t>
+      </w:r>
+      <w:r>
+        <w:rPr>
+          <w:rFonts w:ascii="Consolas" w:cs="Consolas" w:eastAsia="Consolas" w:hAnsi="Consolas"/>
+          <w:sz w:val="19"/>
+          <w:szCs w:val="19"/>
+        </w:rPr>
+        <w:br/>
+        <w:t xml:space="preserve">    FOR i = 0 TO NSTARS - 1</w:t>
+      </w:r>
+      <w:r>
+        <w:rPr>
+          <w:rFonts w:ascii="Consolas" w:cs="Consolas" w:eastAsia="Consolas" w:hAnsi="Consolas"/>
+          <w:sz w:val="19"/>
+          <w:szCs w:val="19"/>
+        </w:rPr>
+        <w:br/>
+        <w:t xml:space="preserve">        starY[i] = starY[i] + 2</w:t>
+      </w:r>
+      <w:r>
+        <w:rPr>
+          <w:rFonts w:ascii="Consolas" w:cs="Consolas" w:eastAsia="Consolas" w:hAnsi="Consolas"/>
+          <w:sz w:val="19"/>
+          <w:szCs w:val="19"/>
+        </w:rPr>
+        <w:br/>
+        <w:t xml:space="preserve">        IF starY[i] &gt; 639 THEN starY[i] = 0 : starX[i] = RANDINT(0, 479)</w:t>
+      </w:r>
+      <w:r>
+        <w:rPr>
+          <w:rFonts w:ascii="Consolas" w:cs="Consolas" w:eastAsia="Consolas" w:hAnsi="Consolas"/>
+          <w:sz w:val="19"/>
+          <w:szCs w:val="19"/>
+        </w:rPr>
+        <w:br/>
+        <w:t xml:space="preserve">        PLOT(starX[i], starY[i], &amp;HFFFFFF)</w:t>
+      </w:r>
+      <w:r>
+        <w:rPr>
+          <w:rFonts w:ascii="Consolas" w:cs="Consolas" w:eastAsia="Consolas" w:hAnsi="Consolas"/>
+          <w:sz w:val="19"/>
+          <w:szCs w:val="19"/>
+        </w:rPr>
+        <w:br/>
+        <w:t xml:space="preserve">    NEXT i</w:t>
+      </w:r>
+      <w:r>
+        <w:rPr>
+          <w:rFonts w:ascii="Consolas" w:cs="Consolas" w:eastAsia="Consolas" w:hAnsi="Consolas"/>
+          <w:sz w:val="19"/>
+          <w:szCs w:val="19"/>
+        </w:rPr>
+        <w:br/>
+        <w:t xml:space="preserve">    IF KEYPRESSED(KEY_LEFT)  OR KEYPRESSED(KEY_A) THEN shipX = shipX - 4</w:t>
+      </w:r>
+      <w:r>
+        <w:rPr>
+          <w:rFonts w:ascii="Consolas" w:cs="Consolas" w:eastAsia="Consolas" w:hAnsi="Consolas"/>
+          <w:sz w:val="19"/>
+          <w:szCs w:val="19"/>
+        </w:rPr>
+        <w:br/>
+        <w:t xml:space="preserve">    IF KEYPRESSED(KEY_RIGHT) OR KEYPRESSED(KEY_D) THEN shipX = shipX + 4</w:t>
+      </w:r>
+      <w:r>
+        <w:rPr>
+          <w:rFonts w:ascii="Consolas" w:cs="Consolas" w:eastAsia="Consolas" w:hAnsi="Consolas"/>
+          <w:sz w:val="19"/>
+          <w:szCs w:val="19"/>
+        </w:rPr>
+        <w:br/>
+        <w:t xml:space="preserve">    IF shipX &lt; 0 THEN shipX = 0</w:t>
+      </w:r>
+      <w:r>
+        <w:rPr>
+          <w:rFonts w:ascii="Consolas" w:cs="Consolas" w:eastAsia="Consolas" w:hAnsi="Consolas"/>
+          <w:sz w:val="19"/>
+          <w:szCs w:val="19"/>
+        </w:rPr>
+        <w:br/>
+        <w:t xml:space="preserve">    IF shipX &gt; 464 THEN shipX = 464</w:t>
+      </w:r>
+      <w:r>
+        <w:rPr>
+          <w:rFonts w:ascii="Consolas" w:cs="Consolas" w:eastAsia="Consolas" w:hAnsi="Consolas"/>
+          <w:sz w:val="19"/>
+          <w:szCs w:val="19"/>
+        </w:rPr>
+        <w:br/>
+        <w:t xml:space="preserve">    DIM firing AS BOOLEAN : firing = KEYPRESSED(KEY_SPACE)</w:t>
+      </w:r>
+      <w:r>
+        <w:rPr>
+          <w:rFonts w:ascii="Consolas" w:cs="Consolas" w:eastAsia="Consolas" w:hAnsi="Consolas"/>
+          <w:sz w:val="19"/>
+          <w:szCs w:val="19"/>
+        </w:rPr>
+        <w:br/>
+        <w:t xml:space="preserve">    IF firing AND NOT prevShoot THEN</w:t>
+      </w:r>
+      <w:r>
+        <w:rPr>
+          <w:rFonts w:ascii="Consolas" w:cs="Consolas" w:eastAsia="Consolas" w:hAnsi="Consolas"/>
+          <w:sz w:val="19"/>
+          <w:szCs w:val="19"/>
+        </w:rPr>
+        <w:br/>
+        <w:t xml:space="preserve">        DIM s AS INTEGER</w:t>
+      </w:r>
+      <w:r>
+        <w:rPr>
+          <w:rFonts w:ascii="Consolas" w:cs="Consolas" w:eastAsia="Consolas" w:hAnsi="Consolas"/>
+          <w:sz w:val="19"/>
+          <w:szCs w:val="19"/>
+        </w:rPr>
+        <w:br/>
+        <w:t xml:space="preserve">        FOR s = 0 TO NBULLET - 1</w:t>
+      </w:r>
+      <w:r>
+        <w:rPr>
+          <w:rFonts w:ascii="Consolas" w:cs="Consolas" w:eastAsia="Consolas" w:hAnsi="Consolas"/>
+          <w:sz w:val="19"/>
+          <w:szCs w:val="19"/>
+        </w:rPr>
+        <w:br/>
+        <w:t xml:space="preserve">            IF NOT bAlive[s] THEN</w:t>
+      </w:r>
+      <w:r>
+        <w:rPr>
+          <w:rFonts w:ascii="Consolas" w:cs="Consolas" w:eastAsia="Consolas" w:hAnsi="Consolas"/>
+          <w:sz w:val="19"/>
+          <w:szCs w:val="19"/>
+        </w:rPr>
+        <w:br/>
+        <w:t xml:space="preserve">                bAlive[s] = TRUE : bx[s] = shipX + 5 : by[s] = shipY - 4 : BREAK</w:t>
+      </w:r>
+      <w:r>
+        <w:rPr>
+          <w:rFonts w:ascii="Consolas" w:cs="Consolas" w:eastAsia="Consolas" w:hAnsi="Consolas"/>
+          <w:sz w:val="19"/>
+          <w:szCs w:val="19"/>
+        </w:rPr>
+        <w:br/>
+        <w:t xml:space="preserve">            END IF</w:t>
+      </w:r>
+      <w:r>
+        <w:rPr>
+          <w:rFonts w:ascii="Consolas" w:cs="Consolas" w:eastAsia="Consolas" w:hAnsi="Consolas"/>
+          <w:sz w:val="19"/>
+          <w:szCs w:val="19"/>
+        </w:rPr>
+        <w:br/>
+        <w:t xml:space="preserve">        NEXT s</w:t>
+      </w:r>
+      <w:r>
+        <w:rPr>
+          <w:rFonts w:ascii="Consolas" w:cs="Consolas" w:eastAsia="Consolas" w:hAnsi="Consolas"/>
+          <w:sz w:val="19"/>
+          <w:szCs w:val="19"/>
+        </w:rPr>
+        <w:br/>
+        <w:t xml:space="preserve">    END IF</w:t>
+      </w:r>
+      <w:r>
+        <w:rPr>
+          <w:rFonts w:ascii="Consolas" w:cs="Consolas" w:eastAsia="Consolas" w:hAnsi="Consolas"/>
+          <w:sz w:val="19"/>
+          <w:szCs w:val="19"/>
+        </w:rPr>
+        <w:br/>
+        <w:t xml:space="preserve">    prevShoot = firing</w:t>
+      </w:r>
+      <w:r>
+        <w:rPr>
+          <w:rFonts w:ascii="Consolas" w:cs="Consolas" w:eastAsia="Consolas" w:hAnsi="Consolas"/>
+          <w:sz w:val="19"/>
+          <w:szCs w:val="19"/>
+        </w:rPr>
+        <w:br/>
+        <w:t xml:space="preserve">    FOR i = 0 TO NBULLET - 1</w:t>
+      </w:r>
+      <w:r>
+        <w:rPr>
+          <w:rFonts w:ascii="Consolas" w:cs="Consolas" w:eastAsia="Consolas" w:hAnsi="Consolas"/>
+          <w:sz w:val="19"/>
+          <w:szCs w:val="19"/>
+        </w:rPr>
+        <w:br/>
+        <w:t xml:space="preserve">        IF bAlive[i] THEN</w:t>
+      </w:r>
+      <w:r>
+        <w:rPr>
+          <w:rFonts w:ascii="Consolas" w:cs="Consolas" w:eastAsia="Consolas" w:hAnsi="Consolas"/>
+          <w:sz w:val="19"/>
+          <w:szCs w:val="19"/>
+        </w:rPr>
+        <w:br/>
+        <w:t xml:space="preserve">            by[i] = by[i] - 8</w:t>
+      </w:r>
+      <w:r>
+        <w:rPr>
+          <w:rFonts w:ascii="Consolas" w:cs="Consolas" w:eastAsia="Consolas" w:hAnsi="Consolas"/>
+          <w:sz w:val="19"/>
+          <w:szCs w:val="19"/>
+        </w:rPr>
+        <w:br/>
+        <w:t xml:space="preserve">            IF by[i] &lt; -8 THEN bAlive[i] = FALSE</w:t>
+      </w:r>
+      <w:r>
+        <w:rPr>
+          <w:rFonts w:ascii="Consolas" w:cs="Consolas" w:eastAsia="Consolas" w:hAnsi="Consolas"/>
+          <w:sz w:val="19"/>
+          <w:szCs w:val="19"/>
+        </w:rPr>
+        <w:br/>
+        <w:t xml:space="preserve">            DRAWIMAGE(bulletImg, bx[i], by[i])</w:t>
+      </w:r>
+      <w:r>
+        <w:rPr>
+          <w:rFonts w:ascii="Consolas" w:cs="Consolas" w:eastAsia="Consolas" w:hAnsi="Consolas"/>
+          <w:sz w:val="19"/>
+          <w:szCs w:val="19"/>
+        </w:rPr>
+        <w:br/>
+        <w:t xml:space="preserve">        END IF</w:t>
+      </w:r>
+      <w:r>
+        <w:rPr>
+          <w:rFonts w:ascii="Consolas" w:cs="Consolas" w:eastAsia="Consolas" w:hAnsi="Consolas"/>
+          <w:sz w:val="19"/>
+          <w:szCs w:val="19"/>
+        </w:rPr>
+        <w:br/>
+        <w:t xml:space="preserve">    NEXT i</w:t>
+      </w:r>
+      <w:r>
+        <w:rPr>
+          <w:rFonts w:ascii="Consolas" w:cs="Consolas" w:eastAsia="Consolas" w:hAnsi="Consolas"/>
+          <w:sz w:val="19"/>
+          <w:szCs w:val="19"/>
+        </w:rPr>
+        <w:br/>
+        <w:t xml:space="preserve">    DRAWIMAGE(shipImg, shipX, shipY)</w:t>
+      </w:r>
+      <w:r>
+        <w:rPr>
+          <w:rFonts w:ascii="Consolas" w:cs="Consolas" w:eastAsia="Consolas" w:hAnsi="Consolas"/>
+          <w:sz w:val="19"/>
+          <w:szCs w:val="19"/>
+        </w:rPr>
+        <w:br/>
+        <w:t xml:space="preserve">    FLIP()</w:t>
+      </w:r>
+      <w:r>
+        <w:rPr>
+          <w:rFonts w:ascii="Consolas" w:cs="Consolas" w:eastAsia="Consolas" w:hAnsi="Consolas"/>
+          <w:sz w:val="19"/>
+          <w:szCs w:val="19"/>
+        </w:rPr>
+        <w:br/>
+        <w:t xml:space="preserve">WEND</w:t>
+      </w:r>
+    </w:p>
+    <w:p>
+      <w:pPr>
+        <w:spacing w:after="40" w:before="120"/>
+        <w:jc w:val="center"/>
+      </w:pPr>
+      <w:r>
+        <w:drawing>
+          <wp:inline distT="0" distB="0" distL="0" distR="0">
+            <wp:extent cx="2857500" cy="3810000"/>
+            <wp:effectExtent t="0" r="0" b="0" l="0"/>
+            <wp:docPr id="1" name="kap04_schiessen.png" descr="Feuer frei: Die Schüsse steigen in einer Reihe nach oben." title="Feuer frei: Die Schüsse steigen in einer Reihe nach oben."/>
+            <wp:cNvGraphicFramePr>
+              <a:graphicFrameLocks xmlns:a="http://schemas.openxmlformats.org/drawingml/2006/main" noChangeAspect="1"/>
+            </wp:cNvGraphicFramePr>
+            <a:graphic xmlns:a="http://schemas.openxmlformats.org/drawingml/2006/main">
+              <a:graphicData uri="http://schemas.openxmlformats.org/drawingml/2006/picture">
+                <pic:pic xmlns:pic="http://schemas.openxmlformats.org/drawingml/2006/picture">
+                  <pic:nvPicPr>
+                    <pic:cNvPr id="0" name="" descr=""/>
+                    <pic:cNvPicPr>
+                      <a:picLocks noChangeAspect="1" noChangeArrowheads="1"/>
+                    </pic:cNvPicPr>
+                  </pic:nvPicPr>
+                  <pic:blipFill>
+                    <a:blip r:embed="rId20" cstate="none"/>
+                    <a:srcRect/>
+                    <a:stretch>
+                      <a:fillRect/>
+                    </a:stretch>
+                  </pic:blipFill>
+                  <pic:spPr bwMode="auto">
+                    <a:xfrm>
+                      <a:off x="0" y="0"/>
+                      <a:ext cx="2857500" cy="3810000"/>
+                    </a:xfrm>
+                    <a:prstGeom prst="rect">
+                      <a:avLst/>
+                    </a:prstGeom>
+                  </pic:spPr>
+                </pic:pic>
+              </a:graphicData>
+            </a:graphic>
+          </wp:inline>
+        </w:drawing>
+      </w:r>
+    </w:p>
+    <w:p>
+      <w:pPr>
+        <w:spacing w:after="200"/>
+        <w:jc w:val="center"/>
+      </w:pPr>
+      <w:r>
+        <w:rPr>
+          <w:i/>
+          <w:iCs/>
+          <w:color w:val="6A6A6A"/>
+          <w:sz w:val="18"/>
+          <w:szCs w:val="18"/>
+        </w:rPr>
+        <w:t xml:space="preserve">Feuer frei: Die Schüsse steigen in einer Reihe nach oben.</w:t>
+      </w:r>
+    </w:p>
+    <w:p>
+      <w:pPr>
+        <w:pStyle w:val="Heading2"/>
+      </w:pPr>
+      <w:r>
+        <w:t xml:space="preserve">Was du gelernt hast</w:t>
+      </w:r>
+    </w:p>
+    <w:p>
+      <w:pPr>
+        <w:pStyle w:val="ListParagraph"/>
+        <w:numPr>
+          <w:ilvl w:val="0"/>
+          <w:numId w:val="2"/>
+        </w:numPr>
+        <w:spacing w:after="60"/>
+      </w:pPr>
+      <w:r>
+        <w:rPr>
+          <w:b/>
+          <w:bCs/>
+          <w:sz w:val="22"/>
+          <w:szCs w:val="22"/>
+        </w:rPr>
+        <w:t xml:space="preserve">Pool </w:t>
+      </w:r>
+      <w:r>
+        <w:rPr>
+          <w:sz w:val="22"/>
+          <w:szCs w:val="22"/>
+        </w:rPr>
+        <w:t xml:space="preserve">= fester Vorrat (hier 5 Schüsse), der wiederverwendet wird – mit bAlive merken wir, welche Plätze belegt sind.</w:t>
+      </w:r>
+    </w:p>
+    <w:p>
+      <w:pPr>
+        <w:pStyle w:val="ListParagraph"/>
+        <w:numPr>
+          <w:ilvl w:val="0"/>
+          <w:numId w:val="2"/>
+        </w:numPr>
+        <w:spacing w:after="60"/>
+      </w:pPr>
+      <w:r>
+        <w:rPr>
+          <w:b/>
+          <w:bCs/>
+          <w:sz w:val="22"/>
+          <w:szCs w:val="22"/>
+        </w:rPr>
+        <w:t xml:space="preserve">BOOLEAN </w:t>
+      </w:r>
+      <w:r>
+        <w:rPr>
+          <w:sz w:val="22"/>
+          <w:szCs w:val="22"/>
+        </w:rPr>
+        <w:t xml:space="preserve">speichert Ja/Nein (TRUE/FALSE).</w:t>
+      </w:r>
+    </w:p>
+    <w:p>
+      <w:pPr>
+        <w:pStyle w:val="ListParagraph"/>
+        <w:numPr>
+          <w:ilvl w:val="0"/>
+          <w:numId w:val="2"/>
+        </w:numPr>
+        <w:spacing w:after="60"/>
+      </w:pPr>
+      <w:r>
+        <w:rPr>
+          <w:b/>
+          <w:bCs/>
+          <w:sz w:val="22"/>
+          <w:szCs w:val="22"/>
+        </w:rPr>
+        <w:t xml:space="preserve">Flankenerkennung </w:t>
+      </w:r>
+      <w:r>
+        <w:rPr>
+          <w:sz w:val="22"/>
+          <w:szCs w:val="22"/>
+        </w:rPr>
+        <w:t xml:space="preserve">(firing AND NOT prevShoot) = ein Schuss pro Tastendruck.</w:t>
+      </w:r>
+    </w:p>
+    <w:p>
+      <w:pPr>
+        <w:pStyle w:val="ListParagraph"/>
+        <w:numPr>
+          <w:ilvl w:val="0"/>
+          <w:numId w:val="2"/>
+        </w:numPr>
+        <w:spacing w:after="60"/>
+      </w:pPr>
+      <w:r>
+        <w:rPr>
+          <w:b/>
+          <w:bCs/>
+          <w:sz w:val="22"/>
+          <w:szCs w:val="22"/>
+        </w:rPr>
+        <w:t xml:space="preserve">BREAK </w:t>
+      </w:r>
+      <w:r>
+        <w:rPr>
+          <w:sz w:val="22"/>
+          <w:szCs w:val="22"/>
+        </w:rPr>
+        <w:t xml:space="preserve">verlässt eine Schleife vorzeitig.</w:t>
+      </w:r>
+    </w:p>
+    <w:p>
+      <w:pPr>
+        <w:pStyle w:val="Heading2"/>
+      </w:pPr>
+      <w:r>
+        <w:t xml:space="preserve">Übung</w:t>
+      </w:r>
+    </w:p>
+    <w:p>
+      <w:pPr>
+        <w:pStyle w:val="ListParagraph"/>
+        <w:numPr>
+          <w:ilvl w:val="0"/>
+          <w:numId w:val="2"/>
+        </w:numPr>
+        <w:spacing w:after="60"/>
+      </w:pPr>
+      <w:r>
+        <w:rPr>
+          <w:sz w:val="22"/>
+          <w:szCs w:val="22"/>
+        </w:rPr>
+        <w:t xml:space="preserve">Erlaube mehr Schüsse gleichzeitig (NBULLET erhöhen).</w:t>
+      </w:r>
+    </w:p>
+    <w:p>
+      <w:pPr>
+        <w:pStyle w:val="ListParagraph"/>
+        <w:numPr>
+          <w:ilvl w:val="0"/>
+          <w:numId w:val="2"/>
+        </w:numPr>
+        <w:spacing w:after="60"/>
+      </w:pPr>
+      <w:r>
+        <w:rPr>
+          <w:sz w:val="22"/>
+          <w:szCs w:val="22"/>
+        </w:rPr>
+        <w:t xml:space="preserve">Mach die Schüsse schneller oder langsamer (die 8).</w:t>
+      </w:r>
+    </w:p>
+    <w:p>
+      <w:pPr>
+        <w:pStyle w:val="ListParagraph"/>
+        <w:numPr>
+          <w:ilvl w:val="0"/>
+          <w:numId w:val="2"/>
+        </w:numPr>
+        <w:spacing w:after="60"/>
+      </w:pPr>
+      <w:r>
+        <w:rPr>
+          <w:sz w:val="22"/>
+          <w:szCs w:val="22"/>
+        </w:rPr>
+        <w:t xml:space="preserve">Entferne die Flankenerkennung (feuere bei gehaltener Taste) – wie fühlt sich das an?</w:t>
       </w:r>
     </w:p>
     <w:sectPr>

</xml_diff>

<commit_message>
docs(buch-galaga): Kapitel 5 "Sternenhimmel mit Parallax"
Code-Kapitel: Sterne in 3 Tiefen-Ebenen (FLOAT-Tempo = Parallax), Funkeln via
SIN(frame+phase) + Helligkeit/INT/RGB, RANDF/MOD erklaert. Fokus auf die
Aufwertung (voller kumulativer Code in code/kap05/sternenhimmel.gb). Code-Bloecke,
Tipp (Frame-Zaehler), Screenshot, Zusammenfassung + Uebungen. gbrt --check clean,
docx validiert (PASSED), 20 Seiten, visuell geprueft.

Co-Authored-By: Claude Opus 4.8 <noreply@anthropic.com>
</commit_message>
<xml_diff>
--- a/buch-galaga/buch/GameBasic-Buch.docx
+++ b/buch-galaga/buch/GameBasic-Buch.docx
@@ -5910,6 +5910,832 @@
           <w:szCs w:val="22"/>
         </w:rPr>
         <w:t xml:space="preserve">Entferne die Flankenerkennung (feuere bei gehaltener Taste) – wie fühlt sich das an?</w:t>
+      </w:r>
+    </w:p>
+    <w:p>
+      <w:r>
+        <w:br w:type="page"/>
+      </w:r>
+    </w:p>
+    <w:p>
+      <w:pPr>
+        <w:pStyle w:val="Heading1"/>
+        <w:pBdr>
+          <w:bottom w:val="single" w:color="1B6CA8" w:sz="12" w:space="4"/>
+        </w:pBdr>
+        <w:spacing w:after="80" w:before="320"/>
+      </w:pPr>
+      <w:r>
+        <w:t xml:space="preserve">Kapitel 5: Sternenhimmel mit Parallax</w:t>
+      </w:r>
+    </w:p>
+    <w:tbl>
+      <w:tblPr>
+        <w:tblW w:type="dxa" w:w="9360"/>
+        <w:tblBorders>
+          <w:top w:val="single" w:color="auto" w:sz="4"/>
+          <w:left w:val="single" w:color="auto" w:sz="4"/>
+          <w:bottom w:val="single" w:color="auto" w:sz="4"/>
+          <w:right w:val="single" w:color="auto" w:sz="4"/>
+          <w:insideH w:val="single" w:color="auto" w:sz="4"/>
+          <w:insideV w:val="single" w:color="auto" w:sz="4"/>
+        </w:tblBorders>
+      </w:tblPr>
+      <w:tblGrid>
+        <w:gridCol w:w="9360"/>
+      </w:tblGrid>
+      <w:tr>
+        <w:tc>
+          <w:tcPr>
+            <w:tcW w:type="dxa" w:w="9360"/>
+            <w:tcBorders>
+              <w:top w:val="single" w:color="9CC8E6" w:sz="6"/>
+              <w:left w:val="single" w:color="9CC8E6" w:sz="6"/>
+              <w:bottom w:val="single" w:color="9CC8E6" w:sz="6"/>
+              <w:right w:val="single" w:color="9CC8E6" w:sz="6"/>
+            </w:tcBorders>
+            <w:shd w:fill="E7F2FA" w:val="clear"/>
+            <w:tcMar>
+              <w:top w:type="dxa" w:w="120"/>
+              <w:left w:type="dxa" w:w="160"/>
+              <w:bottom w:type="dxa" w:w="120"/>
+              <w:right w:type="dxa" w:w="160"/>
+            </w:tcMar>
+          </w:tcPr>
+          <w:p>
+            <w:pPr>
+              <w:spacing w:after="40"/>
+            </w:pPr>
+            <w:r>
+              <w:rPr>
+                <w:b/>
+                <w:bCs/>
+                <w:color w:val="1B6CA8"/>
+                <w:sz w:val="22"/>
+                <w:szCs w:val="22"/>
+              </w:rPr>
+              <w:t xml:space="preserve">In diesem Kapitel</w:t>
+            </w:r>
+          </w:p>
+          <w:p>
+            <w:r>
+              <w:rPr>
+                <w:sz w:val="22"/>
+                <w:szCs w:val="22"/>
+              </w:rPr>
+              <w:t xml:space="preserve">Aus dem schlichten Sternenhimmel von Kapitel 1 wird ein echter Weltraum: Sterne in mehreren Tiefen-Ebenen, die unterschiedlich schnell scrollen und sanft funkeln.</w:t>
+            </w:r>
+          </w:p>
+        </w:tc>
+      </w:tr>
+    </w:tbl>
+    <w:p>
+      <w:pPr>
+        <w:pStyle w:val="Heading2"/>
+      </w:pPr>
+      <w:r>
+        <w:t xml:space="preserve">Tiefe durch Tempo (Parallax)</w:t>
+      </w:r>
+    </w:p>
+    <w:p>
+      <w:pPr>
+        <w:spacing w:after="140"/>
+      </w:pPr>
+      <w:r>
+        <w:rPr>
+          <w:sz w:val="22"/>
+          <w:szCs w:val="22"/>
+        </w:rPr>
+        <w:t xml:space="preserve">Schau aus einem fahrenden Auto: Nahe Dinge sausen vorbei, ferne Berge ziehen langsam dahin. Dieser Effekt heisst Parallax – und er lässt flache Sterne räumlich wirken. Wir teilen unsere Sterne in drei Ebenen: fern (dunkel, langsam), mittel und nah (hell, schnell).</w:t>
+      </w:r>
+    </w:p>
+    <w:p>
+      <w:pPr>
+        <w:spacing w:after="140"/>
+      </w:pPr>
+      <w:r>
+        <w:rPr>
+          <w:sz w:val="22"/>
+          <w:szCs w:val="22"/>
+        </w:rPr>
+        <w:t xml:space="preserve">Für sanfte, unterschiedliche Geschwindigkeiten brauchen wir Kommazahlen – den Typ </w:t>
+      </w:r>
+      <w:r>
+        <w:rPr>
+          <w:rFonts w:ascii="Consolas" w:cs="Consolas" w:eastAsia="Consolas" w:hAnsi="Consolas"/>
+          <w:sz w:val="21"/>
+          <w:szCs w:val="21"/>
+        </w:rPr>
+        <w:t xml:space="preserve">FLOAT</w:t>
+      </w:r>
+      <w:r>
+        <w:rPr>
+          <w:sz w:val="22"/>
+          <w:szCs w:val="22"/>
+        </w:rPr>
+        <w:t xml:space="preserve">. Jeder Stern bekommt Tempo, Helligkeit und eine zufällige „Funkel-Phase“:</w:t>
+      </w:r>
+    </w:p>
+    <w:p>
+      <w:pPr>
+        <w:pBdr>
+          <w:left w:val="single" w:color="1B6CA8" w:sz="18" w:space="6"/>
+        </w:pBdr>
+        <w:shd w:fill="F4F4F4" w:val="clear"/>
+        <w:spacing w:after="160" w:before="80"/>
+        <w:ind w:left="120"/>
+      </w:pPr>
+      <w:r>
+        <w:rPr>
+          <w:rFonts w:ascii="Consolas" w:cs="Consolas" w:eastAsia="Consolas" w:hAnsi="Consolas"/>
+          <w:sz w:val="19"/>
+          <w:szCs w:val="19"/>
+        </w:rPr>
+        <w:t xml:space="preserve">CONST NSTARS AS INTEGER = 80</w:t>
+      </w:r>
+      <w:r>
+        <w:rPr>
+          <w:rFonts w:ascii="Consolas" w:cs="Consolas" w:eastAsia="Consolas" w:hAnsi="Consolas"/>
+          <w:sz w:val="19"/>
+          <w:szCs w:val="19"/>
+        </w:rPr>
+        <w:br/>
+        <w:t xml:space="preserve">DIM starX[NSTARS]   AS FLOAT</w:t>
+      </w:r>
+      <w:r>
+        <w:rPr>
+          <w:rFonts w:ascii="Consolas" w:cs="Consolas" w:eastAsia="Consolas" w:hAnsi="Consolas"/>
+          <w:sz w:val="19"/>
+          <w:szCs w:val="19"/>
+        </w:rPr>
+        <w:br/>
+        <w:t xml:space="preserve">DIM starY[NSTARS]   AS FLOAT</w:t>
+      </w:r>
+      <w:r>
+        <w:rPr>
+          <w:rFonts w:ascii="Consolas" w:cs="Consolas" w:eastAsia="Consolas" w:hAnsi="Consolas"/>
+          <w:sz w:val="19"/>
+          <w:szCs w:val="19"/>
+        </w:rPr>
+        <w:br/>
+        <w:t xml:space="preserve">DIM starSpd[NSTARS] AS FLOAT        ' Tempo = Tiefe</w:t>
+      </w:r>
+      <w:r>
+        <w:rPr>
+          <w:rFonts w:ascii="Consolas" w:cs="Consolas" w:eastAsia="Consolas" w:hAnsi="Consolas"/>
+          <w:sz w:val="19"/>
+          <w:szCs w:val="19"/>
+        </w:rPr>
+        <w:br/>
+        <w:t xml:space="preserve">DIM starBri[NSTARS] AS INTEGER      ' Grund-Helligkeit</w:t>
+      </w:r>
+      <w:r>
+        <w:rPr>
+          <w:rFonts w:ascii="Consolas" w:cs="Consolas" w:eastAsia="Consolas" w:hAnsi="Consolas"/>
+          <w:sz w:val="19"/>
+          <w:szCs w:val="19"/>
+        </w:rPr>
+        <w:br/>
+        <w:t xml:space="preserve">DIM starPh[NSTARS]  AS FLOAT        ' Phase fuers Funkeln</w:t>
+      </w:r>
+      <w:r>
+        <w:rPr>
+          <w:rFonts w:ascii="Consolas" w:cs="Consolas" w:eastAsia="Consolas" w:hAnsi="Consolas"/>
+          <w:sz w:val="19"/>
+          <w:szCs w:val="19"/>
+        </w:rPr>
+        <w:br/>
+        <w:t xml:space="preserve">DIM i AS INTEGER</w:t>
+      </w:r>
+      <w:r>
+        <w:rPr>
+          <w:rFonts w:ascii="Consolas" w:cs="Consolas" w:eastAsia="Consolas" w:hAnsi="Consolas"/>
+          <w:sz w:val="19"/>
+          <w:szCs w:val="19"/>
+        </w:rPr>
+        <w:br/>
+        <w:t xml:space="preserve">FOR i = 0 TO NSTARS - 1</w:t>
+      </w:r>
+      <w:r>
+        <w:rPr>
+          <w:rFonts w:ascii="Consolas" w:cs="Consolas" w:eastAsia="Consolas" w:hAnsi="Consolas"/>
+          <w:sz w:val="19"/>
+          <w:szCs w:val="19"/>
+        </w:rPr>
+        <w:br/>
+        <w:t xml:space="preserve">    starX[i] = RANDF(0.0, 479.0)</w:t>
+      </w:r>
+      <w:r>
+        <w:rPr>
+          <w:rFonts w:ascii="Consolas" w:cs="Consolas" w:eastAsia="Consolas" w:hAnsi="Consolas"/>
+          <w:sz w:val="19"/>
+          <w:szCs w:val="19"/>
+        </w:rPr>
+        <w:br/>
+        <w:t xml:space="preserve">    starY[i] = RANDF(0.0, 639.0)</w:t>
+      </w:r>
+      <w:r>
+        <w:rPr>
+          <w:rFonts w:ascii="Consolas" w:cs="Consolas" w:eastAsia="Consolas" w:hAnsi="Consolas"/>
+          <w:sz w:val="19"/>
+          <w:szCs w:val="19"/>
+        </w:rPr>
+        <w:br/>
+        <w:t xml:space="preserve">    starPh[i] = RANDF(0.0, 6.28)</w:t>
+      </w:r>
+      <w:r>
+        <w:rPr>
+          <w:rFonts w:ascii="Consolas" w:cs="Consolas" w:eastAsia="Consolas" w:hAnsi="Consolas"/>
+          <w:sz w:val="19"/>
+          <w:szCs w:val="19"/>
+        </w:rPr>
+        <w:br/>
+        <w:t xml:space="preserve">    DIM layer AS INTEGER : layer = i MOD 3</w:t>
+      </w:r>
+      <w:r>
+        <w:rPr>
+          <w:rFonts w:ascii="Consolas" w:cs="Consolas" w:eastAsia="Consolas" w:hAnsi="Consolas"/>
+          <w:sz w:val="19"/>
+          <w:szCs w:val="19"/>
+        </w:rPr>
+        <w:br/>
+        <w:t xml:space="preserve">    IF layer = 0 THEN starSpd[i] = 0.5 : starBri[i] = 80</w:t>
+      </w:r>
+      <w:r>
+        <w:rPr>
+          <w:rFonts w:ascii="Consolas" w:cs="Consolas" w:eastAsia="Consolas" w:hAnsi="Consolas"/>
+          <w:sz w:val="19"/>
+          <w:szCs w:val="19"/>
+        </w:rPr>
+        <w:br/>
+        <w:t xml:space="preserve">    IF layer = 1 THEN starSpd[i] = 1.1 : starBri[i] = 150</w:t>
+      </w:r>
+      <w:r>
+        <w:rPr>
+          <w:rFonts w:ascii="Consolas" w:cs="Consolas" w:eastAsia="Consolas" w:hAnsi="Consolas"/>
+          <w:sz w:val="19"/>
+          <w:szCs w:val="19"/>
+        </w:rPr>
+        <w:br/>
+        <w:t xml:space="preserve">    IF layer = 2 THEN starSpd[i] = 2.0 : starBri[i] = 240</w:t>
+      </w:r>
+      <w:r>
+        <w:rPr>
+          <w:rFonts w:ascii="Consolas" w:cs="Consolas" w:eastAsia="Consolas" w:hAnsi="Consolas"/>
+          <w:sz w:val="19"/>
+          <w:szCs w:val="19"/>
+        </w:rPr>
+        <w:br/>
+        <w:t xml:space="preserve">NEXT i</w:t>
+      </w:r>
+    </w:p>
+    <w:p>
+      <w:pPr>
+        <w:spacing w:after="140"/>
+      </w:pPr>
+      <w:r>
+        <w:rPr>
+          <w:sz w:val="22"/>
+          <w:szCs w:val="22"/>
+        </w:rPr>
+        <w:t xml:space="preserve"/>
+      </w:r>
+      <w:r>
+        <w:rPr>
+          <w:rFonts w:ascii="Consolas" w:cs="Consolas" w:eastAsia="Consolas" w:hAnsi="Consolas"/>
+          <w:sz w:val="21"/>
+          <w:szCs w:val="21"/>
+        </w:rPr>
+        <w:t xml:space="preserve">RANDF(min, max)</w:t>
+      </w:r>
+      <w:r>
+        <w:rPr>
+          <w:sz w:val="22"/>
+          <w:szCs w:val="22"/>
+        </w:rPr>
+        <w:t xml:space="preserve"> liefert eine zufällige Kommazahl (anders als </w:t>
+      </w:r>
+      <w:r>
+        <w:rPr>
+          <w:rFonts w:ascii="Consolas" w:cs="Consolas" w:eastAsia="Consolas" w:hAnsi="Consolas"/>
+          <w:sz w:val="21"/>
+          <w:szCs w:val="21"/>
+        </w:rPr>
+        <w:t xml:space="preserve">RANDINT</w:t>
+      </w:r>
+      <w:r>
+        <w:rPr>
+          <w:sz w:val="22"/>
+          <w:szCs w:val="22"/>
+        </w:rPr>
+        <w:t xml:space="preserve">, das ganze Zahlen gibt). </w:t>
+      </w:r>
+      <w:r>
+        <w:rPr>
+          <w:rFonts w:ascii="Consolas" w:cs="Consolas" w:eastAsia="Consolas" w:hAnsi="Consolas"/>
+          <w:sz w:val="21"/>
+          <w:szCs w:val="21"/>
+        </w:rPr>
+        <w:t xml:space="preserve">i MOD 3</w:t>
+      </w:r>
+      <w:r>
+        <w:rPr>
+          <w:sz w:val="22"/>
+          <w:szCs w:val="22"/>
+        </w:rPr>
+        <w:t xml:space="preserve"> ist der Rest beim Teilen durch 3 – ergibt reihum 0, 1, 2 und verteilt die Sterne auf die drei Ebenen.</w:t>
+      </w:r>
+    </w:p>
+    <w:p>
+      <w:pPr>
+        <w:pStyle w:val="Heading2"/>
+      </w:pPr>
+      <w:r>
+        <w:t xml:space="preserve">Funkeln mit SIN</w:t>
+      </w:r>
+    </w:p>
+    <w:p>
+      <w:pPr>
+        <w:spacing w:after="140"/>
+      </w:pPr>
+      <w:r>
+        <w:rPr>
+          <w:sz w:val="22"/>
+          <w:szCs w:val="22"/>
+        </w:rPr>
+        <w:t xml:space="preserve">Funkeln heisst: die Helligkeit eines Sterns schwankt sanft auf und ab. Eine weiche Wellenbewegung liefert der Sinus, SIN. Über die Zeit (unseren Frame-Zähler) plus die eigene Phase jedes Sterns funkelt jeder ein bisschen anders:</w:t>
+      </w:r>
+    </w:p>
+    <w:p>
+      <w:pPr>
+        <w:pBdr>
+          <w:left w:val="single" w:color="1B6CA8" w:sz="18" w:space="6"/>
+        </w:pBdr>
+        <w:shd w:fill="F4F4F4" w:val="clear"/>
+        <w:spacing w:after="160" w:before="80"/>
+        <w:ind w:left="120"/>
+      </w:pPr>
+      <w:r>
+        <w:rPr>
+          <w:rFonts w:ascii="Consolas" w:cs="Consolas" w:eastAsia="Consolas" w:hAnsi="Consolas"/>
+          <w:sz w:val="19"/>
+          <w:szCs w:val="19"/>
+        </w:rPr>
+        <w:t xml:space="preserve">FOR i = 0 TO NSTARS - 1</w:t>
+      </w:r>
+      <w:r>
+        <w:rPr>
+          <w:rFonts w:ascii="Consolas" w:cs="Consolas" w:eastAsia="Consolas" w:hAnsi="Consolas"/>
+          <w:sz w:val="19"/>
+          <w:szCs w:val="19"/>
+        </w:rPr>
+        <w:br/>
+        <w:t xml:space="preserve">    starY[i] = starY[i] + starSpd[i]</w:t>
+      </w:r>
+      <w:r>
+        <w:rPr>
+          <w:rFonts w:ascii="Consolas" w:cs="Consolas" w:eastAsia="Consolas" w:hAnsi="Consolas"/>
+          <w:sz w:val="19"/>
+          <w:szCs w:val="19"/>
+        </w:rPr>
+        <w:br/>
+        <w:t xml:space="preserve">    IF starY[i] &gt; 639.0 THEN starY[i] = 0.0 : starX[i] = RANDF(0.0, 479.0)</w:t>
+      </w:r>
+      <w:r>
+        <w:rPr>
+          <w:rFonts w:ascii="Consolas" w:cs="Consolas" w:eastAsia="Consolas" w:hAnsi="Consolas"/>
+          <w:sz w:val="19"/>
+          <w:szCs w:val="19"/>
+        </w:rPr>
+        <w:br/>
+        <w:t xml:space="preserve">    DIM tw AS FLOAT : tw = 0.55 + 0.45 * SIN(frame * 0.08 + starPh[i])</w:t>
+      </w:r>
+      <w:r>
+        <w:rPr>
+          <w:rFonts w:ascii="Consolas" w:cs="Consolas" w:eastAsia="Consolas" w:hAnsi="Consolas"/>
+          <w:sz w:val="19"/>
+          <w:szCs w:val="19"/>
+        </w:rPr>
+        <w:br/>
+        <w:t xml:space="preserve">    DIM v AS INTEGER : v = INT(starBri[i] * tw)</w:t>
+      </w:r>
+      <w:r>
+        <w:rPr>
+          <w:rFonts w:ascii="Consolas" w:cs="Consolas" w:eastAsia="Consolas" w:hAnsi="Consolas"/>
+          <w:sz w:val="19"/>
+          <w:szCs w:val="19"/>
+        </w:rPr>
+        <w:br/>
+        <w:t xml:space="preserve">    PLOT(INT(starX[i]), INT(starY[i]), RGB(v, v, v))</w:t>
+      </w:r>
+      <w:r>
+        <w:rPr>
+          <w:rFonts w:ascii="Consolas" w:cs="Consolas" w:eastAsia="Consolas" w:hAnsi="Consolas"/>
+          <w:sz w:val="19"/>
+          <w:szCs w:val="19"/>
+        </w:rPr>
+        <w:br/>
+        <w:t xml:space="preserve">NEXT i</w:t>
+      </w:r>
+    </w:p>
+    <w:p>
+      <w:pPr>
+        <w:spacing w:after="140"/>
+      </w:pPr>
+      <w:r>
+        <w:rPr>
+          <w:sz w:val="22"/>
+          <w:szCs w:val="22"/>
+        </w:rPr>
+        <w:t xml:space="preserve"/>
+      </w:r>
+      <w:r>
+        <w:rPr>
+          <w:rFonts w:ascii="Consolas" w:cs="Consolas" w:eastAsia="Consolas" w:hAnsi="Consolas"/>
+          <w:sz w:val="21"/>
+          <w:szCs w:val="21"/>
+        </w:rPr>
+        <w:t xml:space="preserve">SIN(...)</w:t>
+      </w:r>
+      <w:r>
+        <w:rPr>
+          <w:sz w:val="22"/>
+          <w:szCs w:val="22"/>
+        </w:rPr>
+        <w:t xml:space="preserve"> pendelt weich zwischen -1 und 1. Mit </w:t>
+      </w:r>
+      <w:r>
+        <w:rPr>
+          <w:rFonts w:ascii="Consolas" w:cs="Consolas" w:eastAsia="Consolas" w:hAnsi="Consolas"/>
+          <w:sz w:val="21"/>
+          <w:szCs w:val="21"/>
+        </w:rPr>
+        <w:t xml:space="preserve">0.55 + 0.45 * SIN(...)</w:t>
+      </w:r>
+      <w:r>
+        <w:rPr>
+          <w:sz w:val="22"/>
+          <w:szCs w:val="22"/>
+        </w:rPr>
+        <w:t xml:space="preserve"> wird daraus ein Faktor zwischen 0,1 und 1,0 für die Helligkeit. </w:t>
+      </w:r>
+      <w:r>
+        <w:rPr>
+          <w:rFonts w:ascii="Consolas" w:cs="Consolas" w:eastAsia="Consolas" w:hAnsi="Consolas"/>
+          <w:sz w:val="21"/>
+          <w:szCs w:val="21"/>
+        </w:rPr>
+        <w:t xml:space="preserve">INT(...)</w:t>
+      </w:r>
+      <w:r>
+        <w:rPr>
+          <w:sz w:val="22"/>
+          <w:szCs w:val="22"/>
+        </w:rPr>
+        <w:t xml:space="preserve"> macht aus der Kommazahl wieder eine ganze Zahl (Farben und Pixel brauchen ganze Werte), und </w:t>
+      </w:r>
+      <w:r>
+        <w:rPr>
+          <w:rFonts w:ascii="Consolas" w:cs="Consolas" w:eastAsia="Consolas" w:hAnsi="Consolas"/>
+          <w:sz w:val="21"/>
+          <w:szCs w:val="21"/>
+        </w:rPr>
+        <w:t xml:space="preserve">RGB(v, v, v)</w:t>
+      </w:r>
+      <w:r>
+        <w:rPr>
+          <w:sz w:val="22"/>
+          <w:szCs w:val="22"/>
+        </w:rPr>
+        <w:t xml:space="preserve"> mischt aus gleichen Rot/Grün/Blau-Anteilen einen Grauton – mal heller, mal dunkler.</w:t>
+      </w:r>
+    </w:p>
+    <w:tbl>
+      <w:tblPr>
+        <w:tblW w:type="dxa" w:w="9360"/>
+        <w:tblBorders>
+          <w:top w:val="single" w:color="auto" w:sz="4"/>
+          <w:left w:val="single" w:color="auto" w:sz="4"/>
+          <w:bottom w:val="single" w:color="auto" w:sz="4"/>
+          <w:right w:val="single" w:color="auto" w:sz="4"/>
+          <w:insideH w:val="single" w:color="auto" w:sz="4"/>
+          <w:insideV w:val="single" w:color="auto" w:sz="4"/>
+        </w:tblBorders>
+      </w:tblPr>
+      <w:tblGrid>
+        <w:gridCol w:w="9360"/>
+      </w:tblGrid>
+      <w:tr>
+        <w:tc>
+          <w:tcPr>
+            <w:tcW w:type="dxa" w:w="9360"/>
+            <w:tcBorders>
+              <w:top w:val="single" w:color="9CC8E6" w:sz="6"/>
+              <w:left w:val="single" w:color="9CC8E6" w:sz="6"/>
+              <w:bottom w:val="single" w:color="9CC8E6" w:sz="6"/>
+              <w:right w:val="single" w:color="9CC8E6" w:sz="6"/>
+            </w:tcBorders>
+            <w:shd w:fill="E7F2FA" w:val="clear"/>
+            <w:tcMar>
+              <w:top w:type="dxa" w:w="120"/>
+              <w:left w:type="dxa" w:w="160"/>
+              <w:bottom w:type="dxa" w:w="120"/>
+              <w:right w:type="dxa" w:w="160"/>
+            </w:tcMar>
+          </w:tcPr>
+          <w:p>
+            <w:pPr>
+              <w:spacing w:after="40"/>
+            </w:pPr>
+            <w:r>
+              <w:rPr>
+                <w:b/>
+                <w:bCs/>
+                <w:color w:val="1B6CA8"/>
+                <w:sz w:val="22"/>
+                <w:szCs w:val="22"/>
+              </w:rPr>
+              <w:t xml:space="preserve">Frame-Zähler nicht vergessen</w:t>
+            </w:r>
+          </w:p>
+          <w:p>
+            <w:r>
+              <w:rPr>
+                <w:sz w:val="22"/>
+                <w:szCs w:val="22"/>
+              </w:rPr>
+              <w:t xml:space="preserve">Damit sich das Funkeln über die Zeit bewegt, brauchst du eine Variable frame, die in der Schleife jedes Bild um 1 hochzählt (DIM frame AS INTEGER vor der Schleife, frame = frame + 1 als erste Zeile darin).</w:t>
+            </w:r>
+          </w:p>
+        </w:tc>
+      </w:tr>
+    </w:tbl>
+    <w:p>
+      <w:pPr>
+        <w:pStyle w:val="Heading2"/>
+      </w:pPr>
+      <w:r>
+        <w:t xml:space="preserve">Einbauen</w:t>
+      </w:r>
+    </w:p>
+    <w:p>
+      <w:pPr>
+        <w:spacing w:after="140"/>
+      </w:pPr>
+      <w:r>
+        <w:rPr>
+          <w:sz w:val="22"/>
+          <w:szCs w:val="22"/>
+        </w:rPr>
+        <w:t xml:space="preserve">Ersetze den einfachen Sternen-Teil aus Kapitel 1 durch diese beiden Blöcke. Schiff und Schüsse aus Kapitel 4 bleiben unverändert. Das vollständige Programm liegt fertig in </w:t>
+      </w:r>
+      <w:r>
+        <w:rPr>
+          <w:rFonts w:ascii="Consolas" w:cs="Consolas" w:eastAsia="Consolas" w:hAnsi="Consolas"/>
+          <w:sz w:val="21"/>
+          <w:szCs w:val="21"/>
+        </w:rPr>
+        <w:t xml:space="preserve">code/kap05/sternenhimmel.gb</w:t>
+      </w:r>
+      <w:r>
+        <w:rPr>
+          <w:sz w:val="22"/>
+          <w:szCs w:val="22"/>
+        </w:rPr>
+        <w:t xml:space="preserve">.</w:t>
+      </w:r>
+    </w:p>
+    <w:p>
+      <w:pPr>
+        <w:spacing w:after="40" w:before="120"/>
+        <w:jc w:val="center"/>
+      </w:pPr>
+      <w:r>
+        <w:drawing>
+          <wp:inline distT="0" distB="0" distL="0" distR="0">
+            <wp:extent cx="2857500" cy="3810000"/>
+            <wp:effectExtent t="0" r="0" b="0" l="0"/>
+            <wp:docPr id="1" name="kap05_sternenhimmel.png" descr="Ein tieferer Weltraum: Sterne in mehreren Helligkeiten, die funkeln und scrollen." title="Ein tieferer Weltraum: Sterne in mehreren Helligkeiten, die funkeln und scrollen."/>
+            <wp:cNvGraphicFramePr>
+              <a:graphicFrameLocks xmlns:a="http://schemas.openxmlformats.org/drawingml/2006/main" noChangeAspect="1"/>
+            </wp:cNvGraphicFramePr>
+            <a:graphic xmlns:a="http://schemas.openxmlformats.org/drawingml/2006/main">
+              <a:graphicData uri="http://schemas.openxmlformats.org/drawingml/2006/picture">
+                <pic:pic xmlns:pic="http://schemas.openxmlformats.org/drawingml/2006/picture">
+                  <pic:nvPicPr>
+                    <pic:cNvPr id="0" name="" descr=""/>
+                    <pic:cNvPicPr>
+                      <a:picLocks noChangeAspect="1" noChangeArrowheads="1"/>
+                    </pic:cNvPicPr>
+                  </pic:nvPicPr>
+                  <pic:blipFill>
+                    <a:blip r:embed="rId21" cstate="none"/>
+                    <a:srcRect/>
+                    <a:stretch>
+                      <a:fillRect/>
+                    </a:stretch>
+                  </pic:blipFill>
+                  <pic:spPr bwMode="auto">
+                    <a:xfrm>
+                      <a:off x="0" y="0"/>
+                      <a:ext cx="2857500" cy="3810000"/>
+                    </a:xfrm>
+                    <a:prstGeom prst="rect">
+                      <a:avLst/>
+                    </a:prstGeom>
+                  </pic:spPr>
+                </pic:pic>
+              </a:graphicData>
+            </a:graphic>
+          </wp:inline>
+        </w:drawing>
+      </w:r>
+    </w:p>
+    <w:p>
+      <w:pPr>
+        <w:spacing w:after="200"/>
+        <w:jc w:val="center"/>
+      </w:pPr>
+      <w:r>
+        <w:rPr>
+          <w:i/>
+          <w:iCs/>
+          <w:color w:val="6A6A6A"/>
+          <w:sz w:val="18"/>
+          <w:szCs w:val="18"/>
+        </w:rPr>
+        <w:t xml:space="preserve">Ein tieferer Weltraum: Sterne in mehreren Helligkeiten, die funkeln und scrollen.</w:t>
+      </w:r>
+    </w:p>
+    <w:p>
+      <w:pPr>
+        <w:pStyle w:val="Heading2"/>
+      </w:pPr>
+      <w:r>
+        <w:t xml:space="preserve">Was du gelernt hast</w:t>
+      </w:r>
+    </w:p>
+    <w:p>
+      <w:pPr>
+        <w:pStyle w:val="ListParagraph"/>
+        <w:numPr>
+          <w:ilvl w:val="0"/>
+          <w:numId w:val="2"/>
+        </w:numPr>
+        <w:spacing w:after="60"/>
+      </w:pPr>
+      <w:r>
+        <w:rPr>
+          <w:b/>
+          <w:bCs/>
+          <w:sz w:val="22"/>
+          <w:szCs w:val="22"/>
+        </w:rPr>
+        <w:t xml:space="preserve">FLOAT </w:t>
+      </w:r>
+      <w:r>
+        <w:rPr>
+          <w:sz w:val="22"/>
+          <w:szCs w:val="22"/>
+        </w:rPr>
+        <w:t xml:space="preserve">speichert Kommazahlen – nötig für feine Geschwindigkeiten.</w:t>
+      </w:r>
+    </w:p>
+    <w:p>
+      <w:pPr>
+        <w:pStyle w:val="ListParagraph"/>
+        <w:numPr>
+          <w:ilvl w:val="0"/>
+          <w:numId w:val="2"/>
+        </w:numPr>
+        <w:spacing w:after="60"/>
+      </w:pPr>
+      <w:r>
+        <w:rPr>
+          <w:b/>
+          <w:bCs/>
+          <w:sz w:val="22"/>
+          <w:szCs w:val="22"/>
+        </w:rPr>
+        <w:t xml:space="preserve">Parallax </w:t>
+      </w:r>
+      <w:r>
+        <w:rPr>
+          <w:sz w:val="22"/>
+          <w:szCs w:val="22"/>
+        </w:rPr>
+        <w:t xml:space="preserve">= verschiedene Ebenen scrollen verschieden schnell → Raumgefühl.</w:t>
+      </w:r>
+    </w:p>
+    <w:p>
+      <w:pPr>
+        <w:pStyle w:val="ListParagraph"/>
+        <w:numPr>
+          <w:ilvl w:val="0"/>
+          <w:numId w:val="2"/>
+        </w:numPr>
+        <w:spacing w:after="60"/>
+      </w:pPr>
+      <w:r>
+        <w:rPr>
+          <w:b/>
+          <w:bCs/>
+          <w:sz w:val="22"/>
+          <w:szCs w:val="22"/>
+        </w:rPr>
+        <w:t xml:space="preserve">SIN </w:t>
+      </w:r>
+      <w:r>
+        <w:rPr>
+          <w:sz w:val="22"/>
+          <w:szCs w:val="22"/>
+        </w:rPr>
+        <w:t xml:space="preserve">liefert eine weiche Welle – ideal fürs Funkeln (mit eigener Phase pro Stern).</w:t>
+      </w:r>
+    </w:p>
+    <w:p>
+      <w:pPr>
+        <w:pStyle w:val="ListParagraph"/>
+        <w:numPr>
+          <w:ilvl w:val="0"/>
+          <w:numId w:val="2"/>
+        </w:numPr>
+        <w:spacing w:after="60"/>
+      </w:pPr>
+      <w:r>
+        <w:rPr>
+          <w:b/>
+          <w:bCs/>
+          <w:sz w:val="22"/>
+          <w:szCs w:val="22"/>
+        </w:rPr>
+        <w:t xml:space="preserve">INT und RGB </w:t>
+      </w:r>
+      <w:r>
+        <w:rPr>
+          <w:sz w:val="22"/>
+          <w:szCs w:val="22"/>
+        </w:rPr>
+        <w:t xml:space="preserve">wandeln Kommazahlen in ganze Werte und mischen Farben.</w:t>
+      </w:r>
+    </w:p>
+    <w:p>
+      <w:pPr>
+        <w:pStyle w:val="Heading2"/>
+      </w:pPr>
+      <w:r>
+        <w:t xml:space="preserve">Übung</w:t>
+      </w:r>
+    </w:p>
+    <w:p>
+      <w:pPr>
+        <w:pStyle w:val="ListParagraph"/>
+        <w:numPr>
+          <w:ilvl w:val="0"/>
+          <w:numId w:val="2"/>
+        </w:numPr>
+        <w:spacing w:after="60"/>
+      </w:pPr>
+      <w:r>
+        <w:rPr>
+          <w:sz w:val="22"/>
+          <w:szCs w:val="22"/>
+        </w:rPr>
+        <w:t xml:space="preserve">Füge eine vierte, sehr helle und schnelle Ebene hinzu.</w:t>
+      </w:r>
+    </w:p>
+    <w:p>
+      <w:pPr>
+        <w:pStyle w:val="ListParagraph"/>
+        <w:numPr>
+          <w:ilvl w:val="0"/>
+          <w:numId w:val="2"/>
+        </w:numPr>
+        <w:spacing w:after="60"/>
+      </w:pPr>
+      <w:r>
+        <w:rPr>
+          <w:sz w:val="22"/>
+          <w:szCs w:val="22"/>
+        </w:rPr>
+        <w:t xml:space="preserve">Gib den Sternen einen leichten Blaustich (etwas weniger Rot/Grün als Blau).</w:t>
+      </w:r>
+    </w:p>
+    <w:p>
+      <w:pPr>
+        <w:pStyle w:val="ListParagraph"/>
+        <w:numPr>
+          <w:ilvl w:val="0"/>
+          <w:numId w:val="2"/>
+        </w:numPr>
+        <w:spacing w:after="60"/>
+      </w:pPr>
+      <w:r>
+        <w:rPr>
+          <w:sz w:val="22"/>
+          <w:szCs w:val="22"/>
+        </w:rPr>
+        <w:t xml:space="preserve">Ändere die Funkel-Geschwindigkeit (die 0.08).</w:t>
       </w:r>
     </w:p>
     <w:sectPr>

</xml_diff>

<commit_message>
docs(buch-galaga): Kapitel 6 "Gegner & Formation" (Klassen/OOP)
Fuehrt Klassen ein: CLASS Bug (Felder x/y/row/alive, Init-Methode, Self, NEW),
Array von Objekten, Formation 3x8 via MOD/Ganzzahl-Division, Gegner zeichnen mit
DRAWIMAGEPART (Einzel-Frame aus 2-Frame-Sheet) + SIN-Schweben + Fluegelschlag.
Kumulativer Code code/kap06/gegner.gb. Code-Bloecke, Tipp, Screenshot (3 Reihen
mehrfarbig), Zusammenfassung + Uebungen. gbrt --check clean, docx validiert
(PASSED), 23 Seiten, visuell geprueft.

Co-Authored-By: Claude Opus 4.8 <noreply@anthropic.com>
</commit_message>
<xml_diff>
--- a/buch-galaga/buch/GameBasic-Buch.docx
+++ b/buch-galaga/buch/GameBasic-Buch.docx
@@ -6736,6 +6736,958 @@
           <w:szCs w:val="22"/>
         </w:rPr>
         <w:t xml:space="preserve">Ändere die Funkel-Geschwindigkeit (die 0.08).</w:t>
+      </w:r>
+    </w:p>
+    <w:p>
+      <w:r>
+        <w:br w:type="page"/>
+      </w:r>
+    </w:p>
+    <w:p>
+      <w:pPr>
+        <w:pStyle w:val="Heading1"/>
+        <w:pBdr>
+          <w:bottom w:val="single" w:color="1B6CA8" w:sz="12" w:space="4"/>
+        </w:pBdr>
+        <w:spacing w:after="80" w:before="320"/>
+      </w:pPr>
+      <w:r>
+        <w:t xml:space="preserve">Kapitel 6: Gegner &amp; Formation</w:t>
+      </w:r>
+    </w:p>
+    <w:tbl>
+      <w:tblPr>
+        <w:tblW w:type="dxa" w:w="9360"/>
+        <w:tblBorders>
+          <w:top w:val="single" w:color="auto" w:sz="4"/>
+          <w:left w:val="single" w:color="auto" w:sz="4"/>
+          <w:bottom w:val="single" w:color="auto" w:sz="4"/>
+          <w:right w:val="single" w:color="auto" w:sz="4"/>
+          <w:insideH w:val="single" w:color="auto" w:sz="4"/>
+          <w:insideV w:val="single" w:color="auto" w:sz="4"/>
+        </w:tblBorders>
+      </w:tblPr>
+      <w:tblGrid>
+        <w:gridCol w:w="9360"/>
+      </w:tblGrid>
+      <w:tr>
+        <w:tc>
+          <w:tcPr>
+            <w:tcW w:type="dxa" w:w="9360"/>
+            <w:tcBorders>
+              <w:top w:val="single" w:color="9CC8E6" w:sz="6"/>
+              <w:left w:val="single" w:color="9CC8E6" w:sz="6"/>
+              <w:bottom w:val="single" w:color="9CC8E6" w:sz="6"/>
+              <w:right w:val="single" w:color="9CC8E6" w:sz="6"/>
+            </w:tcBorders>
+            <w:shd w:fill="E7F2FA" w:val="clear"/>
+            <w:tcMar>
+              <w:top w:type="dxa" w:w="120"/>
+              <w:left w:type="dxa" w:w="160"/>
+              <w:bottom w:type="dxa" w:w="120"/>
+              <w:right w:type="dxa" w:w="160"/>
+            </w:tcMar>
+          </w:tcPr>
+          <w:p>
+            <w:pPr>
+              <w:spacing w:after="40"/>
+            </w:pPr>
+            <w:r>
+              <w:rPr>
+                <w:b/>
+                <w:bCs/>
+                <w:color w:val="1B6CA8"/>
+                <w:sz w:val="22"/>
+                <w:szCs w:val="22"/>
+              </w:rPr>
+              <w:t xml:space="preserve">In diesem Kapitel</w:t>
+            </w:r>
+          </w:p>
+          <w:p>
+            <w:r>
+              <w:rPr>
+                <w:sz w:val="22"/>
+                <w:szCs w:val="22"/>
+              </w:rPr>
+              <w:t xml:space="preserve">Jetzt kommt Leben ins Spiel: eine ganze Formation bunter Gegner. Dafür lernst du Klassen kennen – einen Bauplan für gleichartige Dinge – und ordnest 24 Gegner in einem Gitter an, das sanft schwebt.</w:t>
+            </w:r>
+          </w:p>
+        </w:tc>
+      </w:tr>
+    </w:tbl>
+    <w:p>
+      <w:pPr>
+        <w:pStyle w:val="Heading2"/>
+      </w:pPr>
+      <w:r>
+        <w:t xml:space="preserve">Eine Klasse für die Gegner</w:t>
+      </w:r>
+    </w:p>
+    <w:p>
+      <w:pPr>
+        <w:spacing w:after="140"/>
+      </w:pPr>
+      <w:r>
+        <w:rPr>
+          <w:sz w:val="22"/>
+          <w:szCs w:val="22"/>
+        </w:rPr>
+        <w:t xml:space="preserve">Alle Gegner sind gleich aufgebaut: jeder hat eine Position, eine Reihe (sie bestimmt die Farbe) und einen Zustand (lebt er noch?). Statt für jeden einzelne Variablen zu schreiben, beschreiben wir einmal den Bauplan – eine Klasse:</w:t>
+      </w:r>
+    </w:p>
+    <w:p>
+      <w:pPr>
+        <w:pBdr>
+          <w:left w:val="single" w:color="1B6CA8" w:sz="18" w:space="6"/>
+        </w:pBdr>
+        <w:shd w:fill="F4F4F4" w:val="clear"/>
+        <w:spacing w:after="160" w:before="80"/>
+        <w:ind w:left="120"/>
+      </w:pPr>
+      <w:r>
+        <w:rPr>
+          <w:rFonts w:ascii="Consolas" w:cs="Consolas" w:eastAsia="Consolas" w:hAnsi="Consolas"/>
+          <w:sz w:val="19"/>
+          <w:szCs w:val="19"/>
+        </w:rPr>
+        <w:t xml:space="preserve">CLASS Bug</w:t>
+      </w:r>
+      <w:r>
+        <w:rPr>
+          <w:rFonts w:ascii="Consolas" w:cs="Consolas" w:eastAsia="Consolas" w:hAnsi="Consolas"/>
+          <w:sz w:val="19"/>
+          <w:szCs w:val="19"/>
+        </w:rPr>
+        <w:br/>
+        <w:t xml:space="preserve">    DIM x AS INTEGER</w:t>
+      </w:r>
+      <w:r>
+        <w:rPr>
+          <w:rFonts w:ascii="Consolas" w:cs="Consolas" w:eastAsia="Consolas" w:hAnsi="Consolas"/>
+          <w:sz w:val="19"/>
+          <w:szCs w:val="19"/>
+        </w:rPr>
+        <w:br/>
+        <w:t xml:space="preserve">    DIM y AS INTEGER</w:t>
+      </w:r>
+      <w:r>
+        <w:rPr>
+          <w:rFonts w:ascii="Consolas" w:cs="Consolas" w:eastAsia="Consolas" w:hAnsi="Consolas"/>
+          <w:sz w:val="19"/>
+          <w:szCs w:val="19"/>
+        </w:rPr>
+        <w:br/>
+        <w:t xml:space="preserve">    DIM row AS INTEGER          ' Reihe 0/1/2 -&gt; Farbe</w:t>
+      </w:r>
+      <w:r>
+        <w:rPr>
+          <w:rFonts w:ascii="Consolas" w:cs="Consolas" w:eastAsia="Consolas" w:hAnsi="Consolas"/>
+          <w:sz w:val="19"/>
+          <w:szCs w:val="19"/>
+        </w:rPr>
+        <w:br/>
+        <w:t xml:space="preserve">    DIM alive AS BOOLEAN</w:t>
+      </w:r>
+      <w:r>
+        <w:rPr>
+          <w:rFonts w:ascii="Consolas" w:cs="Consolas" w:eastAsia="Consolas" w:hAnsi="Consolas"/>
+          <w:sz w:val="19"/>
+          <w:szCs w:val="19"/>
+        </w:rPr>
+        <w:br/>
+        <w:t xml:space="preserve"/>
+      </w:r>
+      <w:r>
+        <w:rPr>
+          <w:rFonts w:ascii="Consolas" w:cs="Consolas" w:eastAsia="Consolas" w:hAnsi="Consolas"/>
+          <w:sz w:val="19"/>
+          <w:szCs w:val="19"/>
+        </w:rPr>
+        <w:br/>
+        <w:t xml:space="preserve">    SUB Init(px AS INTEGER, py AS INTEGER, prow AS INTEGER)</w:t>
+      </w:r>
+      <w:r>
+        <w:rPr>
+          <w:rFonts w:ascii="Consolas" w:cs="Consolas" w:eastAsia="Consolas" w:hAnsi="Consolas"/>
+          <w:sz w:val="19"/>
+          <w:szCs w:val="19"/>
+        </w:rPr>
+        <w:br/>
+        <w:t xml:space="preserve">        Self.x = px : Self.y = py : Self.row = prow : Self.alive = TRUE</w:t>
+      </w:r>
+      <w:r>
+        <w:rPr>
+          <w:rFonts w:ascii="Consolas" w:cs="Consolas" w:eastAsia="Consolas" w:hAnsi="Consolas"/>
+          <w:sz w:val="19"/>
+          <w:szCs w:val="19"/>
+        </w:rPr>
+        <w:br/>
+        <w:t xml:space="preserve">    END SUB</w:t>
+      </w:r>
+      <w:r>
+        <w:rPr>
+          <w:rFonts w:ascii="Consolas" w:cs="Consolas" w:eastAsia="Consolas" w:hAnsi="Consolas"/>
+          <w:sz w:val="19"/>
+          <w:szCs w:val="19"/>
+        </w:rPr>
+        <w:br/>
+        <w:t xml:space="preserve">END CLASS</w:t>
+      </w:r>
+    </w:p>
+    <w:p>
+      <w:pPr>
+        <w:spacing w:after="140"/>
+      </w:pPr>
+      <w:r>
+        <w:rPr>
+          <w:sz w:val="22"/>
+          <w:szCs w:val="22"/>
+        </w:rPr>
+        <w:t xml:space="preserve">Eine </w:t>
+      </w:r>
+      <w:r>
+        <w:rPr>
+          <w:rFonts w:ascii="Consolas" w:cs="Consolas" w:eastAsia="Consolas" w:hAnsi="Consolas"/>
+          <w:sz w:val="21"/>
+          <w:szCs w:val="21"/>
+        </w:rPr>
+        <w:t xml:space="preserve">CLASS</w:t>
+      </w:r>
+      <w:r>
+        <w:rPr>
+          <w:sz w:val="22"/>
+          <w:szCs w:val="22"/>
+        </w:rPr>
+        <w:t xml:space="preserve"> ist ein Bauplan; ein konkreter Gegner daraus heisst Objekt. Die Felder (</w:t>
+      </w:r>
+      <w:r>
+        <w:rPr>
+          <w:rFonts w:ascii="Consolas" w:cs="Consolas" w:eastAsia="Consolas" w:hAnsi="Consolas"/>
+          <w:sz w:val="21"/>
+          <w:szCs w:val="21"/>
+        </w:rPr>
+        <w:t xml:space="preserve">x</w:t>
+      </w:r>
+      <w:r>
+        <w:rPr>
+          <w:sz w:val="22"/>
+          <w:szCs w:val="22"/>
+        </w:rPr>
+        <w:t xml:space="preserve">, </w:t>
+      </w:r>
+      <w:r>
+        <w:rPr>
+          <w:rFonts w:ascii="Consolas" w:cs="Consolas" w:eastAsia="Consolas" w:hAnsi="Consolas"/>
+          <w:sz w:val="21"/>
+          <w:szCs w:val="21"/>
+        </w:rPr>
+        <w:t xml:space="preserve">y</w:t>
+      </w:r>
+      <w:r>
+        <w:rPr>
+          <w:sz w:val="22"/>
+          <w:szCs w:val="22"/>
+        </w:rPr>
+        <w:t xml:space="preserve">, …) gehören jedem Objekt einzeln. </w:t>
+      </w:r>
+      <w:r>
+        <w:rPr>
+          <w:rFonts w:ascii="Consolas" w:cs="Consolas" w:eastAsia="Consolas" w:hAnsi="Consolas"/>
+          <w:sz w:val="21"/>
+          <w:szCs w:val="21"/>
+        </w:rPr>
+        <w:t xml:space="preserve">Init</w:t>
+      </w:r>
+      <w:r>
+        <w:rPr>
+          <w:sz w:val="22"/>
+          <w:szCs w:val="22"/>
+        </w:rPr>
+        <w:t xml:space="preserve"> ist eine besondere Methode: Sie läuft automatisch, wenn wir mit </w:t>
+      </w:r>
+      <w:r>
+        <w:rPr>
+          <w:rFonts w:ascii="Consolas" w:cs="Consolas" w:eastAsia="Consolas" w:hAnsi="Consolas"/>
+          <w:sz w:val="21"/>
+          <w:szCs w:val="21"/>
+        </w:rPr>
+        <w:t xml:space="preserve">NEW</w:t>
+      </w:r>
+      <w:r>
+        <w:rPr>
+          <w:sz w:val="22"/>
+          <w:szCs w:val="22"/>
+        </w:rPr>
+        <w:t xml:space="preserve"> einen Gegner erzeugen, und füllt die Felder. </w:t>
+      </w:r>
+      <w:r>
+        <w:rPr>
+          <w:rFonts w:ascii="Consolas" w:cs="Consolas" w:eastAsia="Consolas" w:hAnsi="Consolas"/>
+          <w:sz w:val="21"/>
+          <w:szCs w:val="21"/>
+        </w:rPr>
+        <w:t xml:space="preserve">Self</w:t>
+      </w:r>
+      <w:r>
+        <w:rPr>
+          <w:sz w:val="22"/>
+          <w:szCs w:val="22"/>
+        </w:rPr>
+        <w:t xml:space="preserve"> meint dabei „dieses eine Objekt“.</w:t>
+      </w:r>
+    </w:p>
+    <w:p>
+      <w:pPr>
+        <w:pStyle w:val="Heading2"/>
+      </w:pPr>
+      <w:r>
+        <w:t xml:space="preserve">Die Formation aufbauen</w:t>
+      </w:r>
+    </w:p>
+    <w:p>
+      <w:pPr>
+        <w:spacing w:after="140"/>
+      </w:pPr>
+      <w:r>
+        <w:rPr>
+          <w:sz w:val="22"/>
+          <w:szCs w:val="22"/>
+        </w:rPr>
+        <w:t xml:space="preserve">24 Gegner = 3 Reihen × 8 Spalten. Wir legen ein Array von Bug-Objekten an und erzeugen sie in einer Schleife. Aus der Laufnummer i berechnen wir Spalte und Reihe:</w:t>
+      </w:r>
+    </w:p>
+    <w:p>
+      <w:pPr>
+        <w:pBdr>
+          <w:left w:val="single" w:color="1B6CA8" w:sz="18" w:space="6"/>
+        </w:pBdr>
+        <w:shd w:fill="F4F4F4" w:val="clear"/>
+        <w:spacing w:after="160" w:before="80"/>
+        <w:ind w:left="120"/>
+      </w:pPr>
+      <w:r>
+        <w:rPr>
+          <w:rFonts w:ascii="Consolas" w:cs="Consolas" w:eastAsia="Consolas" w:hAnsi="Consolas"/>
+          <w:sz w:val="19"/>
+          <w:szCs w:val="19"/>
+        </w:rPr>
+        <w:t xml:space="preserve">CONST COLS AS INTEGER = 8</w:t>
+      </w:r>
+      <w:r>
+        <w:rPr>
+          <w:rFonts w:ascii="Consolas" w:cs="Consolas" w:eastAsia="Consolas" w:hAnsi="Consolas"/>
+          <w:sz w:val="19"/>
+          <w:szCs w:val="19"/>
+        </w:rPr>
+        <w:br/>
+        <w:t xml:space="preserve">CONST ROWS AS INTEGER = 3</w:t>
+      </w:r>
+      <w:r>
+        <w:rPr>
+          <w:rFonts w:ascii="Consolas" w:cs="Consolas" w:eastAsia="Consolas" w:hAnsi="Consolas"/>
+          <w:sz w:val="19"/>
+          <w:szCs w:val="19"/>
+        </w:rPr>
+        <w:br/>
+        <w:t xml:space="preserve">CONST NBUGS AS INTEGER = 24</w:t>
+      </w:r>
+      <w:r>
+        <w:rPr>
+          <w:rFonts w:ascii="Consolas" w:cs="Consolas" w:eastAsia="Consolas" w:hAnsi="Consolas"/>
+          <w:sz w:val="19"/>
+          <w:szCs w:val="19"/>
+        </w:rPr>
+        <w:br/>
+        <w:t xml:space="preserve">DIM bugs[NBUGS] AS Bug</w:t>
+      </w:r>
+      <w:r>
+        <w:rPr>
+          <w:rFonts w:ascii="Consolas" w:cs="Consolas" w:eastAsia="Consolas" w:hAnsi="Consolas"/>
+          <w:sz w:val="19"/>
+          <w:szCs w:val="19"/>
+        </w:rPr>
+        <w:br/>
+        <w:t xml:space="preserve">DIM gapX AS INTEGER : gapX = 48</w:t>
+      </w:r>
+      <w:r>
+        <w:rPr>
+          <w:rFonts w:ascii="Consolas" w:cs="Consolas" w:eastAsia="Consolas" w:hAnsi="Consolas"/>
+          <w:sz w:val="19"/>
+          <w:szCs w:val="19"/>
+        </w:rPr>
+        <w:br/>
+        <w:t xml:space="preserve">DIM startX AS INTEGER : startX = (480 - (COLS - 1) * gapX) \ 2 - 8</w:t>
+      </w:r>
+      <w:r>
+        <w:rPr>
+          <w:rFonts w:ascii="Consolas" w:cs="Consolas" w:eastAsia="Consolas" w:hAnsi="Consolas"/>
+          <w:sz w:val="19"/>
+          <w:szCs w:val="19"/>
+        </w:rPr>
+        <w:br/>
+        <w:t xml:space="preserve">FOR i = 0 TO NBUGS - 1</w:t>
+      </w:r>
+      <w:r>
+        <w:rPr>
+          <w:rFonts w:ascii="Consolas" w:cs="Consolas" w:eastAsia="Consolas" w:hAnsi="Consolas"/>
+          <w:sz w:val="19"/>
+          <w:szCs w:val="19"/>
+        </w:rPr>
+        <w:br/>
+        <w:t xml:space="preserve">    DIM col AS INTEGER : col = i MOD COLS</w:t>
+      </w:r>
+      <w:r>
+        <w:rPr>
+          <w:rFonts w:ascii="Consolas" w:cs="Consolas" w:eastAsia="Consolas" w:hAnsi="Consolas"/>
+          <w:sz w:val="19"/>
+          <w:szCs w:val="19"/>
+        </w:rPr>
+        <w:br/>
+        <w:t xml:space="preserve">    DIM rw AS INTEGER  : rw = i \ COLS</w:t>
+      </w:r>
+      <w:r>
+        <w:rPr>
+          <w:rFonts w:ascii="Consolas" w:cs="Consolas" w:eastAsia="Consolas" w:hAnsi="Consolas"/>
+          <w:sz w:val="19"/>
+          <w:szCs w:val="19"/>
+        </w:rPr>
+        <w:br/>
+        <w:t xml:space="preserve">    bugs[i] = NEW Bug(startX + col * gapX, 60 + rw * 40, rw)</w:t>
+      </w:r>
+      <w:r>
+        <w:rPr>
+          <w:rFonts w:ascii="Consolas" w:cs="Consolas" w:eastAsia="Consolas" w:hAnsi="Consolas"/>
+          <w:sz w:val="19"/>
+          <w:szCs w:val="19"/>
+        </w:rPr>
+        <w:br/>
+        <w:t xml:space="preserve">NEXT i</w:t>
+      </w:r>
+    </w:p>
+    <w:p>
+      <w:pPr>
+        <w:spacing w:after="140"/>
+      </w:pPr>
+      <w:r>
+        <w:rPr>
+          <w:sz w:val="22"/>
+          <w:szCs w:val="22"/>
+        </w:rPr>
+        <w:t xml:space="preserve"/>
+      </w:r>
+      <w:r>
+        <w:rPr>
+          <w:rFonts w:ascii="Consolas" w:cs="Consolas" w:eastAsia="Consolas" w:hAnsi="Consolas"/>
+          <w:sz w:val="21"/>
+          <w:szCs w:val="21"/>
+        </w:rPr>
+        <w:t xml:space="preserve">i MOD COLS</w:t>
+      </w:r>
+      <w:r>
+        <w:rPr>
+          <w:sz w:val="22"/>
+          <w:szCs w:val="22"/>
+        </w:rPr>
+        <w:t xml:space="preserve"> ist der Rest beim Teilen – die Spalte (0…7). </w:t>
+      </w:r>
+      <w:r>
+        <w:rPr>
+          <w:rFonts w:ascii="Consolas" w:cs="Consolas" w:eastAsia="Consolas" w:hAnsi="Consolas"/>
+          <w:sz w:val="21"/>
+          <w:szCs w:val="21"/>
+        </w:rPr>
+        <w:t xml:space="preserve">i \ COLS</w:t>
+      </w:r>
+      <w:r>
+        <w:rPr>
+          <w:sz w:val="22"/>
+          <w:szCs w:val="22"/>
+        </w:rPr>
+        <w:t xml:space="preserve"> ist die Ganzzahl-Division – die Reihe (0…2). </w:t>
+      </w:r>
+      <w:r>
+        <w:rPr>
+          <w:rFonts w:ascii="Consolas" w:cs="Consolas" w:eastAsia="Consolas" w:hAnsi="Consolas"/>
+          <w:sz w:val="21"/>
+          <w:szCs w:val="21"/>
+        </w:rPr>
+        <w:t xml:space="preserve">NEW Bug(...)</w:t>
+      </w:r>
+      <w:r>
+        <w:rPr>
+          <w:sz w:val="22"/>
+          <w:szCs w:val="22"/>
+        </w:rPr>
+        <w:t xml:space="preserve"> erzeugt einen Gegner und ruft dessen </w:t>
+      </w:r>
+      <w:r>
+        <w:rPr>
+          <w:rFonts w:ascii="Consolas" w:cs="Consolas" w:eastAsia="Consolas" w:hAnsi="Consolas"/>
+          <w:sz w:val="21"/>
+          <w:szCs w:val="21"/>
+        </w:rPr>
+        <w:t xml:space="preserve">Init</w:t>
+      </w:r>
+      <w:r>
+        <w:rPr>
+          <w:sz w:val="22"/>
+          <w:szCs w:val="22"/>
+        </w:rPr>
+        <w:t xml:space="preserve"> auf. So füllt sich das Gitter Zeile für Zeile.</w:t>
+      </w:r>
+    </w:p>
+    <w:p>
+      <w:pPr>
+        <w:pStyle w:val="Heading2"/>
+      </w:pPr>
+      <w:r>
+        <w:t xml:space="preserve">Gegner zeichnen – mit Schweben und Flügelschlag</w:t>
+      </w:r>
+    </w:p>
+    <w:p>
+      <w:pPr>
+        <w:spacing w:after="140"/>
+      </w:pPr>
+      <w:r>
+        <w:rPr>
+          <w:sz w:val="22"/>
+          <w:szCs w:val="22"/>
+        </w:rPr>
+        <w:t xml:space="preserve">Jedes Gegner-Bild ist ein kleines Sheet mit zwei Frames (Flügel oben/unten). Mit </w:t>
+      </w:r>
+      <w:r>
+        <w:rPr>
+          <w:rFonts w:ascii="Consolas" w:cs="Consolas" w:eastAsia="Consolas" w:hAnsi="Consolas"/>
+          <w:sz w:val="21"/>
+          <w:szCs w:val="21"/>
+        </w:rPr>
+        <w:t xml:space="preserve">DRAWIMAGEPART</w:t>
+      </w:r>
+      <w:r>
+        <w:rPr>
+          <w:sz w:val="22"/>
+          <w:szCs w:val="22"/>
+        </w:rPr>
+        <w:t xml:space="preserve"> schneiden wir genau ein 16×16-Stück heraus. Die ganze Formation schwebt per </w:t>
+      </w:r>
+      <w:r>
+        <w:rPr>
+          <w:rFonts w:ascii="Consolas" w:cs="Consolas" w:eastAsia="Consolas" w:hAnsi="Consolas"/>
+          <w:sz w:val="21"/>
+          <w:szCs w:val="21"/>
+        </w:rPr>
+        <w:t xml:space="preserve">SIN</w:t>
+      </w:r>
+      <w:r>
+        <w:rPr>
+          <w:sz w:val="22"/>
+          <w:szCs w:val="22"/>
+        </w:rPr>
+        <w:t xml:space="preserve"> hin und her, und der Flügelschlag wechselt im Takt:</w:t>
+      </w:r>
+    </w:p>
+    <w:p>
+      <w:pPr>
+        <w:pBdr>
+          <w:left w:val="single" w:color="1B6CA8" w:sz="18" w:space="6"/>
+        </w:pBdr>
+        <w:shd w:fill="F4F4F4" w:val="clear"/>
+        <w:spacing w:after="160" w:before="80"/>
+        <w:ind w:left="120"/>
+      </w:pPr>
+      <w:r>
+        <w:rPr>
+          <w:rFonts w:ascii="Consolas" w:cs="Consolas" w:eastAsia="Consolas" w:hAnsi="Consolas"/>
+          <w:sz w:val="19"/>
+          <w:szCs w:val="19"/>
+        </w:rPr>
+        <w:t xml:space="preserve">DIM sway AS INTEGER : sway = INT(SIN(frame * 0.04) * 12.0)</w:t>
+      </w:r>
+      <w:r>
+        <w:rPr>
+          <w:rFonts w:ascii="Consolas" w:cs="Consolas" w:eastAsia="Consolas" w:hAnsi="Consolas"/>
+          <w:sz w:val="19"/>
+          <w:szCs w:val="19"/>
+        </w:rPr>
+        <w:br/>
+        <w:t xml:space="preserve">DIM srcX AS INTEGER : srcX = IIF((frame \ 12) MOD 2 = 0, 0, 16)</w:t>
+      </w:r>
+      <w:r>
+        <w:rPr>
+          <w:rFonts w:ascii="Consolas" w:cs="Consolas" w:eastAsia="Consolas" w:hAnsi="Consolas"/>
+          <w:sz w:val="19"/>
+          <w:szCs w:val="19"/>
+        </w:rPr>
+        <w:br/>
+        <w:t xml:space="preserve">FOR i = 0 TO NBUGS - 1</w:t>
+      </w:r>
+      <w:r>
+        <w:rPr>
+          <w:rFonts w:ascii="Consolas" w:cs="Consolas" w:eastAsia="Consolas" w:hAnsi="Consolas"/>
+          <w:sz w:val="19"/>
+          <w:szCs w:val="19"/>
+        </w:rPr>
+        <w:br/>
+        <w:t xml:space="preserve">    IF bugs[i].alive THEN</w:t>
+      </w:r>
+      <w:r>
+        <w:rPr>
+          <w:rFonts w:ascii="Consolas" w:cs="Consolas" w:eastAsia="Consolas" w:hAnsi="Consolas"/>
+          <w:sz w:val="19"/>
+          <w:szCs w:val="19"/>
+        </w:rPr>
+        <w:br/>
+        <w:t xml:space="preserve">        DRAWIMAGEPART(rowImg[bugs[i].row], srcX, 0, 16, 16, bugs[i].x + sway, bugs[i].y)</w:t>
+      </w:r>
+      <w:r>
+        <w:rPr>
+          <w:rFonts w:ascii="Consolas" w:cs="Consolas" w:eastAsia="Consolas" w:hAnsi="Consolas"/>
+          <w:sz w:val="19"/>
+          <w:szCs w:val="19"/>
+        </w:rPr>
+        <w:br/>
+        <w:t xml:space="preserve">    END IF</w:t>
+      </w:r>
+      <w:r>
+        <w:rPr>
+          <w:rFonts w:ascii="Consolas" w:cs="Consolas" w:eastAsia="Consolas" w:hAnsi="Consolas"/>
+          <w:sz w:val="19"/>
+          <w:szCs w:val="19"/>
+        </w:rPr>
+        <w:br/>
+        <w:t xml:space="preserve">NEXT i</w:t>
+      </w:r>
+    </w:p>
+    <w:p>
+      <w:pPr>
+        <w:spacing w:after="140"/>
+      </w:pPr>
+      <w:r>
+        <w:rPr>
+          <w:sz w:val="22"/>
+          <w:szCs w:val="22"/>
+        </w:rPr>
+        <w:t xml:space="preserve"/>
+      </w:r>
+      <w:r>
+        <w:rPr>
+          <w:rFonts w:ascii="Consolas" w:cs="Consolas" w:eastAsia="Consolas" w:hAnsi="Consolas"/>
+          <w:sz w:val="21"/>
+          <w:szCs w:val="21"/>
+        </w:rPr>
+        <w:t xml:space="preserve">DRAWIMAGEPART(bild, sx, sy, sw, sh, x, y)</w:t>
+      </w:r>
+      <w:r>
+        <w:rPr>
+          <w:sz w:val="22"/>
+          <w:szCs w:val="22"/>
+        </w:rPr>
+        <w:t xml:space="preserve"> zeichnet nur den Ausschnitt ab (sx, sy) mit Grösse sw×sh. Mit </w:t>
+      </w:r>
+      <w:r>
+        <w:rPr>
+          <w:rFonts w:ascii="Consolas" w:cs="Consolas" w:eastAsia="Consolas" w:hAnsi="Consolas"/>
+          <w:sz w:val="21"/>
+          <w:szCs w:val="21"/>
+        </w:rPr>
+        <w:t xml:space="preserve">srcX</w:t>
+      </w:r>
+      <w:r>
+        <w:rPr>
+          <w:sz w:val="22"/>
+          <w:szCs w:val="22"/>
+        </w:rPr>
+        <w:t xml:space="preserve"> = 0 oder 16 wählen wir Frame 1 oder 2. </w:t>
+      </w:r>
+      <w:r>
+        <w:rPr>
+          <w:rFonts w:ascii="Consolas" w:cs="Consolas" w:eastAsia="Consolas" w:hAnsi="Consolas"/>
+          <w:sz w:val="21"/>
+          <w:szCs w:val="21"/>
+        </w:rPr>
+        <w:t xml:space="preserve">bugs[i].alive</w:t>
+      </w:r>
+      <w:r>
+        <w:rPr>
+          <w:sz w:val="22"/>
+          <w:szCs w:val="22"/>
+        </w:rPr>
+        <w:t xml:space="preserve"> liest das Feld eines Objekts – nur lebende Gegner werden gezeichnet. </w:t>
+      </w:r>
+      <w:r>
+        <w:rPr>
+          <w:rFonts w:ascii="Consolas" w:cs="Consolas" w:eastAsia="Consolas" w:hAnsi="Consolas"/>
+          <w:sz w:val="21"/>
+          <w:szCs w:val="21"/>
+        </w:rPr>
+        <w:t xml:space="preserve">rowImg</w:t>
+      </w:r>
+      <w:r>
+        <w:rPr>
+          <w:sz w:val="22"/>
+          <w:szCs w:val="22"/>
+        </w:rPr>
+        <w:t xml:space="preserve"> ist ein Array mit dem passenden Bild je Reihe (bug0/1/2.png).</w:t>
+      </w:r>
+    </w:p>
+    <w:p>
+      <w:pPr>
+        <w:spacing w:after="140"/>
+      </w:pPr>
+      <w:r>
+        <w:rPr>
+          <w:sz w:val="22"/>
+          <w:szCs w:val="22"/>
+        </w:rPr>
+        <w:t xml:space="preserve">Das vollständige Programm (mit Sternen, Schiff und Schüssen) liegt in </w:t>
+      </w:r>
+      <w:r>
+        <w:rPr>
+          <w:rFonts w:ascii="Consolas" w:cs="Consolas" w:eastAsia="Consolas" w:hAnsi="Consolas"/>
+          <w:sz w:val="21"/>
+          <w:szCs w:val="21"/>
+        </w:rPr>
+        <w:t xml:space="preserve">code/kap06/gegner.gb</w:t>
+      </w:r>
+      <w:r>
+        <w:rPr>
+          <w:sz w:val="22"/>
+          <w:szCs w:val="22"/>
+        </w:rPr>
+        <w:t xml:space="preserve">.</w:t>
+      </w:r>
+    </w:p>
+    <w:p>
+      <w:pPr>
+        <w:spacing w:after="40" w:before="120"/>
+        <w:jc w:val="center"/>
+      </w:pPr>
+      <w:r>
+        <w:drawing>
+          <wp:inline distT="0" distB="0" distL="0" distR="0">
+            <wp:extent cx="2857500" cy="3810000"/>
+            <wp:effectExtent t="0" r="0" b="0" l="0"/>
+            <wp:docPr id="1" name="kap06_gegner.png" descr="Die Formation: 3 Reihen, 3 Farben, 24 Gegner – sie schweben und schlagen mit den Flügeln." title="Die Formation: 3 Reihen, 3 Farben, 24 Gegner – sie schweben und schlagen mit den Flügeln."/>
+            <wp:cNvGraphicFramePr>
+              <a:graphicFrameLocks xmlns:a="http://schemas.openxmlformats.org/drawingml/2006/main" noChangeAspect="1"/>
+            </wp:cNvGraphicFramePr>
+            <a:graphic xmlns:a="http://schemas.openxmlformats.org/drawingml/2006/main">
+              <a:graphicData uri="http://schemas.openxmlformats.org/drawingml/2006/picture">
+                <pic:pic xmlns:pic="http://schemas.openxmlformats.org/drawingml/2006/picture">
+                  <pic:nvPicPr>
+                    <pic:cNvPr id="0" name="" descr=""/>
+                    <pic:cNvPicPr>
+                      <a:picLocks noChangeAspect="1" noChangeArrowheads="1"/>
+                    </pic:cNvPicPr>
+                  </pic:nvPicPr>
+                  <pic:blipFill>
+                    <a:blip r:embed="rId22" cstate="none"/>
+                    <a:srcRect/>
+                    <a:stretch>
+                      <a:fillRect/>
+                    </a:stretch>
+                  </pic:blipFill>
+                  <pic:spPr bwMode="auto">
+                    <a:xfrm>
+                      <a:off x="0" y="0"/>
+                      <a:ext cx="2857500" cy="3810000"/>
+                    </a:xfrm>
+                    <a:prstGeom prst="rect">
+                      <a:avLst/>
+                    </a:prstGeom>
+                  </pic:spPr>
+                </pic:pic>
+              </a:graphicData>
+            </a:graphic>
+          </wp:inline>
+        </w:drawing>
+      </w:r>
+    </w:p>
+    <w:p>
+      <w:pPr>
+        <w:spacing w:after="200"/>
+        <w:jc w:val="center"/>
+      </w:pPr>
+      <w:r>
+        <w:rPr>
+          <w:i/>
+          <w:iCs/>
+          <w:color w:val="6A6A6A"/>
+          <w:sz w:val="18"/>
+          <w:szCs w:val="18"/>
+        </w:rPr>
+        <w:t xml:space="preserve">Die Formation: 3 Reihen, 3 Farben, 24 Gegner – sie schweben und schlagen mit den Flügeln.</w:t>
+      </w:r>
+    </w:p>
+    <w:p>
+      <w:pPr>
+        <w:pStyle w:val="Heading2"/>
+      </w:pPr>
+      <w:r>
+        <w:t xml:space="preserve">Was du gelernt hast</w:t>
+      </w:r>
+    </w:p>
+    <w:p>
+      <w:pPr>
+        <w:pStyle w:val="ListParagraph"/>
+        <w:numPr>
+          <w:ilvl w:val="0"/>
+          <w:numId w:val="2"/>
+        </w:numPr>
+        <w:spacing w:after="60"/>
+      </w:pPr>
+      <w:r>
+        <w:rPr>
+          <w:b/>
+          <w:bCs/>
+          <w:sz w:val="22"/>
+          <w:szCs w:val="22"/>
+        </w:rPr>
+        <w:t xml:space="preserve">CLASS </w:t>
+      </w:r>
+      <w:r>
+        <w:rPr>
+          <w:sz w:val="22"/>
+          <w:szCs w:val="22"/>
+        </w:rPr>
+        <w:t xml:space="preserve">= Bauplan; ein Objekt daraus hat eigene Felder. NEW erzeugt es, Init füllt es, Self meint das Objekt selbst.</w:t>
+      </w:r>
+    </w:p>
+    <w:p>
+      <w:pPr>
+        <w:pStyle w:val="ListParagraph"/>
+        <w:numPr>
+          <w:ilvl w:val="0"/>
+          <w:numId w:val="2"/>
+        </w:numPr>
+        <w:spacing w:after="60"/>
+      </w:pPr>
+      <w:r>
+        <w:rPr>
+          <w:b/>
+          <w:bCs/>
+          <w:sz w:val="22"/>
+          <w:szCs w:val="22"/>
+        </w:rPr>
+        <w:t xml:space="preserve">Array von Objekten </w:t>
+      </w:r>
+      <w:r>
+        <w:rPr>
+          <w:sz w:val="22"/>
+          <w:szCs w:val="22"/>
+        </w:rPr>
+        <w:t xml:space="preserve">(DIM bugs[NBUGS] AS Bug) verwaltet viele Gegner auf einmal.</w:t>
+      </w:r>
+    </w:p>
+    <w:p>
+      <w:pPr>
+        <w:pStyle w:val="ListParagraph"/>
+        <w:numPr>
+          <w:ilvl w:val="0"/>
+          <w:numId w:val="2"/>
+        </w:numPr>
+        <w:spacing w:after="60"/>
+      </w:pPr>
+      <w:r>
+        <w:rPr>
+          <w:b/>
+          <w:bCs/>
+          <w:sz w:val="22"/>
+          <w:szCs w:val="22"/>
+        </w:rPr>
+        <w:t xml:space="preserve">MOD und \ </w:t>
+      </w:r>
+      <w:r>
+        <w:rPr>
+          <w:sz w:val="22"/>
+          <w:szCs w:val="22"/>
+        </w:rPr>
+        <w:t xml:space="preserve">rechnen aus einer Laufnummer Spalte und Reihe – praktisch für Gitter.</w:t>
+      </w:r>
+    </w:p>
+    <w:p>
+      <w:pPr>
+        <w:pStyle w:val="ListParagraph"/>
+        <w:numPr>
+          <w:ilvl w:val="0"/>
+          <w:numId w:val="2"/>
+        </w:numPr>
+        <w:spacing w:after="60"/>
+      </w:pPr>
+      <w:r>
+        <w:rPr>
+          <w:b/>
+          <w:bCs/>
+          <w:sz w:val="22"/>
+          <w:szCs w:val="22"/>
+        </w:rPr>
+        <w:t xml:space="preserve">DRAWIMAGEPART </w:t>
+      </w:r>
+      <w:r>
+        <w:rPr>
+          <w:sz w:val="22"/>
+          <w:szCs w:val="22"/>
+        </w:rPr>
+        <w:t xml:space="preserve">zeichnet einen Bild-Ausschnitt – so nutzen wir einzelne Animations-Frames.</w:t>
+      </w:r>
+    </w:p>
+    <w:p>
+      <w:pPr>
+        <w:pStyle w:val="Heading2"/>
+      </w:pPr>
+      <w:r>
+        <w:t xml:space="preserve">Übung</w:t>
+      </w:r>
+    </w:p>
+    <w:p>
+      <w:pPr>
+        <w:pStyle w:val="ListParagraph"/>
+        <w:numPr>
+          <w:ilvl w:val="0"/>
+          <w:numId w:val="2"/>
+        </w:numPr>
+        <w:spacing w:after="60"/>
+      </w:pPr>
+      <w:r>
+        <w:rPr>
+          <w:sz w:val="22"/>
+          <w:szCs w:val="22"/>
+        </w:rPr>
+        <w:t xml:space="preserve">Ändere die Formationsgrösse (COLS/ROWS) und die Abstände (gapX).</w:t>
+      </w:r>
+    </w:p>
+    <w:p>
+      <w:pPr>
+        <w:pStyle w:val="ListParagraph"/>
+        <w:numPr>
+          <w:ilvl w:val="0"/>
+          <w:numId w:val="2"/>
+        </w:numPr>
+        <w:spacing w:after="60"/>
+      </w:pPr>
+      <w:r>
+        <w:rPr>
+          <w:sz w:val="22"/>
+          <w:szCs w:val="22"/>
+        </w:rPr>
+        <w:t xml:space="preserve">Lass die Formation stärker oder schneller schweben (die 12 bzw. 0.04).</w:t>
+      </w:r>
+    </w:p>
+    <w:p>
+      <w:pPr>
+        <w:pStyle w:val="ListParagraph"/>
+        <w:numPr>
+          <w:ilvl w:val="0"/>
+          <w:numId w:val="2"/>
+        </w:numPr>
+        <w:spacing w:after="60"/>
+      </w:pPr>
+      <w:r>
+        <w:rPr>
+          <w:sz w:val="22"/>
+          <w:szCs w:val="22"/>
+        </w:rPr>
+        <w:t xml:space="preserve">Verlangsame den Flügelschlag (die 12 in der Frame-Wahl).</w:t>
       </w:r>
     </w:p>
     <w:sectPr>

</xml_diff>

<commit_message>
docs(buch-galaga): Kapitel 7 "Einflug-Manoever" (Bezier-Kurven + Tupel)
Gegner fliegen in Boegen ein: curves-Modul (IMPORT), CURVE_BEZIER2(t,...) ->
Punkt, Tupel-Destructuring (bx,by)=..., Bug-Klasse um Pfad-Felder (4
Kontrollpunkte/t/ts/delay/inForm) + Update-Methode erweitert (entlang Kurve,
dann FORM). Kumulativ code/kap07/einflug.gb. Code-Bloecke, Tipp, Screenshot
(gestaffelter Einflug), Zusammenfassung + Uebungen. gbrt --check clean, docx
validiert (PASSED), 26 Seiten, visuell geprueft.

Co-Authored-By: Claude Opus 4.8 <noreply@anthropic.com>
</commit_message>
<xml_diff>
--- a/buch-galaga/buch/GameBasic-Buch.docx
+++ b/buch-galaga/buch/GameBasic-Buch.docx
@@ -7688,6 +7688,906 @@
           <w:szCs w:val="22"/>
         </w:rPr>
         <w:t xml:space="preserve">Verlangsame den Flügelschlag (die 12 in der Frame-Wahl).</w:t>
+      </w:r>
+    </w:p>
+    <w:p>
+      <w:r>
+        <w:br w:type="page"/>
+      </w:r>
+    </w:p>
+    <w:p>
+      <w:pPr>
+        <w:pStyle w:val="Heading1"/>
+        <w:pBdr>
+          <w:bottom w:val="single" w:color="1B6CA8" w:sz="12" w:space="4"/>
+        </w:pBdr>
+        <w:spacing w:after="80" w:before="320"/>
+      </w:pPr>
+      <w:r>
+        <w:t xml:space="preserve">Kapitel 7: Einflug-Manöver</w:t>
+      </w:r>
+    </w:p>
+    <w:tbl>
+      <w:tblPr>
+        <w:tblW w:type="dxa" w:w="9360"/>
+        <w:tblBorders>
+          <w:top w:val="single" w:color="auto" w:sz="4"/>
+          <w:left w:val="single" w:color="auto" w:sz="4"/>
+          <w:bottom w:val="single" w:color="auto" w:sz="4"/>
+          <w:right w:val="single" w:color="auto" w:sz="4"/>
+          <w:insideH w:val="single" w:color="auto" w:sz="4"/>
+          <w:insideV w:val="single" w:color="auto" w:sz="4"/>
+        </w:tblBorders>
+      </w:tblPr>
+      <w:tblGrid>
+        <w:gridCol w:w="9360"/>
+      </w:tblGrid>
+      <w:tr>
+        <w:tc>
+          <w:tcPr>
+            <w:tcW w:type="dxa" w:w="9360"/>
+            <w:tcBorders>
+              <w:top w:val="single" w:color="9CC8E6" w:sz="6"/>
+              <w:left w:val="single" w:color="9CC8E6" w:sz="6"/>
+              <w:bottom w:val="single" w:color="9CC8E6" w:sz="6"/>
+              <w:right w:val="single" w:color="9CC8E6" w:sz="6"/>
+            </w:tcBorders>
+            <w:shd w:fill="E7F2FA" w:val="clear"/>
+            <w:tcMar>
+              <w:top w:type="dxa" w:w="120"/>
+              <w:left w:type="dxa" w:w="160"/>
+              <w:bottom w:type="dxa" w:w="120"/>
+              <w:right w:type="dxa" w:w="160"/>
+            </w:tcMar>
+          </w:tcPr>
+          <w:p>
+            <w:pPr>
+              <w:spacing w:after="40"/>
+            </w:pPr>
+            <w:r>
+              <w:rPr>
+                <w:b/>
+                <w:bCs/>
+                <w:color w:val="1B6CA8"/>
+                <w:sz w:val="22"/>
+                <w:szCs w:val="22"/>
+              </w:rPr>
+              <w:t xml:space="preserve">In diesem Kapitel</w:t>
+            </w:r>
+          </w:p>
+          <w:p>
+            <w:r>
+              <w:rPr>
+                <w:sz w:val="22"/>
+                <w:szCs w:val="22"/>
+              </w:rPr>
+              <w:t xml:space="preserve">Die Gegner stehen nicht mehr einfach da – sie fliegen in eleganten, geschwungenen Bögen ein und sammeln sich dann zur Formation. Das ist der Moment, in dem es sich richtig nach Galaga anfühlt.</w:t>
+            </w:r>
+          </w:p>
+        </w:tc>
+      </w:tr>
+    </w:tbl>
+    <w:p>
+      <w:pPr>
+        <w:pStyle w:val="Heading2"/>
+      </w:pPr>
+      <w:r>
+        <w:t xml:space="preserve">Geschwungene Bahnen mit Bézier-Kurven</w:t>
+      </w:r>
+    </w:p>
+    <w:p>
+      <w:pPr>
+        <w:spacing w:after="140"/>
+      </w:pPr>
+      <w:r>
+        <w:rPr>
+          <w:sz w:val="22"/>
+          <w:szCs w:val="22"/>
+        </w:rPr>
+        <w:t xml:space="preserve">Eine gerade Linie ist langweilig. Schöne Kurven beschreibt man mit Bézier-Kurven: aus vier Punkten – Start, zwei „Zieh-Punkten“ für die Form und Ziel – entsteht eine weiche Bahn. GameBasic liefert sie fertig im curves-Modul:</w:t>
+      </w:r>
+    </w:p>
+    <w:p>
+      <w:pPr>
+        <w:pBdr>
+          <w:left w:val="single" w:color="1B6CA8" w:sz="18" w:space="6"/>
+        </w:pBdr>
+        <w:shd w:fill="F4F4F4" w:val="clear"/>
+        <w:spacing w:after="160" w:before="80"/>
+        <w:ind w:left="120"/>
+      </w:pPr>
+      <w:r>
+        <w:rPr>
+          <w:rFonts w:ascii="Consolas" w:cs="Consolas" w:eastAsia="Consolas" w:hAnsi="Consolas"/>
+          <w:sz w:val="19"/>
+          <w:szCs w:val="19"/>
+        </w:rPr>
+        <w:t xml:space="preserve">IMPORT "curves"</w:t>
+      </w:r>
+    </w:p>
+    <w:p>
+      <w:pPr>
+        <w:spacing w:after="140"/>
+      </w:pPr>
+      <w:r>
+        <w:rPr>
+          <w:sz w:val="22"/>
+          <w:szCs w:val="22"/>
+        </w:rPr>
+        <w:t xml:space="preserve"/>
+      </w:r>
+      <w:r>
+        <w:rPr>
+          <w:rFonts w:ascii="Consolas" w:cs="Consolas" w:eastAsia="Consolas" w:hAnsi="Consolas"/>
+          <w:sz w:val="21"/>
+          <w:szCs w:val="21"/>
+        </w:rPr>
+        <w:t xml:space="preserve">IMPORT</w:t>
+      </w:r>
+      <w:r>
+        <w:rPr>
+          <w:sz w:val="22"/>
+          <w:szCs w:val="22"/>
+        </w:rPr>
+        <w:t xml:space="preserve"> holt ein Zusatz-Modul dazu. </w:t>
+      </w:r>
+      <w:r>
+        <w:rPr>
+          <w:rFonts w:ascii="Consolas" w:cs="Consolas" w:eastAsia="Consolas" w:hAnsi="Consolas"/>
+          <w:sz w:val="21"/>
+          <w:szCs w:val="21"/>
+        </w:rPr>
+        <w:t xml:space="preserve">CURVE_BEZIER2(t, x0,y0, x1,y1, x2,y2, x3,y3)</w:t>
+      </w:r>
+      <w:r>
+        <w:rPr>
+          <w:sz w:val="22"/>
+          <w:szCs w:val="22"/>
+        </w:rPr>
+        <w:t xml:space="preserve"> berechnet einen Punkt auf der Kurve. </w:t>
+      </w:r>
+      <w:r>
+        <w:rPr>
+          <w:rFonts w:ascii="Consolas" w:cs="Consolas" w:eastAsia="Consolas" w:hAnsi="Consolas"/>
+          <w:sz w:val="21"/>
+          <w:szCs w:val="21"/>
+        </w:rPr>
+        <w:t xml:space="preserve">t</w:t>
+      </w:r>
+      <w:r>
+        <w:rPr>
+          <w:sz w:val="22"/>
+          <w:szCs w:val="22"/>
+        </w:rPr>
+        <w:t xml:space="preserve"> läuft dabei von 0 (Start) bis 1 (Ziel) – bei 0,5 ist man in der Mitte der Bahn.</w:t>
+      </w:r>
+    </w:p>
+    <w:p>
+      <w:pPr>
+        <w:pStyle w:val="Heading2"/>
+      </w:pPr>
+      <w:r>
+        <w:t xml:space="preserve">Tupel: zwei Werte auf einmal</w:t>
+      </w:r>
+    </w:p>
+    <w:p>
+      <w:pPr>
+        <w:spacing w:after="140"/>
+      </w:pPr>
+      <w:r>
+        <w:rPr>
+          <w:sz w:val="22"/>
+          <w:szCs w:val="22"/>
+        </w:rPr>
+        <w:t xml:space="preserve">Ein Punkt hat zwei Zahlen: x und y. CURVE_BEZIER2 gibt deshalb gleich beide zurück – als Tupel. Mit einer Klammer-Zuweisung holen wir sie in zwei Variablen:</w:t>
+      </w:r>
+    </w:p>
+    <w:p>
+      <w:pPr>
+        <w:pBdr>
+          <w:left w:val="single" w:color="1B6CA8" w:sz="18" w:space="6"/>
+        </w:pBdr>
+        <w:shd w:fill="F4F4F4" w:val="clear"/>
+        <w:spacing w:after="160" w:before="80"/>
+        <w:ind w:left="120"/>
+      </w:pPr>
+      <w:r>
+        <w:rPr>
+          <w:rFonts w:ascii="Consolas" w:cs="Consolas" w:eastAsia="Consolas" w:hAnsi="Consolas"/>
+          <w:sz w:val="19"/>
+          <w:szCs w:val="19"/>
+        </w:rPr>
+        <w:t xml:space="preserve">DIM bx AS FLOAT : DIM by AS FLOAT</w:t>
+      </w:r>
+      <w:r>
+        <w:rPr>
+          <w:rFonts w:ascii="Consolas" w:cs="Consolas" w:eastAsia="Consolas" w:hAnsi="Consolas"/>
+          <w:sz w:val="19"/>
+          <w:szCs w:val="19"/>
+        </w:rPr>
+        <w:br/>
+        <w:t xml:space="preserve">(bx, by) = CURVE_BEZIER2(t, cx0, cy0, cx1, cy1, cx2, cy2, cx3, cy3)</w:t>
+      </w:r>
+    </w:p>
+    <w:p>
+      <w:pPr>
+        <w:spacing w:after="140"/>
+      </w:pPr>
+      <w:r>
+        <w:rPr>
+          <w:sz w:val="22"/>
+          <w:szCs w:val="22"/>
+        </w:rPr>
+        <w:t xml:space="preserve">Die linke Seite </w:t>
+      </w:r>
+      <w:r>
+        <w:rPr>
+          <w:rFonts w:ascii="Consolas" w:cs="Consolas" w:eastAsia="Consolas" w:hAnsi="Consolas"/>
+          <w:sz w:val="21"/>
+          <w:szCs w:val="21"/>
+        </w:rPr>
+        <w:t xml:space="preserve">(bx, by)</w:t>
+      </w:r>
+      <w:r>
+        <w:rPr>
+          <w:sz w:val="22"/>
+          <w:szCs w:val="22"/>
+        </w:rPr>
+        <w:t xml:space="preserve"> verteilt die beiden Rückgabewerte auf zwei Variablen – praktisch, wenn etwas mehr als einen Wert liefert.</w:t>
+      </w:r>
+    </w:p>
+    <w:p>
+      <w:pPr>
+        <w:pStyle w:val="Heading2"/>
+      </w:pPr>
+      <w:r>
+        <w:t xml:space="preserve">Der Gegner bekommt eine Flugbahn</w:t>
+      </w:r>
+    </w:p>
+    <w:p>
+      <w:pPr>
+        <w:spacing w:after="140"/>
+      </w:pPr>
+      <w:r>
+        <w:rPr>
+          <w:sz w:val="22"/>
+          <w:szCs w:val="22"/>
+        </w:rPr>
+        <w:t xml:space="preserve">Wir erweitern die Bug-Klasse um die vier Kontrollpunkte, einen Fortschritt t mit Tempo, einen Startverzögerung delay (damit nicht alle gleichzeitig losfliegen) und ein Flag inForm. In Init legen wir die Bahn fest – von ausserhalb des Bildes in einem Bogen zur Heimatposition:</w:t>
+      </w:r>
+    </w:p>
+    <w:p>
+      <w:pPr>
+        <w:pBdr>
+          <w:left w:val="single" w:color="1B6CA8" w:sz="18" w:space="6"/>
+        </w:pBdr>
+        <w:shd w:fill="F4F4F4" w:val="clear"/>
+        <w:spacing w:after="160" w:before="80"/>
+        <w:ind w:left="120"/>
+      </w:pPr>
+      <w:r>
+        <w:rPr>
+          <w:rFonts w:ascii="Consolas" w:cs="Consolas" w:eastAsia="Consolas" w:hAnsi="Consolas"/>
+          <w:sz w:val="19"/>
+          <w:szCs w:val="19"/>
+        </w:rPr>
+        <w:t xml:space="preserve">SUB Init(phx AS FLOAT, phy AS FLOAT, prow AS INTEGER, pdelay AS INTEGER)</w:t>
+      </w:r>
+      <w:r>
+        <w:rPr>
+          <w:rFonts w:ascii="Consolas" w:cs="Consolas" w:eastAsia="Consolas" w:hAnsi="Consolas"/>
+          <w:sz w:val="19"/>
+          <w:szCs w:val="19"/>
+        </w:rPr>
+        <w:br/>
+        <w:t xml:space="preserve">    Self.hx = phx : Self.hy = phy : Self.row = prow</w:t>
+      </w:r>
+      <w:r>
+        <w:rPr>
+          <w:rFonts w:ascii="Consolas" w:cs="Consolas" w:eastAsia="Consolas" w:hAnsi="Consolas"/>
+          <w:sz w:val="19"/>
+          <w:szCs w:val="19"/>
+        </w:rPr>
+        <w:br/>
+        <w:t xml:space="preserve">    Self.alive = TRUE : Self.inForm = FALSE</w:t>
+      </w:r>
+      <w:r>
+        <w:rPr>
+          <w:rFonts w:ascii="Consolas" w:cs="Consolas" w:eastAsia="Consolas" w:hAnsi="Consolas"/>
+          <w:sz w:val="19"/>
+          <w:szCs w:val="19"/>
+        </w:rPr>
+        <w:br/>
+        <w:t xml:space="preserve">    Self.t = 0.0 : Self.ts = 0.012 : Self.delay = pdelay</w:t>
+      </w:r>
+      <w:r>
+        <w:rPr>
+          <w:rFonts w:ascii="Consolas" w:cs="Consolas" w:eastAsia="Consolas" w:hAnsi="Consolas"/>
+          <w:sz w:val="19"/>
+          <w:szCs w:val="19"/>
+        </w:rPr>
+        <w:br/>
+        <w:t xml:space="preserve">    DIM side AS INTEGER : side = IIF(prow MOD 2 = 0, -1, 1)</w:t>
+      </w:r>
+      <w:r>
+        <w:rPr>
+          <w:rFonts w:ascii="Consolas" w:cs="Consolas" w:eastAsia="Consolas" w:hAnsi="Consolas"/>
+          <w:sz w:val="19"/>
+          <w:szCs w:val="19"/>
+        </w:rPr>
+        <w:br/>
+        <w:t xml:space="preserve">    Self.cx0 = phx - side * 180.0 : Self.cy0 = -30.0</w:t>
+      </w:r>
+      <w:r>
+        <w:rPr>
+          <w:rFonts w:ascii="Consolas" w:cs="Consolas" w:eastAsia="Consolas" w:hAnsi="Consolas"/>
+          <w:sz w:val="19"/>
+          <w:szCs w:val="19"/>
+        </w:rPr>
+        <w:br/>
+        <w:t xml:space="preserve">    Self.cx1 = 240.0 + side * 140.0 : Self.cy1 = 120.0</w:t>
+      </w:r>
+      <w:r>
+        <w:rPr>
+          <w:rFonts w:ascii="Consolas" w:cs="Consolas" w:eastAsia="Consolas" w:hAnsi="Consolas"/>
+          <w:sz w:val="19"/>
+          <w:szCs w:val="19"/>
+        </w:rPr>
+        <w:br/>
+        <w:t xml:space="preserve">    Self.cx2 = phx + side * 80.0 : Self.cy2 = 40.0</w:t>
+      </w:r>
+      <w:r>
+        <w:rPr>
+          <w:rFonts w:ascii="Consolas" w:cs="Consolas" w:eastAsia="Consolas" w:hAnsi="Consolas"/>
+          <w:sz w:val="19"/>
+          <w:szCs w:val="19"/>
+        </w:rPr>
+        <w:br/>
+        <w:t xml:space="preserve">    Self.cx3 = phx : Self.cy3 = phy</w:t>
+      </w:r>
+      <w:r>
+        <w:rPr>
+          <w:rFonts w:ascii="Consolas" w:cs="Consolas" w:eastAsia="Consolas" w:hAnsi="Consolas"/>
+          <w:sz w:val="19"/>
+          <w:szCs w:val="19"/>
+        </w:rPr>
+        <w:br/>
+        <w:t xml:space="preserve">    Self.x = Self.cx0 : Self.y = Self.cy0</w:t>
+      </w:r>
+      <w:r>
+        <w:rPr>
+          <w:rFonts w:ascii="Consolas" w:cs="Consolas" w:eastAsia="Consolas" w:hAnsi="Consolas"/>
+          <w:sz w:val="19"/>
+          <w:szCs w:val="19"/>
+        </w:rPr>
+        <w:br/>
+        <w:t xml:space="preserve">END SUB</w:t>
+      </w:r>
+    </w:p>
+    <w:p>
+      <w:pPr>
+        <w:spacing w:after="140"/>
+      </w:pPr>
+      <w:r>
+        <w:rPr>
+          <w:sz w:val="22"/>
+          <w:szCs w:val="22"/>
+        </w:rPr>
+        <w:t xml:space="preserve"/>
+      </w:r>
+      <w:r>
+        <w:rPr>
+          <w:rFonts w:ascii="Consolas" w:cs="Consolas" w:eastAsia="Consolas" w:hAnsi="Consolas"/>
+          <w:sz w:val="21"/>
+          <w:szCs w:val="21"/>
+        </w:rPr>
+        <w:t xml:space="preserve">side</w:t>
+      </w:r>
+      <w:r>
+        <w:rPr>
+          <w:sz w:val="22"/>
+          <w:szCs w:val="22"/>
+        </w:rPr>
+        <w:t xml:space="preserve"> ist je nach Reihe -1 oder 1 – so kommen die Gegner abwechselnd von links und rechts. Start (cx0/cy0) liegt oben ausserhalb des Bildes, Ziel (cx3/cy3) ist die Formationsposition.</w:t>
+      </w:r>
+    </w:p>
+    <w:p>
+      <w:pPr>
+        <w:pStyle w:val="Heading2"/>
+      </w:pPr>
+      <w:r>
+        <w:t xml:space="preserve">Bewegen entlang der Kurve</w:t>
+      </w:r>
+    </w:p>
+    <w:p>
+      <w:pPr>
+        <w:spacing w:after="140"/>
+      </w:pPr>
+      <w:r>
+        <w:rPr>
+          <w:sz w:val="22"/>
+          <w:szCs w:val="22"/>
+        </w:rPr>
+        <w:t xml:space="preserve">Die Update-Methode treibt den Gegner über die Bahn. Ist er angekommen (t ≥ 1), schwebt er ab da nur noch in der Formation:</w:t>
+      </w:r>
+    </w:p>
+    <w:p>
+      <w:pPr>
+        <w:pBdr>
+          <w:left w:val="single" w:color="1B6CA8" w:sz="18" w:space="6"/>
+        </w:pBdr>
+        <w:shd w:fill="F4F4F4" w:val="clear"/>
+        <w:spacing w:after="160" w:before="80"/>
+        <w:ind w:left="120"/>
+      </w:pPr>
+      <w:r>
+        <w:rPr>
+          <w:rFonts w:ascii="Consolas" w:cs="Consolas" w:eastAsia="Consolas" w:hAnsi="Consolas"/>
+          <w:sz w:val="19"/>
+          <w:szCs w:val="19"/>
+        </w:rPr>
+        <w:t xml:space="preserve">SUB Update(sway AS FLOAT)</w:t>
+      </w:r>
+      <w:r>
+        <w:rPr>
+          <w:rFonts w:ascii="Consolas" w:cs="Consolas" w:eastAsia="Consolas" w:hAnsi="Consolas"/>
+          <w:sz w:val="19"/>
+          <w:szCs w:val="19"/>
+        </w:rPr>
+        <w:br/>
+        <w:t xml:space="preserve">    IF Self.inForm THEN</w:t>
+      </w:r>
+      <w:r>
+        <w:rPr>
+          <w:rFonts w:ascii="Consolas" w:cs="Consolas" w:eastAsia="Consolas" w:hAnsi="Consolas"/>
+          <w:sz w:val="19"/>
+          <w:szCs w:val="19"/>
+        </w:rPr>
+        <w:br/>
+        <w:t xml:space="preserve">        Self.x = Self.hx + sway : Self.y = Self.hy : RETURN</w:t>
+      </w:r>
+      <w:r>
+        <w:rPr>
+          <w:rFonts w:ascii="Consolas" w:cs="Consolas" w:eastAsia="Consolas" w:hAnsi="Consolas"/>
+          <w:sz w:val="19"/>
+          <w:szCs w:val="19"/>
+        </w:rPr>
+        <w:br/>
+        <w:t xml:space="preserve">    END IF</w:t>
+      </w:r>
+      <w:r>
+        <w:rPr>
+          <w:rFonts w:ascii="Consolas" w:cs="Consolas" w:eastAsia="Consolas" w:hAnsi="Consolas"/>
+          <w:sz w:val="19"/>
+          <w:szCs w:val="19"/>
+        </w:rPr>
+        <w:br/>
+        <w:t xml:space="preserve">    IF Self.delay &gt; 0 THEN Self.delay = Self.delay - 1 : RETURN</w:t>
+      </w:r>
+      <w:r>
+        <w:rPr>
+          <w:rFonts w:ascii="Consolas" w:cs="Consolas" w:eastAsia="Consolas" w:hAnsi="Consolas"/>
+          <w:sz w:val="19"/>
+          <w:szCs w:val="19"/>
+        </w:rPr>
+        <w:br/>
+        <w:t xml:space="preserve">    Self.t = Self.t + Self.ts</w:t>
+      </w:r>
+      <w:r>
+        <w:rPr>
+          <w:rFonts w:ascii="Consolas" w:cs="Consolas" w:eastAsia="Consolas" w:hAnsi="Consolas"/>
+          <w:sz w:val="19"/>
+          <w:szCs w:val="19"/>
+        </w:rPr>
+        <w:br/>
+        <w:t xml:space="preserve">    DIM bx AS FLOAT : DIM by AS FLOAT</w:t>
+      </w:r>
+      <w:r>
+        <w:rPr>
+          <w:rFonts w:ascii="Consolas" w:cs="Consolas" w:eastAsia="Consolas" w:hAnsi="Consolas"/>
+          <w:sz w:val="19"/>
+          <w:szCs w:val="19"/>
+        </w:rPr>
+        <w:br/>
+        <w:t xml:space="preserve">    (bx, by) = CURVE_BEZIER2(MIN(Self.t, 1.0), Self.cx0, Self.cy0, _</w:t>
+      </w:r>
+      <w:r>
+        <w:rPr>
+          <w:rFonts w:ascii="Consolas" w:cs="Consolas" w:eastAsia="Consolas" w:hAnsi="Consolas"/>
+          <w:sz w:val="19"/>
+          <w:szCs w:val="19"/>
+        </w:rPr>
+        <w:br/>
+        <w:t xml:space="preserve">        Self.cx1, Self.cy1, Self.cx2, Self.cy2, Self.cx3, Self.cy3)</w:t>
+      </w:r>
+      <w:r>
+        <w:rPr>
+          <w:rFonts w:ascii="Consolas" w:cs="Consolas" w:eastAsia="Consolas" w:hAnsi="Consolas"/>
+          <w:sz w:val="19"/>
+          <w:szCs w:val="19"/>
+        </w:rPr>
+        <w:br/>
+        <w:t xml:space="preserve">    Self.x = bx : Self.y = by</w:t>
+      </w:r>
+      <w:r>
+        <w:rPr>
+          <w:rFonts w:ascii="Consolas" w:cs="Consolas" w:eastAsia="Consolas" w:hAnsi="Consolas"/>
+          <w:sz w:val="19"/>
+          <w:szCs w:val="19"/>
+        </w:rPr>
+        <w:br/>
+        <w:t xml:space="preserve">    IF Self.t &gt;= 1.0 THEN Self.inForm = TRUE</w:t>
+      </w:r>
+      <w:r>
+        <w:rPr>
+          <w:rFonts w:ascii="Consolas" w:cs="Consolas" w:eastAsia="Consolas" w:hAnsi="Consolas"/>
+          <w:sz w:val="19"/>
+          <w:szCs w:val="19"/>
+        </w:rPr>
+        <w:br/>
+        <w:t xml:space="preserve">END SUB</w:t>
+      </w:r>
+    </w:p>
+    <w:p>
+      <w:pPr>
+        <w:spacing w:after="140"/>
+      </w:pPr>
+      <w:r>
+        <w:rPr>
+          <w:sz w:val="22"/>
+          <w:szCs w:val="22"/>
+        </w:rPr>
+        <w:t xml:space="preserve"/>
+      </w:r>
+      <w:r>
+        <w:rPr>
+          <w:rFonts w:ascii="Consolas" w:cs="Consolas" w:eastAsia="Consolas" w:hAnsi="Consolas"/>
+          <w:sz w:val="21"/>
+          <w:szCs w:val="21"/>
+        </w:rPr>
+        <w:t xml:space="preserve">RETURN</w:t>
+      </w:r>
+      <w:r>
+        <w:rPr>
+          <w:sz w:val="22"/>
+          <w:szCs w:val="22"/>
+        </w:rPr>
+        <w:t xml:space="preserve"> in einer SUB bricht die Methode sofort ab. Der </w:t>
+      </w:r>
+      <w:r>
+        <w:rPr>
+          <w:rFonts w:ascii="Consolas" w:cs="Consolas" w:eastAsia="Consolas" w:hAnsi="Consolas"/>
+          <w:sz w:val="21"/>
+          <w:szCs w:val="21"/>
+        </w:rPr>
+        <w:t xml:space="preserve">delay</w:t>
+      </w:r>
+      <w:r>
+        <w:rPr>
+          <w:sz w:val="22"/>
+          <w:szCs w:val="22"/>
+        </w:rPr>
+        <w:t xml:space="preserve"> zählt zuerst herunter (gestaffelter Start). </w:t>
+      </w:r>
+      <w:r>
+        <w:rPr>
+          <w:rFonts w:ascii="Consolas" w:cs="Consolas" w:eastAsia="Consolas" w:hAnsi="Consolas"/>
+          <w:sz w:val="21"/>
+          <w:szCs w:val="21"/>
+        </w:rPr>
+        <w:t xml:space="preserve">MIN(Self.t, 1.0)</w:t>
+      </w:r>
+      <w:r>
+        <w:rPr>
+          <w:sz w:val="22"/>
+          <w:szCs w:val="22"/>
+        </w:rPr>
+        <w:t xml:space="preserve"> sorgt dafür, dass t nicht über 1 hinausläuft. Das Unterstrich-Zeichen </w:t>
+      </w:r>
+      <w:r>
+        <w:rPr>
+          <w:rFonts w:ascii="Consolas" w:cs="Consolas" w:eastAsia="Consolas" w:hAnsi="Consolas"/>
+          <w:sz w:val="21"/>
+          <w:szCs w:val="21"/>
+        </w:rPr>
+        <w:t xml:space="preserve">_</w:t>
+      </w:r>
+      <w:r>
+        <w:rPr>
+          <w:sz w:val="22"/>
+          <w:szCs w:val="22"/>
+        </w:rPr>
+        <w:t xml:space="preserve"> am Zeilenende setzt eine lange Zeile unten fort.</w:t>
+      </w:r>
+    </w:p>
+    <w:p>
+      <w:pPr>
+        <w:spacing w:after="140"/>
+      </w:pPr>
+      <w:r>
+        <w:rPr>
+          <w:sz w:val="22"/>
+          <w:szCs w:val="22"/>
+        </w:rPr>
+        <w:t xml:space="preserve">In der Spielschleife rufst du pro Gegner </w:t>
+      </w:r>
+      <w:r>
+        <w:rPr>
+          <w:rFonts w:ascii="Consolas" w:cs="Consolas" w:eastAsia="Consolas" w:hAnsi="Consolas"/>
+          <w:sz w:val="21"/>
+          <w:szCs w:val="21"/>
+        </w:rPr>
+        <w:t xml:space="preserve">bugs[i].Update(sway)</w:t>
+      </w:r>
+      <w:r>
+        <w:rPr>
+          <w:sz w:val="22"/>
+          <w:szCs w:val="22"/>
+        </w:rPr>
+        <w:t xml:space="preserve"> auf und zeichnest ihn an </w:t>
+      </w:r>
+      <w:r>
+        <w:rPr>
+          <w:rFonts w:ascii="Consolas" w:cs="Consolas" w:eastAsia="Consolas" w:hAnsi="Consolas"/>
+          <w:sz w:val="21"/>
+          <w:szCs w:val="21"/>
+        </w:rPr>
+        <w:t xml:space="preserve">INT(bugs[i].x), INT(bugs[i].y)</w:t>
+      </w:r>
+      <w:r>
+        <w:rPr>
+          <w:sz w:val="22"/>
+          <w:szCs w:val="22"/>
+        </w:rPr>
+        <w:t xml:space="preserve">. Das vollständige Programm liegt in </w:t>
+      </w:r>
+      <w:r>
+        <w:rPr>
+          <w:rFonts w:ascii="Consolas" w:cs="Consolas" w:eastAsia="Consolas" w:hAnsi="Consolas"/>
+          <w:sz w:val="21"/>
+          <w:szCs w:val="21"/>
+        </w:rPr>
+        <w:t xml:space="preserve">code/kap07/einflug.gb</w:t>
+      </w:r>
+      <w:r>
+        <w:rPr>
+          <w:sz w:val="22"/>
+          <w:szCs w:val="22"/>
+        </w:rPr>
+        <w:t xml:space="preserve">.</w:t>
+      </w:r>
+    </w:p>
+    <w:p>
+      <w:pPr>
+        <w:spacing w:after="40" w:before="120"/>
+        <w:jc w:val="center"/>
+      </w:pPr>
+      <w:r>
+        <w:drawing>
+          <wp:inline distT="0" distB="0" distL="0" distR="0">
+            <wp:extent cx="2857500" cy="3810000"/>
+            <wp:effectExtent t="0" r="0" b="0" l="0"/>
+            <wp:docPr id="1" name="kap07_einflug.png" descr="Einflug: Die obere Reihe steht schon, die nächste strömt im Bogen herein." title="Einflug: Die obere Reihe steht schon, die nächste strömt im Bogen herein."/>
+            <wp:cNvGraphicFramePr>
+              <a:graphicFrameLocks xmlns:a="http://schemas.openxmlformats.org/drawingml/2006/main" noChangeAspect="1"/>
+            </wp:cNvGraphicFramePr>
+            <a:graphic xmlns:a="http://schemas.openxmlformats.org/drawingml/2006/main">
+              <a:graphicData uri="http://schemas.openxmlformats.org/drawingml/2006/picture">
+                <pic:pic xmlns:pic="http://schemas.openxmlformats.org/drawingml/2006/picture">
+                  <pic:nvPicPr>
+                    <pic:cNvPr id="0" name="" descr=""/>
+                    <pic:cNvPicPr>
+                      <a:picLocks noChangeAspect="1" noChangeArrowheads="1"/>
+                    </pic:cNvPicPr>
+                  </pic:nvPicPr>
+                  <pic:blipFill>
+                    <a:blip r:embed="rId23" cstate="none"/>
+                    <a:srcRect/>
+                    <a:stretch>
+                      <a:fillRect/>
+                    </a:stretch>
+                  </pic:blipFill>
+                  <pic:spPr bwMode="auto">
+                    <a:xfrm>
+                      <a:off x="0" y="0"/>
+                      <a:ext cx="2857500" cy="3810000"/>
+                    </a:xfrm>
+                    <a:prstGeom prst="rect">
+                      <a:avLst/>
+                    </a:prstGeom>
+                  </pic:spPr>
+                </pic:pic>
+              </a:graphicData>
+            </a:graphic>
+          </wp:inline>
+        </w:drawing>
+      </w:r>
+    </w:p>
+    <w:p>
+      <w:pPr>
+        <w:spacing w:after="200"/>
+        <w:jc w:val="center"/>
+      </w:pPr>
+      <w:r>
+        <w:rPr>
+          <w:i/>
+          <w:iCs/>
+          <w:color w:val="6A6A6A"/>
+          <w:sz w:val="18"/>
+          <w:szCs w:val="18"/>
+        </w:rPr>
+        <w:t xml:space="preserve">Einflug: Die obere Reihe steht schon, die nächste strömt im Bogen herein.</w:t>
+      </w:r>
+    </w:p>
+    <w:p>
+      <w:pPr>
+        <w:pStyle w:val="Heading2"/>
+      </w:pPr>
+      <w:r>
+        <w:t xml:space="preserve">Was du gelernt hast</w:t>
+      </w:r>
+    </w:p>
+    <w:p>
+      <w:pPr>
+        <w:pStyle w:val="ListParagraph"/>
+        <w:numPr>
+          <w:ilvl w:val="0"/>
+          <w:numId w:val="2"/>
+        </w:numPr>
+        <w:spacing w:after="60"/>
+      </w:pPr>
+      <w:r>
+        <w:rPr>
+          <w:b/>
+          <w:bCs/>
+          <w:sz w:val="22"/>
+          <w:szCs w:val="22"/>
+        </w:rPr>
+        <w:t xml:space="preserve">IMPORT </w:t>
+      </w:r>
+      <w:r>
+        <w:rPr>
+          <w:sz w:val="22"/>
+          <w:szCs w:val="22"/>
+        </w:rPr>
+        <w:t xml:space="preserve">holt Zusatz-Module dazu (hier curves).</w:t>
+      </w:r>
+    </w:p>
+    <w:p>
+      <w:pPr>
+        <w:pStyle w:val="ListParagraph"/>
+        <w:numPr>
+          <w:ilvl w:val="0"/>
+          <w:numId w:val="2"/>
+        </w:numPr>
+        <w:spacing w:after="60"/>
+      </w:pPr>
+      <w:r>
+        <w:rPr>
+          <w:b/>
+          <w:bCs/>
+          <w:sz w:val="22"/>
+          <w:szCs w:val="22"/>
+        </w:rPr>
+        <w:t xml:space="preserve">Bézier-Kurve </w:t>
+      </w:r>
+      <w:r>
+        <w:rPr>
+          <w:sz w:val="22"/>
+          <w:szCs w:val="22"/>
+        </w:rPr>
+        <w:t xml:space="preserve">= weiche Bahn aus 4 Punkten; CURVE_BEZIER2(t, …) liefert den Punkt bei t (0…1).</w:t>
+      </w:r>
+    </w:p>
+    <w:p>
+      <w:pPr>
+        <w:pStyle w:val="ListParagraph"/>
+        <w:numPr>
+          <w:ilvl w:val="0"/>
+          <w:numId w:val="2"/>
+        </w:numPr>
+        <w:spacing w:after="60"/>
+      </w:pPr>
+      <w:r>
+        <w:rPr>
+          <w:b/>
+          <w:bCs/>
+          <w:sz w:val="22"/>
+          <w:szCs w:val="22"/>
+        </w:rPr>
+        <w:t xml:space="preserve">Tupel </w:t>
+      </w:r>
+      <w:r>
+        <w:rPr>
+          <w:sz w:val="22"/>
+          <w:szCs w:val="22"/>
+        </w:rPr>
+        <w:t xml:space="preserve">= mehrere Werte auf einmal: (bx, by) = ...</w:t>
+      </w:r>
+    </w:p>
+    <w:p>
+      <w:pPr>
+        <w:pStyle w:val="ListParagraph"/>
+        <w:numPr>
+          <w:ilvl w:val="0"/>
+          <w:numId w:val="2"/>
+        </w:numPr>
+        <w:spacing w:after="60"/>
+      </w:pPr>
+      <w:r>
+        <w:rPr>
+          <w:b/>
+          <w:bCs/>
+          <w:sz w:val="22"/>
+          <w:szCs w:val="22"/>
+        </w:rPr>
+        <w:t xml:space="preserve">Methode mit Zustand </w:t>
+      </w:r>
+      <w:r>
+        <w:rPr>
+          <w:sz w:val="22"/>
+          <w:szCs w:val="22"/>
+        </w:rPr>
+        <w:t xml:space="preserve">(inForm, delay, t): jeder Gegner steuert seinen eigenen Einflug.</w:t>
+      </w:r>
+    </w:p>
+    <w:p>
+      <w:pPr>
+        <w:pStyle w:val="Heading2"/>
+      </w:pPr>
+      <w:r>
+        <w:t xml:space="preserve">Übung</w:t>
+      </w:r>
+    </w:p>
+    <w:p>
+      <w:pPr>
+        <w:pStyle w:val="ListParagraph"/>
+        <w:numPr>
+          <w:ilvl w:val="0"/>
+          <w:numId w:val="2"/>
+        </w:numPr>
+        <w:spacing w:after="60"/>
+      </w:pPr>
+      <w:r>
+        <w:rPr>
+          <w:sz w:val="22"/>
+          <w:szCs w:val="22"/>
+        </w:rPr>
+        <w:t xml:space="preserve">Mach den Einflug schneller oder langsamer (ts in Init).</w:t>
+      </w:r>
+    </w:p>
+    <w:p>
+      <w:pPr>
+        <w:pStyle w:val="ListParagraph"/>
+        <w:numPr>
+          <w:ilvl w:val="0"/>
+          <w:numId w:val="2"/>
+        </w:numPr>
+        <w:spacing w:after="60"/>
+      </w:pPr>
+      <w:r>
+        <w:rPr>
+          <w:sz w:val="22"/>
+          <w:szCs w:val="22"/>
+        </w:rPr>
+        <w:t xml:space="preserve">Verändere die Kontrollpunkte – wie ändert sich die Bahnform?</w:t>
+      </w:r>
+    </w:p>
+    <w:p>
+      <w:pPr>
+        <w:pStyle w:val="ListParagraph"/>
+        <w:numPr>
+          <w:ilvl w:val="0"/>
+          <w:numId w:val="2"/>
+        </w:numPr>
+        <w:spacing w:after="60"/>
+      </w:pPr>
+      <w:r>
+        <w:rPr>
+          <w:sz w:val="22"/>
+          <w:szCs w:val="22"/>
+        </w:rPr>
+        <w:t xml:space="preserve">Lass die Gegner enger gestaffelt starten (kleinerer delay-Faktor als i * 4).</w:t>
       </w:r>
     </w:p>
     <w:sectPr>

</xml_diff>

<commit_message>
docs(buch-galaga): Kapitel 8 "Sturzangriffe" (ENUM + Zustands-Maschine)
ENUM St = ENTER/FORM/DIVE ersetzt das Boolean-Flag; Bug-Klasse: SetPath-Refactor,
Dive-Methode (Bogen Richtung Spieler, unten raus), Update als Zustands-Maschine
(t>=1: DIVE->Wiedereinflug->ENTER, sonst FORM), Dive-Trigger (Timer + zufaelliger
FORM-Gegner). Kumulativ code/kap08/sturz.gb. Code-Bloecke, Tipps (ENUM-Namens-
kollision), Screenshot, Zusammenfassung + Uebungen. gbrt --check clean, docx
validiert (PASSED), 29 Seiten, visuell geprueft.

Co-Authored-By: Claude Opus 4.8 <noreply@anthropic.com>
</commit_message>
<xml_diff>
--- a/buch-galaga/buch/GameBasic-Buch.docx
+++ b/buch-galaga/buch/GameBasic-Buch.docx
@@ -8588,6 +8588,945 @@
           <w:szCs w:val="22"/>
         </w:rPr>
         <w:t xml:space="preserve">Lass die Gegner enger gestaffelt starten (kleinerer delay-Faktor als i * 4).</w:t>
+      </w:r>
+    </w:p>
+    <w:p>
+      <w:r>
+        <w:br w:type="page"/>
+      </w:r>
+    </w:p>
+    <w:p>
+      <w:pPr>
+        <w:pStyle w:val="Heading1"/>
+        <w:pBdr>
+          <w:bottom w:val="single" w:color="1B6CA8" w:sz="12" w:space="4"/>
+        </w:pBdr>
+        <w:spacing w:after="80" w:before="320"/>
+      </w:pPr>
+      <w:r>
+        <w:t xml:space="preserve">Kapitel 8: Sturzangriffe</w:t>
+      </w:r>
+    </w:p>
+    <w:tbl>
+      <w:tblPr>
+        <w:tblW w:type="dxa" w:w="9360"/>
+        <w:tblBorders>
+          <w:top w:val="single" w:color="auto" w:sz="4"/>
+          <w:left w:val="single" w:color="auto" w:sz="4"/>
+          <w:bottom w:val="single" w:color="auto" w:sz="4"/>
+          <w:right w:val="single" w:color="auto" w:sz="4"/>
+          <w:insideH w:val="single" w:color="auto" w:sz="4"/>
+          <w:insideV w:val="single" w:color="auto" w:sz="4"/>
+        </w:tblBorders>
+      </w:tblPr>
+      <w:tblGrid>
+        <w:gridCol w:w="9360"/>
+      </w:tblGrid>
+      <w:tr>
+        <w:tc>
+          <w:tcPr>
+            <w:tcW w:type="dxa" w:w="9360"/>
+            <w:tcBorders>
+              <w:top w:val="single" w:color="9CC8E6" w:sz="6"/>
+              <w:left w:val="single" w:color="9CC8E6" w:sz="6"/>
+              <w:bottom w:val="single" w:color="9CC8E6" w:sz="6"/>
+              <w:right w:val="single" w:color="9CC8E6" w:sz="6"/>
+            </w:tcBorders>
+            <w:shd w:fill="E7F2FA" w:val="clear"/>
+            <w:tcMar>
+              <w:top w:type="dxa" w:w="120"/>
+              <w:left w:type="dxa" w:w="160"/>
+              <w:bottom w:type="dxa" w:w="120"/>
+              <w:right w:type="dxa" w:w="160"/>
+            </w:tcMar>
+          </w:tcPr>
+          <w:p>
+            <w:pPr>
+              <w:spacing w:after="40"/>
+            </w:pPr>
+            <w:r>
+              <w:rPr>
+                <w:b/>
+                <w:bCs/>
+                <w:color w:val="1B6CA8"/>
+                <w:sz w:val="22"/>
+                <w:szCs w:val="22"/>
+              </w:rPr>
+              <w:t xml:space="preserve">In diesem Kapitel</w:t>
+            </w:r>
+          </w:p>
+          <w:p>
+            <w:r>
+              <w:rPr>
+                <w:sz w:val="22"/>
+                <w:szCs w:val="22"/>
+              </w:rPr>
+              <w:t xml:space="preserve">Die Gegner werden gefährlich: Einzelne lösen sich aus der Formation und stürzen im Bogen auf dich herab. Dafür bekommt jeder Gegner eine kleine Zustands-Maschine – gesteuert über ein ENUM.</w:t>
+            </w:r>
+          </w:p>
+        </w:tc>
+      </w:tr>
+    </w:tbl>
+    <w:p>
+      <w:pPr>
+        <w:pStyle w:val="Heading2"/>
+      </w:pPr>
+      <w:r>
+        <w:t xml:space="preserve">Zustände mit ENUM</w:t>
+      </w:r>
+    </w:p>
+    <w:p>
+      <w:pPr>
+        <w:spacing w:after="140"/>
+      </w:pPr>
+      <w:r>
+        <w:rPr>
+          <w:sz w:val="22"/>
+          <w:szCs w:val="22"/>
+        </w:rPr>
+        <w:t xml:space="preserve">Ein Gegner ist immer in genau einem von drei Zuständen: Er fliegt ein (ENTER), schwebt in der Formation (FORM) oder stürzt gerade (DIVE). Statt unklarer Zahlen oder mehrerer Ja/Nein-Flags geben wir diesen Zuständen Namen – mit einem ENUM:</w:t>
+      </w:r>
+    </w:p>
+    <w:p>
+      <w:pPr>
+        <w:pBdr>
+          <w:left w:val="single" w:color="1B6CA8" w:sz="18" w:space="6"/>
+        </w:pBdr>
+        <w:shd w:fill="F4F4F4" w:val="clear"/>
+        <w:spacing w:after="160" w:before="80"/>
+        <w:ind w:left="120"/>
+      </w:pPr>
+      <w:r>
+        <w:rPr>
+          <w:rFonts w:ascii="Consolas" w:cs="Consolas" w:eastAsia="Consolas" w:hAnsi="Consolas"/>
+          <w:sz w:val="19"/>
+          <w:szCs w:val="19"/>
+        </w:rPr>
+        <w:t xml:space="preserve">ENUM St = ENTER, FORM, DIVE</w:t>
+      </w:r>
+    </w:p>
+    <w:p>
+      <w:pPr>
+        <w:spacing w:after="140"/>
+      </w:pPr>
+      <w:r>
+        <w:rPr>
+          <w:sz w:val="22"/>
+          <w:szCs w:val="22"/>
+        </w:rPr>
+        <w:t xml:space="preserve">Ein </w:t>
+      </w:r>
+      <w:r>
+        <w:rPr>
+          <w:rFonts w:ascii="Consolas" w:cs="Consolas" w:eastAsia="Consolas" w:hAnsi="Consolas"/>
+          <w:sz w:val="21"/>
+          <w:szCs w:val="21"/>
+        </w:rPr>
+        <w:t xml:space="preserve">ENUM</w:t>
+      </w:r>
+      <w:r>
+        <w:rPr>
+          <w:sz w:val="22"/>
+          <w:szCs w:val="22"/>
+        </w:rPr>
+        <w:t xml:space="preserve"> ist eine Liste benannter Werte. Statt einer nichtssagenden 1 schreiben wir </w:t>
+      </w:r>
+      <w:r>
+        <w:rPr>
+          <w:rFonts w:ascii="Consolas" w:cs="Consolas" w:eastAsia="Consolas" w:hAnsi="Consolas"/>
+          <w:sz w:val="21"/>
+          <w:szCs w:val="21"/>
+        </w:rPr>
+        <w:t xml:space="preserve">St.FORM</w:t>
+      </w:r>
+      <w:r>
+        <w:rPr>
+          <w:sz w:val="22"/>
+          <w:szCs w:val="22"/>
+        </w:rPr>
+        <w:t xml:space="preserve"> – das liest sich wie ein Satz. In der Bug-Klasse ersetzt ein Feld </w:t>
+      </w:r>
+      <w:r>
+        <w:rPr>
+          <w:rFonts w:ascii="Consolas" w:cs="Consolas" w:eastAsia="Consolas" w:hAnsi="Consolas"/>
+          <w:sz w:val="21"/>
+          <w:szCs w:val="21"/>
+        </w:rPr>
+        <w:t xml:space="preserve">state AS INTEGER</w:t>
+      </w:r>
+      <w:r>
+        <w:rPr>
+          <w:sz w:val="22"/>
+          <w:szCs w:val="22"/>
+        </w:rPr>
+        <w:t xml:space="preserve"> das frühere Ja/Nein-Flag.</w:t>
+      </w:r>
+    </w:p>
+    <w:tbl>
+      <w:tblPr>
+        <w:tblW w:type="dxa" w:w="9360"/>
+        <w:tblBorders>
+          <w:top w:val="single" w:color="auto" w:sz="4"/>
+          <w:left w:val="single" w:color="auto" w:sz="4"/>
+          <w:bottom w:val="single" w:color="auto" w:sz="4"/>
+          <w:right w:val="single" w:color="auto" w:sz="4"/>
+          <w:insideH w:val="single" w:color="auto" w:sz="4"/>
+          <w:insideV w:val="single" w:color="auto" w:sz="4"/>
+        </w:tblBorders>
+      </w:tblPr>
+      <w:tblGrid>
+        <w:gridCol w:w="9360"/>
+      </w:tblGrid>
+      <w:tr>
+        <w:tc>
+          <w:tcPr>
+            <w:tcW w:type="dxa" w:w="9360"/>
+            <w:tcBorders>
+              <w:top w:val="single" w:color="9CC8E6" w:sz="6"/>
+              <w:left w:val="single" w:color="9CC8E6" w:sz="6"/>
+              <w:bottom w:val="single" w:color="9CC8E6" w:sz="6"/>
+              <w:right w:val="single" w:color="9CC8E6" w:sz="6"/>
+            </w:tcBorders>
+            <w:shd w:fill="E7F2FA" w:val="clear"/>
+            <w:tcMar>
+              <w:top w:type="dxa" w:w="120"/>
+              <w:left w:type="dxa" w:w="160"/>
+              <w:bottom w:type="dxa" w:w="120"/>
+              <w:right w:type="dxa" w:w="160"/>
+            </w:tcMar>
+          </w:tcPr>
+          <w:p>
+            <w:pPr>
+              <w:spacing w:after="40"/>
+            </w:pPr>
+            <w:r>
+              <w:rPr>
+                <w:b/>
+                <w:bCs/>
+                <w:color w:val="1B6CA8"/>
+                <w:sz w:val="22"/>
+                <w:szCs w:val="22"/>
+              </w:rPr>
+              <w:t xml:space="preserve">Namen klug wählen</w:t>
+            </w:r>
+          </w:p>
+          <w:p>
+            <w:r>
+              <w:rPr>
+                <w:sz w:val="22"/>
+                <w:szCs w:val="22"/>
+              </w:rPr>
+              <w:t xml:space="preserve">Weil GameBasic Gross-/Kleinschreibung ignoriert, darf der ENUM-Name nicht gleich heissen wie eine deiner Variablen. Wir nennen ihn kurz St – das kollidiert mit nichts.</w:t>
+            </w:r>
+          </w:p>
+        </w:tc>
+      </w:tr>
+    </w:tbl>
+    <w:p>
+      <w:pPr>
+        <w:pStyle w:val="Heading2"/>
+      </w:pPr>
+      <w:r>
+        <w:t xml:space="preserve">Eine Bahn für den Sturz</w:t>
+      </w:r>
+    </w:p>
+    <w:p>
+      <w:pPr>
+        <w:spacing w:after="140"/>
+      </w:pPr>
+      <w:r>
+        <w:rPr>
+          <w:sz w:val="22"/>
+          <w:szCs w:val="22"/>
+        </w:rPr>
+        <w:t xml:space="preserve">Den Einflug- und den Sturz-Bogen setzen wir mit derselben Hilfsmethode </w:t>
+      </w:r>
+      <w:r>
+        <w:rPr>
+          <w:rFonts w:ascii="Consolas" w:cs="Consolas" w:eastAsia="Consolas" w:hAnsi="Consolas"/>
+          <w:sz w:val="21"/>
+          <w:szCs w:val="21"/>
+        </w:rPr>
+        <w:t xml:space="preserve">SetPath</w:t>
+      </w:r>
+      <w:r>
+        <w:rPr>
+          <w:sz w:val="22"/>
+          <w:szCs w:val="22"/>
+        </w:rPr>
+        <w:t xml:space="preserve"> (Start, zwei Kontrollpunkte, Ziel + Tempo). Die Dive-Methode legt eine Bahn von der Formation hinunter an der Spielerspalte vorbei und unten aus dem Bild:</w:t>
+      </w:r>
+    </w:p>
+    <w:p>
+      <w:pPr>
+        <w:pBdr>
+          <w:left w:val="single" w:color="1B6CA8" w:sz="18" w:space="6"/>
+        </w:pBdr>
+        <w:shd w:fill="F4F4F4" w:val="clear"/>
+        <w:spacing w:after="160" w:before="80"/>
+        <w:ind w:left="120"/>
+      </w:pPr>
+      <w:r>
+        <w:rPr>
+          <w:rFonts w:ascii="Consolas" w:cs="Consolas" w:eastAsia="Consolas" w:hAnsi="Consolas"/>
+          <w:sz w:val="19"/>
+          <w:szCs w:val="19"/>
+        </w:rPr>
+        <w:t xml:space="preserve">SUB Dive(px AS FLOAT, speed AS FLOAT)</w:t>
+      </w:r>
+      <w:r>
+        <w:rPr>
+          <w:rFonts w:ascii="Consolas" w:cs="Consolas" w:eastAsia="Consolas" w:hAnsi="Consolas"/>
+          <w:sz w:val="19"/>
+          <w:szCs w:val="19"/>
+        </w:rPr>
+        <w:br/>
+        <w:t xml:space="preserve">    DIM side AS INTEGER : side = IIF(Self.hx &lt; 240.0, 1, -1)</w:t>
+      </w:r>
+      <w:r>
+        <w:rPr>
+          <w:rFonts w:ascii="Consolas" w:cs="Consolas" w:eastAsia="Consolas" w:hAnsi="Consolas"/>
+          <w:sz w:val="19"/>
+          <w:szCs w:val="19"/>
+        </w:rPr>
+        <w:br/>
+        <w:t xml:space="preserve">    Self.SetPath(speed, Self.hx, Self.hy, Self.hx + side * 100.0, Self.hy + 160.0, _</w:t>
+      </w:r>
+      <w:r>
+        <w:rPr>
+          <w:rFonts w:ascii="Consolas" w:cs="Consolas" w:eastAsia="Consolas" w:hAnsi="Consolas"/>
+          <w:sz w:val="19"/>
+          <w:szCs w:val="19"/>
+        </w:rPr>
+        <w:br/>
+        <w:t xml:space="preserve">        px, 460.0, px - side * 100.0, 700.0)</w:t>
+      </w:r>
+      <w:r>
+        <w:rPr>
+          <w:rFonts w:ascii="Consolas" w:cs="Consolas" w:eastAsia="Consolas" w:hAnsi="Consolas"/>
+          <w:sz w:val="19"/>
+          <w:szCs w:val="19"/>
+        </w:rPr>
+        <w:br/>
+        <w:t xml:space="preserve">    Self.state = St.DIVE</w:t>
+      </w:r>
+      <w:r>
+        <w:rPr>
+          <w:rFonts w:ascii="Consolas" w:cs="Consolas" w:eastAsia="Consolas" w:hAnsi="Consolas"/>
+          <w:sz w:val="19"/>
+          <w:szCs w:val="19"/>
+        </w:rPr>
+        <w:br/>
+        <w:t xml:space="preserve">END SUB</w:t>
+      </w:r>
+    </w:p>
+    <w:p>
+      <w:pPr>
+        <w:pStyle w:val="Heading2"/>
+      </w:pPr>
+      <w:r>
+        <w:t xml:space="preserve">Die Zustands-Maschine</w:t>
+      </w:r>
+    </w:p>
+    <w:p>
+      <w:pPr>
+        <w:spacing w:after="140"/>
+      </w:pPr>
+      <w:r>
+        <w:rPr>
+          <w:sz w:val="22"/>
+          <w:szCs w:val="22"/>
+        </w:rPr>
+        <w:t xml:space="preserve">Die Update-Methode reagiert auf den Zustand. Kommt ein Gegner am Ende seiner Bahn an (t ≥ 1), entscheidet sein Zustand, wie es weitergeht: Nach einem Sturz fliegt er von oben wieder in die Formation, sonst hat er die Formation erreicht:</w:t>
+      </w:r>
+    </w:p>
+    <w:p>
+      <w:pPr>
+        <w:pBdr>
+          <w:left w:val="single" w:color="1B6CA8" w:sz="18" w:space="6"/>
+        </w:pBdr>
+        <w:shd w:fill="F4F4F4" w:val="clear"/>
+        <w:spacing w:after="160" w:before="80"/>
+        <w:ind w:left="120"/>
+      </w:pPr>
+      <w:r>
+        <w:rPr>
+          <w:rFonts w:ascii="Consolas" w:cs="Consolas" w:eastAsia="Consolas" w:hAnsi="Consolas"/>
+          <w:sz w:val="19"/>
+          <w:szCs w:val="19"/>
+        </w:rPr>
+        <w:t xml:space="preserve">IF Self.t &gt;= 1.0 THEN</w:t>
+      </w:r>
+      <w:r>
+        <w:rPr>
+          <w:rFonts w:ascii="Consolas" w:cs="Consolas" w:eastAsia="Consolas" w:hAnsi="Consolas"/>
+          <w:sz w:val="19"/>
+          <w:szCs w:val="19"/>
+        </w:rPr>
+        <w:br/>
+        <w:t xml:space="preserve">    IF Self.state = St.DIVE THEN</w:t>
+      </w:r>
+      <w:r>
+        <w:rPr>
+          <w:rFonts w:ascii="Consolas" w:cs="Consolas" w:eastAsia="Consolas" w:hAnsi="Consolas"/>
+          <w:sz w:val="19"/>
+          <w:szCs w:val="19"/>
+        </w:rPr>
+        <w:br/>
+        <w:t xml:space="preserve">        ' nach dem Sturz von oben zurueck in die Formation</w:t>
+      </w:r>
+      <w:r>
+        <w:rPr>
+          <w:rFonts w:ascii="Consolas" w:cs="Consolas" w:eastAsia="Consolas" w:hAnsi="Consolas"/>
+          <w:sz w:val="19"/>
+          <w:szCs w:val="19"/>
+        </w:rPr>
+        <w:br/>
+        <w:t xml:space="preserve">        Self.SetPath(0.02, Self.hx, -30.0, Self.hx, 60.0, Self.hx, 30.0, Self.hx, Self.hy)</w:t>
+      </w:r>
+      <w:r>
+        <w:rPr>
+          <w:rFonts w:ascii="Consolas" w:cs="Consolas" w:eastAsia="Consolas" w:hAnsi="Consolas"/>
+          <w:sz w:val="19"/>
+          <w:szCs w:val="19"/>
+        </w:rPr>
+        <w:br/>
+        <w:t xml:space="preserve">        Self.state = St.ENTER</w:t>
+      </w:r>
+      <w:r>
+        <w:rPr>
+          <w:rFonts w:ascii="Consolas" w:cs="Consolas" w:eastAsia="Consolas" w:hAnsi="Consolas"/>
+          <w:sz w:val="19"/>
+          <w:szCs w:val="19"/>
+        </w:rPr>
+        <w:br/>
+        <w:t xml:space="preserve">    ELSE</w:t>
+      </w:r>
+      <w:r>
+        <w:rPr>
+          <w:rFonts w:ascii="Consolas" w:cs="Consolas" w:eastAsia="Consolas" w:hAnsi="Consolas"/>
+          <w:sz w:val="19"/>
+          <w:szCs w:val="19"/>
+        </w:rPr>
+        <w:br/>
+        <w:t xml:space="preserve">        Self.state = St.FORM</w:t>
+      </w:r>
+      <w:r>
+        <w:rPr>
+          <w:rFonts w:ascii="Consolas" w:cs="Consolas" w:eastAsia="Consolas" w:hAnsi="Consolas"/>
+          <w:sz w:val="19"/>
+          <w:szCs w:val="19"/>
+        </w:rPr>
+        <w:br/>
+        <w:t xml:space="preserve">    END IF</w:t>
+      </w:r>
+      <w:r>
+        <w:rPr>
+          <w:rFonts w:ascii="Consolas" w:cs="Consolas" w:eastAsia="Consolas" w:hAnsi="Consolas"/>
+          <w:sz w:val="19"/>
+          <w:szCs w:val="19"/>
+        </w:rPr>
+        <w:br/>
+        <w:t xml:space="preserve">END IF</w:t>
+      </w:r>
+    </w:p>
+    <w:p>
+      <w:pPr>
+        <w:spacing w:after="140"/>
+      </w:pPr>
+      <w:r>
+        <w:rPr>
+          <w:sz w:val="22"/>
+          <w:szCs w:val="22"/>
+        </w:rPr>
+        <w:t xml:space="preserve">So entsteht ein Kreislauf: </w:t>
+      </w:r>
+      <w:r>
+        <w:rPr>
+          <w:rFonts w:ascii="Consolas" w:cs="Consolas" w:eastAsia="Consolas" w:hAnsi="Consolas"/>
+          <w:sz w:val="21"/>
+          <w:szCs w:val="21"/>
+        </w:rPr>
+        <w:t xml:space="preserve">ENTER</w:t>
+      </w:r>
+      <w:r>
+        <w:rPr>
+          <w:sz w:val="22"/>
+          <w:szCs w:val="22"/>
+        </w:rPr>
+        <w:t xml:space="preserve"> → </w:t>
+      </w:r>
+      <w:r>
+        <w:rPr>
+          <w:rFonts w:ascii="Consolas" w:cs="Consolas" w:eastAsia="Consolas" w:hAnsi="Consolas"/>
+          <w:sz w:val="21"/>
+          <w:szCs w:val="21"/>
+        </w:rPr>
+        <w:t xml:space="preserve">FORM</w:t>
+      </w:r>
+      <w:r>
+        <w:rPr>
+          <w:sz w:val="22"/>
+          <w:szCs w:val="22"/>
+        </w:rPr>
+        <w:t xml:space="preserve"> → (Sturz) </w:t>
+      </w:r>
+      <w:r>
+        <w:rPr>
+          <w:rFonts w:ascii="Consolas" w:cs="Consolas" w:eastAsia="Consolas" w:hAnsi="Consolas"/>
+          <w:sz w:val="21"/>
+          <w:szCs w:val="21"/>
+        </w:rPr>
+        <w:t xml:space="preserve">DIVE</w:t>
+      </w:r>
+      <w:r>
+        <w:rPr>
+          <w:sz w:val="22"/>
+          <w:szCs w:val="22"/>
+        </w:rPr>
+        <w:t xml:space="preserve"> → </w:t>
+      </w:r>
+      <w:r>
+        <w:rPr>
+          <w:rFonts w:ascii="Consolas" w:cs="Consolas" w:eastAsia="Consolas" w:hAnsi="Consolas"/>
+          <w:sz w:val="21"/>
+          <w:szCs w:val="21"/>
+        </w:rPr>
+        <w:t xml:space="preserve">ENTER</w:t>
+      </w:r>
+      <w:r>
+        <w:rPr>
+          <w:sz w:val="22"/>
+          <w:szCs w:val="22"/>
+        </w:rPr>
+        <w:t xml:space="preserve"> → … Genau das ist eine Zustands-Maschine.</w:t>
+      </w:r>
+    </w:p>
+    <w:p>
+      <w:pPr>
+        <w:pStyle w:val="Heading2"/>
+      </w:pPr>
+      <w:r>
+        <w:t xml:space="preserve">Wann stürzt wer?</w:t>
+      </w:r>
+    </w:p>
+    <w:p>
+      <w:pPr>
+        <w:spacing w:after="140"/>
+      </w:pPr>
+      <w:r>
+        <w:rPr>
+          <w:sz w:val="22"/>
+          <w:szCs w:val="22"/>
+        </w:rPr>
+        <w:t xml:space="preserve">Ein Zähler löst in Abständen einen Sturz aus. Wir suchen einen zufälligen Gegner, der gerade in Formation schwebt, und schicken ihn Richtung Schiff:</w:t>
+      </w:r>
+    </w:p>
+    <w:p>
+      <w:pPr>
+        <w:pBdr>
+          <w:left w:val="single" w:color="1B6CA8" w:sz="18" w:space="6"/>
+        </w:pBdr>
+        <w:shd w:fill="F4F4F4" w:val="clear"/>
+        <w:spacing w:after="160" w:before="80"/>
+        <w:ind w:left="120"/>
+      </w:pPr>
+      <w:r>
+        <w:rPr>
+          <w:rFonts w:ascii="Consolas" w:cs="Consolas" w:eastAsia="Consolas" w:hAnsi="Consolas"/>
+          <w:sz w:val="19"/>
+          <w:szCs w:val="19"/>
+        </w:rPr>
+        <w:t xml:space="preserve">diveTimer = diveTimer - 1</w:t>
+      </w:r>
+      <w:r>
+        <w:rPr>
+          <w:rFonts w:ascii="Consolas" w:cs="Consolas" w:eastAsia="Consolas" w:hAnsi="Consolas"/>
+          <w:sz w:val="19"/>
+          <w:szCs w:val="19"/>
+        </w:rPr>
+        <w:br/>
+        <w:t xml:space="preserve">IF diveTimer &lt;= 0 THEN</w:t>
+      </w:r>
+      <w:r>
+        <w:rPr>
+          <w:rFonts w:ascii="Consolas" w:cs="Consolas" w:eastAsia="Consolas" w:hAnsi="Consolas"/>
+          <w:sz w:val="19"/>
+          <w:szCs w:val="19"/>
+        </w:rPr>
+        <w:br/>
+        <w:t xml:space="preserve">    diveTimer = 80 + RANDINT(0, 60)</w:t>
+      </w:r>
+      <w:r>
+        <w:rPr>
+          <w:rFonts w:ascii="Consolas" w:cs="Consolas" w:eastAsia="Consolas" w:hAnsi="Consolas"/>
+          <w:sz w:val="19"/>
+          <w:szCs w:val="19"/>
+        </w:rPr>
+        <w:br/>
+        <w:t xml:space="preserve">    DIM tries AS INTEGER</w:t>
+      </w:r>
+      <w:r>
+        <w:rPr>
+          <w:rFonts w:ascii="Consolas" w:cs="Consolas" w:eastAsia="Consolas" w:hAnsi="Consolas"/>
+          <w:sz w:val="19"/>
+          <w:szCs w:val="19"/>
+        </w:rPr>
+        <w:br/>
+        <w:t xml:space="preserve">    FOR tries = 0 TO 10</w:t>
+      </w:r>
+      <w:r>
+        <w:rPr>
+          <w:rFonts w:ascii="Consolas" w:cs="Consolas" w:eastAsia="Consolas" w:hAnsi="Consolas"/>
+          <w:sz w:val="19"/>
+          <w:szCs w:val="19"/>
+        </w:rPr>
+        <w:br/>
+        <w:t xml:space="preserve">        DIM pick AS INTEGER : pick = RANDINT(0, NBUGS - 1)</w:t>
+      </w:r>
+      <w:r>
+        <w:rPr>
+          <w:rFonts w:ascii="Consolas" w:cs="Consolas" w:eastAsia="Consolas" w:hAnsi="Consolas"/>
+          <w:sz w:val="19"/>
+          <w:szCs w:val="19"/>
+        </w:rPr>
+        <w:br/>
+        <w:t xml:space="preserve">        IF bugs[pick].alive AND bugs[pick].state = St.FORM THEN</w:t>
+      </w:r>
+      <w:r>
+        <w:rPr>
+          <w:rFonts w:ascii="Consolas" w:cs="Consolas" w:eastAsia="Consolas" w:hAnsi="Consolas"/>
+          <w:sz w:val="19"/>
+          <w:szCs w:val="19"/>
+        </w:rPr>
+        <w:br/>
+        <w:t xml:space="preserve">            bugs[pick].Dive(shipX, 0.013)</w:t>
+      </w:r>
+      <w:r>
+        <w:rPr>
+          <w:rFonts w:ascii="Consolas" w:cs="Consolas" w:eastAsia="Consolas" w:hAnsi="Consolas"/>
+          <w:sz w:val="19"/>
+          <w:szCs w:val="19"/>
+        </w:rPr>
+        <w:br/>
+        <w:t xml:space="preserve">            BREAK</w:t>
+      </w:r>
+      <w:r>
+        <w:rPr>
+          <w:rFonts w:ascii="Consolas" w:cs="Consolas" w:eastAsia="Consolas" w:hAnsi="Consolas"/>
+          <w:sz w:val="19"/>
+          <w:szCs w:val="19"/>
+        </w:rPr>
+        <w:br/>
+        <w:t xml:space="preserve">        END IF</w:t>
+      </w:r>
+      <w:r>
+        <w:rPr>
+          <w:rFonts w:ascii="Consolas" w:cs="Consolas" w:eastAsia="Consolas" w:hAnsi="Consolas"/>
+          <w:sz w:val="19"/>
+          <w:szCs w:val="19"/>
+        </w:rPr>
+        <w:br/>
+        <w:t xml:space="preserve">    NEXT tries</w:t>
+      </w:r>
+      <w:r>
+        <w:rPr>
+          <w:rFonts w:ascii="Consolas" w:cs="Consolas" w:eastAsia="Consolas" w:hAnsi="Consolas"/>
+          <w:sz w:val="19"/>
+          <w:szCs w:val="19"/>
+        </w:rPr>
+        <w:br/>
+        <w:t xml:space="preserve">END IF</w:t>
+      </w:r>
+    </w:p>
+    <w:p>
+      <w:pPr>
+        <w:spacing w:after="140"/>
+      </w:pPr>
+      <w:r>
+        <w:rPr>
+          <w:sz w:val="22"/>
+          <w:szCs w:val="22"/>
+        </w:rPr>
+        <w:t xml:space="preserve">Wir probieren bis zu 11-mal einen zufälligen Gegner; der erste passende (lebt und ist in </w:t>
+      </w:r>
+      <w:r>
+        <w:rPr>
+          <w:rFonts w:ascii="Consolas" w:cs="Consolas" w:eastAsia="Consolas" w:hAnsi="Consolas"/>
+          <w:sz w:val="21"/>
+          <w:szCs w:val="21"/>
+        </w:rPr>
+        <w:t xml:space="preserve">FORM</w:t>
+      </w:r>
+      <w:r>
+        <w:rPr>
+          <w:sz w:val="22"/>
+          <w:szCs w:val="22"/>
+        </w:rPr>
+        <w:t xml:space="preserve">) stürzt los. </w:t>
+      </w:r>
+      <w:r>
+        <w:rPr>
+          <w:rFonts w:ascii="Consolas" w:cs="Consolas" w:eastAsia="Consolas" w:hAnsi="Consolas"/>
+          <w:sz w:val="21"/>
+          <w:szCs w:val="21"/>
+        </w:rPr>
+        <w:t xml:space="preserve">shipX</w:t>
+      </w:r>
+      <w:r>
+        <w:rPr>
+          <w:sz w:val="22"/>
+          <w:szCs w:val="22"/>
+        </w:rPr>
+        <w:t xml:space="preserve"> übergibt die Spielerposition als Ziel. Das vollständige Programm liegt in </w:t>
+      </w:r>
+      <w:r>
+        <w:rPr>
+          <w:rFonts w:ascii="Consolas" w:cs="Consolas" w:eastAsia="Consolas" w:hAnsi="Consolas"/>
+          <w:sz w:val="21"/>
+          <w:szCs w:val="21"/>
+        </w:rPr>
+        <w:t xml:space="preserve">code/kap08/sturz.gb</w:t>
+      </w:r>
+      <w:r>
+        <w:rPr>
+          <w:sz w:val="22"/>
+          <w:szCs w:val="22"/>
+        </w:rPr>
+        <w:t xml:space="preserve">.</w:t>
+      </w:r>
+    </w:p>
+    <w:p>
+      <w:pPr>
+        <w:spacing w:after="40" w:before="120"/>
+        <w:jc w:val="center"/>
+      </w:pPr>
+      <w:r>
+        <w:drawing>
+          <wp:inline distT="0" distB="0" distL="0" distR="0">
+            <wp:extent cx="2857500" cy="3810000"/>
+            <wp:effectExtent t="0" r="0" b="0" l="0"/>
+            <wp:docPr id="1" name="kap08_sturz.png" descr="Ein Gegner hat sich gelöst und stürzt im Bogen auf das Schiff herab." title="Ein Gegner hat sich gelöst und stürzt im Bogen auf das Schiff herab."/>
+            <wp:cNvGraphicFramePr>
+              <a:graphicFrameLocks xmlns:a="http://schemas.openxmlformats.org/drawingml/2006/main" noChangeAspect="1"/>
+            </wp:cNvGraphicFramePr>
+            <a:graphic xmlns:a="http://schemas.openxmlformats.org/drawingml/2006/main">
+              <a:graphicData uri="http://schemas.openxmlformats.org/drawingml/2006/picture">
+                <pic:pic xmlns:pic="http://schemas.openxmlformats.org/drawingml/2006/picture">
+                  <pic:nvPicPr>
+                    <pic:cNvPr id="0" name="" descr=""/>
+                    <pic:cNvPicPr>
+                      <a:picLocks noChangeAspect="1" noChangeArrowheads="1"/>
+                    </pic:cNvPicPr>
+                  </pic:nvPicPr>
+                  <pic:blipFill>
+                    <a:blip r:embed="rId24" cstate="none"/>
+                    <a:srcRect/>
+                    <a:stretch>
+                      <a:fillRect/>
+                    </a:stretch>
+                  </pic:blipFill>
+                  <pic:spPr bwMode="auto">
+                    <a:xfrm>
+                      <a:off x="0" y="0"/>
+                      <a:ext cx="2857500" cy="3810000"/>
+                    </a:xfrm>
+                    <a:prstGeom prst="rect">
+                      <a:avLst/>
+                    </a:prstGeom>
+                  </pic:spPr>
+                </pic:pic>
+              </a:graphicData>
+            </a:graphic>
+          </wp:inline>
+        </w:drawing>
+      </w:r>
+    </w:p>
+    <w:p>
+      <w:pPr>
+        <w:spacing w:after="200"/>
+        <w:jc w:val="center"/>
+      </w:pPr>
+      <w:r>
+        <w:rPr>
+          <w:i/>
+          <w:iCs/>
+          <w:color w:val="6A6A6A"/>
+          <w:sz w:val="18"/>
+          <w:szCs w:val="18"/>
+        </w:rPr>
+        <w:t xml:space="preserve">Ein Gegner hat sich gelöst und stürzt im Bogen auf das Schiff herab.</w:t>
+      </w:r>
+    </w:p>
+    <w:p>
+      <w:pPr>
+        <w:pStyle w:val="Heading2"/>
+      </w:pPr>
+      <w:r>
+        <w:t xml:space="preserve">Was du gelernt hast</w:t>
+      </w:r>
+    </w:p>
+    <w:p>
+      <w:pPr>
+        <w:pStyle w:val="ListParagraph"/>
+        <w:numPr>
+          <w:ilvl w:val="0"/>
+          <w:numId w:val="2"/>
+        </w:numPr>
+        <w:spacing w:after="60"/>
+      </w:pPr>
+      <w:r>
+        <w:rPr>
+          <w:b/>
+          <w:bCs/>
+          <w:sz w:val="22"/>
+          <w:szCs w:val="22"/>
+        </w:rPr>
+        <w:t xml:space="preserve">ENUM </w:t>
+      </w:r>
+      <w:r>
+        <w:rPr>
+          <w:sz w:val="22"/>
+          <w:szCs w:val="22"/>
+        </w:rPr>
+        <w:t xml:space="preserve">gibt Zahlen verständliche Namen (St.ENTER/FORM/DIVE).</w:t>
+      </w:r>
+    </w:p>
+    <w:p>
+      <w:pPr>
+        <w:pStyle w:val="ListParagraph"/>
+        <w:numPr>
+          <w:ilvl w:val="0"/>
+          <w:numId w:val="2"/>
+        </w:numPr>
+        <w:spacing w:after="60"/>
+      </w:pPr>
+      <w:r>
+        <w:rPr>
+          <w:b/>
+          <w:bCs/>
+          <w:sz w:val="22"/>
+          <w:szCs w:val="22"/>
+        </w:rPr>
+        <w:t xml:space="preserve">Zustands-Maschine </w:t>
+      </w:r>
+      <w:r>
+        <w:rPr>
+          <w:sz w:val="22"/>
+          <w:szCs w:val="22"/>
+        </w:rPr>
+        <w:t xml:space="preserve">= ein Objekt wechselt zwischen klaren Zuständen; die Update-Methode reagiert je nach Zustand.</w:t>
+      </w:r>
+    </w:p>
+    <w:p>
+      <w:pPr>
+        <w:pStyle w:val="ListParagraph"/>
+        <w:numPr>
+          <w:ilvl w:val="0"/>
+          <w:numId w:val="2"/>
+        </w:numPr>
+        <w:spacing w:after="60"/>
+      </w:pPr>
+      <w:r>
+        <w:rPr>
+          <w:b/>
+          <w:bCs/>
+          <w:sz w:val="22"/>
+          <w:szCs w:val="22"/>
+        </w:rPr>
+        <w:t xml:space="preserve">Wiederverwenden </w:t>
+      </w:r>
+      <w:r>
+        <w:rPr>
+          <w:sz w:val="22"/>
+          <w:szCs w:val="22"/>
+        </w:rPr>
+        <w:t xml:space="preserve">= dieselbe SetPath-Methode für Einflug und Sturz.</w:t>
+      </w:r>
+    </w:p>
+    <w:p>
+      <w:pPr>
+        <w:pStyle w:val="ListParagraph"/>
+        <w:numPr>
+          <w:ilvl w:val="0"/>
+          <w:numId w:val="2"/>
+        </w:numPr>
+        <w:spacing w:after="60"/>
+      </w:pPr>
+      <w:r>
+        <w:rPr>
+          <w:b/>
+          <w:bCs/>
+          <w:sz w:val="22"/>
+          <w:szCs w:val="22"/>
+        </w:rPr>
+        <w:t xml:space="preserve">Zufalls-Auslöser </w:t>
+      </w:r>
+      <w:r>
+        <w:rPr>
+          <w:sz w:val="22"/>
+          <w:szCs w:val="22"/>
+        </w:rPr>
+        <w:t xml:space="preserve">= ein Timer + RANDINT bestimmen, wann und wer stürzt.</w:t>
+      </w:r>
+    </w:p>
+    <w:p>
+      <w:pPr>
+        <w:pStyle w:val="Heading2"/>
+      </w:pPr>
+      <w:r>
+        <w:t xml:space="preserve">Übung</w:t>
+      </w:r>
+    </w:p>
+    <w:p>
+      <w:pPr>
+        <w:pStyle w:val="ListParagraph"/>
+        <w:numPr>
+          <w:ilvl w:val="0"/>
+          <w:numId w:val="2"/>
+        </w:numPr>
+        <w:spacing w:after="60"/>
+      </w:pPr>
+      <w:r>
+        <w:rPr>
+          <w:sz w:val="22"/>
+          <w:szCs w:val="22"/>
+        </w:rPr>
+        <w:t xml:space="preserve">Lass Gegner häufiger oder seltener stürzen (diveTimer-Werte).</w:t>
+      </w:r>
+    </w:p>
+    <w:p>
+      <w:pPr>
+        <w:pStyle w:val="ListParagraph"/>
+        <w:numPr>
+          <w:ilvl w:val="0"/>
+          <w:numId w:val="2"/>
+        </w:numPr>
+        <w:spacing w:after="60"/>
+      </w:pPr>
+      <w:r>
+        <w:rPr>
+          <w:sz w:val="22"/>
+          <w:szCs w:val="22"/>
+        </w:rPr>
+        <w:t xml:space="preserve">Mach den Sturz schneller (die 0.013).</w:t>
+      </w:r>
+    </w:p>
+    <w:p>
+      <w:pPr>
+        <w:pStyle w:val="ListParagraph"/>
+        <w:numPr>
+          <w:ilvl w:val="0"/>
+          <w:numId w:val="2"/>
+        </w:numPr>
+        <w:spacing w:after="60"/>
+      </w:pPr>
+      <w:r>
+        <w:rPr>
+          <w:sz w:val="22"/>
+          <w:szCs w:val="22"/>
+        </w:rPr>
+        <w:t xml:space="preserve">Zusatz: Lass beim Sturz-Tiefpunkt etwas passieren (Vorschau auf die Bomben im nächsten Kapitel).</w:t>
       </w:r>
     </w:p>
     <w:sectPr>

</xml_diff>

<commit_message>
docs(buch-galaga): Kapitel 9 "Bomben & Ausweichen"
Update wird FUNCTION->BOOLEAN ("jetzt Bombe?"), dropAt/dropped (Abwurf einmal pro
Sturz an zufaelliger Bahnstelle), zweiter Pool fuer fallende Bomben (bmx/bmy/
boAlive, bombSpeed), Abwurf-bei-Signal + Fall/Frei-Gabe, Bomben-Pulsieren via
DRAWIMAGEPART. Kumulativ code/kap09/bomben.gb. Code-Bloecke, Screenshot
(Sturz+fallende Bombe), Zusammenfassung + Uebungen. gbrt --check clean, docx
validiert (PASSED), 31 Seiten, visuell geprueft.

Co-Authored-By: Claude Opus 4.8 <noreply@anthropic.com>
</commit_message>
<xml_diff>
--- a/buch-galaga/buch/GameBasic-Buch.docx
+++ b/buch-galaga/buch/GameBasic-Buch.docx
@@ -9527,6 +9527,958 @@
           <w:szCs w:val="22"/>
         </w:rPr>
         <w:t xml:space="preserve">Zusatz: Lass beim Sturz-Tiefpunkt etwas passieren (Vorschau auf die Bomben im nächsten Kapitel).</w:t>
+      </w:r>
+    </w:p>
+    <w:p>
+      <w:r>
+        <w:br w:type="page"/>
+      </w:r>
+    </w:p>
+    <w:p>
+      <w:pPr>
+        <w:pStyle w:val="Heading1"/>
+        <w:pBdr>
+          <w:bottom w:val="single" w:color="1B6CA8" w:sz="12" w:space="4"/>
+        </w:pBdr>
+        <w:spacing w:after="80" w:before="320"/>
+      </w:pPr>
+      <w:r>
+        <w:t xml:space="preserve">Kapitel 9: Bomben &amp; Ausweichen</w:t>
+      </w:r>
+    </w:p>
+    <w:tbl>
+      <w:tblPr>
+        <w:tblW w:type="dxa" w:w="9360"/>
+        <w:tblBorders>
+          <w:top w:val="single" w:color="auto" w:sz="4"/>
+          <w:left w:val="single" w:color="auto" w:sz="4"/>
+          <w:bottom w:val="single" w:color="auto" w:sz="4"/>
+          <w:right w:val="single" w:color="auto" w:sz="4"/>
+          <w:insideH w:val="single" w:color="auto" w:sz="4"/>
+          <w:insideV w:val="single" w:color="auto" w:sz="4"/>
+        </w:tblBorders>
+      </w:tblPr>
+      <w:tblGrid>
+        <w:gridCol w:w="9360"/>
+      </w:tblGrid>
+      <w:tr>
+        <w:tc>
+          <w:tcPr>
+            <w:tcW w:type="dxa" w:w="9360"/>
+            <w:tcBorders>
+              <w:top w:val="single" w:color="9CC8E6" w:sz="6"/>
+              <w:left w:val="single" w:color="9CC8E6" w:sz="6"/>
+              <w:bottom w:val="single" w:color="9CC8E6" w:sz="6"/>
+              <w:right w:val="single" w:color="9CC8E6" w:sz="6"/>
+            </w:tcBorders>
+            <w:shd w:fill="E7F2FA" w:val="clear"/>
+            <w:tcMar>
+              <w:top w:type="dxa" w:w="120"/>
+              <w:left w:type="dxa" w:w="160"/>
+              <w:bottom w:type="dxa" w:w="120"/>
+              <w:right w:type="dxa" w:w="160"/>
+            </w:tcMar>
+          </w:tcPr>
+          <w:p>
+            <w:pPr>
+              <w:spacing w:after="40"/>
+            </w:pPr>
+            <w:r>
+              <w:rPr>
+                <w:b/>
+                <w:bCs/>
+                <w:color w:val="1B6CA8"/>
+                <w:sz w:val="22"/>
+                <w:szCs w:val="22"/>
+              </w:rPr>
+              <w:t xml:space="preserve">In diesem Kapitel</w:t>
+            </w:r>
+          </w:p>
+          <w:p>
+            <w:r>
+              <w:rPr>
+                <w:sz w:val="22"/>
+                <w:szCs w:val="22"/>
+              </w:rPr>
+              <w:t xml:space="preserve">Jetzt wird zurückgeschossen: Stürzende Gegner werfen Bomben ab, denen du ausweichen musst. Du nutzt einen zweiten Pool – diesmal für fallende Bomben – und lernst, wie eine Methode mit FUNCTION ein Ergebnis zurückgibt.</w:t>
+            </w:r>
+          </w:p>
+        </w:tc>
+      </w:tr>
+    </w:tbl>
+    <w:p>
+      <w:pPr>
+        <w:pStyle w:val="Heading2"/>
+      </w:pPr>
+      <w:r>
+        <w:t xml:space="preserve">Update gibt Auskunft: FUNCTION</w:t>
+      </w:r>
+    </w:p>
+    <w:p>
+      <w:pPr>
+        <w:spacing w:after="140"/>
+      </w:pPr>
+      <w:r>
+        <w:rPr>
+          <w:sz w:val="22"/>
+          <w:szCs w:val="22"/>
+        </w:rPr>
+        <w:t xml:space="preserve">Bisher war </w:t>
+      </w:r>
+      <w:r>
+        <w:rPr>
+          <w:rFonts w:ascii="Consolas" w:cs="Consolas" w:eastAsia="Consolas" w:hAnsi="Consolas"/>
+          <w:sz w:val="21"/>
+          <w:szCs w:val="21"/>
+        </w:rPr>
+        <w:t xml:space="preserve">Update</w:t>
+      </w:r>
+      <w:r>
+        <w:rPr>
+          <w:sz w:val="22"/>
+          <w:szCs w:val="22"/>
+        </w:rPr>
+        <w:t xml:space="preserve"> eine SUB – sie tut etwas, gibt aber nichts zurück. Eine </w:t>
+      </w:r>
+      <w:r>
+        <w:rPr>
+          <w:rFonts w:ascii="Consolas" w:cs="Consolas" w:eastAsia="Consolas" w:hAnsi="Consolas"/>
+          <w:sz w:val="21"/>
+          <w:szCs w:val="21"/>
+        </w:rPr>
+        <w:t xml:space="preserve">FUNCTION</w:t>
+      </w:r>
+      <w:r>
+        <w:rPr>
+          <w:sz w:val="22"/>
+          <w:szCs w:val="22"/>
+        </w:rPr>
+        <w:t xml:space="preserve"> ist dasselbe, liefert aber ein Ergebnis mit </w:t>
+      </w:r>
+      <w:r>
+        <w:rPr>
+          <w:rFonts w:ascii="Consolas" w:cs="Consolas" w:eastAsia="Consolas" w:hAnsi="Consolas"/>
+          <w:sz w:val="21"/>
+          <w:szCs w:val="21"/>
+        </w:rPr>
+        <w:t xml:space="preserve">RETURN</w:t>
+      </w:r>
+      <w:r>
+        <w:rPr>
+          <w:sz w:val="22"/>
+          <w:szCs w:val="22"/>
+        </w:rPr>
+        <w:t xml:space="preserve">. Wir machen daraus eine FUNCTION, die </w:t>
+      </w:r>
+      <w:r>
+        <w:rPr>
+          <w:rFonts w:ascii="Consolas" w:cs="Consolas" w:eastAsia="Consolas" w:hAnsi="Consolas"/>
+          <w:sz w:val="21"/>
+          <w:szCs w:val="21"/>
+        </w:rPr>
+        <w:t xml:space="preserve">TRUE</w:t>
+      </w:r>
+      <w:r>
+        <w:rPr>
+          <w:sz w:val="22"/>
+          <w:szCs w:val="22"/>
+        </w:rPr>
+        <w:t xml:space="preserve"> zurückgibt, wenn der Gegner gerade jetzt eine Bombe abwerfen soll:</w:t>
+      </w:r>
+    </w:p>
+    <w:p>
+      <w:pPr>
+        <w:pBdr>
+          <w:left w:val="single" w:color="1B6CA8" w:sz="18" w:space="6"/>
+        </w:pBdr>
+        <w:shd w:fill="F4F4F4" w:val="clear"/>
+        <w:spacing w:after="160" w:before="80"/>
+        <w:ind w:left="120"/>
+      </w:pPr>
+      <w:r>
+        <w:rPr>
+          <w:rFonts w:ascii="Consolas" w:cs="Consolas" w:eastAsia="Consolas" w:hAnsi="Consolas"/>
+          <w:sz w:val="19"/>
+          <w:szCs w:val="19"/>
+        </w:rPr>
+        <w:t xml:space="preserve">FUNCTION Update(sway AS FLOAT) AS BOOLEAN</w:t>
+      </w:r>
+      <w:r>
+        <w:rPr>
+          <w:rFonts w:ascii="Consolas" w:cs="Consolas" w:eastAsia="Consolas" w:hAnsi="Consolas"/>
+          <w:sz w:val="19"/>
+          <w:szCs w:val="19"/>
+        </w:rPr>
+        <w:br/>
+        <w:t xml:space="preserve">    ' ... bewegen wie bisher ...</w:t>
+      </w:r>
+      <w:r>
+        <w:rPr>
+          <w:rFonts w:ascii="Consolas" w:cs="Consolas" w:eastAsia="Consolas" w:hAnsi="Consolas"/>
+          <w:sz w:val="19"/>
+          <w:szCs w:val="19"/>
+        </w:rPr>
+        <w:br/>
+        <w:t xml:space="preserve">    DIM drop AS BOOLEAN : drop = FALSE</w:t>
+      </w:r>
+      <w:r>
+        <w:rPr>
+          <w:rFonts w:ascii="Consolas" w:cs="Consolas" w:eastAsia="Consolas" w:hAnsi="Consolas"/>
+          <w:sz w:val="19"/>
+          <w:szCs w:val="19"/>
+        </w:rPr>
+        <w:br/>
+        <w:t xml:space="preserve">    IF Self.state = St.DIVE AND NOT Self.dropped AND Self.t &gt;= Self.dropAt THEN</w:t>
+      </w:r>
+      <w:r>
+        <w:rPr>
+          <w:rFonts w:ascii="Consolas" w:cs="Consolas" w:eastAsia="Consolas" w:hAnsi="Consolas"/>
+          <w:sz w:val="19"/>
+          <w:szCs w:val="19"/>
+        </w:rPr>
+        <w:br/>
+        <w:t xml:space="preserve">        Self.dropped = TRUE : drop = TRUE</w:t>
+      </w:r>
+      <w:r>
+        <w:rPr>
+          <w:rFonts w:ascii="Consolas" w:cs="Consolas" w:eastAsia="Consolas" w:hAnsi="Consolas"/>
+          <w:sz w:val="19"/>
+          <w:szCs w:val="19"/>
+        </w:rPr>
+        <w:br/>
+        <w:t xml:space="preserve">    END IF</w:t>
+      </w:r>
+      <w:r>
+        <w:rPr>
+          <w:rFonts w:ascii="Consolas" w:cs="Consolas" w:eastAsia="Consolas" w:hAnsi="Consolas"/>
+          <w:sz w:val="19"/>
+          <w:szCs w:val="19"/>
+        </w:rPr>
+        <w:br/>
+        <w:t xml:space="preserve">    ' ... Zustandswechsel bei t &gt;= 1 ...</w:t>
+      </w:r>
+      <w:r>
+        <w:rPr>
+          <w:rFonts w:ascii="Consolas" w:cs="Consolas" w:eastAsia="Consolas" w:hAnsi="Consolas"/>
+          <w:sz w:val="19"/>
+          <w:szCs w:val="19"/>
+        </w:rPr>
+        <w:br/>
+        <w:t xml:space="preserve">    RETURN drop</w:t>
+      </w:r>
+      <w:r>
+        <w:rPr>
+          <w:rFonts w:ascii="Consolas" w:cs="Consolas" w:eastAsia="Consolas" w:hAnsi="Consolas"/>
+          <w:sz w:val="19"/>
+          <w:szCs w:val="19"/>
+        </w:rPr>
+        <w:br/>
+        <w:t xml:space="preserve">END FUNCTION</w:t>
+      </w:r>
+    </w:p>
+    <w:p>
+      <w:pPr>
+        <w:spacing w:after="140"/>
+      </w:pPr>
+      <w:r>
+        <w:rPr>
+          <w:sz w:val="22"/>
+          <w:szCs w:val="22"/>
+        </w:rPr>
+        <w:t xml:space="preserve">Das Feld </w:t>
+      </w:r>
+      <w:r>
+        <w:rPr>
+          <w:rFonts w:ascii="Consolas" w:cs="Consolas" w:eastAsia="Consolas" w:hAnsi="Consolas"/>
+          <w:sz w:val="21"/>
+          <w:szCs w:val="21"/>
+        </w:rPr>
+        <w:t xml:space="preserve">dropped</w:t>
+      </w:r>
+      <w:r>
+        <w:rPr>
+          <w:sz w:val="22"/>
+          <w:szCs w:val="22"/>
+        </w:rPr>
+        <w:t xml:space="preserve"> sorgt dafür, dass pro Sturz nur eine Bombe fällt: Einmal abgeworfen, bleibt es </w:t>
+      </w:r>
+      <w:r>
+        <w:rPr>
+          <w:rFonts w:ascii="Consolas" w:cs="Consolas" w:eastAsia="Consolas" w:hAnsi="Consolas"/>
+          <w:sz w:val="21"/>
+          <w:szCs w:val="21"/>
+        </w:rPr>
+        <w:t xml:space="preserve">TRUE</w:t>
+      </w:r>
+      <w:r>
+        <w:rPr>
+          <w:sz w:val="22"/>
+          <w:szCs w:val="22"/>
+        </w:rPr>
+        <w:t xml:space="preserve">, bis der nächste Sturz beginnt.</w:t>
+      </w:r>
+    </w:p>
+    <w:p>
+      <w:pPr>
+        <w:pStyle w:val="Heading2"/>
+      </w:pPr>
+      <w:r>
+        <w:t xml:space="preserve">Wann fällt eine Bombe?</w:t>
+      </w:r>
+    </w:p>
+    <w:p>
+      <w:pPr>
+        <w:spacing w:after="140"/>
+      </w:pPr>
+      <w:r>
+        <w:rPr>
+          <w:sz w:val="22"/>
+          <w:szCs w:val="22"/>
+        </w:rPr>
+        <w:t xml:space="preserve">Beim Start des Sturzes legen wir in </w:t>
+      </w:r>
+      <w:r>
+        <w:rPr>
+          <w:rFonts w:ascii="Consolas" w:cs="Consolas" w:eastAsia="Consolas" w:hAnsi="Consolas"/>
+          <w:sz w:val="21"/>
+          <w:szCs w:val="21"/>
+        </w:rPr>
+        <w:t xml:space="preserve">Dive</w:t>
+      </w:r>
+      <w:r>
+        <w:rPr>
+          <w:sz w:val="22"/>
+          <w:szCs w:val="22"/>
+        </w:rPr>
+        <w:t xml:space="preserve"> einen zufälligen Zeitpunkt fest – etwa in der Bahnmitte:</w:t>
+      </w:r>
+    </w:p>
+    <w:p>
+      <w:pPr>
+        <w:pBdr>
+          <w:left w:val="single" w:color="1B6CA8" w:sz="18" w:space="6"/>
+        </w:pBdr>
+        <w:shd w:fill="F4F4F4" w:val="clear"/>
+        <w:spacing w:after="160" w:before="80"/>
+        <w:ind w:left="120"/>
+      </w:pPr>
+      <w:r>
+        <w:rPr>
+          <w:rFonts w:ascii="Consolas" w:cs="Consolas" w:eastAsia="Consolas" w:hAnsi="Consolas"/>
+          <w:sz w:val="19"/>
+          <w:szCs w:val="19"/>
+        </w:rPr>
+        <w:t xml:space="preserve">Self.dropAt = 0.45 + RANDF(0.0, 0.2)   ' irgendwo um die Mitte (t)</w:t>
+      </w:r>
+      <w:r>
+        <w:rPr>
+          <w:rFonts w:ascii="Consolas" w:cs="Consolas" w:eastAsia="Consolas" w:hAnsi="Consolas"/>
+          <w:sz w:val="19"/>
+          <w:szCs w:val="19"/>
+        </w:rPr>
+        <w:br/>
+        <w:t xml:space="preserve">Self.dropped = FALSE</w:t>
+      </w:r>
+    </w:p>
+    <w:p>
+      <w:pPr>
+        <w:spacing w:after="140"/>
+      </w:pPr>
+      <w:r>
+        <w:rPr>
+          <w:sz w:val="22"/>
+          <w:szCs w:val="22"/>
+        </w:rPr>
+        <w:t xml:space="preserve">Sobald </w:t>
+      </w:r>
+      <w:r>
+        <w:rPr>
+          <w:rFonts w:ascii="Consolas" w:cs="Consolas" w:eastAsia="Consolas" w:hAnsi="Consolas"/>
+          <w:sz w:val="21"/>
+          <w:szCs w:val="21"/>
+        </w:rPr>
+        <w:t xml:space="preserve">Self.t</w:t>
+      </w:r>
+      <w:r>
+        <w:rPr>
+          <w:sz w:val="22"/>
+          <w:szCs w:val="22"/>
+        </w:rPr>
+        <w:t xml:space="preserve"> diesen </w:t>
+      </w:r>
+      <w:r>
+        <w:rPr>
+          <w:rFonts w:ascii="Consolas" w:cs="Consolas" w:eastAsia="Consolas" w:hAnsi="Consolas"/>
+          <w:sz w:val="21"/>
+          <w:szCs w:val="21"/>
+        </w:rPr>
+        <w:t xml:space="preserve">dropAt</w:t>
+      </w:r>
+      <w:r>
+        <w:rPr>
+          <w:sz w:val="22"/>
+          <w:szCs w:val="22"/>
+        </w:rPr>
+        <w:t xml:space="preserve"> überschreitet, gibt Update einmalig </w:t>
+      </w:r>
+      <w:r>
+        <w:rPr>
+          <w:rFonts w:ascii="Consolas" w:cs="Consolas" w:eastAsia="Consolas" w:hAnsi="Consolas"/>
+          <w:sz w:val="21"/>
+          <w:szCs w:val="21"/>
+        </w:rPr>
+        <w:t xml:space="preserve">TRUE</w:t>
+      </w:r>
+      <w:r>
+        <w:rPr>
+          <w:sz w:val="22"/>
+          <w:szCs w:val="22"/>
+        </w:rPr>
+        <w:t xml:space="preserve"> zurück.</w:t>
+      </w:r>
+    </w:p>
+    <w:p>
+      <w:pPr>
+        <w:pStyle w:val="Heading2"/>
+      </w:pPr>
+      <w:r>
+        <w:t xml:space="preserve">Der Bomben-Pool</w:t>
+      </w:r>
+    </w:p>
+    <w:p>
+      <w:pPr>
+        <w:spacing w:after="140"/>
+      </w:pPr>
+      <w:r>
+        <w:rPr>
+          <w:sz w:val="22"/>
+          <w:szCs w:val="22"/>
+        </w:rPr>
+        <w:t xml:space="preserve">Genau wie die Schüsse verwalten wir Bomben in einem Pool – nur dass sie nach unten fallen. Erst der Vorrat:</w:t>
+      </w:r>
+    </w:p>
+    <w:p>
+      <w:pPr>
+        <w:pBdr>
+          <w:left w:val="single" w:color="1B6CA8" w:sz="18" w:space="6"/>
+        </w:pBdr>
+        <w:shd w:fill="F4F4F4" w:val="clear"/>
+        <w:spacing w:after="160" w:before="80"/>
+        <w:ind w:left="120"/>
+      </w:pPr>
+      <w:r>
+        <w:rPr>
+          <w:rFonts w:ascii="Consolas" w:cs="Consolas" w:eastAsia="Consolas" w:hAnsi="Consolas"/>
+          <w:sz w:val="19"/>
+          <w:szCs w:val="19"/>
+        </w:rPr>
+        <w:t xml:space="preserve">DIM bombImg AS IMAGE</w:t>
+      </w:r>
+      <w:r>
+        <w:rPr>
+          <w:rFonts w:ascii="Consolas" w:cs="Consolas" w:eastAsia="Consolas" w:hAnsi="Consolas"/>
+          <w:sz w:val="19"/>
+          <w:szCs w:val="19"/>
+        </w:rPr>
+        <w:br/>
+        <w:t xml:space="preserve">bombImg = LOADIMAGE("../../assets/sprites/bomb.png")</w:t>
+      </w:r>
+      <w:r>
+        <w:rPr>
+          <w:rFonts w:ascii="Consolas" w:cs="Consolas" w:eastAsia="Consolas" w:hAnsi="Consolas"/>
+          <w:sz w:val="19"/>
+          <w:szCs w:val="19"/>
+        </w:rPr>
+        <w:br/>
+        <w:t xml:space="preserve">CONST NBOMB AS INTEGER = 8</w:t>
+      </w:r>
+      <w:r>
+        <w:rPr>
+          <w:rFonts w:ascii="Consolas" w:cs="Consolas" w:eastAsia="Consolas" w:hAnsi="Consolas"/>
+          <w:sz w:val="19"/>
+          <w:szCs w:val="19"/>
+        </w:rPr>
+        <w:br/>
+        <w:t xml:space="preserve">DIM bmx[NBOMB] AS FLOAT : DIM bmy[NBOMB] AS FLOAT</w:t>
+      </w:r>
+      <w:r>
+        <w:rPr>
+          <w:rFonts w:ascii="Consolas" w:cs="Consolas" w:eastAsia="Consolas" w:hAnsi="Consolas"/>
+          <w:sz w:val="19"/>
+          <w:szCs w:val="19"/>
+        </w:rPr>
+        <w:br/>
+        <w:t xml:space="preserve">DIM boAlive[NBOMB] AS BOOLEAN</w:t>
+      </w:r>
+      <w:r>
+        <w:rPr>
+          <w:rFonts w:ascii="Consolas" w:cs="Consolas" w:eastAsia="Consolas" w:hAnsi="Consolas"/>
+          <w:sz w:val="19"/>
+          <w:szCs w:val="19"/>
+        </w:rPr>
+        <w:br/>
+        <w:t xml:space="preserve">FOR i = 0 TO NBOMB - 1 : boAlive[i] = FALSE : NEXT i</w:t>
+      </w:r>
+      <w:r>
+        <w:rPr>
+          <w:rFonts w:ascii="Consolas" w:cs="Consolas" w:eastAsia="Consolas" w:hAnsi="Consolas"/>
+          <w:sz w:val="19"/>
+          <w:szCs w:val="19"/>
+        </w:rPr>
+        <w:br/>
+        <w:t xml:space="preserve">DIM bombSpeed AS FLOAT : bombSpeed = 3.0</w:t>
+      </w:r>
+    </w:p>
+    <w:p>
+      <w:pPr>
+        <w:spacing w:after="140"/>
+      </w:pPr>
+      <w:r>
+        <w:rPr>
+          <w:sz w:val="22"/>
+          <w:szCs w:val="22"/>
+        </w:rPr>
+        <w:t xml:space="preserve">Wenn Update TRUE meldet, suchen wir einen freien Bomben-Platz an der Gegnerposition:</w:t>
+      </w:r>
+    </w:p>
+    <w:p>
+      <w:pPr>
+        <w:pBdr>
+          <w:left w:val="single" w:color="1B6CA8" w:sz="18" w:space="6"/>
+        </w:pBdr>
+        <w:shd w:fill="F4F4F4" w:val="clear"/>
+        <w:spacing w:after="160" w:before="80"/>
+        <w:ind w:left="120"/>
+      </w:pPr>
+      <w:r>
+        <w:rPr>
+          <w:rFonts w:ascii="Consolas" w:cs="Consolas" w:eastAsia="Consolas" w:hAnsi="Consolas"/>
+          <w:sz w:val="19"/>
+          <w:szCs w:val="19"/>
+        </w:rPr>
+        <w:t xml:space="preserve">IF bugs[i].Update(sway) THEN</w:t>
+      </w:r>
+      <w:r>
+        <w:rPr>
+          <w:rFonts w:ascii="Consolas" w:cs="Consolas" w:eastAsia="Consolas" w:hAnsi="Consolas"/>
+          <w:sz w:val="19"/>
+          <w:szCs w:val="19"/>
+        </w:rPr>
+        <w:br/>
+        <w:t xml:space="preserve">    DIM b AS INTEGER</w:t>
+      </w:r>
+      <w:r>
+        <w:rPr>
+          <w:rFonts w:ascii="Consolas" w:cs="Consolas" w:eastAsia="Consolas" w:hAnsi="Consolas"/>
+          <w:sz w:val="19"/>
+          <w:szCs w:val="19"/>
+        </w:rPr>
+        <w:br/>
+        <w:t xml:space="preserve">    FOR b = 0 TO NBOMB - 1</w:t>
+      </w:r>
+      <w:r>
+        <w:rPr>
+          <w:rFonts w:ascii="Consolas" w:cs="Consolas" w:eastAsia="Consolas" w:hAnsi="Consolas"/>
+          <w:sz w:val="19"/>
+          <w:szCs w:val="19"/>
+        </w:rPr>
+        <w:br/>
+        <w:t xml:space="preserve">        IF NOT boAlive[b] THEN</w:t>
+      </w:r>
+      <w:r>
+        <w:rPr>
+          <w:rFonts w:ascii="Consolas" w:cs="Consolas" w:eastAsia="Consolas" w:hAnsi="Consolas"/>
+          <w:sz w:val="19"/>
+          <w:szCs w:val="19"/>
+        </w:rPr>
+        <w:br/>
+        <w:t xml:space="preserve">            boAlive[b] = TRUE : bmx[b] = bugs[i].x + 5.0 : bmy[b] = bugs[i].y + 8.0 : BREAK</w:t>
+      </w:r>
+      <w:r>
+        <w:rPr>
+          <w:rFonts w:ascii="Consolas" w:cs="Consolas" w:eastAsia="Consolas" w:hAnsi="Consolas"/>
+          <w:sz w:val="19"/>
+          <w:szCs w:val="19"/>
+        </w:rPr>
+        <w:br/>
+        <w:t xml:space="preserve">        END IF</w:t>
+      </w:r>
+      <w:r>
+        <w:rPr>
+          <w:rFonts w:ascii="Consolas" w:cs="Consolas" w:eastAsia="Consolas" w:hAnsi="Consolas"/>
+          <w:sz w:val="19"/>
+          <w:szCs w:val="19"/>
+        </w:rPr>
+        <w:br/>
+        <w:t xml:space="preserve">    NEXT b</w:t>
+      </w:r>
+      <w:r>
+        <w:rPr>
+          <w:rFonts w:ascii="Consolas" w:cs="Consolas" w:eastAsia="Consolas" w:hAnsi="Consolas"/>
+          <w:sz w:val="19"/>
+          <w:szCs w:val="19"/>
+        </w:rPr>
+        <w:br/>
+        <w:t xml:space="preserve">END IF</w:t>
+      </w:r>
+    </w:p>
+    <w:p>
+      <w:pPr>
+        <w:spacing w:after="140"/>
+      </w:pPr>
+      <w:r>
+        <w:rPr>
+          <w:sz w:val="22"/>
+          <w:szCs w:val="22"/>
+        </w:rPr>
+        <w:t xml:space="preserve">Und jeden Frame fallen die Bomben nach unten – wer unten herausfällt, gibt seinen Platz frei:</w:t>
+      </w:r>
+    </w:p>
+    <w:p>
+      <w:pPr>
+        <w:pBdr>
+          <w:left w:val="single" w:color="1B6CA8" w:sz="18" w:space="6"/>
+        </w:pBdr>
+        <w:shd w:fill="F4F4F4" w:val="clear"/>
+        <w:spacing w:after="160" w:before="80"/>
+        <w:ind w:left="120"/>
+      </w:pPr>
+      <w:r>
+        <w:rPr>
+          <w:rFonts w:ascii="Consolas" w:cs="Consolas" w:eastAsia="Consolas" w:hAnsi="Consolas"/>
+          <w:sz w:val="19"/>
+          <w:szCs w:val="19"/>
+        </w:rPr>
+        <w:t xml:space="preserve">FOR i = 0 TO NBOMB - 1</w:t>
+      </w:r>
+      <w:r>
+        <w:rPr>
+          <w:rFonts w:ascii="Consolas" w:cs="Consolas" w:eastAsia="Consolas" w:hAnsi="Consolas"/>
+          <w:sz w:val="19"/>
+          <w:szCs w:val="19"/>
+        </w:rPr>
+        <w:br/>
+        <w:t xml:space="preserve">    IF boAlive[i] THEN</w:t>
+      </w:r>
+      <w:r>
+        <w:rPr>
+          <w:rFonts w:ascii="Consolas" w:cs="Consolas" w:eastAsia="Consolas" w:hAnsi="Consolas"/>
+          <w:sz w:val="19"/>
+          <w:szCs w:val="19"/>
+        </w:rPr>
+        <w:br/>
+        <w:t xml:space="preserve">        bmy[i] = bmy[i] + bombSpeed</w:t>
+      </w:r>
+      <w:r>
+        <w:rPr>
+          <w:rFonts w:ascii="Consolas" w:cs="Consolas" w:eastAsia="Consolas" w:hAnsi="Consolas"/>
+          <w:sz w:val="19"/>
+          <w:szCs w:val="19"/>
+        </w:rPr>
+        <w:br/>
+        <w:t xml:space="preserve">        IF bmy[i] &gt; 640.0 THEN boAlive[i] = FALSE</w:t>
+      </w:r>
+      <w:r>
+        <w:rPr>
+          <w:rFonts w:ascii="Consolas" w:cs="Consolas" w:eastAsia="Consolas" w:hAnsi="Consolas"/>
+          <w:sz w:val="19"/>
+          <w:szCs w:val="19"/>
+        </w:rPr>
+        <w:br/>
+        <w:t xml:space="preserve">        DRAWIMAGEPART(bombImg, srcXb, 0, 6, 6, INT(bmx[i]), INT(bmy[i]))</w:t>
+      </w:r>
+      <w:r>
+        <w:rPr>
+          <w:rFonts w:ascii="Consolas" w:cs="Consolas" w:eastAsia="Consolas" w:hAnsi="Consolas"/>
+          <w:sz w:val="19"/>
+          <w:szCs w:val="19"/>
+        </w:rPr>
+        <w:br/>
+        <w:t xml:space="preserve">    END IF</w:t>
+      </w:r>
+      <w:r>
+        <w:rPr>
+          <w:rFonts w:ascii="Consolas" w:cs="Consolas" w:eastAsia="Consolas" w:hAnsi="Consolas"/>
+          <w:sz w:val="19"/>
+          <w:szCs w:val="19"/>
+        </w:rPr>
+        <w:br/>
+        <w:t xml:space="preserve">NEXT i</w:t>
+      </w:r>
+    </w:p>
+    <w:p>
+      <w:pPr>
+        <w:spacing w:after="140"/>
+      </w:pPr>
+      <w:r>
+        <w:rPr>
+          <w:sz w:val="22"/>
+          <w:szCs w:val="22"/>
+        </w:rPr>
+        <w:t xml:space="preserve"/>
+      </w:r>
+      <w:r>
+        <w:rPr>
+          <w:rFonts w:ascii="Consolas" w:cs="Consolas" w:eastAsia="Consolas" w:hAnsi="Consolas"/>
+          <w:sz w:val="21"/>
+          <w:szCs w:val="21"/>
+        </w:rPr>
+        <w:t xml:space="preserve">srcXb</w:t>
+      </w:r>
+      <w:r>
+        <w:rPr>
+          <w:sz w:val="22"/>
+          <w:szCs w:val="22"/>
+        </w:rPr>
+        <w:t xml:space="preserve"> wechselt wie beim Flügelschlag zwischen den zwei Bomben-Frames (Pulsieren). Das vollständige Programm liegt in </w:t>
+      </w:r>
+      <w:r>
+        <w:rPr>
+          <w:rFonts w:ascii="Consolas" w:cs="Consolas" w:eastAsia="Consolas" w:hAnsi="Consolas"/>
+          <w:sz w:val="21"/>
+          <w:szCs w:val="21"/>
+        </w:rPr>
+        <w:t xml:space="preserve">code/kap09/bomben.gb</w:t>
+      </w:r>
+      <w:r>
+        <w:rPr>
+          <w:sz w:val="22"/>
+          <w:szCs w:val="22"/>
+        </w:rPr>
+        <w:t xml:space="preserve">.</w:t>
+      </w:r>
+    </w:p>
+    <w:p>
+      <w:pPr>
+        <w:spacing w:after="40" w:before="120"/>
+        <w:jc w:val="center"/>
+      </w:pPr>
+      <w:r>
+        <w:drawing>
+          <wp:inline distT="0" distB="0" distL="0" distR="0">
+            <wp:extent cx="2857500" cy="3810000"/>
+            <wp:effectExtent t="0" r="0" b="0" l="0"/>
+            <wp:docPr id="1" name="kap09_bomben.png" descr="Ein Gegner stürzt und hat eine Bombe abgeworfen – sie fällt nun nach unten." title="Ein Gegner stürzt und hat eine Bombe abgeworfen – sie fällt nun nach unten."/>
+            <wp:cNvGraphicFramePr>
+              <a:graphicFrameLocks xmlns:a="http://schemas.openxmlformats.org/drawingml/2006/main" noChangeAspect="1"/>
+            </wp:cNvGraphicFramePr>
+            <a:graphic xmlns:a="http://schemas.openxmlformats.org/drawingml/2006/main">
+              <a:graphicData uri="http://schemas.openxmlformats.org/drawingml/2006/picture">
+                <pic:pic xmlns:pic="http://schemas.openxmlformats.org/drawingml/2006/picture">
+                  <pic:nvPicPr>
+                    <pic:cNvPr id="0" name="" descr=""/>
+                    <pic:cNvPicPr>
+                      <a:picLocks noChangeAspect="1" noChangeArrowheads="1"/>
+                    </pic:cNvPicPr>
+                  </pic:nvPicPr>
+                  <pic:blipFill>
+                    <a:blip r:embed="rId25" cstate="none"/>
+                    <a:srcRect/>
+                    <a:stretch>
+                      <a:fillRect/>
+                    </a:stretch>
+                  </pic:blipFill>
+                  <pic:spPr bwMode="auto">
+                    <a:xfrm>
+                      <a:off x="0" y="0"/>
+                      <a:ext cx="2857500" cy="3810000"/>
+                    </a:xfrm>
+                    <a:prstGeom prst="rect">
+                      <a:avLst/>
+                    </a:prstGeom>
+                  </pic:spPr>
+                </pic:pic>
+              </a:graphicData>
+            </a:graphic>
+          </wp:inline>
+        </w:drawing>
+      </w:r>
+    </w:p>
+    <w:p>
+      <w:pPr>
+        <w:spacing w:after="200"/>
+        <w:jc w:val="center"/>
+      </w:pPr>
+      <w:r>
+        <w:rPr>
+          <w:i/>
+          <w:iCs/>
+          <w:color w:val="6A6A6A"/>
+          <w:sz w:val="18"/>
+          <w:szCs w:val="18"/>
+        </w:rPr>
+        <w:t xml:space="preserve">Ein Gegner stürzt und hat eine Bombe abgeworfen – sie fällt nun nach unten.</w:t>
+      </w:r>
+    </w:p>
+    <w:p>
+      <w:pPr>
+        <w:pStyle w:val="Heading2"/>
+      </w:pPr>
+      <w:r>
+        <w:t xml:space="preserve">Was du gelernt hast</w:t>
+      </w:r>
+    </w:p>
+    <w:p>
+      <w:pPr>
+        <w:pStyle w:val="ListParagraph"/>
+        <w:numPr>
+          <w:ilvl w:val="0"/>
+          <w:numId w:val="2"/>
+        </w:numPr>
+        <w:spacing w:after="60"/>
+      </w:pPr>
+      <w:r>
+        <w:rPr>
+          <w:b/>
+          <w:bCs/>
+          <w:sz w:val="22"/>
+          <w:szCs w:val="22"/>
+        </w:rPr>
+        <w:t xml:space="preserve">FUNCTION </w:t>
+      </w:r>
+      <w:r>
+        <w:rPr>
+          <w:sz w:val="22"/>
+          <w:szCs w:val="22"/>
+        </w:rPr>
+        <w:t xml:space="preserve">= wie SUB, gibt aber mit RETURN ein Ergebnis zurück (hier: „jetzt Bombe?“).</w:t>
+      </w:r>
+    </w:p>
+    <w:p>
+      <w:pPr>
+        <w:pStyle w:val="ListParagraph"/>
+        <w:numPr>
+          <w:ilvl w:val="0"/>
+          <w:numId w:val="2"/>
+        </w:numPr>
+        <w:spacing w:after="60"/>
+      </w:pPr>
+      <w:r>
+        <w:rPr>
+          <w:b/>
+          <w:bCs/>
+          <w:sz w:val="22"/>
+          <w:szCs w:val="22"/>
+        </w:rPr>
+        <w:t xml:space="preserve">dropped-Flag </w:t>
+      </w:r>
+      <w:r>
+        <w:rPr>
+          <w:sz w:val="22"/>
+          <w:szCs w:val="22"/>
+        </w:rPr>
+        <w:t xml:space="preserve">verhindert, dass pro Sturz mehrere Bomben fallen.</w:t>
+      </w:r>
+    </w:p>
+    <w:p>
+      <w:pPr>
+        <w:pStyle w:val="ListParagraph"/>
+        <w:numPr>
+          <w:ilvl w:val="0"/>
+          <w:numId w:val="2"/>
+        </w:numPr>
+        <w:spacing w:after="60"/>
+      </w:pPr>
+      <w:r>
+        <w:rPr>
+          <w:b/>
+          <w:bCs/>
+          <w:sz w:val="22"/>
+          <w:szCs w:val="22"/>
+        </w:rPr>
+        <w:t xml:space="preserve">Zweiter Pool </w:t>
+      </w:r>
+      <w:r>
+        <w:rPr>
+          <w:sz w:val="22"/>
+          <w:szCs w:val="22"/>
+        </w:rPr>
+        <w:t xml:space="preserve">= Bomben funktionieren wie Schüsse, fallen aber nach unten.</w:t>
+      </w:r>
+    </w:p>
+    <w:p>
+      <w:pPr>
+        <w:pStyle w:val="ListParagraph"/>
+        <w:numPr>
+          <w:ilvl w:val="0"/>
+          <w:numId w:val="2"/>
+        </w:numPr>
+        <w:spacing w:after="60"/>
+      </w:pPr>
+      <w:r>
+        <w:rPr>
+          <w:b/>
+          <w:bCs/>
+          <w:sz w:val="22"/>
+          <w:szCs w:val="22"/>
+        </w:rPr>
+        <w:t xml:space="preserve">Timing über t </w:t>
+      </w:r>
+      <w:r>
+        <w:rPr>
+          <w:sz w:val="22"/>
+          <w:szCs w:val="22"/>
+        </w:rPr>
+        <w:t xml:space="preserve">= der Abwurf hängt am Fortschritt der Sturzbahn (dropAt).</w:t>
+      </w:r>
+    </w:p>
+    <w:p>
+      <w:pPr>
+        <w:pStyle w:val="Heading2"/>
+      </w:pPr>
+      <w:r>
+        <w:t xml:space="preserve">Übung</w:t>
+      </w:r>
+    </w:p>
+    <w:p>
+      <w:pPr>
+        <w:pStyle w:val="ListParagraph"/>
+        <w:numPr>
+          <w:ilvl w:val="0"/>
+          <w:numId w:val="2"/>
+        </w:numPr>
+        <w:spacing w:after="60"/>
+      </w:pPr>
+      <w:r>
+        <w:rPr>
+          <w:sz w:val="22"/>
+          <w:szCs w:val="22"/>
+        </w:rPr>
+        <w:t xml:space="preserve">Mach die Bomben schneller oder langsamer (bombSpeed).</w:t>
+      </w:r>
+    </w:p>
+    <w:p>
+      <w:pPr>
+        <w:pStyle w:val="ListParagraph"/>
+        <w:numPr>
+          <w:ilvl w:val="0"/>
+          <w:numId w:val="2"/>
+        </w:numPr>
+        <w:spacing w:after="60"/>
+      </w:pPr>
+      <w:r>
+        <w:rPr>
+          <w:sz w:val="22"/>
+          <w:szCs w:val="22"/>
+        </w:rPr>
+        <w:t xml:space="preserve">Lass Gegner früher oder später abwerfen (dropAt).</w:t>
+      </w:r>
+    </w:p>
+    <w:p>
+      <w:pPr>
+        <w:pStyle w:val="ListParagraph"/>
+        <w:numPr>
+          <w:ilvl w:val="0"/>
+          <w:numId w:val="2"/>
+        </w:numPr>
+        <w:spacing w:after="60"/>
+      </w:pPr>
+      <w:r>
+        <w:rPr>
+          <w:sz w:val="22"/>
+          <w:szCs w:val="22"/>
+        </w:rPr>
+        <w:t xml:space="preserve">Erhöhe NBOMB, damit mehr Bomben gleichzeitig fallen können.</w:t>
       </w:r>
     </w:p>
     <w:sectPr>

</xml_diff>

<commit_message>
docs(buch-galaga): Kapitel 10 "Treffer & Punkte" + Leerseiten-Fix
Spielbares Spiel: eigene FUNCTION Overlap (AABB/BOOLEAN-Logik), Schuss-vs-Gegner
(+Score je Reihe), Spieler-Treffer (Bombe/Sturz -> Leben-1 + invuln-Blinken),
HUD (TEXT/STR$), SUB NewGame (Formation/Reset) + Game-Over-Neustart. Kumulativ
code/kap10/treffer.gb. ZUSAETZLICH: Kapitel beginnen nun via chapter() mit
pageBreakBefore statt eigenem PageBreak-Absatz -> keine Leerseiten mehr (Buch
34 statt 35 Seiten). gbrt --check clean, docx validiert (PASSED), 0 Leerseiten,
visuell geprueft.

Co-Authored-By: Claude Opus 4.8 <noreply@anthropic.com>
</commit_message>
<xml_diff>
--- a/buch-galaga/buch/GameBasic-Buch.docx
+++ b/buch-galaga/buch/GameBasic-Buch.docx
@@ -1393,17 +1393,13 @@
       </w:tr>
     </w:tbl>
     <w:p>
-      <w:r>
-        <w:br w:type="page"/>
-      </w:r>
-    </w:p>
-    <w:p>
       <w:pPr>
         <w:pStyle w:val="Heading1"/>
+        <w:pageBreakBefore/>
         <w:pBdr>
           <w:bottom w:val="single" w:color="1B6CA8" w:sz="12" w:space="4"/>
         </w:pBdr>
-        <w:spacing w:after="80" w:before="320"/>
+        <w:spacing w:after="80" w:before="0"/>
       </w:pPr>
       <w:r>
         <w:t xml:space="preserve">Kapitel 1: Das erste Fenster</w:t>
@@ -2545,17 +2541,13 @@
       </w:r>
     </w:p>
     <w:p>
-      <w:r>
-        <w:br w:type="page"/>
-      </w:r>
-    </w:p>
-    <w:p>
       <w:pPr>
         <w:pStyle w:val="Heading1"/>
+        <w:pageBreakBefore/>
         <w:pBdr>
           <w:bottom w:val="single" w:color="1B6CA8" w:sz="12" w:space="4"/>
         </w:pBdr>
-        <w:spacing w:after="80" w:before="320"/>
+        <w:spacing w:after="80" w:before="0"/>
       </w:pPr>
       <w:r>
         <w:t xml:space="preserve">Kapitel 2: Das Schiff</w:t>
@@ -3643,17 +3635,13 @@
       </w:r>
     </w:p>
     <w:p>
-      <w:r>
-        <w:br w:type="page"/>
-      </w:r>
-    </w:p>
-    <w:p>
       <w:pPr>
         <w:pStyle w:val="Heading1"/>
+        <w:pageBreakBefore/>
         <w:pBdr>
           <w:bottom w:val="single" w:color="1B6CA8" w:sz="12" w:space="4"/>
         </w:pBdr>
-        <w:spacing w:after="80" w:before="320"/>
+        <w:spacing w:after="80" w:before="0"/>
       </w:pPr>
       <w:r>
         <w:t xml:space="preserve">Kapitel 3: Sprites selbst zeichnen</w:t>
@@ -4635,17 +4623,13 @@
       </w:r>
     </w:p>
     <w:p>
-      <w:r>
-        <w:br w:type="page"/>
-      </w:r>
-    </w:p>
-    <w:p>
       <w:pPr>
         <w:pStyle w:val="Heading1"/>
+        <w:pageBreakBefore/>
         <w:pBdr>
           <w:bottom w:val="single" w:color="1B6CA8" w:sz="12" w:space="4"/>
         </w:pBdr>
-        <w:spacing w:after="80" w:before="320"/>
+        <w:spacing w:after="80" w:before="0"/>
       </w:pPr>
       <w:r>
         <w:t xml:space="preserve">Kapitel 4: Schiessen</w:t>
@@ -5913,17 +5897,13 @@
       </w:r>
     </w:p>
     <w:p>
-      <w:r>
-        <w:br w:type="page"/>
-      </w:r>
-    </w:p>
-    <w:p>
       <w:pPr>
         <w:pStyle w:val="Heading1"/>
+        <w:pageBreakBefore/>
         <w:pBdr>
           <w:bottom w:val="single" w:color="1B6CA8" w:sz="12" w:space="4"/>
         </w:pBdr>
-        <w:spacing w:after="80" w:before="320"/>
+        <w:spacing w:after="80" w:before="0"/>
       </w:pPr>
       <w:r>
         <w:t xml:space="preserve">Kapitel 5: Sternenhimmel mit Parallax</w:t>
@@ -6739,17 +6719,13 @@
       </w:r>
     </w:p>
     <w:p>
-      <w:r>
-        <w:br w:type="page"/>
-      </w:r>
-    </w:p>
-    <w:p>
       <w:pPr>
         <w:pStyle w:val="Heading1"/>
+        <w:pageBreakBefore/>
         <w:pBdr>
           <w:bottom w:val="single" w:color="1B6CA8" w:sz="12" w:space="4"/>
         </w:pBdr>
-        <w:spacing w:after="80" w:before="320"/>
+        <w:spacing w:after="80" w:before="0"/>
       </w:pPr>
       <w:r>
         <w:t xml:space="preserve">Kapitel 6: Gegner &amp; Formation</w:t>
@@ -7691,17 +7667,13 @@
       </w:r>
     </w:p>
     <w:p>
-      <w:r>
-        <w:br w:type="page"/>
-      </w:r>
-    </w:p>
-    <w:p>
       <w:pPr>
         <w:pStyle w:val="Heading1"/>
+        <w:pageBreakBefore/>
         <w:pBdr>
           <w:bottom w:val="single" w:color="1B6CA8" w:sz="12" w:space="4"/>
         </w:pBdr>
-        <w:spacing w:after="80" w:before="320"/>
+        <w:spacing w:after="80" w:before="0"/>
       </w:pPr>
       <w:r>
         <w:t xml:space="preserve">Kapitel 7: Einflug-Manöver</w:t>
@@ -8591,17 +8563,13 @@
       </w:r>
     </w:p>
     <w:p>
-      <w:r>
-        <w:br w:type="page"/>
-      </w:r>
-    </w:p>
-    <w:p>
       <w:pPr>
         <w:pStyle w:val="Heading1"/>
+        <w:pageBreakBefore/>
         <w:pBdr>
           <w:bottom w:val="single" w:color="1B6CA8" w:sz="12" w:space="4"/>
         </w:pBdr>
-        <w:spacing w:after="80" w:before="320"/>
+        <w:spacing w:after="80" w:before="0"/>
       </w:pPr>
       <w:r>
         <w:t xml:space="preserve">Kapitel 8: Sturzangriffe</w:t>
@@ -9530,17 +9498,13 @@
       </w:r>
     </w:p>
     <w:p>
-      <w:r>
-        <w:br w:type="page"/>
-      </w:r>
-    </w:p>
-    <w:p>
       <w:pPr>
         <w:pStyle w:val="Heading1"/>
+        <w:pageBreakBefore/>
         <w:pBdr>
           <w:bottom w:val="single" w:color="1B6CA8" w:sz="12" w:space="4"/>
         </w:pBdr>
-        <w:spacing w:after="80" w:before="320"/>
+        <w:spacing w:after="80" w:before="0"/>
       </w:pPr>
       <w:r>
         <w:t xml:space="preserve">Kapitel 9: Bomben &amp; Ausweichen</w:t>
@@ -10479,6 +10443,951 @@
           <w:szCs w:val="22"/>
         </w:rPr>
         <w:t xml:space="preserve">Erhöhe NBOMB, damit mehr Bomben gleichzeitig fallen können.</w:t>
+      </w:r>
+    </w:p>
+    <w:p>
+      <w:pPr>
+        <w:pStyle w:val="Heading1"/>
+        <w:pageBreakBefore/>
+        <w:pBdr>
+          <w:bottom w:val="single" w:color="1B6CA8" w:sz="12" w:space="4"/>
+        </w:pBdr>
+        <w:spacing w:after="80" w:before="0"/>
+      </w:pPr>
+      <w:r>
+        <w:t xml:space="preserve">Kapitel 10: Treffer &amp; Punkte</w:t>
+      </w:r>
+    </w:p>
+    <w:tbl>
+      <w:tblPr>
+        <w:tblW w:type="dxa" w:w="9360"/>
+        <w:tblBorders>
+          <w:top w:val="single" w:color="auto" w:sz="4"/>
+          <w:left w:val="single" w:color="auto" w:sz="4"/>
+          <w:bottom w:val="single" w:color="auto" w:sz="4"/>
+          <w:right w:val="single" w:color="auto" w:sz="4"/>
+          <w:insideH w:val="single" w:color="auto" w:sz="4"/>
+          <w:insideV w:val="single" w:color="auto" w:sz="4"/>
+        </w:tblBorders>
+      </w:tblPr>
+      <w:tblGrid>
+        <w:gridCol w:w="9360"/>
+      </w:tblGrid>
+      <w:tr>
+        <w:tc>
+          <w:tcPr>
+            <w:tcW w:type="dxa" w:w="9360"/>
+            <w:tcBorders>
+              <w:top w:val="single" w:color="9CC8E6" w:sz="6"/>
+              <w:left w:val="single" w:color="9CC8E6" w:sz="6"/>
+              <w:bottom w:val="single" w:color="9CC8E6" w:sz="6"/>
+              <w:right w:val="single" w:color="9CC8E6" w:sz="6"/>
+            </w:tcBorders>
+            <w:shd w:fill="E7F2FA" w:val="clear"/>
+            <w:tcMar>
+              <w:top w:type="dxa" w:w="120"/>
+              <w:left w:type="dxa" w:w="160"/>
+              <w:bottom w:type="dxa" w:w="120"/>
+              <w:right w:type="dxa" w:w="160"/>
+            </w:tcMar>
+          </w:tcPr>
+          <w:p>
+            <w:pPr>
+              <w:spacing w:after="40"/>
+            </w:pPr>
+            <w:r>
+              <w:rPr>
+                <w:b/>
+                <w:bCs/>
+                <w:color w:val="1B6CA8"/>
+                <w:sz w:val="22"/>
+                <w:szCs w:val="22"/>
+              </w:rPr>
+              <w:t xml:space="preserve">In diesem Kapitel</w:t>
+            </w:r>
+          </w:p>
+          <w:p>
+            <w:r>
+              <w:rPr>
+                <w:sz w:val="22"/>
+                <w:szCs w:val="22"/>
+              </w:rPr>
+              <w:t xml:space="preserve">Jetzt wird es ein echtes Spiel: Schüsse zerstören Gegner und geben Punkte, Bomben und Stürze kosten dich Leben – und bei null Leben heisst es Game Over (mit Neustart). Dafür schreibst du deine erste eigene Funktion.</w:t>
+            </w:r>
+          </w:p>
+        </w:tc>
+      </w:tr>
+    </w:tbl>
+    <w:p>
+      <w:pPr>
+        <w:pStyle w:val="Heading2"/>
+      </w:pPr>
+      <w:r>
+        <w:t xml:space="preserve">Berühren sich zwei Rechtecke? Eine Funktion</w:t>
+      </w:r>
+    </w:p>
+    <w:p>
+      <w:pPr>
+        <w:spacing w:after="140"/>
+      </w:pPr>
+      <w:r>
+        <w:rPr>
+          <w:sz w:val="22"/>
+          <w:szCs w:val="22"/>
+        </w:rPr>
+        <w:t xml:space="preserve">Eine Kollision prüfen wir oft – für Schüsse, Bomben, das Schiff. Solchen wiederkehrenden Code packt man in eine eigene Funktion und gibt ihr einen Namen. Unsere Funktion prüft, ob sich zwei Rechtecke überlappen (AABB-Test):</w:t>
+      </w:r>
+    </w:p>
+    <w:p>
+      <w:pPr>
+        <w:pBdr>
+          <w:left w:val="single" w:color="1B6CA8" w:sz="18" w:space="6"/>
+        </w:pBdr>
+        <w:shd w:fill="F4F4F4" w:val="clear"/>
+        <w:spacing w:after="160" w:before="80"/>
+        <w:ind w:left="120"/>
+      </w:pPr>
+      <w:r>
+        <w:rPr>
+          <w:rFonts w:ascii="Consolas" w:cs="Consolas" w:eastAsia="Consolas" w:hAnsi="Consolas"/>
+          <w:sz w:val="19"/>
+          <w:szCs w:val="19"/>
+        </w:rPr>
+        <w:t xml:space="preserve">FUNCTION Overlap(ax AS FLOAT, ay AS FLOAT, aw AS FLOAT, ah AS FLOAT, _</w:t>
+      </w:r>
+      <w:r>
+        <w:rPr>
+          <w:rFonts w:ascii="Consolas" w:cs="Consolas" w:eastAsia="Consolas" w:hAnsi="Consolas"/>
+          <w:sz w:val="19"/>
+          <w:szCs w:val="19"/>
+        </w:rPr>
+        <w:br/>
+        <w:t xml:space="preserve">                 cx AS FLOAT, cy AS FLOAT, cw AS FLOAT, ch AS FLOAT) AS BOOLEAN</w:t>
+      </w:r>
+      <w:r>
+        <w:rPr>
+          <w:rFonts w:ascii="Consolas" w:cs="Consolas" w:eastAsia="Consolas" w:hAnsi="Consolas"/>
+          <w:sz w:val="19"/>
+          <w:szCs w:val="19"/>
+        </w:rPr>
+        <w:br/>
+        <w:t xml:space="preserve">    RETURN ax &lt; cx + cw AND ax + aw &gt; cx AND ay &lt; cy + ch AND ay + ah &gt; cy</w:t>
+      </w:r>
+      <w:r>
+        <w:rPr>
+          <w:rFonts w:ascii="Consolas" w:cs="Consolas" w:eastAsia="Consolas" w:hAnsi="Consolas"/>
+          <w:sz w:val="19"/>
+          <w:szCs w:val="19"/>
+        </w:rPr>
+        <w:br/>
+        <w:t xml:space="preserve">END FUNCTION</w:t>
+      </w:r>
+    </w:p>
+    <w:p>
+      <w:pPr>
+        <w:spacing w:after="140"/>
+      </w:pPr>
+      <w:r>
+        <w:rPr>
+          <w:sz w:val="22"/>
+          <w:szCs w:val="22"/>
+        </w:rPr>
+        <w:t xml:space="preserve">Zwei Rechtecke überlappen nur, wenn sie sich in beiden Richtungen überschneiden – das prüfen die vier mit </w:t>
+      </w:r>
+      <w:r>
+        <w:rPr>
+          <w:rFonts w:ascii="Consolas" w:cs="Consolas" w:eastAsia="Consolas" w:hAnsi="Consolas"/>
+          <w:sz w:val="21"/>
+          <w:szCs w:val="21"/>
+        </w:rPr>
+        <w:t xml:space="preserve">AND</w:t>
+      </w:r>
+      <w:r>
+        <w:rPr>
+          <w:sz w:val="22"/>
+          <w:szCs w:val="22"/>
+        </w:rPr>
+        <w:t xml:space="preserve"> verknüpften Bedingungen. Jedes Rechteck wird durch Ecke (x, y) und Grösse (Breite, Höhe) beschrieben. Die Funktion gibt </w:t>
+      </w:r>
+      <w:r>
+        <w:rPr>
+          <w:rFonts w:ascii="Consolas" w:cs="Consolas" w:eastAsia="Consolas" w:hAnsi="Consolas"/>
+          <w:sz w:val="21"/>
+          <w:szCs w:val="21"/>
+        </w:rPr>
+        <w:t xml:space="preserve">TRUE</w:t>
+      </w:r>
+      <w:r>
+        <w:rPr>
+          <w:sz w:val="22"/>
+          <w:szCs w:val="22"/>
+        </w:rPr>
+        <w:t xml:space="preserve"> oder </w:t>
+      </w:r>
+      <w:r>
+        <w:rPr>
+          <w:rFonts w:ascii="Consolas" w:cs="Consolas" w:eastAsia="Consolas" w:hAnsi="Consolas"/>
+          <w:sz w:val="21"/>
+          <w:szCs w:val="21"/>
+        </w:rPr>
+        <w:t xml:space="preserve">FALSE</w:t>
+      </w:r>
+      <w:r>
+        <w:rPr>
+          <w:sz w:val="22"/>
+          <w:szCs w:val="22"/>
+        </w:rPr>
+        <w:t xml:space="preserve"> zurück.</w:t>
+      </w:r>
+    </w:p>
+    <w:p>
+      <w:pPr>
+        <w:pStyle w:val="Heading2"/>
+      </w:pPr>
+      <w:r>
+        <w:t xml:space="preserve">Schuss trifft Gegner</w:t>
+      </w:r>
+    </w:p>
+    <w:p>
+      <w:pPr>
+        <w:spacing w:after="140"/>
+      </w:pPr>
+      <w:r>
+        <w:rPr>
+          <w:sz w:val="22"/>
+          <w:szCs w:val="22"/>
+        </w:rPr>
+        <w:t xml:space="preserve">Für jeden fliegenden Schuss prüfen wir jeden lebenden Gegner. Bei einer Überlappung verschwinden beide, und es gibt Punkte (obere Reihen zählen mehr):</w:t>
+      </w:r>
+    </w:p>
+    <w:p>
+      <w:pPr>
+        <w:pBdr>
+          <w:left w:val="single" w:color="1B6CA8" w:sz="18" w:space="6"/>
+        </w:pBdr>
+        <w:shd w:fill="F4F4F4" w:val="clear"/>
+        <w:spacing w:after="160" w:before="80"/>
+        <w:ind w:left="120"/>
+      </w:pPr>
+      <w:r>
+        <w:rPr>
+          <w:rFonts w:ascii="Consolas" w:cs="Consolas" w:eastAsia="Consolas" w:hAnsi="Consolas"/>
+          <w:sz w:val="19"/>
+          <w:szCs w:val="19"/>
+        </w:rPr>
+        <w:t xml:space="preserve">FOR i = 0 TO NBULLET - 1</w:t>
+      </w:r>
+      <w:r>
+        <w:rPr>
+          <w:rFonts w:ascii="Consolas" w:cs="Consolas" w:eastAsia="Consolas" w:hAnsi="Consolas"/>
+          <w:sz w:val="19"/>
+          <w:szCs w:val="19"/>
+        </w:rPr>
+        <w:br/>
+        <w:t xml:space="preserve">    IF bAlive[i] THEN</w:t>
+      </w:r>
+      <w:r>
+        <w:rPr>
+          <w:rFonts w:ascii="Consolas" w:cs="Consolas" w:eastAsia="Consolas" w:hAnsi="Consolas"/>
+          <w:sz w:val="19"/>
+          <w:szCs w:val="19"/>
+        </w:rPr>
+        <w:br/>
+        <w:t xml:space="preserve">        FOR j = 0 TO NBUGS - 1</w:t>
+      </w:r>
+      <w:r>
+        <w:rPr>
+          <w:rFonts w:ascii="Consolas" w:cs="Consolas" w:eastAsia="Consolas" w:hAnsi="Consolas"/>
+          <w:sz w:val="19"/>
+          <w:szCs w:val="19"/>
+        </w:rPr>
+        <w:br/>
+        <w:t xml:space="preserve">            IF bugs[j].alive AND Overlap(bx[i], by[i], 6, 8, bugs[j].x, bugs[j].y, 16, 16) THEN</w:t>
+      </w:r>
+      <w:r>
+        <w:rPr>
+          <w:rFonts w:ascii="Consolas" w:cs="Consolas" w:eastAsia="Consolas" w:hAnsi="Consolas"/>
+          <w:sz w:val="19"/>
+          <w:szCs w:val="19"/>
+        </w:rPr>
+        <w:br/>
+        <w:t xml:space="preserve">                bugs[j].alive = FALSE : bAlive[i] = FALSE</w:t>
+      </w:r>
+      <w:r>
+        <w:rPr>
+          <w:rFonts w:ascii="Consolas" w:cs="Consolas" w:eastAsia="Consolas" w:hAnsi="Consolas"/>
+          <w:sz w:val="19"/>
+          <w:szCs w:val="19"/>
+        </w:rPr>
+        <w:br/>
+        <w:t xml:space="preserve">                score = score + (ROWS - bugs[j].row) * 10</w:t>
+      </w:r>
+      <w:r>
+        <w:rPr>
+          <w:rFonts w:ascii="Consolas" w:cs="Consolas" w:eastAsia="Consolas" w:hAnsi="Consolas"/>
+          <w:sz w:val="19"/>
+          <w:szCs w:val="19"/>
+        </w:rPr>
+        <w:br/>
+        <w:t xml:space="preserve">                BREAK</w:t>
+      </w:r>
+      <w:r>
+        <w:rPr>
+          <w:rFonts w:ascii="Consolas" w:cs="Consolas" w:eastAsia="Consolas" w:hAnsi="Consolas"/>
+          <w:sz w:val="19"/>
+          <w:szCs w:val="19"/>
+        </w:rPr>
+        <w:br/>
+        <w:t xml:space="preserve">            END IF</w:t>
+      </w:r>
+      <w:r>
+        <w:rPr>
+          <w:rFonts w:ascii="Consolas" w:cs="Consolas" w:eastAsia="Consolas" w:hAnsi="Consolas"/>
+          <w:sz w:val="19"/>
+          <w:szCs w:val="19"/>
+        </w:rPr>
+        <w:br/>
+        <w:t xml:space="preserve">        NEXT j</w:t>
+      </w:r>
+      <w:r>
+        <w:rPr>
+          <w:rFonts w:ascii="Consolas" w:cs="Consolas" w:eastAsia="Consolas" w:hAnsi="Consolas"/>
+          <w:sz w:val="19"/>
+          <w:szCs w:val="19"/>
+        </w:rPr>
+        <w:br/>
+        <w:t xml:space="preserve">    END IF</w:t>
+      </w:r>
+      <w:r>
+        <w:rPr>
+          <w:rFonts w:ascii="Consolas" w:cs="Consolas" w:eastAsia="Consolas" w:hAnsi="Consolas"/>
+          <w:sz w:val="19"/>
+          <w:szCs w:val="19"/>
+        </w:rPr>
+        <w:br/>
+        <w:t xml:space="preserve">NEXT i</w:t>
+      </w:r>
+    </w:p>
+    <w:p>
+      <w:pPr>
+        <w:pStyle w:val="Heading2"/>
+      </w:pPr>
+      <w:r>
+        <w:t xml:space="preserve">Spieler getroffen</w:t>
+      </w:r>
+    </w:p>
+    <w:p>
+      <w:pPr>
+        <w:spacing w:after="140"/>
+      </w:pPr>
+      <w:r>
+        <w:rPr>
+          <w:sz w:val="22"/>
+          <w:szCs w:val="22"/>
+        </w:rPr>
+        <w:t xml:space="preserve">Genauso prüfen wir Bomben und stürzende Gegner gegen das Schiff. Ein Treffer kostet ein Leben und macht dich kurz unverwundbar (</w:t>
+      </w:r>
+      <w:r>
+        <w:rPr>
+          <w:rFonts w:ascii="Consolas" w:cs="Consolas" w:eastAsia="Consolas" w:hAnsi="Consolas"/>
+          <w:sz w:val="21"/>
+          <w:szCs w:val="21"/>
+        </w:rPr>
+        <w:t xml:space="preserve">invuln</w:t>
+      </w:r>
+      <w:r>
+        <w:rPr>
+          <w:sz w:val="22"/>
+          <w:szCs w:val="22"/>
+        </w:rPr>
+        <w:t xml:space="preserve">), damit du nicht sofort mehrfach getroffen wirst:</w:t>
+      </w:r>
+    </w:p>
+    <w:p>
+      <w:pPr>
+        <w:pBdr>
+          <w:left w:val="single" w:color="1B6CA8" w:sz="18" w:space="6"/>
+        </w:pBdr>
+        <w:shd w:fill="F4F4F4" w:val="clear"/>
+        <w:spacing w:after="160" w:before="80"/>
+        <w:ind w:left="120"/>
+      </w:pPr>
+      <w:r>
+        <w:rPr>
+          <w:rFonts w:ascii="Consolas" w:cs="Consolas" w:eastAsia="Consolas" w:hAnsi="Consolas"/>
+          <w:sz w:val="19"/>
+          <w:szCs w:val="19"/>
+        </w:rPr>
+        <w:t xml:space="preserve">IF invuln = 0 THEN</w:t>
+      </w:r>
+      <w:r>
+        <w:rPr>
+          <w:rFonts w:ascii="Consolas" w:cs="Consolas" w:eastAsia="Consolas" w:hAnsi="Consolas"/>
+          <w:sz w:val="19"/>
+          <w:szCs w:val="19"/>
+        </w:rPr>
+        <w:br/>
+        <w:t xml:space="preserve">    DIM hit AS BOOLEAN : hit = FALSE</w:t>
+      </w:r>
+      <w:r>
+        <w:rPr>
+          <w:rFonts w:ascii="Consolas" w:cs="Consolas" w:eastAsia="Consolas" w:hAnsi="Consolas"/>
+          <w:sz w:val="19"/>
+          <w:szCs w:val="19"/>
+        </w:rPr>
+        <w:br/>
+        <w:t xml:space="preserve">    FOR i = 0 TO NBOMB - 1</w:t>
+      </w:r>
+      <w:r>
+        <w:rPr>
+          <w:rFonts w:ascii="Consolas" w:cs="Consolas" w:eastAsia="Consolas" w:hAnsi="Consolas"/>
+          <w:sz w:val="19"/>
+          <w:szCs w:val="19"/>
+        </w:rPr>
+        <w:br/>
+        <w:t xml:space="preserve">        IF boAlive[i] AND Overlap(bmx[i], bmy[i], 6, 6, shipX+3.0, shipY+2.0, 10, 12) THEN</w:t>
+      </w:r>
+      <w:r>
+        <w:rPr>
+          <w:rFonts w:ascii="Consolas" w:cs="Consolas" w:eastAsia="Consolas" w:hAnsi="Consolas"/>
+          <w:sz w:val="19"/>
+          <w:szCs w:val="19"/>
+        </w:rPr>
+        <w:br/>
+        <w:t xml:space="preserve">            boAlive[i] = FALSE : hit = TRUE</w:t>
+      </w:r>
+      <w:r>
+        <w:rPr>
+          <w:rFonts w:ascii="Consolas" w:cs="Consolas" w:eastAsia="Consolas" w:hAnsi="Consolas"/>
+          <w:sz w:val="19"/>
+          <w:szCs w:val="19"/>
+        </w:rPr>
+        <w:br/>
+        <w:t xml:space="preserve">        END IF</w:t>
+      </w:r>
+      <w:r>
+        <w:rPr>
+          <w:rFonts w:ascii="Consolas" w:cs="Consolas" w:eastAsia="Consolas" w:hAnsi="Consolas"/>
+          <w:sz w:val="19"/>
+          <w:szCs w:val="19"/>
+        </w:rPr>
+        <w:br/>
+        <w:t xml:space="preserve">    NEXT i</w:t>
+      </w:r>
+      <w:r>
+        <w:rPr>
+          <w:rFonts w:ascii="Consolas" w:cs="Consolas" w:eastAsia="Consolas" w:hAnsi="Consolas"/>
+          <w:sz w:val="19"/>
+          <w:szCs w:val="19"/>
+        </w:rPr>
+        <w:br/>
+        <w:t xml:space="preserve">    ' ... ebenso stuerzende Gegner pruefen ...</w:t>
+      </w:r>
+      <w:r>
+        <w:rPr>
+          <w:rFonts w:ascii="Consolas" w:cs="Consolas" w:eastAsia="Consolas" w:hAnsi="Consolas"/>
+          <w:sz w:val="19"/>
+          <w:szCs w:val="19"/>
+        </w:rPr>
+        <w:br/>
+        <w:t xml:space="preserve">    IF hit THEN lives = lives - 1 : invuln = 90</w:t>
+      </w:r>
+      <w:r>
+        <w:rPr>
+          <w:rFonts w:ascii="Consolas" w:cs="Consolas" w:eastAsia="Consolas" w:hAnsi="Consolas"/>
+          <w:sz w:val="19"/>
+          <w:szCs w:val="19"/>
+        </w:rPr>
+        <w:br/>
+        <w:t xml:space="preserve">END IF</w:t>
+      </w:r>
+    </w:p>
+    <w:p>
+      <w:pPr>
+        <w:spacing w:after="140"/>
+      </w:pPr>
+      <w:r>
+        <w:rPr>
+          <w:sz w:val="22"/>
+          <w:szCs w:val="22"/>
+        </w:rPr>
+        <w:t xml:space="preserve">Solange </w:t>
+      </w:r>
+      <w:r>
+        <w:rPr>
+          <w:rFonts w:ascii="Consolas" w:cs="Consolas" w:eastAsia="Consolas" w:hAnsi="Consolas"/>
+          <w:sz w:val="21"/>
+          <w:szCs w:val="21"/>
+        </w:rPr>
+        <w:t xml:space="preserve">invuln</w:t>
+      </w:r>
+      <w:r>
+        <w:rPr>
+          <w:sz w:val="22"/>
+          <w:szCs w:val="22"/>
+        </w:rPr>
+        <w:t xml:space="preserve"> grösser 0 ist, lassen wir das Schiff blinken (zeichnen es nur in jedem zweiten Moment) – ein klares Zeichen, dass du gerade geschützt bist.</w:t>
+      </w:r>
+    </w:p>
+    <w:p>
+      <w:pPr>
+        <w:pStyle w:val="Heading2"/>
+      </w:pPr>
+      <w:r>
+        <w:t xml:space="preserve">Punkte &amp; Leben anzeigen (HUD)</w:t>
+      </w:r>
+    </w:p>
+    <w:p>
+      <w:pPr>
+        <w:spacing w:after="140"/>
+      </w:pPr>
+      <w:r>
+        <w:rPr>
+          <w:sz w:val="22"/>
+          <w:szCs w:val="22"/>
+        </w:rPr>
+        <w:t xml:space="preserve">Text schreibst du mit </w:t>
+      </w:r>
+      <w:r>
+        <w:rPr>
+          <w:rFonts w:ascii="Consolas" w:cs="Consolas" w:eastAsia="Consolas" w:hAnsi="Consolas"/>
+          <w:sz w:val="21"/>
+          <w:szCs w:val="21"/>
+        </w:rPr>
+        <w:t xml:space="preserve">TEXT(x, y, text)</w:t>
+      </w:r>
+      <w:r>
+        <w:rPr>
+          <w:sz w:val="22"/>
+          <w:szCs w:val="22"/>
+        </w:rPr>
+        <w:t xml:space="preserve">. Zahlen musst du dafür in Text verwandeln – das macht </w:t>
+      </w:r>
+      <w:r>
+        <w:rPr>
+          <w:rFonts w:ascii="Consolas" w:cs="Consolas" w:eastAsia="Consolas" w:hAnsi="Consolas"/>
+          <w:sz w:val="21"/>
+          <w:szCs w:val="21"/>
+        </w:rPr>
+        <w:t xml:space="preserve">STR$</w:t>
+      </w:r>
+      <w:r>
+        <w:rPr>
+          <w:sz w:val="22"/>
+          <w:szCs w:val="22"/>
+        </w:rPr>
+        <w:t xml:space="preserve">:</w:t>
+      </w:r>
+    </w:p>
+    <w:p>
+      <w:pPr>
+        <w:pBdr>
+          <w:left w:val="single" w:color="1B6CA8" w:sz="18" w:space="6"/>
+        </w:pBdr>
+        <w:shd w:fill="F4F4F4" w:val="clear"/>
+        <w:spacing w:after="160" w:before="80"/>
+        <w:ind w:left="120"/>
+      </w:pPr>
+      <w:r>
+        <w:rPr>
+          <w:rFonts w:ascii="Consolas" w:cs="Consolas" w:eastAsia="Consolas" w:hAnsi="Consolas"/>
+          <w:sz w:val="19"/>
+          <w:szCs w:val="19"/>
+        </w:rPr>
+        <w:t xml:space="preserve">TEXT(8, 6, "SCORE: " + STR$(score))</w:t>
+      </w:r>
+      <w:r>
+        <w:rPr>
+          <w:rFonts w:ascii="Consolas" w:cs="Consolas" w:eastAsia="Consolas" w:hAnsi="Consolas"/>
+          <w:sz w:val="19"/>
+          <w:szCs w:val="19"/>
+        </w:rPr>
+        <w:br/>
+        <w:t xml:space="preserve">TEXT(360, 6, "LEBEN: " + STR$(lives))</w:t>
+      </w:r>
+    </w:p>
+    <w:p>
+      <w:pPr>
+        <w:pStyle w:val="Heading2"/>
+      </w:pPr>
+      <w:r>
+        <w:t xml:space="preserve">Neustart: eine eigene SUB</w:t>
+      </w:r>
+    </w:p>
+    <w:p>
+      <w:pPr>
+        <w:spacing w:after="140"/>
+      </w:pPr>
+      <w:r>
+        <w:rPr>
+          <w:sz w:val="22"/>
+          <w:szCs w:val="22"/>
+        </w:rPr>
+        <w:t xml:space="preserve">Den Aufbau eines frischen Spiels (Formation bauen, Punkte und Leben zurücksetzen) brauchen wir am Anfang und bei jedem Neustart. Deshalb steckt er in einer eigenen SUB, die wir einfach aufrufen:</w:t>
+      </w:r>
+    </w:p>
+    <w:p>
+      <w:pPr>
+        <w:pBdr>
+          <w:left w:val="single" w:color="1B6CA8" w:sz="18" w:space="6"/>
+        </w:pBdr>
+        <w:shd w:fill="F4F4F4" w:val="clear"/>
+        <w:spacing w:after="160" w:before="80"/>
+        <w:ind w:left="120"/>
+      </w:pPr>
+      <w:r>
+        <w:rPr>
+          <w:rFonts w:ascii="Consolas" w:cs="Consolas" w:eastAsia="Consolas" w:hAnsi="Consolas"/>
+          <w:sz w:val="19"/>
+          <w:szCs w:val="19"/>
+        </w:rPr>
+        <w:t xml:space="preserve">SUB NewGame()</w:t>
+      </w:r>
+      <w:r>
+        <w:rPr>
+          <w:rFonts w:ascii="Consolas" w:cs="Consolas" w:eastAsia="Consolas" w:hAnsi="Consolas"/>
+          <w:sz w:val="19"/>
+          <w:szCs w:val="19"/>
+        </w:rPr>
+        <w:br/>
+        <w:t xml:space="preserve">    DIM k AS INTEGER</w:t>
+      </w:r>
+      <w:r>
+        <w:rPr>
+          <w:rFonts w:ascii="Consolas" w:cs="Consolas" w:eastAsia="Consolas" w:hAnsi="Consolas"/>
+          <w:sz w:val="19"/>
+          <w:szCs w:val="19"/>
+        </w:rPr>
+        <w:br/>
+        <w:t xml:space="preserve">    ' ... Formation 3x8 bauen (wie in Kapitel 6) ...</w:t>
+      </w:r>
+      <w:r>
+        <w:rPr>
+          <w:rFonts w:ascii="Consolas" w:cs="Consolas" w:eastAsia="Consolas" w:hAnsi="Consolas"/>
+          <w:sz w:val="19"/>
+          <w:szCs w:val="19"/>
+        </w:rPr>
+        <w:br/>
+        <w:t xml:space="preserve">    FOR k = 0 TO NBULLET - 1 : bAlive[k] = FALSE : NEXT k</w:t>
+      </w:r>
+      <w:r>
+        <w:rPr>
+          <w:rFonts w:ascii="Consolas" w:cs="Consolas" w:eastAsia="Consolas" w:hAnsi="Consolas"/>
+          <w:sz w:val="19"/>
+          <w:szCs w:val="19"/>
+        </w:rPr>
+        <w:br/>
+        <w:t xml:space="preserve">    FOR k = 0 TO NBOMB - 1 : boAlive[k] = FALSE : NEXT k</w:t>
+      </w:r>
+      <w:r>
+        <w:rPr>
+          <w:rFonts w:ascii="Consolas" w:cs="Consolas" w:eastAsia="Consolas" w:hAnsi="Consolas"/>
+          <w:sz w:val="19"/>
+          <w:szCs w:val="19"/>
+        </w:rPr>
+        <w:br/>
+        <w:t xml:space="preserve">    score = 0 : lives = 3 : invuln = 0 : diveTimer = 120 : shipX = 232</w:t>
+      </w:r>
+      <w:r>
+        <w:rPr>
+          <w:rFonts w:ascii="Consolas" w:cs="Consolas" w:eastAsia="Consolas" w:hAnsi="Consolas"/>
+          <w:sz w:val="19"/>
+          <w:szCs w:val="19"/>
+        </w:rPr>
+        <w:br/>
+        <w:t xml:space="preserve">END SUB</w:t>
+      </w:r>
+    </w:p>
+    <w:p>
+      <w:pPr>
+        <w:spacing w:after="140"/>
+      </w:pPr>
+      <w:r>
+        <w:rPr>
+          <w:sz w:val="22"/>
+          <w:szCs w:val="22"/>
+        </w:rPr>
+        <w:t xml:space="preserve">Wir rufen </w:t>
+      </w:r>
+      <w:r>
+        <w:rPr>
+          <w:rFonts w:ascii="Consolas" w:cs="Consolas" w:eastAsia="Consolas" w:hAnsi="Consolas"/>
+          <w:sz w:val="21"/>
+          <w:szCs w:val="21"/>
+        </w:rPr>
+        <w:t xml:space="preserve">NewGame()</w:t>
+      </w:r>
+      <w:r>
+        <w:rPr>
+          <w:sz w:val="22"/>
+          <w:szCs w:val="22"/>
+        </w:rPr>
+        <w:t xml:space="preserve"> einmal vor der Schleife auf – und bei Game Over erneut, sobald Leertaste gedrückt wird. Das vollständige Programm liegt in </w:t>
+      </w:r>
+      <w:r>
+        <w:rPr>
+          <w:rFonts w:ascii="Consolas" w:cs="Consolas" w:eastAsia="Consolas" w:hAnsi="Consolas"/>
+          <w:sz w:val="21"/>
+          <w:szCs w:val="21"/>
+        </w:rPr>
+        <w:t xml:space="preserve">code/kap10/treffer.gb</w:t>
+      </w:r>
+      <w:r>
+        <w:rPr>
+          <w:sz w:val="22"/>
+          <w:szCs w:val="22"/>
+        </w:rPr>
+        <w:t xml:space="preserve">.</w:t>
+      </w:r>
+    </w:p>
+    <w:p>
+      <w:pPr>
+        <w:spacing w:after="40" w:before="120"/>
+        <w:jc w:val="center"/>
+      </w:pPr>
+      <w:r>
+        <w:drawing>
+          <wp:inline distT="0" distB="0" distL="0" distR="0">
+            <wp:extent cx="2857500" cy="3810000"/>
+            <wp:effectExtent t="0" r="0" b="0" l="0"/>
+            <wp:docPr id="1" name="kap10_treffer.png" descr="Ein echtes Spiel: Punkte oben links, Leben oben rechts, ausgedünnte Formation." title="Ein echtes Spiel: Punkte oben links, Leben oben rechts, ausgedünnte Formation."/>
+            <wp:cNvGraphicFramePr>
+              <a:graphicFrameLocks xmlns:a="http://schemas.openxmlformats.org/drawingml/2006/main" noChangeAspect="1"/>
+            </wp:cNvGraphicFramePr>
+            <a:graphic xmlns:a="http://schemas.openxmlformats.org/drawingml/2006/main">
+              <a:graphicData uri="http://schemas.openxmlformats.org/drawingml/2006/picture">
+                <pic:pic xmlns:pic="http://schemas.openxmlformats.org/drawingml/2006/picture">
+                  <pic:nvPicPr>
+                    <pic:cNvPr id="0" name="" descr=""/>
+                    <pic:cNvPicPr>
+                      <a:picLocks noChangeAspect="1" noChangeArrowheads="1"/>
+                    </pic:cNvPicPr>
+                  </pic:nvPicPr>
+                  <pic:blipFill>
+                    <a:blip r:embed="rId26" cstate="none"/>
+                    <a:srcRect/>
+                    <a:stretch>
+                      <a:fillRect/>
+                    </a:stretch>
+                  </pic:blipFill>
+                  <pic:spPr bwMode="auto">
+                    <a:xfrm>
+                      <a:off x="0" y="0"/>
+                      <a:ext cx="2857500" cy="3810000"/>
+                    </a:xfrm>
+                    <a:prstGeom prst="rect">
+                      <a:avLst/>
+                    </a:prstGeom>
+                  </pic:spPr>
+                </pic:pic>
+              </a:graphicData>
+            </a:graphic>
+          </wp:inline>
+        </w:drawing>
+      </w:r>
+    </w:p>
+    <w:p>
+      <w:pPr>
+        <w:spacing w:after="200"/>
+        <w:jc w:val="center"/>
+      </w:pPr>
+      <w:r>
+        <w:rPr>
+          <w:i/>
+          <w:iCs/>
+          <w:color w:val="6A6A6A"/>
+          <w:sz w:val="18"/>
+          <w:szCs w:val="18"/>
+        </w:rPr>
+        <w:t xml:space="preserve">Ein echtes Spiel: Punkte oben links, Leben oben rechts, ausgedünnte Formation.</w:t>
+      </w:r>
+    </w:p>
+    <w:p>
+      <w:pPr>
+        <w:pStyle w:val="Heading2"/>
+      </w:pPr>
+      <w:r>
+        <w:t xml:space="preserve">Was du gelernt hast</w:t>
+      </w:r>
+    </w:p>
+    <w:p>
+      <w:pPr>
+        <w:pStyle w:val="ListParagraph"/>
+        <w:numPr>
+          <w:ilvl w:val="0"/>
+          <w:numId w:val="2"/>
+        </w:numPr>
+        <w:spacing w:after="60"/>
+      </w:pPr>
+      <w:r>
+        <w:rPr>
+          <w:b/>
+          <w:bCs/>
+          <w:sz w:val="22"/>
+          <w:szCs w:val="22"/>
+        </w:rPr>
+        <w:t xml:space="preserve">Eigene FUNCTION </w:t>
+      </w:r>
+      <w:r>
+        <w:rPr>
+          <w:sz w:val="22"/>
+          <w:szCs w:val="22"/>
+        </w:rPr>
+        <w:t xml:space="preserve">(Overlap) bündelt wiederkehrenden Code und gibt ein Ergebnis zurück.</w:t>
+      </w:r>
+    </w:p>
+    <w:p>
+      <w:pPr>
+        <w:pStyle w:val="ListParagraph"/>
+        <w:numPr>
+          <w:ilvl w:val="0"/>
+          <w:numId w:val="2"/>
+        </w:numPr>
+        <w:spacing w:after="60"/>
+      </w:pPr>
+      <w:r>
+        <w:rPr>
+          <w:b/>
+          <w:bCs/>
+          <w:sz w:val="22"/>
+          <w:szCs w:val="22"/>
+        </w:rPr>
+        <w:t xml:space="preserve">AABB-Kollision </w:t>
+      </w:r>
+      <w:r>
+        <w:rPr>
+          <w:sz w:val="22"/>
+          <w:szCs w:val="22"/>
+        </w:rPr>
+        <w:t xml:space="preserve">= Rechteck-Überlappung mit vier AND-Bedingungen.</w:t>
+      </w:r>
+    </w:p>
+    <w:p>
+      <w:pPr>
+        <w:pStyle w:val="ListParagraph"/>
+        <w:numPr>
+          <w:ilvl w:val="0"/>
+          <w:numId w:val="2"/>
+        </w:numPr>
+        <w:spacing w:after="60"/>
+      </w:pPr>
+      <w:r>
+        <w:rPr>
+          <w:b/>
+          <w:bCs/>
+          <w:sz w:val="22"/>
+          <w:szCs w:val="22"/>
+        </w:rPr>
+        <w:t xml:space="preserve">Score, Leben, Unverwundbarkeit </w:t>
+      </w:r>
+      <w:r>
+        <w:rPr>
+          <w:sz w:val="22"/>
+          <w:szCs w:val="22"/>
+        </w:rPr>
+        <w:t xml:space="preserve">machen aus Bewegung ein Spiel.</w:t>
+      </w:r>
+    </w:p>
+    <w:p>
+      <w:pPr>
+        <w:pStyle w:val="ListParagraph"/>
+        <w:numPr>
+          <w:ilvl w:val="0"/>
+          <w:numId w:val="2"/>
+        </w:numPr>
+        <w:spacing w:after="60"/>
+      </w:pPr>
+      <w:r>
+        <w:rPr>
+          <w:b/>
+          <w:bCs/>
+          <w:sz w:val="22"/>
+          <w:szCs w:val="22"/>
+        </w:rPr>
+        <w:t xml:space="preserve">SUB NewGame </w:t>
+      </w:r>
+      <w:r>
+        <w:rPr>
+          <w:sz w:val="22"/>
+          <w:szCs w:val="22"/>
+        </w:rPr>
+        <w:t xml:space="preserve">+ TEXT/STR$ für Neustart und HUD.</w:t>
+      </w:r>
+    </w:p>
+    <w:p>
+      <w:pPr>
+        <w:pStyle w:val="Heading2"/>
+      </w:pPr>
+      <w:r>
+        <w:t xml:space="preserve">Übung</w:t>
+      </w:r>
+    </w:p>
+    <w:p>
+      <w:pPr>
+        <w:pStyle w:val="ListParagraph"/>
+        <w:numPr>
+          <w:ilvl w:val="0"/>
+          <w:numId w:val="2"/>
+        </w:numPr>
+        <w:spacing w:after="60"/>
+      </w:pPr>
+      <w:r>
+        <w:rPr>
+          <w:sz w:val="22"/>
+          <w:szCs w:val="22"/>
+        </w:rPr>
+        <w:t xml:space="preserve">Vergib mehr Punkte oder andere Werte pro Reihe.</w:t>
+      </w:r>
+    </w:p>
+    <w:p>
+      <w:pPr>
+        <w:pStyle w:val="ListParagraph"/>
+        <w:numPr>
+          <w:ilvl w:val="0"/>
+          <w:numId w:val="2"/>
+        </w:numPr>
+        <w:spacing w:after="60"/>
+      </w:pPr>
+      <w:r>
+        <w:rPr>
+          <w:sz w:val="22"/>
+          <w:szCs w:val="22"/>
+        </w:rPr>
+        <w:t xml:space="preserve">Gib dem Spieler 5 statt 3 Leben.</w:t>
+      </w:r>
+    </w:p>
+    <w:p>
+      <w:pPr>
+        <w:pStyle w:val="ListParagraph"/>
+        <w:numPr>
+          <w:ilvl w:val="0"/>
+          <w:numId w:val="2"/>
+        </w:numPr>
+        <w:spacing w:after="60"/>
+      </w:pPr>
+      <w:r>
+        <w:rPr>
+          <w:sz w:val="22"/>
+          <w:szCs w:val="22"/>
+        </w:rPr>
+        <w:t xml:space="preserve">Verlängere die Unverwundbarkeit (invuln = 90 → grösser).</w:t>
+      </w:r>
+    </w:p>
+    <w:p>
+      <w:pPr>
+        <w:pStyle w:val="ListParagraph"/>
+        <w:numPr>
+          <w:ilvl w:val="0"/>
+          <w:numId w:val="2"/>
+        </w:numPr>
+        <w:spacing w:after="60"/>
+      </w:pPr>
+      <w:r>
+        <w:rPr>
+          <w:sz w:val="22"/>
+          <w:szCs w:val="22"/>
+        </w:rPr>
+        <w:t xml:space="preserve">Zusatz: Zeige „LEVEL geschafft“, wenn alle Gegner abgeschossen sind.</w:t>
       </w:r>
     </w:p>
     <w:sectPr>

</xml_diff>

<commit_message>
docs(buch-galaga): Kapitel 11 "Vollbild & Kamera"
camera-Modul: logisches Spielfeld 480x640 bleibt, SCREEN(960,540)+SET_FULLSCREEN,
zoom=sh/PH + offx zentrieren, CAMERA_SET/RESET, Letterbox (CLS schwarz + BOX-
Spielfeld), HUD nach CAMERA_RESET (offx-relativ, scharf). Gameplay unveraendert.
Kumulativ code/kap11/vollbild.gb. Code-Bloecke, Tipp, Screenshot (Letterbox),
Zusammenfassung + Uebungen. gbrt --check clean, docx validiert (PASSED), 36
Seiten, 0 Leerseiten, visuell geprueft.

Co-Authored-By: Claude Opus 4.8 <noreply@anthropic.com>
</commit_message>
<xml_diff>
--- a/buch-galaga/buch/GameBasic-Buch.docx
+++ b/buch-galaga/buch/GameBasic-Buch.docx
@@ -11388,6 +11388,648 @@
           <w:szCs w:val="22"/>
         </w:rPr>
         <w:t xml:space="preserve">Zusatz: Zeige „LEVEL geschafft“, wenn alle Gegner abgeschossen sind.</w:t>
+      </w:r>
+    </w:p>
+    <w:p>
+      <w:pPr>
+        <w:pStyle w:val="Heading1"/>
+        <w:pageBreakBefore/>
+        <w:pBdr>
+          <w:bottom w:val="single" w:color="1B6CA8" w:sz="12" w:space="4"/>
+        </w:pBdr>
+        <w:spacing w:after="80" w:before="0"/>
+      </w:pPr>
+      <w:r>
+        <w:t xml:space="preserve">Kapitel 11: Vollbild &amp; Kamera</w:t>
+      </w:r>
+    </w:p>
+    <w:tbl>
+      <w:tblPr>
+        <w:tblW w:type="dxa" w:w="9360"/>
+        <w:tblBorders>
+          <w:top w:val="single" w:color="auto" w:sz="4"/>
+          <w:left w:val="single" w:color="auto" w:sz="4"/>
+          <w:bottom w:val="single" w:color="auto" w:sz="4"/>
+          <w:right w:val="single" w:color="auto" w:sz="4"/>
+          <w:insideH w:val="single" w:color="auto" w:sz="4"/>
+          <w:insideV w:val="single" w:color="auto" w:sz="4"/>
+        </w:tblBorders>
+      </w:tblPr>
+      <w:tblGrid>
+        <w:gridCol w:w="9360"/>
+      </w:tblGrid>
+      <w:tr>
+        <w:tc>
+          <w:tcPr>
+            <w:tcW w:type="dxa" w:w="9360"/>
+            <w:tcBorders>
+              <w:top w:val="single" w:color="9CC8E6" w:sz="6"/>
+              <w:left w:val="single" w:color="9CC8E6" w:sz="6"/>
+              <w:bottom w:val="single" w:color="9CC8E6" w:sz="6"/>
+              <w:right w:val="single" w:color="9CC8E6" w:sz="6"/>
+            </w:tcBorders>
+            <w:shd w:fill="E7F2FA" w:val="clear"/>
+            <w:tcMar>
+              <w:top w:type="dxa" w:w="120"/>
+              <w:left w:type="dxa" w:w="160"/>
+              <w:bottom w:type="dxa" w:w="120"/>
+              <w:right w:type="dxa" w:w="160"/>
+            </w:tcMar>
+          </w:tcPr>
+          <w:p>
+            <w:pPr>
+              <w:spacing w:after="40"/>
+            </w:pPr>
+            <w:r>
+              <w:rPr>
+                <w:b/>
+                <w:bCs/>
+                <w:color w:val="1B6CA8"/>
+                <w:sz w:val="22"/>
+                <w:szCs w:val="22"/>
+              </w:rPr>
+              <w:t xml:space="preserve">In diesem Kapitel</w:t>
+            </w:r>
+          </w:p>
+          <w:p>
+            <w:r>
+              <w:rPr>
+                <w:sz w:val="22"/>
+                <w:szCs w:val="22"/>
+              </w:rPr>
+              <w:t xml:space="preserve">Dein Spiel wird Vollbild – und zwar ohne dass du eine einzige Spielkoordinate ändern musst. Der Trick: die Kamera skaliert dein festes Spielfeld auf jeden Bildschirm und zentriert es.</w:t>
+            </w:r>
+          </w:p>
+        </w:tc>
+      </w:tr>
+    </w:tbl>
+    <w:p>
+      <w:pPr>
+        <w:pStyle w:val="Heading2"/>
+      </w:pPr>
+      <w:r>
+        <w:t xml:space="preserve">Das Problem</w:t>
+      </w:r>
+    </w:p>
+    <w:p>
+      <w:pPr>
+        <w:spacing w:after="140"/>
+      </w:pPr>
+      <w:r>
+        <w:rPr>
+          <w:sz w:val="22"/>
+          <w:szCs w:val="22"/>
+        </w:rPr>
+        <w:t xml:space="preserve">Bisher lief alles in einem festen 480×640-Fenster. Auf einem grossen, breiten Monitor wäre echtes Vollbild schöner. Aber alle Positionen (Schiff, Sterne, Formation) rechnen mit 480×640 – die wollen wir nicht alle umstellen.</w:t>
+      </w:r>
+    </w:p>
+    <w:p>
+      <w:pPr>
+        <w:pStyle w:val="Heading2"/>
+      </w:pPr>
+      <w:r>
+        <w:t xml:space="preserve">Die Kamera skaliert für dich</w:t>
+      </w:r>
+    </w:p>
+    <w:p>
+      <w:pPr>
+        <w:spacing w:after="140"/>
+      </w:pPr>
+      <w:r>
+        <w:rPr>
+          <w:sz w:val="22"/>
+          <w:szCs w:val="22"/>
+        </w:rPr>
+        <w:t xml:space="preserve">Die Lösung: Das Spielfeld bleibt logisch 480×640. Wir öffnen ein grosses Fenster (oder Vollbild) und lassen die Kamera unser Spielfeld passend skalieren und zentrieren:</w:t>
+      </w:r>
+    </w:p>
+    <w:p>
+      <w:pPr>
+        <w:pBdr>
+          <w:left w:val="single" w:color="1B6CA8" w:sz="18" w:space="6"/>
+        </w:pBdr>
+        <w:shd w:fill="F4F4F4" w:val="clear"/>
+        <w:spacing w:after="160" w:before="80"/>
+        <w:ind w:left="120"/>
+      </w:pPr>
+      <w:r>
+        <w:rPr>
+          <w:rFonts w:ascii="Consolas" w:cs="Consolas" w:eastAsia="Consolas" w:hAnsi="Consolas"/>
+          <w:sz w:val="19"/>
+          <w:szCs w:val="19"/>
+        </w:rPr>
+        <w:t xml:space="preserve">CONST PW AS INTEGER = 480</w:t>
+      </w:r>
+      <w:r>
+        <w:rPr>
+          <w:rFonts w:ascii="Consolas" w:cs="Consolas" w:eastAsia="Consolas" w:hAnsi="Consolas"/>
+          <w:sz w:val="19"/>
+          <w:szCs w:val="19"/>
+        </w:rPr>
+        <w:br/>
+        <w:t xml:space="preserve">CONST PH AS INTEGER = 640</w:t>
+      </w:r>
+      <w:r>
+        <w:rPr>
+          <w:rFonts w:ascii="Consolas" w:cs="Consolas" w:eastAsia="Consolas" w:hAnsi="Consolas"/>
+          <w:sz w:val="19"/>
+          <w:szCs w:val="19"/>
+        </w:rPr>
+        <w:br/>
+        <w:t xml:space="preserve">SCREEN(960, 540, "Mein Galaga", 1)</w:t>
+      </w:r>
+      <w:r>
+        <w:rPr>
+          <w:rFonts w:ascii="Consolas" w:cs="Consolas" w:eastAsia="Consolas" w:hAnsi="Consolas"/>
+          <w:sz w:val="19"/>
+          <w:szCs w:val="19"/>
+        </w:rPr>
+        <w:br/>
+        <w:t xml:space="preserve">SET_FULLSCREEN(TRUE)</w:t>
+      </w:r>
+      <w:r>
+        <w:rPr>
+          <w:rFonts w:ascii="Consolas" w:cs="Consolas" w:eastAsia="Consolas" w:hAnsi="Consolas"/>
+          <w:sz w:val="19"/>
+          <w:szCs w:val="19"/>
+        </w:rPr>
+        <w:br/>
+        <w:t xml:space="preserve">' ... pro Frame, vor dem Zeichnen: ...</w:t>
+      </w:r>
+      <w:r>
+        <w:rPr>
+          <w:rFonts w:ascii="Consolas" w:cs="Consolas" w:eastAsia="Consolas" w:hAnsi="Consolas"/>
+          <w:sz w:val="19"/>
+          <w:szCs w:val="19"/>
+        </w:rPr>
+        <w:br/>
+        <w:t xml:space="preserve">DIM sw AS INTEGER : sw = SCREENWIDTH()</w:t>
+      </w:r>
+      <w:r>
+        <w:rPr>
+          <w:rFonts w:ascii="Consolas" w:cs="Consolas" w:eastAsia="Consolas" w:hAnsi="Consolas"/>
+          <w:sz w:val="19"/>
+          <w:szCs w:val="19"/>
+        </w:rPr>
+        <w:br/>
+        <w:t xml:space="preserve">DIM sh AS INTEGER : sh = SCREENHEIGHT()</w:t>
+      </w:r>
+      <w:r>
+        <w:rPr>
+          <w:rFonts w:ascii="Consolas" w:cs="Consolas" w:eastAsia="Consolas" w:hAnsi="Consolas"/>
+          <w:sz w:val="19"/>
+          <w:szCs w:val="19"/>
+        </w:rPr>
+        <w:br/>
+        <w:t xml:space="preserve">DIM zoom AS FLOAT : zoom = sh / PH                 ' auf Bildhoehe skalieren</w:t>
+      </w:r>
+      <w:r>
+        <w:rPr>
+          <w:rFonts w:ascii="Consolas" w:cs="Consolas" w:eastAsia="Consolas" w:hAnsi="Consolas"/>
+          <w:sz w:val="19"/>
+          <w:szCs w:val="19"/>
+        </w:rPr>
+        <w:br/>
+        <w:t xml:space="preserve">DIM offx AS FLOAT : offx = (sw - PW * zoom) / 2.0  ' zentrieren</w:t>
+      </w:r>
+      <w:r>
+        <w:rPr>
+          <w:rFonts w:ascii="Consolas" w:cs="Consolas" w:eastAsia="Consolas" w:hAnsi="Consolas"/>
+          <w:sz w:val="19"/>
+          <w:szCs w:val="19"/>
+        </w:rPr>
+        <w:br/>
+        <w:t xml:space="preserve">CAMERA_SET(-offx / zoom, 0.0, zoom)</w:t>
+      </w:r>
+    </w:p>
+    <w:p>
+      <w:pPr>
+        <w:spacing w:after="140"/>
+      </w:pPr>
+      <w:r>
+        <w:rPr>
+          <w:sz w:val="22"/>
+          <w:szCs w:val="22"/>
+        </w:rPr>
+        <w:t xml:space="preserve">Nach </w:t>
+      </w:r>
+      <w:r>
+        <w:rPr>
+          <w:rFonts w:ascii="Consolas" w:cs="Consolas" w:eastAsia="Consolas" w:hAnsi="Consolas"/>
+          <w:sz w:val="21"/>
+          <w:szCs w:val="21"/>
+        </w:rPr>
+        <w:t xml:space="preserve">CAMERA_SET</w:t>
+      </w:r>
+      <w:r>
+        <w:rPr>
+          <w:sz w:val="22"/>
+          <w:szCs w:val="22"/>
+        </w:rPr>
+        <w:t xml:space="preserve"> sind alle Zeichen-Befehle in deinen vertrauten Welt-Koordinaten (480×640) – die Kamera vergrössert und verschiebt automatisch. </w:t>
+      </w:r>
+      <w:r>
+        <w:rPr>
+          <w:rFonts w:ascii="Consolas" w:cs="Consolas" w:eastAsia="Consolas" w:hAnsi="Consolas"/>
+          <w:sz w:val="21"/>
+          <w:szCs w:val="21"/>
+        </w:rPr>
+        <w:t xml:space="preserve">SCREENWIDTH()</w:t>
+      </w:r>
+      <w:r>
+        <w:rPr>
+          <w:sz w:val="22"/>
+          <w:szCs w:val="22"/>
+        </w:rPr>
+        <w:t xml:space="preserve">/</w:t>
+      </w:r>
+      <w:r>
+        <w:rPr>
+          <w:rFonts w:ascii="Consolas" w:cs="Consolas" w:eastAsia="Consolas" w:hAnsi="Consolas"/>
+          <w:sz w:val="21"/>
+          <w:szCs w:val="21"/>
+        </w:rPr>
+        <w:t xml:space="preserve">SCREENHEIGHT()</w:t>
+      </w:r>
+      <w:r>
+        <w:rPr>
+          <w:sz w:val="22"/>
+          <w:szCs w:val="22"/>
+        </w:rPr>
+        <w:t xml:space="preserve"> liefern die echte (Vollbild-)Grösse, also passt sich alles jedem Monitor an.</w:t>
+      </w:r>
+    </w:p>
+    <w:p>
+      <w:pPr>
+        <w:pStyle w:val="Heading2"/>
+      </w:pPr>
+      <w:r>
+        <w:t xml:space="preserve">Letterbox &amp; HUD</w:t>
+      </w:r>
+    </w:p>
+    <w:p>
+      <w:pPr>
+        <w:spacing w:after="140"/>
+      </w:pPr>
+      <w:r>
+        <w:rPr>
+          <w:sz w:val="22"/>
+          <w:szCs w:val="22"/>
+        </w:rPr>
+        <w:t xml:space="preserve">Weil unser Spielfeld hochkant ist, ein breiter Bildschirm aber quer, bleiben links und rechts Ränder – die füllen wir schwarz (Letterbox). Den HUD-Text zeichnen wir nach CAMERA_RESET wieder in Bildschirm-Koordinaten, damit er gestochen scharf bleibt:</w:t>
+      </w:r>
+    </w:p>
+    <w:p>
+      <w:pPr>
+        <w:pBdr>
+          <w:left w:val="single" w:color="1B6CA8" w:sz="18" w:space="6"/>
+        </w:pBdr>
+        <w:shd w:fill="F4F4F4" w:val="clear"/>
+        <w:spacing w:after="160" w:before="80"/>
+        <w:ind w:left="120"/>
+      </w:pPr>
+      <w:r>
+        <w:rPr>
+          <w:rFonts w:ascii="Consolas" w:cs="Consolas" w:eastAsia="Consolas" w:hAnsi="Consolas"/>
+          <w:sz w:val="19"/>
+          <w:szCs w:val="19"/>
+        </w:rPr>
+        <w:t xml:space="preserve">CLS(&amp;H000000)                          ' Raender schwarz</w:t>
+      </w:r>
+      <w:r>
+        <w:rPr>
+          <w:rFonts w:ascii="Consolas" w:cs="Consolas" w:eastAsia="Consolas" w:hAnsi="Consolas"/>
+          <w:sz w:val="19"/>
+          <w:szCs w:val="19"/>
+        </w:rPr>
+        <w:br/>
+        <w:t xml:space="preserve">CAMERA_SET(-offx / zoom, 0.0, zoom)</w:t>
+      </w:r>
+      <w:r>
+        <w:rPr>
+          <w:rFonts w:ascii="Consolas" w:cs="Consolas" w:eastAsia="Consolas" w:hAnsi="Consolas"/>
+          <w:sz w:val="19"/>
+          <w:szCs w:val="19"/>
+        </w:rPr>
+        <w:br/>
+        <w:t xml:space="preserve">BOX(0, 0, PW - 1, PH - 1, &amp;H05060F)    ' Spielfeld-Hintergrund</w:t>
+      </w:r>
+      <w:r>
+        <w:rPr>
+          <w:rFonts w:ascii="Consolas" w:cs="Consolas" w:eastAsia="Consolas" w:hAnsi="Consolas"/>
+          <w:sz w:val="19"/>
+          <w:szCs w:val="19"/>
+        </w:rPr>
+        <w:br/>
+        <w:t xml:space="preserve">' ... Sterne, Gegner, Schiff usw. zeichnen (Welt-Koordinaten) ...</w:t>
+      </w:r>
+      <w:r>
+        <w:rPr>
+          <w:rFonts w:ascii="Consolas" w:cs="Consolas" w:eastAsia="Consolas" w:hAnsi="Consolas"/>
+          <w:sz w:val="19"/>
+          <w:szCs w:val="19"/>
+        </w:rPr>
+        <w:br/>
+        <w:t xml:space="preserve">CAMERA_RESET()                         ' zurueck zu Bildschirm-Koordinaten</w:t>
+      </w:r>
+      <w:r>
+        <w:rPr>
+          <w:rFonts w:ascii="Consolas" w:cs="Consolas" w:eastAsia="Consolas" w:hAnsi="Consolas"/>
+          <w:sz w:val="19"/>
+          <w:szCs w:val="19"/>
+        </w:rPr>
+        <w:br/>
+        <w:t xml:space="preserve">TEXT(INT(offx) + 8, 6, "SCORE: " + STR$(score))</w:t>
+      </w:r>
+    </w:p>
+    <w:p>
+      <w:pPr>
+        <w:spacing w:after="140"/>
+      </w:pPr>
+      <w:r>
+        <w:rPr>
+          <w:sz w:val="22"/>
+          <w:szCs w:val="22"/>
+        </w:rPr>
+        <w:t xml:space="preserve"/>
+      </w:r>
+      <w:r>
+        <w:rPr>
+          <w:rFonts w:ascii="Consolas" w:cs="Consolas" w:eastAsia="Consolas" w:hAnsi="Consolas"/>
+          <w:sz w:val="21"/>
+          <w:szCs w:val="21"/>
+        </w:rPr>
+        <w:t xml:space="preserve">CAMERA_RESET</w:t>
+      </w:r>
+      <w:r>
+        <w:rPr>
+          <w:sz w:val="22"/>
+          <w:szCs w:val="22"/>
+        </w:rPr>
+        <w:t xml:space="preserve"> hebt den Zoom wieder auf. Den Score setzen wir um </w:t>
+      </w:r>
+      <w:r>
+        <w:rPr>
+          <w:rFonts w:ascii="Consolas" w:cs="Consolas" w:eastAsia="Consolas" w:hAnsi="Consolas"/>
+          <w:sz w:val="21"/>
+          <w:szCs w:val="21"/>
+        </w:rPr>
+        <w:t xml:space="preserve">offx</w:t>
+      </w:r>
+      <w:r>
+        <w:rPr>
+          <w:sz w:val="22"/>
+          <w:szCs w:val="22"/>
+        </w:rPr>
+        <w:t xml:space="preserve"> versetzt, damit er am linken Spielfeldrand sitzt – nicht im schwarzen Rand. Das vollständige Programm liegt in </w:t>
+      </w:r>
+      <w:r>
+        <w:rPr>
+          <w:rFonts w:ascii="Consolas" w:cs="Consolas" w:eastAsia="Consolas" w:hAnsi="Consolas"/>
+          <w:sz w:val="21"/>
+          <w:szCs w:val="21"/>
+        </w:rPr>
+        <w:t xml:space="preserve">code/kap11/vollbild.gb</w:t>
+      </w:r>
+      <w:r>
+        <w:rPr>
+          <w:sz w:val="22"/>
+          <w:szCs w:val="22"/>
+        </w:rPr>
+        <w:t xml:space="preserve">.</w:t>
+      </w:r>
+    </w:p>
+    <w:p>
+      <w:pPr>
+        <w:spacing w:after="40" w:before="120"/>
+        <w:jc w:val="center"/>
+      </w:pPr>
+      <w:r>
+        <w:drawing>
+          <wp:inline distT="0" distB="0" distL="0" distR="0">
+            <wp:extent cx="4000500" cy="2247900"/>
+            <wp:effectExtent t="0" r="0" b="0" l="0"/>
+            <wp:docPr id="1" name="kap11_vollbild.png" descr="Vollbild: Das Spielfeld ist hochskaliert und zentriert, mit schwarzen Rändern." title="Vollbild: Das Spielfeld ist hochskaliert und zentriert, mit schwarzen Rändern."/>
+            <wp:cNvGraphicFramePr>
+              <a:graphicFrameLocks xmlns:a="http://schemas.openxmlformats.org/drawingml/2006/main" noChangeAspect="1"/>
+            </wp:cNvGraphicFramePr>
+            <a:graphic xmlns:a="http://schemas.openxmlformats.org/drawingml/2006/main">
+              <a:graphicData uri="http://schemas.openxmlformats.org/drawingml/2006/picture">
+                <pic:pic xmlns:pic="http://schemas.openxmlformats.org/drawingml/2006/picture">
+                  <pic:nvPicPr>
+                    <pic:cNvPr id="0" name="" descr=""/>
+                    <pic:cNvPicPr>
+                      <a:picLocks noChangeAspect="1" noChangeArrowheads="1"/>
+                    </pic:cNvPicPr>
+                  </pic:nvPicPr>
+                  <pic:blipFill>
+                    <a:blip r:embed="rId27" cstate="none"/>
+                    <a:srcRect/>
+                    <a:stretch>
+                      <a:fillRect/>
+                    </a:stretch>
+                  </pic:blipFill>
+                  <pic:spPr bwMode="auto">
+                    <a:xfrm>
+                      <a:off x="0" y="0"/>
+                      <a:ext cx="4000500" cy="2247900"/>
+                    </a:xfrm>
+                    <a:prstGeom prst="rect">
+                      <a:avLst/>
+                    </a:prstGeom>
+                  </pic:spPr>
+                </pic:pic>
+              </a:graphicData>
+            </a:graphic>
+          </wp:inline>
+        </w:drawing>
+      </w:r>
+    </w:p>
+    <w:p>
+      <w:pPr>
+        <w:spacing w:after="200"/>
+        <w:jc w:val="center"/>
+      </w:pPr>
+      <w:r>
+        <w:rPr>
+          <w:i/>
+          <w:iCs/>
+          <w:color w:val="6A6A6A"/>
+          <w:sz w:val="18"/>
+          <w:szCs w:val="18"/>
+        </w:rPr>
+        <w:t xml:space="preserve">Vollbild: Das Spielfeld ist hochskaliert und zentriert, mit schwarzen Rändern.</w:t>
+      </w:r>
+    </w:p>
+    <w:p>
+      <w:pPr>
+        <w:pStyle w:val="Heading2"/>
+      </w:pPr>
+      <w:r>
+        <w:t xml:space="preserve">Was du gelernt hast</w:t>
+      </w:r>
+    </w:p>
+    <w:p>
+      <w:pPr>
+        <w:pStyle w:val="ListParagraph"/>
+        <w:numPr>
+          <w:ilvl w:val="0"/>
+          <w:numId w:val="2"/>
+        </w:numPr>
+        <w:spacing w:after="60"/>
+      </w:pPr>
+      <w:r>
+        <w:rPr>
+          <w:b/>
+          <w:bCs/>
+          <w:sz w:val="22"/>
+          <w:szCs w:val="22"/>
+        </w:rPr>
+        <w:t xml:space="preserve">Logische Koordinaten </w:t>
+      </w:r>
+      <w:r>
+        <w:rPr>
+          <w:sz w:val="22"/>
+          <w:szCs w:val="22"/>
+        </w:rPr>
+        <w:t xml:space="preserve">(480×640) bleiben; die Kamera kümmert sich um die Anzeige.</w:t>
+      </w:r>
+    </w:p>
+    <w:p>
+      <w:pPr>
+        <w:pStyle w:val="ListParagraph"/>
+        <w:numPr>
+          <w:ilvl w:val="0"/>
+          <w:numId w:val="2"/>
+        </w:numPr>
+        <w:spacing w:after="60"/>
+      </w:pPr>
+      <w:r>
+        <w:rPr>
+          <w:b/>
+          <w:bCs/>
+          <w:sz w:val="22"/>
+          <w:szCs w:val="22"/>
+        </w:rPr>
+        <w:t xml:space="preserve">CAMERA_SET / CAMERA_RESET </w:t>
+      </w:r>
+      <w:r>
+        <w:rPr>
+          <w:sz w:val="22"/>
+          <w:szCs w:val="22"/>
+        </w:rPr>
+        <w:t xml:space="preserve">schalten den Zoom an und wieder aus.</w:t>
+      </w:r>
+    </w:p>
+    <w:p>
+      <w:pPr>
+        <w:pStyle w:val="ListParagraph"/>
+        <w:numPr>
+          <w:ilvl w:val="0"/>
+          <w:numId w:val="2"/>
+        </w:numPr>
+        <w:spacing w:after="60"/>
+      </w:pPr>
+      <w:r>
+        <w:rPr>
+          <w:b/>
+          <w:bCs/>
+          <w:sz w:val="22"/>
+          <w:szCs w:val="22"/>
+        </w:rPr>
+        <w:t xml:space="preserve">zoom &amp; offx </w:t>
+      </w:r>
+      <w:r>
+        <w:rPr>
+          <w:sz w:val="22"/>
+          <w:szCs w:val="22"/>
+        </w:rPr>
+        <w:t xml:space="preserve">skalieren auf die Bildhöhe und zentrieren (Letterbox).</w:t>
+      </w:r>
+    </w:p>
+    <w:p>
+      <w:pPr>
+        <w:pStyle w:val="ListParagraph"/>
+        <w:numPr>
+          <w:ilvl w:val="0"/>
+          <w:numId w:val="2"/>
+        </w:numPr>
+        <w:spacing w:after="60"/>
+      </w:pPr>
+      <w:r>
+        <w:rPr>
+          <w:b/>
+          <w:bCs/>
+          <w:sz w:val="22"/>
+          <w:szCs w:val="22"/>
+        </w:rPr>
+        <w:t xml:space="preserve">HUD nach CAMERA_RESET </w:t>
+      </w:r>
+      <w:r>
+        <w:rPr>
+          <w:sz w:val="22"/>
+          <w:szCs w:val="22"/>
+        </w:rPr>
+        <w:t xml:space="preserve">= scharfer Text in Bildschirm-Koordinaten.</w:t>
+      </w:r>
+    </w:p>
+    <w:p>
+      <w:pPr>
+        <w:pStyle w:val="Heading2"/>
+      </w:pPr>
+      <w:r>
+        <w:t xml:space="preserve">Übung</w:t>
+      </w:r>
+    </w:p>
+    <w:p>
+      <w:pPr>
+        <w:pStyle w:val="ListParagraph"/>
+        <w:numPr>
+          <w:ilvl w:val="0"/>
+          <w:numId w:val="2"/>
+        </w:numPr>
+        <w:spacing w:after="60"/>
+      </w:pPr>
+      <w:r>
+        <w:rPr>
+          <w:sz w:val="22"/>
+          <w:szCs w:val="22"/>
+        </w:rPr>
+        <w:t xml:space="preserve">Schalte FULL auf FALSE und spiele im Fenster – die Kamera funktioniert trotzdem.</w:t>
+      </w:r>
+    </w:p>
+    <w:p>
+      <w:pPr>
+        <w:pStyle w:val="ListParagraph"/>
+        <w:numPr>
+          <w:ilvl w:val="0"/>
+          <w:numId w:val="2"/>
+        </w:numPr>
+        <w:spacing w:after="60"/>
+      </w:pPr>
+      <w:r>
+        <w:rPr>
+          <w:sz w:val="22"/>
+          <w:szCs w:val="22"/>
+        </w:rPr>
+        <w:t xml:space="preserve">Färbe die Letterbox-Ränder ein (statt Schwarz).</w:t>
+      </w:r>
+    </w:p>
+    <w:p>
+      <w:pPr>
+        <w:pStyle w:val="ListParagraph"/>
+        <w:numPr>
+          <w:ilvl w:val="0"/>
+          <w:numId w:val="2"/>
+        </w:numPr>
+        <w:spacing w:after="60"/>
+      </w:pPr>
+      <w:r>
+        <w:rPr>
+          <w:sz w:val="22"/>
+          <w:szCs w:val="22"/>
+        </w:rPr>
+        <w:t xml:space="preserve">Zentriere die GAME-OVER-Schrift genauer auf deinem Bildschirm.</w:t>
       </w:r>
     </w:p>
     <w:sectPr>

</xml_diff>

<commit_message>
docs(buch-galaga): Kapitel 12 "Politur & Ausblick" -- Buch komplett (Kap 1-12)
Finale: Sound (AUDIO_SFX/PLAYSOUND), Wellen/Level (bugsAlive-Zaehler, BuildWave,
Schwierigkeit steigt), Standalone-Export (gbrt --export), Ausblick auf galaga.gb
(Fangstrahl/Doppeljaeger, Bonus-Wellen, Highscore, Effekte, Musik/Gamepad) +
herzlicher Abschluss. Kumulativ code/kap12/politur.gb. Buch jetzt VOLLSTAENDIG:
Einleitung + Kapitel 1-12, 38 Seiten, 0 Leerseiten, farbig, mit 21 Screenshots,
docx validiert (PASSED), alle Seiten visuell geprueft.

Co-Authored-By: Claude Opus 4.8 <noreply@anthropic.com>
</commit_message>
<xml_diff>
--- a/buch-galaga/buch/GameBasic-Buch.docx
+++ b/buch-galaga/buch/GameBasic-Buch.docx
@@ -12030,6 +12030,590 @@
           <w:szCs w:val="22"/>
         </w:rPr>
         <w:t xml:space="preserve">Zentriere die GAME-OVER-Schrift genauer auf deinem Bildschirm.</w:t>
+      </w:r>
+    </w:p>
+    <w:p>
+      <w:pPr>
+        <w:pStyle w:val="Heading1"/>
+        <w:pageBreakBefore/>
+        <w:pBdr>
+          <w:bottom w:val="single" w:color="1B6CA8" w:sz="12" w:space="4"/>
+        </w:pBdr>
+        <w:spacing w:after="80" w:before="0"/>
+      </w:pPr>
+      <w:r>
+        <w:t xml:space="preserve">Kapitel 12: Politur &amp; Ausblick</w:t>
+      </w:r>
+    </w:p>
+    <w:tbl>
+      <w:tblPr>
+        <w:tblW w:type="dxa" w:w="9360"/>
+        <w:tblBorders>
+          <w:top w:val="single" w:color="auto" w:sz="4"/>
+          <w:left w:val="single" w:color="auto" w:sz="4"/>
+          <w:bottom w:val="single" w:color="auto" w:sz="4"/>
+          <w:right w:val="single" w:color="auto" w:sz="4"/>
+          <w:insideH w:val="single" w:color="auto" w:sz="4"/>
+          <w:insideV w:val="single" w:color="auto" w:sz="4"/>
+        </w:tblBorders>
+      </w:tblPr>
+      <w:tblGrid>
+        <w:gridCol w:w="9360"/>
+      </w:tblGrid>
+      <w:tr>
+        <w:tc>
+          <w:tcPr>
+            <w:tcW w:type="dxa" w:w="9360"/>
+            <w:tcBorders>
+              <w:top w:val="single" w:color="9CC8E6" w:sz="6"/>
+              <w:left w:val="single" w:color="9CC8E6" w:sz="6"/>
+              <w:bottom w:val="single" w:color="9CC8E6" w:sz="6"/>
+              <w:right w:val="single" w:color="9CC8E6" w:sz="6"/>
+            </w:tcBorders>
+            <w:shd w:fill="E7F2FA" w:val="clear"/>
+            <w:tcMar>
+              <w:top w:type="dxa" w:w="120"/>
+              <w:left w:type="dxa" w:w="160"/>
+              <w:bottom w:type="dxa" w:w="120"/>
+              <w:right w:type="dxa" w:w="160"/>
+            </w:tcMar>
+          </w:tcPr>
+          <w:p>
+            <w:pPr>
+              <w:spacing w:after="40"/>
+            </w:pPr>
+            <w:r>
+              <w:rPr>
+                <w:b/>
+                <w:bCs/>
+                <w:color w:val="1B6CA8"/>
+                <w:sz w:val="22"/>
+                <w:szCs w:val="22"/>
+              </w:rPr>
+              <w:t xml:space="preserve">In diesem Kapitel</w:t>
+            </w:r>
+          </w:p>
+          <w:p>
+            <w:r>
+              <w:rPr>
+                <w:sz w:val="22"/>
+                <w:szCs w:val="22"/>
+              </w:rPr>
+              <w:t xml:space="preserve">Der letzte Schliff: Sound, mehrere Level mit steigender Schwierigkeit – und wie du dein Spiel als fertiges Programm weitergibst. Zum Schluss ein Ausblick, wie aus diesem Grundgerüst das volle Galaga wird.</w:t>
+            </w:r>
+          </w:p>
+        </w:tc>
+      </w:tr>
+    </w:tbl>
+    <w:p>
+      <w:pPr>
+        <w:pStyle w:val="Heading2"/>
+      </w:pPr>
+      <w:r>
+        <w:t xml:space="preserve">Sound</w:t>
+      </w:r>
+    </w:p>
+    <w:p>
+      <w:pPr>
+        <w:spacing w:after="140"/>
+      </w:pPr>
+      <w:r>
+        <w:rPr>
+          <w:sz w:val="22"/>
+          <w:szCs w:val="22"/>
+        </w:rPr>
+        <w:t xml:space="preserve">Arcade-Sounds erzeugst du dir direkt im Code mit </w:t>
+      </w:r>
+      <w:r>
+        <w:rPr>
+          <w:rFonts w:ascii="Consolas" w:cs="Consolas" w:eastAsia="Consolas" w:hAnsi="Consolas"/>
+          <w:sz w:val="21"/>
+          <w:szCs w:val="21"/>
+        </w:rPr>
+        <w:t xml:space="preserve">AUDIO_SFX</w:t>
+      </w:r>
+      <w:r>
+        <w:rPr>
+          <w:sz w:val="22"/>
+          <w:szCs w:val="22"/>
+        </w:rPr>
+        <w:t xml:space="preserve"> (ein kleiner Synthesizer) und spielst sie mit </w:t>
+      </w:r>
+      <w:r>
+        <w:rPr>
+          <w:rFonts w:ascii="Consolas" w:cs="Consolas" w:eastAsia="Consolas" w:hAnsi="Consolas"/>
+          <w:sz w:val="21"/>
+          <w:szCs w:val="21"/>
+        </w:rPr>
+        <w:t xml:space="preserve">PLAYSOUND</w:t>
+      </w:r>
+      <w:r>
+        <w:rPr>
+          <w:sz w:val="22"/>
+          <w:szCs w:val="22"/>
+        </w:rPr>
+        <w:t xml:space="preserve">:</w:t>
+      </w:r>
+    </w:p>
+    <w:p>
+      <w:pPr>
+        <w:pBdr>
+          <w:left w:val="single" w:color="1B6CA8" w:sz="18" w:space="6"/>
+        </w:pBdr>
+        <w:shd w:fill="F4F4F4" w:val="clear"/>
+        <w:spacing w:after="160" w:before="80"/>
+        <w:ind w:left="120"/>
+      </w:pPr>
+      <w:r>
+        <w:rPr>
+          <w:rFonts w:ascii="Consolas" w:cs="Consolas" w:eastAsia="Consolas" w:hAnsi="Consolas"/>
+          <w:sz w:val="19"/>
+          <w:szCs w:val="19"/>
+        </w:rPr>
+        <w:t xml:space="preserve">IMPORT "audio"</w:t>
+      </w:r>
+      <w:r>
+        <w:rPr>
+          <w:rFonts w:ascii="Consolas" w:cs="Consolas" w:eastAsia="Consolas" w:hAnsi="Consolas"/>
+          <w:sz w:val="19"/>
+          <w:szCs w:val="19"/>
+        </w:rPr>
+        <w:br/>
+        <w:t xml:space="preserve">DIM sfxShoot AS INTEGER : sfxShoot = AUDIO_SFX("square", 900, -600, 0, 8, 90, 0, 0, 0.30)</w:t>
+      </w:r>
+      <w:r>
+        <w:rPr>
+          <w:rFonts w:ascii="Consolas" w:cs="Consolas" w:eastAsia="Consolas" w:hAnsi="Consolas"/>
+          <w:sz w:val="19"/>
+          <w:szCs w:val="19"/>
+        </w:rPr>
+        <w:br/>
+        <w:t xml:space="preserve">DIM sfxBoom  AS INTEGER : sfxBoom  = AUDIO_SFX("noise", 220, -120, 0, 60, 200, 0, 0, 0.50)</w:t>
+      </w:r>
+      <w:r>
+        <w:rPr>
+          <w:rFonts w:ascii="Consolas" w:cs="Consolas" w:eastAsia="Consolas" w:hAnsi="Consolas"/>
+          <w:sz w:val="19"/>
+          <w:szCs w:val="19"/>
+        </w:rPr>
+        <w:br/>
+        <w:t xml:space="preserve">' ... beim Schiessen:  PLAYSOUND(sfxShoot)</w:t>
+      </w:r>
+      <w:r>
+        <w:rPr>
+          <w:rFonts w:ascii="Consolas" w:cs="Consolas" w:eastAsia="Consolas" w:hAnsi="Consolas"/>
+          <w:sz w:val="19"/>
+          <w:szCs w:val="19"/>
+        </w:rPr>
+        <w:br/>
+        <w:t xml:space="preserve">' ... beim Treffer:    PLAYSOUND(sfxBoom)</w:t>
+      </w:r>
+    </w:p>
+    <w:p>
+      <w:pPr>
+        <w:spacing w:after="140"/>
+      </w:pPr>
+      <w:r>
+        <w:rPr>
+          <w:sz w:val="22"/>
+          <w:szCs w:val="22"/>
+        </w:rPr>
+        <w:t xml:space="preserve">Die Zahlen steuern Wellenform, Tonhöhe, Tonhöhen-Verlauf, Hüllkurve und Lautstärke – einfach ausprobieren, bis es „pew“ und „bumm“ macht. Ein eigener Musik-Generator </w:t>
+      </w:r>
+      <w:r>
+        <w:rPr>
+          <w:rFonts w:ascii="Consolas" w:cs="Consolas" w:eastAsia="Consolas" w:hAnsi="Consolas"/>
+          <w:sz w:val="21"/>
+          <w:szCs w:val="21"/>
+        </w:rPr>
+        <w:t xml:space="preserve">gbsfx</w:t>
+      </w:r>
+      <w:r>
+        <w:rPr>
+          <w:sz w:val="22"/>
+          <w:szCs w:val="22"/>
+        </w:rPr>
+        <w:t xml:space="preserve"> hilft beim Tüfteln.</w:t>
+      </w:r>
+    </w:p>
+    <w:p>
+      <w:pPr>
+        <w:pStyle w:val="Heading2"/>
+      </w:pPr>
+      <w:r>
+        <w:t xml:space="preserve">Wellen &amp; Level</w:t>
+      </w:r>
+    </w:p>
+    <w:p>
+      <w:pPr>
+        <w:spacing w:after="140"/>
+      </w:pPr>
+      <w:r>
+        <w:rPr>
+          <w:sz w:val="22"/>
+          <w:szCs w:val="22"/>
+        </w:rPr>
+        <w:t xml:space="preserve">Ist die Formation leergeräumt, beginnt ein neues Level – mit etwas schnelleren Gegnern. Wir zählen die lebenden Gegner mit und bauen bei null eine neue Welle:</w:t>
+      </w:r>
+    </w:p>
+    <w:p>
+      <w:pPr>
+        <w:pBdr>
+          <w:left w:val="single" w:color="1B6CA8" w:sz="18" w:space="6"/>
+        </w:pBdr>
+        <w:shd w:fill="F4F4F4" w:val="clear"/>
+        <w:spacing w:after="160" w:before="80"/>
+        <w:ind w:left="120"/>
+      </w:pPr>
+      <w:r>
+        <w:rPr>
+          <w:rFonts w:ascii="Consolas" w:cs="Consolas" w:eastAsia="Consolas" w:hAnsi="Consolas"/>
+          <w:sz w:val="19"/>
+          <w:szCs w:val="19"/>
+        </w:rPr>
+        <w:t xml:space="preserve">' beim Abschuss:  bugsAlive = bugsAlive - 1</w:t>
+      </w:r>
+      <w:r>
+        <w:rPr>
+          <w:rFonts w:ascii="Consolas" w:cs="Consolas" w:eastAsia="Consolas" w:hAnsi="Consolas"/>
+          <w:sz w:val="19"/>
+          <w:szCs w:val="19"/>
+        </w:rPr>
+        <w:br/>
+        <w:t xml:space="preserve">' nach den Kollisionen:</w:t>
+      </w:r>
+      <w:r>
+        <w:rPr>
+          <w:rFonts w:ascii="Consolas" w:cs="Consolas" w:eastAsia="Consolas" w:hAnsi="Consolas"/>
+          <w:sz w:val="19"/>
+          <w:szCs w:val="19"/>
+        </w:rPr>
+        <w:br/>
+        <w:t xml:space="preserve">IF bugsAlive &lt;= 0 THEN level = level + 1 : BuildWave()</w:t>
+      </w:r>
+    </w:p>
+    <w:p>
+      <w:pPr>
+        <w:spacing w:after="140"/>
+      </w:pPr>
+      <w:r>
+        <w:rPr>
+          <w:sz w:val="22"/>
+          <w:szCs w:val="22"/>
+        </w:rPr>
+        <w:t xml:space="preserve">In </w:t>
+      </w:r>
+      <w:r>
+        <w:rPr>
+          <w:rFonts w:ascii="Consolas" w:cs="Consolas" w:eastAsia="Consolas" w:hAnsi="Consolas"/>
+          <w:sz w:val="21"/>
+          <w:szCs w:val="21"/>
+        </w:rPr>
+        <w:t xml:space="preserve">BuildWave</w:t>
+      </w:r>
+      <w:r>
+        <w:rPr>
+          <w:sz w:val="22"/>
+          <w:szCs w:val="22"/>
+        </w:rPr>
+        <w:t xml:space="preserve"> setzen wir die Formation neu auf und machen die Stürze pro Level ein wenig schneller – so steigt die Spannung. Punkte und Leben bleiben erhalten. Das vollständige Programm liegt in </w:t>
+      </w:r>
+      <w:r>
+        <w:rPr>
+          <w:rFonts w:ascii="Consolas" w:cs="Consolas" w:eastAsia="Consolas" w:hAnsi="Consolas"/>
+          <w:sz w:val="21"/>
+          <w:szCs w:val="21"/>
+        </w:rPr>
+        <w:t xml:space="preserve">code/kap12/politur.gb</w:t>
+      </w:r>
+      <w:r>
+        <w:rPr>
+          <w:sz w:val="22"/>
+          <w:szCs w:val="22"/>
+        </w:rPr>
+        <w:t xml:space="preserve">.</w:t>
+      </w:r>
+    </w:p>
+    <w:p>
+      <w:pPr>
+        <w:spacing w:after="40" w:before="120"/>
+        <w:jc w:val="center"/>
+      </w:pPr>
+      <w:r>
+        <w:drawing>
+          <wp:inline distT="0" distB="0" distL="0" distR="0">
+            <wp:extent cx="4000500" cy="2247900"/>
+            <wp:effectExtent t="0" r="0" b="0" l="0"/>
+            <wp:docPr id="1" name="kap12_politur.png" descr="Das fertige Grundspiel: Vollbild, Sound, Level, HUD." title="Das fertige Grundspiel: Vollbild, Sound, Level, HUD."/>
+            <wp:cNvGraphicFramePr>
+              <a:graphicFrameLocks xmlns:a="http://schemas.openxmlformats.org/drawingml/2006/main" noChangeAspect="1"/>
+            </wp:cNvGraphicFramePr>
+            <a:graphic xmlns:a="http://schemas.openxmlformats.org/drawingml/2006/main">
+              <a:graphicData uri="http://schemas.openxmlformats.org/drawingml/2006/picture">
+                <pic:pic xmlns:pic="http://schemas.openxmlformats.org/drawingml/2006/picture">
+                  <pic:nvPicPr>
+                    <pic:cNvPr id="0" name="" descr=""/>
+                    <pic:cNvPicPr>
+                      <a:picLocks noChangeAspect="1" noChangeArrowheads="1"/>
+                    </pic:cNvPicPr>
+                  </pic:nvPicPr>
+                  <pic:blipFill>
+                    <a:blip r:embed="rId28" cstate="none"/>
+                    <a:srcRect/>
+                    <a:stretch>
+                      <a:fillRect/>
+                    </a:stretch>
+                  </pic:blipFill>
+                  <pic:spPr bwMode="auto">
+                    <a:xfrm>
+                      <a:off x="0" y="0"/>
+                      <a:ext cx="4000500" cy="2247900"/>
+                    </a:xfrm>
+                    <a:prstGeom prst="rect">
+                      <a:avLst/>
+                    </a:prstGeom>
+                  </pic:spPr>
+                </pic:pic>
+              </a:graphicData>
+            </a:graphic>
+          </wp:inline>
+        </w:drawing>
+      </w:r>
+    </w:p>
+    <w:p>
+      <w:pPr>
+        <w:spacing w:after="200"/>
+        <w:jc w:val="center"/>
+      </w:pPr>
+      <w:r>
+        <w:rPr>
+          <w:i/>
+          <w:iCs/>
+          <w:color w:val="6A6A6A"/>
+          <w:sz w:val="18"/>
+          <w:szCs w:val="18"/>
+        </w:rPr>
+        <w:t xml:space="preserve">Das fertige Grundspiel: Vollbild, Sound, Level, HUD.</w:t>
+      </w:r>
+    </w:p>
+    <w:p>
+      <w:pPr>
+        <w:pStyle w:val="Heading2"/>
+      </w:pPr>
+      <w:r>
+        <w:t xml:space="preserve">Als Programm weitergeben (Export)</w:t>
+      </w:r>
+    </w:p>
+    <w:p>
+      <w:pPr>
+        <w:spacing w:after="140"/>
+      </w:pPr>
+      <w:r>
+        <w:rPr>
+          <w:sz w:val="22"/>
+          <w:szCs w:val="22"/>
+        </w:rPr>
+        <w:t xml:space="preserve">Damit Freunde dein Spiel ohne GameBasic spielen können, exportierst du es als eigenständiges Programm:</w:t>
+      </w:r>
+    </w:p>
+    <w:p>
+      <w:pPr>
+        <w:pBdr>
+          <w:left w:val="single" w:color="1B6CA8" w:sz="18" w:space="6"/>
+        </w:pBdr>
+        <w:shd w:fill="F4F4F4" w:val="clear"/>
+        <w:spacing w:after="160" w:before="80"/>
+        <w:ind w:left="120"/>
+      </w:pPr>
+      <w:r>
+        <w:rPr>
+          <w:rFonts w:ascii="Consolas" w:cs="Consolas" w:eastAsia="Consolas" w:hAnsi="Consolas"/>
+          <w:sz w:val="19"/>
+          <w:szCs w:val="19"/>
+        </w:rPr>
+        <w:t xml:space="preserve">gbrt --export  dein-spiel.gb</w:t>
+      </w:r>
+    </w:p>
+    <w:p>
+      <w:pPr>
+        <w:spacing w:after="140"/>
+      </w:pPr>
+      <w:r>
+        <w:rPr>
+          <w:sz w:val="22"/>
+          <w:szCs w:val="22"/>
+        </w:rPr>
+        <w:t xml:space="preserve">Das erzeugt eine startfertige Datei (mit den Bildern und Tönen darin). Doppelklick genügt – kein GameBasic nötig.</w:t>
+      </w:r>
+    </w:p>
+    <w:p>
+      <w:pPr>
+        <w:pStyle w:val="Heading2"/>
+      </w:pPr>
+      <w:r>
+        <w:t xml:space="preserve">Wie geht es weiter? (Ausblick)</w:t>
+      </w:r>
+    </w:p>
+    <w:p>
+      <w:pPr>
+        <w:spacing w:after="140"/>
+      </w:pPr>
+      <w:r>
+        <w:rPr>
+          <w:sz w:val="22"/>
+          <w:szCs w:val="22"/>
+        </w:rPr>
+        <w:t xml:space="preserve">Du hast jetzt ein komplettes, spielbares Galaga-Grundgerüst gebaut. Im Beispielspiel code/galaga.gb findest du dieselben Bausteine – plus die grossen Extras, die du als Nächstes angehen kannst:</w:t>
+      </w:r>
+    </w:p>
+    <w:p>
+      <w:pPr>
+        <w:pStyle w:val="ListParagraph"/>
+        <w:numPr>
+          <w:ilvl w:val="0"/>
+          <w:numId w:val="2"/>
+        </w:numPr>
+        <w:spacing w:after="60"/>
+      </w:pPr>
+      <w:r>
+        <w:rPr>
+          <w:b/>
+          <w:bCs/>
+          <w:sz w:val="22"/>
+          <w:szCs w:val="22"/>
+        </w:rPr>
+        <w:t xml:space="preserve">Fangstrahl &amp; Doppeljäger: </w:t>
+      </w:r>
+      <w:r>
+        <w:rPr>
+          <w:sz w:val="22"/>
+          <w:szCs w:val="22"/>
+        </w:rPr>
+        <w:t xml:space="preserve">Ein Boss fängt dein Schiff – befreie es und fliege mit zwei Schiffen.</w:t>
+      </w:r>
+    </w:p>
+    <w:p>
+      <w:pPr>
+        <w:pStyle w:val="ListParagraph"/>
+        <w:numPr>
+          <w:ilvl w:val="0"/>
+          <w:numId w:val="2"/>
+        </w:numPr>
+        <w:spacing w:after="60"/>
+      </w:pPr>
+      <w:r>
+        <w:rPr>
+          <w:b/>
+          <w:bCs/>
+          <w:sz w:val="22"/>
+          <w:szCs w:val="22"/>
+        </w:rPr>
+        <w:t xml:space="preserve">Bonus-Wellen: </w:t>
+      </w:r>
+      <w:r>
+        <w:rPr>
+          <w:sz w:val="22"/>
+          <w:szCs w:val="22"/>
+        </w:rPr>
+        <w:t xml:space="preserve">Alle paar Level eine Runde nur für Punkte.</w:t>
+      </w:r>
+    </w:p>
+    <w:p>
+      <w:pPr>
+        <w:pStyle w:val="ListParagraph"/>
+        <w:numPr>
+          <w:ilvl w:val="0"/>
+          <w:numId w:val="2"/>
+        </w:numPr>
+        <w:spacing w:after="60"/>
+      </w:pPr>
+      <w:r>
+        <w:rPr>
+          <w:b/>
+          <w:bCs/>
+          <w:sz w:val="22"/>
+          <w:szCs w:val="22"/>
+        </w:rPr>
+        <w:t xml:space="preserve">Highscore-Liste: </w:t>
+      </w:r>
+      <w:r>
+        <w:rPr>
+          <w:sz w:val="22"/>
+          <w:szCs w:val="22"/>
+        </w:rPr>
+        <w:t xml:space="preserve">Namen eintragen, dauerhaft gespeichert (save-Modul).</w:t>
+      </w:r>
+    </w:p>
+    <w:p>
+      <w:pPr>
+        <w:pStyle w:val="ListParagraph"/>
+        <w:numPr>
+          <w:ilvl w:val="0"/>
+          <w:numId w:val="2"/>
+        </w:numPr>
+        <w:spacing w:after="60"/>
+      </w:pPr>
+      <w:r>
+        <w:rPr>
+          <w:b/>
+          <w:bCs/>
+          <w:sz w:val="22"/>
+          <w:szCs w:val="22"/>
+        </w:rPr>
+        <w:t xml:space="preserve">Effekte: </w:t>
+      </w:r>
+      <w:r>
+        <w:rPr>
+          <w:sz w:val="22"/>
+          <w:szCs w:val="22"/>
+        </w:rPr>
+        <w:t xml:space="preserve">Explosionen (Partikel), Bildschirm-Wackeln, CRT-Retro-Look, Regenbogen-Titel, Laufschrift.</w:t>
+      </w:r>
+    </w:p>
+    <w:p>
+      <w:pPr>
+        <w:pStyle w:val="ListParagraph"/>
+        <w:numPr>
+          <w:ilvl w:val="0"/>
+          <w:numId w:val="2"/>
+        </w:numPr>
+        <w:spacing w:after="60"/>
+      </w:pPr>
+      <w:r>
+        <w:rPr>
+          <w:b/>
+          <w:bCs/>
+          <w:sz w:val="22"/>
+          <w:szCs w:val="22"/>
+        </w:rPr>
+        <w:t xml:space="preserve">Musik &amp; Gamepad: </w:t>
+      </w:r>
+      <w:r>
+        <w:rPr>
+          <w:sz w:val="22"/>
+          <w:szCs w:val="22"/>
+        </w:rPr>
+        <w:t xml:space="preserve">Hintergrundmusik und Steuerung per Controller.</w:t>
+      </w:r>
+    </w:p>
+    <w:p>
+      <w:pPr>
+        <w:pStyle w:val="Heading2"/>
+      </w:pPr>
+      <w:r>
+        <w:t xml:space="preserve">Glückwunsch!</w:t>
+      </w:r>
+    </w:p>
+    <w:p>
+      <w:pPr>
+        <w:spacing w:after="140"/>
+      </w:pPr>
+      <w:r>
+        <w:rPr>
+          <w:sz w:val="22"/>
+          <w:szCs w:val="22"/>
+        </w:rPr>
+        <w:t xml:space="preserve">Du hast Schritt für Schritt ein echtes Arcade-Spiel gebaut – vom leeren Fenster bis zu einfliegenden, stürzenden, bombenwerfenden Gegnern mit Punkten, Leben und mehreren Leveln. Und ganz nebenbei hast du Variablen, Schleifen, Arrays, Klassen, Funktionen, Module und Zustands-Maschinen gelernt. Jetzt bist du dran: Bau es um, mach es zu deinem Spiel – und zeig es her. Viel Spass!</w:t>
       </w:r>
     </w:p>
     <w:sectPr>

</xml_diff>

<commit_message>
docs(buch-galaga): Buch ausfuehrlicher + Humor + persoenliches Vorwort
- Neues Vorwort von Hans Schnorrenberger (erste Person, warm, dezenter Humor)
- Alle Kapitel + Einleitung: Erklaerungen vertieft, Walls-of-Text in mehr
  Absaetze aufgebrochen, durchgehend leichter (nicht kitschiger) Humor
- Persoenlicher Abschluss im Schlusskapitel, ebenfalls signiert
- Code-Bloecke und Bilder unveraendert; 38 -> 45 Seiten, 0 Leerseiten, docx valide

Co-Authored-By: Claude Opus 4.8 <noreply@anthropic.com>
</commit_message>
<xml_diff>
--- a/buch-galaga/buch/GameBasic-Buch.docx
+++ b/buch-galaga/buch/GameBasic-Buch.docx
@@ -145,6 +145,105 @@
         <w:spacing w:after="80" w:before="320"/>
       </w:pPr>
       <w:r>
+        <w:t xml:space="preserve">Vorwort</w:t>
+      </w:r>
+    </w:p>
+    <w:p>
+      <w:pPr>
+        <w:spacing w:after="140"/>
+      </w:pPr>
+      <w:r>
+        <w:rPr>
+          <w:sz w:val="22"/>
+          <w:szCs w:val="22"/>
+        </w:rPr>
+        <w:t xml:space="preserve">Es gibt zwei Sorten von Menschen, die Computerspiele lieben: die einen wollen sie spielen, die anderen wollen wissen, wie zum Teufel das eigentlich funktioniert. Wenn du dieses Buch in der Hand hältst, gehörst du vermutlich zur zweiten Sorte – oder du bist gerade dabei, hinüberzuwechseln. Herzlich willkommen, hier ist genau dein Platz.</w:t>
+      </w:r>
+    </w:p>
+    <w:p>
+      <w:pPr>
+        <w:spacing w:after="140"/>
+      </w:pPr>
+      <w:r>
+        <w:rPr>
+          <w:sz w:val="22"/>
+          <w:szCs w:val="22"/>
+        </w:rPr>
+        <w:t xml:space="preserve">Ich heiße Hans Schnorrenberger, und ich habe GameBasic gebaut, weil ich es leid war, Anfängern erklären zu müssen, warum man für ein simples bewegtes Pixel auf dem Bildschirm erst einmal drei Bibliotheken installieren, ein halbes Dutzend Fehlermeldungen entschlüsseln und an einer Stelle „aus Gründen“ ein Semikolon setzen muss. Programmieren sollte sich nicht wie eine Mutprobe anfühlen. Es sollte sich anfühlen wie das, was es eigentlich ist: das Bauen kleiner Welten, in denen du die Regeln machst.</w:t>
+      </w:r>
+    </w:p>
+    <w:p>
+      <w:pPr>
+        <w:spacing w:after="140"/>
+      </w:pPr>
+      <w:r>
+        <w:rPr>
+          <w:sz w:val="22"/>
+          <w:szCs w:val="22"/>
+        </w:rPr>
+        <w:t xml:space="preserve">Deshalb ist GameBasic so geworden, wie es ist. Die Befehle heißen so, wie sie gemeint sind. Wenn etwas schiefgeht, sagt dir die Sprache in ganzen, lesbaren Sätzen, was los ist – und nicht in kryptischem Fachchinesisch, das man erst googeln muss, um zu verstehen, dass man es googeln muss. Und wenn dein Programm läuft, dann läuft es flott, weil im Hintergrund eine richtige Runtime werkelt und nicht bloß gute Laune.</w:t>
+      </w:r>
+    </w:p>
+    <w:p>
+      <w:pPr>
+        <w:spacing w:after="140"/>
+      </w:pPr>
+      <w:r>
+        <w:rPr>
+          <w:sz w:val="22"/>
+          <w:szCs w:val="22"/>
+        </w:rPr>
+        <w:t xml:space="preserve">Dieses Buch baut mit dir gemeinsam ein vollständiges Arcade-Spiel: einen Klon des unsterblichen Klassikers Galaga. Wir fangen ganz vorne an – mit einem leeren schwarzen Fenster, das tapfer darauf wartet, dass etwas passiert – und hören erst auf, wenn bunte Gegner in geschwungenen Bahnen einfliegen, herabstürzen, Bomben werfen und du sie mit einem selbstgezeichneten Raumschiff zu Pixelstaub schießt. Unterwegs lernst du, fast ohne es zu merken, alles Wichtige über das Programmieren.</w:t>
+      </w:r>
+    </w:p>
+    <w:p>
+      <w:pPr>
+        <w:spacing w:after="140"/>
+      </w:pPr>
+      <w:r>
+        <w:rPr>
+          <w:sz w:val="22"/>
+          <w:szCs w:val="22"/>
+        </w:rPr>
+        <w:t xml:space="preserve">Ein einziger Rat noch, bevor es losgeht: Tippe die Beispiele wirklich selbst ab. Ich weiß, Kopieren wäre schneller. Aber Programmieren lernt man in den Fingern, nicht in den Augen – ungefähr so, wie man Fahrradfahren nicht aus einem Buch über Fahrräder lernt. Mach Fehler, viele sogar. Jeder Fehler, den du selbst gefunden und behoben hast, ist eine Lektion, die sitzt.</w:t>
+      </w:r>
+    </w:p>
+    <w:p>
+      <w:pPr>
+        <w:spacing w:after="140"/>
+      </w:pPr>
+      <w:r>
+        <w:rPr>
+          <w:sz w:val="22"/>
+          <w:szCs w:val="22"/>
+        </w:rPr>
+        <w:t xml:space="preserve">Genug der Vorrede. Schnall dich an, der Hangar ist offen.</w:t>
+      </w:r>
+    </w:p>
+    <w:p>
+      <w:pPr>
+        <w:spacing w:before="240"/>
+      </w:pPr>
+      <w:r>
+        <w:rPr>
+          <w:i/>
+          <w:iCs/>
+          <w:color w:val="6A6A6A"/>
+          <w:sz w:val="22"/>
+          <w:szCs w:val="22"/>
+        </w:rPr>
+        <w:t xml:space="preserve">— Hans Schnorrenberger</w:t>
+      </w:r>
+    </w:p>
+    <w:p>
+      <w:pPr>
+        <w:pStyle w:val="Heading1"/>
+        <w:pBdr>
+          <w:bottom w:val="single" w:color="1B6CA8" w:sz="12" w:space="4"/>
+        </w:pBdr>
+        <w:spacing w:after="80" w:before="320"/>
+      </w:pPr>
+      <w:r>
         <w:t xml:space="preserve">Willkommen!</w:t>
       </w:r>
     </w:p>
@@ -157,19 +256,55 @@
           <w:sz w:val="22"/>
           <w:szCs w:val="22"/>
         </w:rPr>
-        <w:t xml:space="preserve">Dieses Buch nimmt dich an die Hand und baut mit dir gemeinsam ein komplettes Arcade-Spiel – einen Klon des Klassikers Galaga. Du brauchst keine Vorkenntnisse. Jedes Kapitel fügt ein kleines, sichtbares Stück hinzu: erst ein Fenster, dann ein Raumschiff, dann Schiessen, Gegner, Einflug-Manöver – bis am Ende ein richtiges Spiel mit Highscore-Liste, Sound und Effekten vor dir läuft.</w:t>
-      </w:r>
-    </w:p>
-    <w:p>
-      <w:pPr>
-        <w:spacing w:after="140"/>
-      </w:pPr>
-      <w:r>
-        <w:rPr>
-          <w:sz w:val="22"/>
-          <w:szCs w:val="22"/>
-        </w:rPr>
-        <w:t xml:space="preserve">Programmieren lernt man am besten, indem man etwas baut, das Spass macht. Genau das ist der Plan. Und das Beste: die Grafik – Raumschiff, Gegner, Schüsse – zeichnest du selbst im mitgelieferten Pixel-Editor.</w:t>
+        <w:t xml:space="preserve">Dieses Buch nimmt dich an die Hand und baut mit dir gemeinsam ein komplettes Arcade-Spiel – einen Klon des Klassikers Galaga. Und mit „komplett“ meine ich komplett: kein abgespecktes Spielzeug-Beispiel, an dessen Ende du dich fragst, wo denn nun das eigentliche Spiel geblieben ist, sondern etwas, das man tatsächlich spielen, verlieren und genervt-aber-glücklich noch einmal von vorne starten will.</w:t>
+      </w:r>
+    </w:p>
+    <w:p>
+      <w:pPr>
+        <w:spacing w:after="140"/>
+      </w:pPr>
+      <w:r>
+        <w:rPr>
+          <w:sz w:val="22"/>
+          <w:szCs w:val="22"/>
+        </w:rPr>
+        <w:t xml:space="preserve">Du brauchst dafür keinerlei Vorkenntnisse. Wirklich keine. Wenn du weißt, wie man einen Computer einschaltet und Text eintippt, bist du qualifiziert. Alles andere bauen wir gemeinsam auf – Stein für Stein, oder besser gesagt: Pixel für Pixel.</w:t>
+      </w:r>
+    </w:p>
+    <w:p>
+      <w:pPr>
+        <w:spacing w:after="140"/>
+      </w:pPr>
+      <w:r>
+        <w:rPr>
+          <w:sz w:val="22"/>
+          <w:szCs w:val="22"/>
+        </w:rPr>
+        <w:t xml:space="preserve">Der Trick dabei ist, dass wir nie auf den großen Knall am Ende warten. Jedes Kapitel fügt ein kleines, sofort sichtbares Stück hinzu: erst ein Fenster, dann ein scrollender Sternenhimmel, dann ein Raumschiff, das auf deine Tasten hört, dann Schüsse, Gegner, geschwungene Einflug-Manöver, Sturzangriffe, Bomben. Am Ende hast du ein richtiges Spiel mit Highscore-Liste, Sound und Effekten – aber schon nach Kapitel 1 läuft etwas, das sich gut anfühlt.</w:t>
+      </w:r>
+    </w:p>
+    <w:p>
+      <w:pPr>
+        <w:spacing w:after="140"/>
+      </w:pPr>
+      <w:r>
+        <w:rPr>
+          <w:sz w:val="22"/>
+          <w:szCs w:val="22"/>
+        </w:rPr>
+        <w:t xml:space="preserve">Programmieren lernt man nämlich am besten, indem man etwas baut, das Spaß macht. Lehrbücher, die einem zur Begrüßung beibringen, wie man die Zahlen von 1 bis 10 untereinander ausdruckt, haben schon so manchen begeisterten Anfänger in einen gelangweilten Aussteiger verwandelt. Das passiert uns hier nicht.</w:t>
+      </w:r>
+    </w:p>
+    <w:p>
+      <w:pPr>
+        <w:spacing w:after="140"/>
+      </w:pPr>
+      <w:r>
+        <w:rPr>
+          <w:sz w:val="22"/>
+          <w:szCs w:val="22"/>
+        </w:rPr>
+        <w:t xml:space="preserve">Und das Beste kommt noch: Die Grafik – Raumschiff, Gegner, Schüsse, Bomben – zeichnest du selbst, mit einem Pixel-Editor, der gleich mitgeliefert wird. Dein Spiel wird also nicht irgendein Spiel sein, sondern ganz und gar deins. Wenn dein Raumschiff am Ende aussieht wie eine fliegende Bratwurst, dann ist das eine bewusste künstlerische Entscheidung, und niemand darf dir widersprechen.</w:t>
       </w:r>
     </w:p>
     <w:tbl>
@@ -226,7 +361,7 @@
                 <w:sz w:val="22"/>
                 <w:szCs w:val="22"/>
               </w:rPr>
-              <w:t xml:space="preserve">Tippe die Beispiele selbst ab und starte sie sofort. Jeder Codeschnipsel läuft für sich. Fehler sind normal – GameBasic sagt dir in klaren Worten, was los ist.</w:t>
+              <w:t xml:space="preserve">Tippe die Beispiele selbst ab und starte sie sofort – nicht erst am Ende des Kapitels, sondern zwischendurch immer wieder. Jeder Codeschnipsel läuft für sich. Und keine Sorge vor Fehlern: Die gehören dazu wie das Salz in die Suppe. GameBasic sagt dir in klaren, ganzen Sätzen, was es nicht verstanden hat – meistens hast du nur einen Buchstaben vertippt.</w:t>
             </w:r>
           </w:p>
         </w:tc>
@@ -253,7 +388,19 @@
           <w:sz w:val="22"/>
           <w:szCs w:val="22"/>
         </w:rPr>
-        <w:t xml:space="preserve">GameBasic ist eine Programmiersprache aus der BASIC-Familie – also eine Sprache, die bewusst leicht lesbar ist und sich fast wie englische Sätze liest. Sie wurde von Grund auf für Spiele gemacht: Grafik, Sound, Eingabe und Spielablauf sind direkt eingebaut, ohne dass du erst komplizierte Bibliotheken zusammensuchen musst.</w:t>
+        <w:t xml:space="preserve">GameBasic ist eine Programmiersprache aus der ehrwürdigen BASIC-Familie. BASIC steht für „Beginner's All-purpose Symbolic Instruction Code“ – ein etwas sperriger Name für eine erstaunlich freundliche Idee: eine Sprache, die bewusst so leicht lesbar ist, dass sie sich fast wie englische Sätze liest. Generationen von Programmierern haben in den achtziger Jahren auf Heimcomputern mit BASIC angefangen, und viele von ihnen erinnern sich bis heute mit feuchten Augen daran.</w:t>
+      </w:r>
+    </w:p>
+    <w:p>
+      <w:pPr>
+        <w:spacing w:after="140"/>
+      </w:pPr>
+      <w:r>
+        <w:rPr>
+          <w:sz w:val="22"/>
+          <w:szCs w:val="22"/>
+        </w:rPr>
+        <w:t xml:space="preserve">GameBasic nimmt diese alte, gute Idee und schleppt sie ins 21. Jahrhundert. Es ist von Grund auf für Spiele gemacht: Grafik, Sound, Eingabe und Spielablauf sind direkt eingebaut. Du musst dir nicht erst aus dem halben Internet Bibliotheken zusammensuchen, von denen die Hälfte nicht zusammenpasst und die andere Hälfte seit drei Jahren nicht mehr gepflegt wird. Du schreibst SCREEN, und ein Fenster geht auf. So soll es sein.</w:t>
       </w:r>
     </w:p>
     <w:p>
@@ -377,7 +524,7 @@
           <w:sz w:val="22"/>
           <w:szCs w:val="22"/>
         </w:rPr>
-        <w:t xml:space="preserve">Ein winziges Programm sieht zum Beispiel so aus:</w:t>
+        <w:t xml:space="preserve">Genug der Theorie – schau dir an, wie wenig nötig ist, um etwas auf den Bildschirm zu bringen. Das hier ist ein vollständiges, lauffähiges GameBasic-Programm:</w:t>
       </w:r>
     </w:p>
     <w:p>
@@ -423,6 +570,18 @@
     </w:p>
     <w:p>
       <w:pPr>
+        <w:spacing w:after="140"/>
+      </w:pPr>
+      <w:r>
+        <w:rPr>
+          <w:sz w:val="22"/>
+          <w:szCs w:val="22"/>
+        </w:rPr>
+        <w:t xml:space="preserve">Drei Zeilen. Die erste öffnet ein Fenster, die zweite schreibt in leuchtendem Gelb „Hallo Welt!“ hinein, die dritte zeigt das Ergebnis an. Man muss kein Hellseher sein, um zu erraten, was hier passiert – und genau das ist der Punkt. In manch anderer Programmiersprache wäre dasselbe „Hallo Welt“ eine kleine Expedition mit Zwischenlager und Sherpa gewesen.</w:t>
+      </w:r>
+    </w:p>
+    <w:p>
+      <w:pPr>
         <w:pStyle w:val="Heading1"/>
         <w:pBdr>
           <w:bottom w:val="single" w:color="1B6CA8" w:sz="12" w:space="4"/>
@@ -442,7 +601,19 @@
           <w:sz w:val="22"/>
           <w:szCs w:val="22"/>
         </w:rPr>
-        <w:t xml:space="preserve">Erstaunlich viel – weit mehr, als wir für unser Galaga-Spiel brauchen. Ein kleiner Vorgeschmack:</w:t>
+        <w:t xml:space="preserve">Erstaunlich viel – ehrlich gesagt weit mehr, als wir für unser bescheidenes Galaga-Spiel jemals brauchen werden. Das ist ein bisschen so, als würde man den Führerschein in einem Sportwagen machen: Wir nutzen längst nicht jede Pferdestärke, aber es ist beruhigend zu wissen, dass sie da ist, falls dich später der Ehrgeiz packt.</w:t>
+      </w:r>
+    </w:p>
+    <w:p>
+      <w:pPr>
+        <w:spacing w:after="140"/>
+      </w:pPr>
+      <w:r>
+        <w:rPr>
+          <w:sz w:val="22"/>
+          <w:szCs w:val="22"/>
+        </w:rPr>
+        <w:t xml:space="preserve">Ein kleiner Vorgeschmack, was alles eingebaut ist:</w:t>
       </w:r>
     </w:p>
     <w:p>
@@ -806,7 +977,31 @@
           <w:sz w:val="22"/>
           <w:szCs w:val="22"/>
         </w:rPr>
-        <w:t xml:space="preserve">Galaga ist einer der berühmtesten Arcade-Shooter: unten steuerst du ein Raumschiff, oben schwebt eine Formation bunter Gegner, die in geschwungenen Bahnen einfliegen, herabstürzen und Bomben werfen. Genau dieses Gefühl bauen wir nach – mit allem Drum und Dran.</w:t>
+        <w:t xml:space="preserve">Im Jahr 1981 stellte die Firma Namco einen Spielautomaten in die Hallen, der die Welt im Sturm eroberte: Galaga. Wer alt genug ist, hat dafür echte Münzen geopfert; wer es nicht ist, kennt es spätestens als das Spiel, das in Filmen immer dann im Hintergrund flimmert, wenn jemand cool sein soll. Es ist einer der berühmtesten Arcade-Shooter überhaupt – und das aus gutem Grund.</w:t>
+      </w:r>
+    </w:p>
+    <w:p>
+      <w:pPr>
+        <w:spacing w:after="140"/>
+      </w:pPr>
+      <w:r>
+        <w:rPr>
+          <w:sz w:val="22"/>
+          <w:szCs w:val="22"/>
+        </w:rPr>
+        <w:t xml:space="preserve">Das Prinzip ist herrlich einfach: Unten steuerst du ein einzelnes Raumschiff, das nur nach links und rechts darf. Oben schwebt eine Formation bunter Gegner. Sie bleiben aber nicht brav oben sitzen – sie fliegen in eleganten, geschwungenen Bahnen ein, lösen sich einzeln aus der Reihe, stürzen auf dich herab und werfen Bomben. Du wiederum schießt nach oben und versuchst, am Leben zu bleiben. Klingt nach wenig, ist aber genau die richtige Mischung aus „eigentlich schaffe ich das“ und „verflixt, noch ein Versuch“.</w:t>
+      </w:r>
+    </w:p>
+    <w:p>
+      <w:pPr>
+        <w:spacing w:after="140"/>
+      </w:pPr>
+      <w:r>
+        <w:rPr>
+          <w:sz w:val="22"/>
+          <w:szCs w:val="22"/>
+        </w:rPr>
+        <w:t xml:space="preserve">Genau dieses Gefühl bauen wir nach – mit allem Drum und Dran. Und keine Sorge: Wir verletzen dabei keine Urheberrechte. Wir kopieren nicht das Original, wir lernen aus seinem Aufbau und bauen unsere eigene Variante, mit unseren eigenen Grafiken und unseren eigenen Tönen.</w:t>
       </w:r>
     </w:p>
     <w:p>
@@ -1173,7 +1368,19 @@
           <w:sz w:val="22"/>
           <w:szCs w:val="22"/>
         </w:rPr>
-        <w:t xml:space="preserve">Wir bauen das Spiel in kleinen, lauffähigen Schritten. Nach jedem Kapitel hast du etwas, das du sofort starten und ausprobieren kannst – und das Lust auf das nächste Kapitel macht.</w:t>
+        <w:t xml:space="preserve">Wir bauen das Spiel in kleinen, lauffähigen Schritten. Das ist Absicht und kein Zufall: Nichts ist demotivierender, als hundert Zeilen Code abzutippen, am Ende auf „Start“ zu drücken und dann nur eine Fehlermeldung zu ernten, ohne die geringste Ahnung, welche der hundert Zeilen die Schuldige ist.</w:t>
+      </w:r>
+    </w:p>
+    <w:p>
+      <w:pPr>
+        <w:spacing w:after="140"/>
+      </w:pPr>
+      <w:r>
+        <w:rPr>
+          <w:sz w:val="22"/>
+          <w:szCs w:val="22"/>
+        </w:rPr>
+        <w:t xml:space="preserve">Deshalb hat jedes Kapitel ein klares, sichtbares Ziel. Nach jedem Kapitel hast du etwas, das du sofort starten und ausprobieren kannst – und das dir Lust auf das nächste Kapitel macht. Der grobe Fahrplan sieht so aus:</w:t>
       </w:r>
     </w:p>
     <w:p>
@@ -1482,7 +1689,7 @@
           <w:sz w:val="22"/>
           <w:szCs w:val="22"/>
         </w:rPr>
-        <w:t xml:space="preserve">Jedes Spiel braucht ein Fenster. In GameBasic genügt dafür eine einzige Zeile:</w:t>
+        <w:t xml:space="preserve">Jedes Spiel braucht eine Bühne, und auf dem Computer ist diese Bühne ein Fenster. Bevor irgendetwas gezeichnet, bewegt oder abgeschossen werden kann, muss dieses Fenster da sein. In manchen Sprachen ist das der Moment, in dem Anfänger zum ersten Mal aufgeben. In GameBasic ist es eine einzige Zeile:</w:t>
       </w:r>
     </w:p>
     <w:p>
@@ -1561,7 +1768,31 @@
           <w:sz w:val="22"/>
           <w:szCs w:val="22"/>
         </w:rPr>
-        <w:t xml:space="preserve">Ein Spiel steht nie still: viele Male pro Sekunde wird das Bild neu gezeichnet und angezeigt. Das erledigt eine Schleife, die so lange läuft, bis du das Fenster schliesst:</w:t>
+        <w:t xml:space="preserve">Jetzt kommt die wichtigste Idee in diesem ganzen Buch – wenn du nur eine Sache mitnimmst, dann diese. Ein Spiel steht nämlich nie still. Selbst wenn auf dem Bildschirm scheinbar nichts passiert, arbeitet das Spiel im Hintergrund pausenlos weiter: Es fragt die Tastatur ab, bewegt die Sterne, prüft auf Zusammenstöße und zeichnet alles neu. Und zwar viele Male pro Sekunde – flüssige 60 Mal sind das Ziel.</w:t>
+      </w:r>
+    </w:p>
+    <w:p>
+      <w:pPr>
+        <w:spacing w:after="140"/>
+      </w:pPr>
+      <w:r>
+        <w:rPr>
+          <w:sz w:val="22"/>
+          <w:szCs w:val="22"/>
+        </w:rPr>
+        <w:t xml:space="preserve">Ein Film besteht aus vielen Einzelbildern, die so schnell hintereinander gezeigt werden, dass unser Auge eine Bewegung sieht. Bei einem Spiel ist es genau dasselbe – nur dass jedes Einzelbild nicht vorher aufgenommen, sondern in dem Augenblick frisch berechnet wird. Ein solches Einzelbild nennt man auf Englisch einen Frame, und dieses Wort wird uns im ganzen Buch begleiten.</w:t>
+      </w:r>
+    </w:p>
+    <w:p>
+      <w:pPr>
+        <w:spacing w:after="140"/>
+      </w:pPr>
+      <w:r>
+        <w:rPr>
+          <w:sz w:val="22"/>
+          <w:szCs w:val="22"/>
+        </w:rPr>
+        <w:t xml:space="preserve">Das Herzstück, das diese Bilder am Fließband produziert, ist die sogenannte Spielschleife. „Schleife“ heißt: etwas wird immer und immer wieder gemacht. Unsere Schleife läuft so lange, bis du das Fenster schließt:</w:t>
       </w:r>
     </w:p>
     <w:p>
@@ -1698,7 +1929,19 @@
           <w:sz w:val="22"/>
           <w:szCs w:val="22"/>
         </w:rPr>
-        <w:t xml:space="preserve">Am Anfang jedes Durchlaufs wischen wir das alte Bild weg – mit </w:t>
+        <w:t xml:space="preserve">Bevor wir ein neues Bild malen, müssen wir das alte loswerden. Täten wir das nicht, würde sich jeder Frame über den vorigen legen, und nach einer Sekunde wäre der Bildschirm ein einziges Schmierbild aus übereinander gepinselten Sternen. Stell es dir vor wie eine Tafel: Bevor der Lehrer etwas Neues anschreibt, wischt er erst einmal das Alte weg.</w:t>
+      </w:r>
+    </w:p>
+    <w:p>
+      <w:pPr>
+        <w:spacing w:after="140"/>
+      </w:pPr>
+      <w:r>
+        <w:rPr>
+          <w:sz w:val="22"/>
+          <w:szCs w:val="22"/>
+        </w:rPr>
+        <w:t xml:space="preserve">Genau das macht </w:t>
       </w:r>
       <w:r>
         <w:rPr>
@@ -1713,7 +1956,7 @@
           <w:sz w:val="22"/>
           <w:szCs w:val="22"/>
         </w:rPr>
-        <w:t xml:space="preserve"> (engl. „clear screen“) und einer Farbe:</w:t>
+        <w:t xml:space="preserve"> – die Abkürzung steht für das englische „clear screen“. Wir übergeben gleich noch eine Farbe, mit der der ganze Bildschirm gefüllt wird:</w:t>
       </w:r>
     </w:p>
     <w:p>
@@ -1793,7 +2036,19 @@
           <w:sz w:val="22"/>
           <w:szCs w:val="22"/>
         </w:rPr>
-        <w:t xml:space="preserve">Sterne sind einfach viele leuchtende Punkte. Wir merken uns ihre Positionen in zwei Listen (sogenannten Arrays) – eine für x, eine für y – und verteilen sie zu Beginn zufällig:</w:t>
+        <w:t xml:space="preserve">Ein leeres dunkelblaues Fenster ist ein guter Anfang, aber niemand würde dafür eine Münze in den Automaten werfen. Geben wir dem All also ein paar Sterne. Das Schöne daran: Sterne sind das einfachste Spielelement überhaupt – einfach viele leuchtende Punkte. Wenn du Sterne hinbekommst, bekommst du später auch Schüsse, Bomben und Explosionen hin, denn im Grunde sind das alles nur Punkte, die sich bewegen und gelegentlich gegen etwas stoßen.</w:t>
+      </w:r>
+    </w:p>
+    <w:p>
+      <w:pPr>
+        <w:spacing w:after="140"/>
+      </w:pPr>
+      <w:r>
+        <w:rPr>
+          <w:sz w:val="22"/>
+          <w:szCs w:val="22"/>
+        </w:rPr>
+        <w:t xml:space="preserve">Wir wollen viele Sterne, sagen wir sechzig. Sechzig einzelne Variablen anzulegen wäre allerdings eine Strafarbeit. Stattdessen nehmen wir eine Liste – im Fachjargon ein Array. Ein Array ist wie ein Setzkasten mit nummerierten Fächern: Fach 0, Fach 1, Fach 2 und so weiter. Wir merken uns die Positionen der Sterne in zwei solchen Listen – eine für die x-Koordinate, eine für die y-Koordinate – und verteilen sie zu Beginn zufällig über den Himmel:</w:t>
       </w:r>
     </w:p>
     <w:p>
@@ -2630,7 +2885,19 @@
           <w:sz w:val="22"/>
           <w:szCs w:val="22"/>
         </w:rPr>
-        <w:t xml:space="preserve">Das Raumschiff ist ein kleines Bild (ein „Sprite“). Im nächsten Kapitel zeichnest du es selbst – fürs Erste nehmen wir das mitgelieferte. Ein Bild laden wir mit LOADIMAGE und merken es uns in einer Variablen vom Typ IMAGE:</w:t>
+        <w:t xml:space="preserve">Ein Weltraum ohne Held ist nur Tapete. Höchste Zeit für unser Raumschiff. Das Raumschiff ist ein kleines Bild – im Spielejargon ein „Sprite“. Das Wort stammt übrigens von den geisterhaften Lichtgestalten alter englischer Sagen; bei uns ist es schlicht eine kleine Grafik, die sich frei über den Bildschirm bewegt.</w:t>
+      </w:r>
+    </w:p>
+    <w:p>
+      <w:pPr>
+        <w:spacing w:after="140"/>
+      </w:pPr>
+      <w:r>
+        <w:rPr>
+          <w:sz w:val="22"/>
+          <w:szCs w:val="22"/>
+        </w:rPr>
+        <w:t xml:space="preserve">Im nächsten Kapitel zeichnest du dein Schiff höchstpersönlich. Fürs Erste nehmen wir aber das mitgelieferte – damit du dich ganz auf das Programmieren konzentrieren kannst und nicht gleichzeitig auch noch Künstler sein musst. Ein Bild laden wir mit dem Befehl LOADIMAGE und merken es uns in einer Variablen vom Typ IMAGE:</w:t>
       </w:r>
     </w:p>
     <w:p>
@@ -2778,7 +3045,19 @@
           <w:sz w:val="22"/>
           <w:szCs w:val="22"/>
         </w:rPr>
-        <w:t xml:space="preserve">Wo soll das Schiff stehen? Wir merken uns seine Position in zwei Variablen und starten unten in der Mitte. Gezeichnet wird mit DRAWIMAGE:</w:t>
+        <w:t xml:space="preserve">Ein geladenes Bild allein sieht man noch nicht – es liegt sozusagen im Hangar und wartet. Wir müssen GameBasic noch sagen, wo auf dem Bildschirm es erscheinen soll. Dafür braucht das Schiff eine Position, und eine Position sind schlicht zwei Zahlen: wie weit rechts (x) und wie weit unten (y).</w:t>
+      </w:r>
+    </w:p>
+    <w:p>
+      <w:pPr>
+        <w:spacing w:after="140"/>
+      </w:pPr>
+      <w:r>
+        <w:rPr>
+          <w:sz w:val="22"/>
+          <w:szCs w:val="22"/>
+        </w:rPr>
+        <w:t xml:space="preserve">Ein kleiner, aber wichtiger Hinweis, der viele Anfänger anfangs stolpern lässt: Am Computer wächst die y-Achse nach unten. Oben ist klein, unten ist groß. Das fühlt sich verkehrt herum an, ist aber überall so. Unser Schiff gehört nach unten in die Mitte, also nehmen wir ein kleines x und ein großes y. Gezeichnet wird dann mit DRAWIMAGE:</w:t>
       </w:r>
     </w:p>
     <w:p>
@@ -3030,7 +3309,19 @@
           <w:sz w:val="22"/>
           <w:szCs w:val="22"/>
         </w:rPr>
-        <w:t xml:space="preserve">Ohne Grenzen würde das Schiff aus dem Bild fliegen. Zwei kurze Prüfungen halten es im Fenster:</w:t>
+        <w:t xml:space="preserve">Probiere ruhig einmal aus, das Schiff ganz nach rechts zu fahren. Es verschwindet seelenruhig aus dem Fenster und denkt gar nicht daran, zurückzukommen – Computer nehmen Anweisungen eben wörtlich. Wir haben gesagt „bei jedem Tastendruck vier Pixel weiter“, und genau das tut es, bis in alle Ewigkeit.</w:t>
+      </w:r>
+    </w:p>
+    <w:p>
+      <w:pPr>
+        <w:spacing w:after="140"/>
+      </w:pPr>
+      <w:r>
+        <w:rPr>
+          <w:sz w:val="22"/>
+          <w:szCs w:val="22"/>
+        </w:rPr>
+        <w:t xml:space="preserve">Wir müssen dem Schiff also Grenzen setzen, so wie man einem übermütigen Hund einen Zaun spendiert. Zwei kurze Prüfungen genügen, und das Schiff bleibt brav im Fenster:</w:t>
       </w:r>
     </w:p>
     <w:p>
@@ -3724,7 +4015,19 @@
           <w:sz w:val="22"/>
           <w:szCs w:val="22"/>
         </w:rPr>
-        <w:t xml:space="preserve">Ein Sprite ist ein kleines Bild aus einzelnen farbigen Pixeln – wie kariertes Papier, bei dem jedes Kästchen eine Farbe bekommt. Unser Schiff ist nur 16 × 16 Pixel gross. Stark vergrössert sieht man die einzelnen Pixel deutlich:</w:t>
+        <w:t xml:space="preserve">Dieses Kapitel ist eine kleine Verschnaufpause vom Programmieren – wir tauschen die Tastatur kurz gegen den Pinsel. Wer es eilig hat und sofort weiterprogrammieren will, darf das ganze Kapitel überspringen und einfach die fertigen Sprites aus dem Projekt benutzen. Aber unter uns: Selbst zu zeichnen macht riesigen Spaß, und es ist der Moment, in dem aus „irgendeinem Spiel“ dein Spiel wird.</w:t>
+      </w:r>
+    </w:p>
+    <w:p>
+      <w:pPr>
+        <w:spacing w:after="140"/>
+      </w:pPr>
+      <w:r>
+        <w:rPr>
+          <w:sz w:val="22"/>
+          <w:szCs w:val="22"/>
+        </w:rPr>
+        <w:t xml:space="preserve">Ein Sprite ist ein kleines Bild aus einzelnen farbigen Pixeln. Stell dir kariertes Papier vor, bei dem jedes Kästchen genau eine Farbe bekommt – mehr ist es nicht. Das klingt nach wenig, aber die gesamte goldene Ära der Videospiele wurde aus genau solchen Kästchen gebaut. Unser Schiff ist gerade einmal 16 × 16 Pixel groß; das sind 256 Kästchen, mit denen man erstaunlich viel anstellen kann. Stark vergrößert sieht man die einzelnen Pixel ganz deutlich:</w:t>
       </w:r>
     </w:p>
     <w:p>
@@ -4172,7 +4475,19 @@
           <w:sz w:val="22"/>
           <w:szCs w:val="22"/>
         </w:rPr>
-        <w:t xml:space="preserve">Ein Gegner wirkt lebendig, wenn er mit den Flügeln schlägt. Dafür zeichnest du mehrere Einzelbilder, sogenannte Frames, und das Spiel zeigt sie schnell nacheinander. Unser Gegner braucht nur zwei Frames – Flügel oben, Flügel unten:</w:t>
+        <w:t xml:space="preserve">Ein Gegner, der nur starr im Raum hängt, wirkt wie ein ausgestopftes Tier im Museum – korrekt, aber leblos. Lebendig wird er erst, wenn er mit den Flügeln schlägt. Und das Geheimnis hinter jeder Animation, vom Daumenkino bis zum Kinofilm, ist immer dasselbe: mehrere leicht unterschiedliche Einzelbilder, schnell hintereinander gezeigt.</w:t>
+      </w:r>
+    </w:p>
+    <w:p>
+      <w:pPr>
+        <w:spacing w:after="140"/>
+      </w:pPr>
+      <w:r>
+        <w:rPr>
+          <w:sz w:val="22"/>
+          <w:szCs w:val="22"/>
+        </w:rPr>
+        <w:t xml:space="preserve">Solche Einzelbilder heißen – du ahnst es bereits aus Kapitel 1 – Frames. Das Beruhigende: Unser Gegner braucht keine aufwändige Daumenkino-Sequenz, sondern nur zwei Frames. Flügel oben, Flügel unten. Im Wechsel gezeigt, ergibt das einen überzeugenden Flügelschlag, und dein Gehirn erledigt den Rest:</w:t>
       </w:r>
     </w:p>
     <w:p>
@@ -4712,7 +5027,31 @@
           <w:sz w:val="22"/>
           <w:szCs w:val="22"/>
         </w:rPr>
-        <w:t xml:space="preserve">Ein Schuss hat eine Position und fliegt, oder er fliegt gerade nicht. Statt ständig neue Schüsse zu erzeugen und wegzuwerfen, legen wir einen festen Vorrat an – einen Pool. Drei Listen beschreiben alle Schüsse zugleich:</w:t>
+        <w:t xml:space="preserve">Ein Raumschiff, das nicht schießen kann, ist in einem Shooter ungefähr so nützlich wie ein Regenschirm aus Papier. Höchste Zeit, das zu ändern. Aber halt – bevor wir wild Schüsse erzeugen, lohnt sich ein kurzer Gedanke darüber, wie wir sie verwalten.</w:t>
+      </w:r>
+    </w:p>
+    <w:p>
+      <w:pPr>
+        <w:spacing w:after="140"/>
+      </w:pPr>
+      <w:r>
+        <w:rPr>
+          <w:sz w:val="22"/>
+          <w:szCs w:val="22"/>
+        </w:rPr>
+        <w:t xml:space="preserve">Ein Schuss hat eine Position, und er ist in genau einem von zwei Zuständen: Entweder er fliegt gerade nach oben, oder er fliegt nicht. Eine naheliegende Idee wäre, bei jedem Tastendruck einen neuen Schuss zu erzeugen und ihn wegzuwerfen, sobald er oben aus dem Bild fliegt. Das funktioniert, aber das ständige Erzeugen und Wegwerfen kostet auf Dauer Kraft – ein bisschen so, als würde man für jedes Glas Wasser einen neuen Becher kaufen und den alten wegschmeißen.</w:t>
+      </w:r>
+    </w:p>
+    <w:p>
+      <w:pPr>
+        <w:spacing w:after="140"/>
+      </w:pPr>
+      <w:r>
+        <w:rPr>
+          <w:sz w:val="22"/>
+          <w:szCs w:val="22"/>
+        </w:rPr>
+        <w:t xml:space="preserve">Profis machen das anders, und du machst es ab jetzt auch: Wir legen einen festen Vorrat an wiederverwendbaren Schüssen an, einen sogenannten Pool. Stell dir einen Köcher mit fünf Pfeilen vor – ist ein Pfeil verschossen und gelandet, wandert er zurück in den Köcher und kann erneut benutzt werden. Drei Listen beschreiben alle fünf Schüsse zugleich:</w:t>
       </w:r>
     </w:p>
     <w:p>
@@ -4876,7 +5215,19 @@
           <w:sz w:val="22"/>
           <w:szCs w:val="22"/>
         </w:rPr>
-        <w:t xml:space="preserve">Beim Feuern suchen wir einen freien Platz im Pool und starten dort einen Schuss. Wichtig: Wir wollen nicht bei gehaltener Taste pausenlos schiessen, sondern einen Schuss pro Druck. Dafür merken wir uns, ob die Taste schon im Bild davor gedrückt war:</w:t>
+        <w:t xml:space="preserve">Beim Feuern suchen wir einen freien Platz im Köcher und starten dort einen Schuss. Klingt simpel, hat aber einen Haken, über den fast jeder einmal stolpert: Die Spielschleife läuft sechzig Mal pro Sekunde. Würden wir einfach „wenn Leertaste gedrückt, dann schieße“ schreiben, dann feuerte das Schiff bei gehaltener Taste sechzig Schüsse pro Sekunde – ein Wasserfall aus Geschossen, und der Köcher wäre im selben Wimpernschlag leer.</w:t>
+      </w:r>
+    </w:p>
+    <w:p>
+      <w:pPr>
+        <w:spacing w:after="140"/>
+      </w:pPr>
+      <w:r>
+        <w:rPr>
+          <w:sz w:val="22"/>
+          <w:szCs w:val="22"/>
+        </w:rPr>
+        <w:t xml:space="preserve">Was wir wollen, ist ein Schuss pro Tastendruck. Dafür müssen wir den Moment erwischen, in dem die Taste gerade eben heruntergeht – nicht die ganze Zeit, in der sie unten bleibt. Der Trick: Wir merken uns von einem Frame zum nächsten, ob die Taste schon vorher gedrückt war. Nur wenn sie jetzt gedrückt ist, vorher aber nicht, ist das ein frischer Tastendruck:</w:t>
       </w:r>
     </w:p>
     <w:p>
@@ -5061,7 +5412,7 @@
           <w:sz w:val="22"/>
           <w:szCs w:val="22"/>
         </w:rPr>
-        <w:t xml:space="preserve">Jeden Frame lassen wir alle fliegenden Schüsse nach oben wandern. Verlässt einer oben das Bild, wird sein Platz wieder frei:</w:t>
+        <w:t xml:space="preserve">Ein gestarteter Schuss soll natürlich nicht in der Luft hängen bleiben wie ein vergessener Luftballon. Jeden Frame lassen wir deshalb alle gerade fliegenden Schüsse ein Stück nach oben wandern. Und sobald einer oben aus dem Bild verschwindet, geben wir seinen Platz im Köcher wieder frei – damit er für den nächsten Schuss bereitsteht. Genau das macht den Pool so sparsam:</w:t>
       </w:r>
     </w:p>
     <w:p>
@@ -5986,7 +6337,19 @@
           <w:sz w:val="22"/>
           <w:szCs w:val="22"/>
         </w:rPr>
-        <w:t xml:space="preserve">Schau aus einem fahrenden Auto: Nahe Dinge sausen vorbei, ferne Berge ziehen langsam dahin. Dieser Effekt heisst Parallax – und er lässt flache Sterne räumlich wirken. Wir teilen unsere Sterne in drei Ebenen: fern (dunkel, langsam), mittel und nah (hell, schnell).</w:t>
+        <w:t xml:space="preserve">Unser Sternenhimmel aus Kapitel 1 tut brav seinen Dienst, aber ehrlich gesagt sieht er ein bisschen aus wie weiße Konfetti, die jemand gleichmäßig nach unten rieseln lässt. Echtes Weltall hat Tiefe – manche Sterne stehen gefühlt zum Greifen nah, andere unendlich weit weg. Diese Tiefe bekommen wir mit einem alten, billigen und wunderbar wirkungsvollen Trick.</w:t>
+      </w:r>
+    </w:p>
+    <w:p>
+      <w:pPr>
+        <w:spacing w:after="140"/>
+      </w:pPr>
+      <w:r>
+        <w:rPr>
+          <w:sz w:val="22"/>
+          <w:szCs w:val="22"/>
+        </w:rPr>
+        <w:t xml:space="preserve">Schau einmal aus dem Fenster eines fahrenden Autos: Der Leitpfosten direkt am Straßenrand saust vorbei, dass dir schwindlig wird, während die Berge am Horizont sich kaum von der Stelle rühren. Genau dieser Effekt heißt Parallax – und er ist der ganze Zaubertrick. Dinge, die schneller vorbeiziehen, nimmt unser Gehirn als näher wahr. Wir teilen unsere Sterne deshalb in drei Ebenen: fern (dunkel, langsam), mittel und nah (hell, schnell). Flache Punkte, plötzlich räumlich.</w:t>
       </w:r>
     </w:p>
     <w:p>
@@ -6793,6 +7156,18 @@
     </w:tbl>
     <w:p>
       <w:pPr>
+        <w:spacing w:after="140"/>
+      </w:pPr>
+      <w:r>
+        <w:rPr>
+          <w:sz w:val="22"/>
+          <w:szCs w:val="22"/>
+        </w:rPr>
+        <w:t xml:space="preserve">Bisher war unser Spiel eine recht einsame Angelegenheit: ein Schiff, ein paar Schüsse, viel leerer Raum. Das ändert sich jetzt schlagartig. Wir holen die Gegner ins Spiel – und nicht nur einen, sondern gleich vierundzwanzig auf einmal. Damit das nicht im Chaos endet, lernst du in diesem Kapitel ein Werkzeug kennen, das in der Programmierung allgegenwärtig ist: die Klasse.</w:t>
+      </w:r>
+    </w:p>
+    <w:p>
+      <w:pPr>
         <w:pStyle w:val="Heading2"/>
       </w:pPr>
       <w:r>
@@ -6808,7 +7183,19 @@
           <w:sz w:val="22"/>
           <w:szCs w:val="22"/>
         </w:rPr>
-        <w:t xml:space="preserve">Alle Gegner sind gleich aufgebaut: jeder hat eine Position, eine Reihe (sie bestimmt die Farbe) und einen Zustand (lebt er noch?). Statt für jeden einzelne Variablen zu schreiben, beschreiben wir einmal den Bauplan – eine Klasse:</w:t>
+        <w:t xml:space="preserve">Schauen wir uns einen einzelnen Gegner an. Was muss er über sich wissen? Wo er steht (seine Position), in welcher Reihe er sitzt (das bestimmt seine Farbe) und ob er überhaupt noch lebt. Bei einem Gegner wären das drei, vier Variablen – kein Problem. Aber bei vierundzwanzig Gegnern bräuchten wir fast hundert einzeln benannte Variablen. Spätestens bei shipPositionVonGegnerNummerSiebzehn würde uns die Lust vergehen.</w:t>
+      </w:r>
+    </w:p>
+    <w:p>
+      <w:pPr>
+        <w:spacing w:after="140"/>
+      </w:pPr>
+      <w:r>
+        <w:rPr>
+          <w:sz w:val="22"/>
+          <w:szCs w:val="22"/>
+        </w:rPr>
+        <w:t xml:space="preserve">Viel klüger ist es, einmal den Bauplan eines Gegners zu beschreiben und GameBasic dann zu sagen: „Mach mir bitte vierundzwanzig davon.“ Genau das ist eine Klasse – ein Bauplan für gleichartige Dinge:</w:t>
       </w:r>
     </w:p>
     <w:p>
@@ -7029,7 +7416,19 @@
           <w:sz w:val="22"/>
           <w:szCs w:val="22"/>
         </w:rPr>
-        <w:t xml:space="preserve">24 Gegner = 3 Reihen × 8 Spalten. Wir legen ein Array von Bug-Objekten an und erzeugen sie in einer Schleife. Aus der Laufnummer i berechnen wir Spalte und Reihe:</w:t>
+        <w:t xml:space="preserve">Vierundzwanzig Gegner ordnen wir nicht wild durcheinander an, sondern ordentlich im Raster: 3 Reihen mal 8 Spalten. Das sieht nicht nur militärisch-bedrohlich aus, es macht uns auch das Leben leichter. Wir legen ein Array von Bug-Objekten an und erzeugen die Gegner in einer einzigen Schleife.</w:t>
+      </w:r>
+    </w:p>
+    <w:p>
+      <w:pPr>
+        <w:spacing w:after="140"/>
+      </w:pPr>
+      <w:r>
+        <w:rPr>
+          <w:sz w:val="22"/>
+          <w:szCs w:val="22"/>
+        </w:rPr>
+        <w:t xml:space="preserve">Jetzt kommt ein kleiner Rechentrick, der dir noch oft begegnen wird. Die Schleife zählt schlicht von 0 bis 23 hoch – eine einzige Laufnummer. Daraus müssen wir für jeden Gegner Spalte und Reihe herausfischen. Zwei alte Bekannte aus dem Mathematikunterricht helfen dabei: der Rest beim Teilen und die Ganzzahl-Division.</w:t>
       </w:r>
     </w:p>
     <w:p>
@@ -7756,7 +8155,31 @@
           <w:sz w:val="22"/>
           <w:szCs w:val="22"/>
         </w:rPr>
-        <w:t xml:space="preserve">Eine gerade Linie ist langweilig. Schöne Kurven beschreibt man mit Bézier-Kurven: aus vier Punkten – Start, zwei „Zieh-Punkten“ für die Form und Ziel – entsteht eine weiche Bahn. GameBasic liefert sie fertig im curves-Modul:</w:t>
+        <w:t xml:space="preserve">Jetzt kommt der Moment, auf den dieses Buch insgeheim die ganze Zeit hingearbeitet hat. Eine Formation, die einfach von oben hereinschwebt, ist nett – aber das unverwechselbare Galaga-Gefühl entsteht erst durch die eleganten, geschwungenen Bahnen, in denen die Gegner hereingleiten, als hätten sie an einer Ballettschule für Außerirdische studiert.</w:t>
+      </w:r>
+    </w:p>
+    <w:p>
+      <w:pPr>
+        <w:spacing w:after="140"/>
+      </w:pPr>
+      <w:r>
+        <w:rPr>
+          <w:sz w:val="22"/>
+          <w:szCs w:val="22"/>
+        </w:rPr>
+        <w:t xml:space="preserve">Eine gerade Linie kriegt jeder hin – aber sie ist eben auch sterbenslangweilig. Schöne, weiche Kurven sind kniffliger. Zum Glück hat sich darüber schon jemand den Kopf zerbrochen: der französische Ingenieur Pierre Bézier, der in den sechziger Jahren bei Renault Karosserien entwarf und eine Methode brauchte, um geschwungene Bleche mathematisch zu beschreiben. Heraus kam die Bézier-Kurve, und sie steckt heute in fast jedem Schriftzeichen, jedem Logo und – ab jetzt – in unseren Gegnern.</w:t>
+      </w:r>
+    </w:p>
+    <w:p>
+      <w:pPr>
+        <w:spacing w:after="140"/>
+      </w:pPr>
+      <w:r>
+        <w:rPr>
+          <w:sz w:val="22"/>
+          <w:szCs w:val="22"/>
+        </w:rPr>
+        <w:t xml:space="preserve">Das Prinzip ist überraschend anschaulich: Aus vier Punkten – einem Start, einem Ziel und zwei „Zieh-Punkten“ dazwischen, die die Kurve in ihre Form locken – entsteht eine weiche Bahn. Man muss die Mathematik dahinter nicht verstehen, denn GameBasic liefert sie fix und fertig im curves-Modul:</w:t>
       </w:r>
     </w:p>
     <w:p>
@@ -8652,7 +9075,31 @@
           <w:sz w:val="22"/>
           <w:szCs w:val="22"/>
         </w:rPr>
-        <w:t xml:space="preserve">Ein Gegner ist immer in genau einem von drei Zuständen: Er fliegt ein (ENTER), schwebt in der Formation (FORM) oder stürzt gerade (DIVE). Statt unklarer Zahlen oder mehrerer Ja/Nein-Flags geben wir diesen Zuständen Namen – mit einem ENUM:</w:t>
+        <w:t xml:space="preserve">Bisher waren unsere Gegner brave Zeitgenossen: einfliegen, sich einreihen, schweben. Charmant, aber als Gegner taugen sie damit ungefähr so viel wie ein Wachhund, der jeden Einbrecher freudig begrüßt. Das ändern wir jetzt. Einzelne Gegner sollen sich aus der Formation lösen und im Sturzflug auf dich herabstoßen – und plötzlich wird aus dem hübschen Bildschirmschoner ein Spiel, bei dem man besser aufpasst.</w:t>
+      </w:r>
+    </w:p>
+    <w:p>
+      <w:pPr>
+        <w:spacing w:after="140"/>
+      </w:pPr>
+      <w:r>
+        <w:rPr>
+          <w:sz w:val="22"/>
+          <w:szCs w:val="22"/>
+        </w:rPr>
+        <w:t xml:space="preserve">Damit ein Gegner zwischen „einfliegen“, „schweben“ und „stürzen“ unterscheiden kann, muss er sich merken, was er gerade tut. Er ist immer in genau einem von drei Zuständen: Er fliegt ein (ENTER), schwebt in der Formation (FORM) oder stürzt gerade (DIVE). Man könnte das mit Zahlen lösen – 0 für einfliegen, 1 für schweben, 2 für stürzen – aber dann sitzt man drei Wochen später vor seinem eigenen Code und rätselt, was zum Henker „state = 2“ wohl bedeuten sollte.</w:t>
+      </w:r>
+    </w:p>
+    <w:p>
+      <w:pPr>
+        <w:spacing w:after="140"/>
+      </w:pPr>
+      <w:r>
+        <w:rPr>
+          <w:sz w:val="22"/>
+          <w:szCs w:val="22"/>
+        </w:rPr>
+        <w:t xml:space="preserve">Viel freundlicher ist es, den Zuständen richtige Namen zu geben. Genau dafür gibt es das ENUM – eine kurze Liste benannter Werte:</w:t>
       </w:r>
     </w:p>
     <w:p>
@@ -9572,6 +10019,18 @@
     </w:tbl>
     <w:p>
       <w:pPr>
+        <w:spacing w:after="140"/>
+      </w:pPr>
+      <w:r>
+        <w:rPr>
+          <w:sz w:val="22"/>
+          <w:szCs w:val="22"/>
+        </w:rPr>
+        <w:t xml:space="preserve">Bisher konnten die Gegner zwar bedrohlich auf dich herabstürzen, aber mehr auch nicht – im schlimmsten Fall rempeln sie dich an. In diesem Kapitel lernen sie eine fiese neue Fähigkeit: Sie werfen im Sturzflug Bomben ab, denen du ausweichen musst. Damit wird das Spiel zum ersten Mal richtig fordernd.</w:t>
+      </w:r>
+    </w:p>
+    <w:p>
+      <w:pPr>
         <w:pStyle w:val="Heading2"/>
       </w:pPr>
       <w:r>
@@ -9587,7 +10046,19 @@
           <w:sz w:val="22"/>
           <w:szCs w:val="22"/>
         </w:rPr>
-        <w:t xml:space="preserve">Bisher war </w:t>
+        <w:t xml:space="preserve">Bevor die Bomben fallen können, brauchen wir eine Antwort auf eine simple Frage: Wann genau soll ein Gegner abwerfen? Und diese Antwort muss von ihm zur Spielschleife wandern, denn der Gegner weiß, wann der richtige Moment ist – aber die Bomben werden außerhalb verwaltet.</w:t>
+      </w:r>
+    </w:p>
+    <w:p>
+      <w:pPr>
+        <w:spacing w:after="140"/>
+      </w:pPr>
+      <w:r>
+        <w:rPr>
+          <w:sz w:val="22"/>
+          <w:szCs w:val="22"/>
+        </w:rPr>
+        <w:t xml:space="preserve">Hier kommt ein neues Werkzeug ins Spiel. Bisher war </w:t>
       </w:r>
       <w:r>
         <w:rPr>
@@ -9602,7 +10073,7 @@
           <w:sz w:val="22"/>
           <w:szCs w:val="22"/>
         </w:rPr>
-        <w:t xml:space="preserve"> eine SUB – sie tut etwas, gibt aber nichts zurück. Eine </w:t>
+        <w:t xml:space="preserve"> eine SUB – sie tut etwas, gibt aber nichts zurück, wie ein fleißiger Helfer, der seine Arbeit erledigt und wortlos wieder geht. Eine </w:t>
       </w:r>
       <w:r>
         <w:rPr>
@@ -9617,7 +10088,7 @@
           <w:sz w:val="22"/>
           <w:szCs w:val="22"/>
         </w:rPr>
-        <w:t xml:space="preserve"> ist dasselbe, liefert aber ein Ergebnis mit </w:t>
+        <w:t xml:space="preserve"> ist im Grunde dasselbe, nur dass sie am Ende eine Antwort mitbringt – mit dem Schlüsselwort </w:t>
       </w:r>
       <w:r>
         <w:rPr>
@@ -9632,7 +10103,7 @@
           <w:sz w:val="22"/>
           <w:szCs w:val="22"/>
         </w:rPr>
-        <w:t xml:space="preserve">. Wir machen daraus eine FUNCTION, die </w:t>
+        <w:t xml:space="preserve">. Wir machen aus Update also eine FUNCTION, die </w:t>
       </w:r>
       <w:r>
         <w:rPr>
@@ -9647,7 +10118,22 @@
           <w:sz w:val="22"/>
           <w:szCs w:val="22"/>
         </w:rPr>
-        <w:t xml:space="preserve"> zurückgibt, wenn der Gegner gerade jetzt eine Bombe abwerfen soll:</w:t>
+        <w:t xml:space="preserve"> zurückmeldet, wenn der Gegner gerade jetzt eine Bombe abwerfen soll, und sonst </w:t>
+      </w:r>
+      <w:r>
+        <w:rPr>
+          <w:rFonts w:ascii="Consolas" w:cs="Consolas" w:eastAsia="Consolas" w:hAnsi="Consolas"/>
+          <w:sz w:val="21"/>
+          <w:szCs w:val="21"/>
+        </w:rPr>
+        <w:t xml:space="preserve">FALSE</w:t>
+      </w:r>
+      <w:r>
+        <w:rPr>
+          <w:sz w:val="22"/>
+          <w:szCs w:val="22"/>
+        </w:rPr>
+        <w:t xml:space="preserve">:</w:t>
       </w:r>
     </w:p>
     <w:p>
@@ -10520,6 +11006,18 @@
     </w:tbl>
     <w:p>
       <w:pPr>
+        <w:spacing w:after="140"/>
+      </w:pPr>
+      <w:r>
+        <w:rPr>
+          <w:sz w:val="22"/>
+          <w:szCs w:val="22"/>
+        </w:rPr>
+        <w:t xml:space="preserve">Wir haben jetzt fliegende Schüsse, einfliegende und stürzende Gegner, fallende Bomben – und bisher gleiten sie alle höflich aneinander vorbei, als wären sie auf einer sehr förmlichen Cocktailparty. Damit ist jetzt Schluss. In diesem Kapitel lernen die Dinge endlich, sich gegenseitig zu treffen. Das ist der Schritt, der aus einer hübschen Bewegung ein echtes Spiel macht.</w:t>
+      </w:r>
+    </w:p>
+    <w:p>
+      <w:pPr>
         <w:pStyle w:val="Heading2"/>
       </w:pPr>
       <w:r>
@@ -10535,7 +11033,19 @@
           <w:sz w:val="22"/>
           <w:szCs w:val="22"/>
         </w:rPr>
-        <w:t xml:space="preserve">Eine Kollision prüfen wir oft – für Schüsse, Bomben, das Schiff. Solchen wiederkehrenden Code packt man in eine eigene Funktion und gibt ihr einen Namen. Unsere Funktion prüft, ob sich zwei Rechtecke überlappen (AABB-Test):</w:t>
+        <w:t xml:space="preserve">Die Frage „berühren sich diese beiden Dinge?“ stellen wir im Spiel ununterbrochen: Trifft der Schuss den Gegner? Trifft die Bombe das Schiff? Rammt ein stürzender Gegner uns? Es wäre eine Qual, diese Prüfung jedes Mal aufs Neue auszuschreiben – und eine wunderbare Gelegenheit, Tippfehler einzubauen.</w:t>
+      </w:r>
+    </w:p>
+    <w:p>
+      <w:pPr>
+        <w:spacing w:after="140"/>
+      </w:pPr>
+      <w:r>
+        <w:rPr>
+          <w:sz w:val="22"/>
+          <w:szCs w:val="22"/>
+        </w:rPr>
+        <w:t xml:space="preserve">Deshalb tun wir, was Programmierer immer tun, wenn sie etwas öfter als einmal brauchen: Wir geben dem wiederkehrenden Code einen Namen und packen ihn in eine eigene Funktion. Einmal sauber geschrieben, einmal getestet, danach für immer verlässlich. Unsere Funktion prüft, ob sich zwei Rechtecke überlappen. Fachleute nennen das einen AABB-Test (für „achsenausgerichtete Begrenzungsrechtecke“ – ein furchteinflößender Name für eine harmlose Idee):</w:t>
       </w:r>
     </w:p>
     <w:p>
@@ -11480,7 +11990,19 @@
           <w:sz w:val="22"/>
           <w:szCs w:val="22"/>
         </w:rPr>
-        <w:t xml:space="preserve">Bisher lief alles in einem festen 480×640-Fenster. Auf einem grossen, breiten Monitor wäre echtes Vollbild schöner. Aber alle Positionen (Schiff, Sterne, Formation) rechnen mit 480×640 – die wollen wir nicht alle umstellen.</w:t>
+        <w:t xml:space="preserve">Unser Spiel ist mittlerweile richtig gut – aber es hockt noch immer in einem kleinen Fensterchen mitten auf dem Bildschirm, wie ein Konzertpianist, der darauf besteht, auf einem Spielzeugklavier zu spielen. Auf einem großen, breiten Monitor schreit das geradezu nach echtem Vollbild.</w:t>
+      </w:r>
+    </w:p>
+    <w:p>
+      <w:pPr>
+        <w:spacing w:after="140"/>
+      </w:pPr>
+      <w:r>
+        <w:rPr>
+          <w:sz w:val="22"/>
+          <w:szCs w:val="22"/>
+        </w:rPr>
+        <w:t xml:space="preserve">Hier lauert allerdings eine Falle, in die schon viele getappt sind. Unser gesamter Code rechnet mit einem festen Spielfeld von 480 × 640 Pixeln. Das Schiff, die Sterne, die Formation, jede Flugbahn, jede Kollision – alles verlässt sich auf diese Maße. Würden wir jetzt einfach das Fenster vergrößern, müssten wir streng genommen jede einzelne Zahl im ganzen Programm umrechnen. Das wäre fehleranfällig, mühsam und etwa so erfreulich wie eine Steuererklärung. Es muss eleganter gehen – und das tut es.</w:t>
       </w:r>
     </w:p>
     <w:p>
@@ -11500,7 +12022,19 @@
           <w:sz w:val="22"/>
           <w:szCs w:val="22"/>
         </w:rPr>
-        <w:t xml:space="preserve">Die Lösung: Das Spielfeld bleibt logisch 480×640. Wir öffnen ein grosses Fenster (oder Vollbild) und lassen die Kamera unser Spielfeld passend skalieren und zentrieren:</w:t>
+        <w:t xml:space="preserve">Die Lösung ist ein Gedanke, der in der Spieleentwicklung Gold wert ist: Wir trennen, wie groß das Spielfeld in unserem Kopf ist, davon, wie groß es auf dem Bildschirm erscheint. Das Spielfeld bleibt für unseren Code in alle Ewigkeit logisch 480 × 640 – daran ändert sich keine einzige Zeile. Wir öffnen aber ein großes Fenster (oder gleich Vollbild) und stellen davor eine Kamera, die unser kleines Spielfeld passend vergrößert und hübsch in die Mitte rückt.</w:t>
+      </w:r>
+    </w:p>
+    <w:p>
+      <w:pPr>
+        <w:spacing w:after="140"/>
+      </w:pPr>
+      <w:r>
+        <w:rPr>
+          <w:sz w:val="22"/>
+          <w:szCs w:val="22"/>
+        </w:rPr>
+        <w:t xml:space="preserve">Stell dir einen Diaprojektor vor: Das Dia ist winzig und unveränderlich, aber je nachdem, wie weit die Wand entfernt ist, erscheint das Bild handtellergroß oder riesig. Genau diese Rolle übernimmt die Kamera:</w:t>
       </w:r>
     </w:p>
     <w:p>
@@ -12107,6 +12641,18 @@
     </w:tbl>
     <w:p>
       <w:pPr>
+        <w:spacing w:after="140"/>
+      </w:pPr>
+      <w:r>
+        <w:rPr>
+          <w:sz w:val="22"/>
+          <w:szCs w:val="22"/>
+        </w:rPr>
+        <w:t xml:space="preserve">Unser Spiel ist vollständig spielbar – aber spiel es einmal mit geschlossenen Augen, und dir fällt sofort auf, was fehlt: Es ist mucksmäuschenstill. Ein Arcade-Spiel ohne Krach ist wie ein Gewitter ohne Donner. In diesem letzten Kapitel geben wir dem Spiel eine Stimme, mehrere Schwierigkeitsstufen und zeigen, wie du es an Freunde weitergibst.</w:t>
+      </w:r>
+    </w:p>
+    <w:p>
+      <w:pPr>
         <w:pStyle w:val="Heading2"/>
       </w:pPr>
       <w:r>
@@ -12122,7 +12668,19 @@
           <w:sz w:val="22"/>
           <w:szCs w:val="22"/>
         </w:rPr>
-        <w:t xml:space="preserve">Arcade-Sounds erzeugst du dir direkt im Code mit </w:t>
+        <w:t xml:space="preserve">Du könntest jetzt anfangen, im Internet nach Sounddateien zu jagen, dich durch Lizenzbedingungen zu wühlen und dir am Ende doch unsicher zu sein, ob du das „pew“ verwenden darfst. Musst du aber nicht. GameBasic hat einen kleinen Synthesizer eingebaut, der dir deine Arcade-Geräusche direkt aus Zahlen zaubert – ganz so, wie es die alten Spielautomaten auch gemacht haben.</w:t>
+      </w:r>
+    </w:p>
+    <w:p>
+      <w:pPr>
+        <w:spacing w:after="140"/>
+      </w:pPr>
+      <w:r>
+        <w:rPr>
+          <w:sz w:val="22"/>
+          <w:szCs w:val="22"/>
+        </w:rPr>
+        <w:t xml:space="preserve">Erzeugt werden diese Töne mit </w:t>
       </w:r>
       <w:r>
         <w:rPr>
@@ -12137,7 +12695,7 @@
           <w:sz w:val="22"/>
           <w:szCs w:val="22"/>
         </w:rPr>
-        <w:t xml:space="preserve"> (ein kleiner Synthesizer) und spielst sie mit </w:t>
+        <w:t xml:space="preserve"> – das ist der kleine Synthesizer – und abgespielt mit </w:t>
       </w:r>
       <w:r>
         <w:rPr>
@@ -12253,7 +12811,19 @@
           <w:sz w:val="22"/>
           <w:szCs w:val="22"/>
         </w:rPr>
-        <w:t xml:space="preserve">Ist die Formation leergeräumt, beginnt ein neues Level – mit etwas schnelleren Gegnern. Wir zählen die lebenden Gegner mit und bauen bei null eine neue Welle:</w:t>
+        <w:t xml:space="preserve">Ein Spiel, das nach der ersten geräumten Formation einfach aufhört, lässt den Spieler etwas ratlos zurück – so als würde ein Achterbahnzug nach der ersten Kurve anhalten. Wir wollen, dass es weitergeht, und zwar fordernder. Ist die Formation also leergeräumt, beginnt sofort ein neues Level, mit etwas flotteren Gegnern.</w:t>
+      </w:r>
+    </w:p>
+    <w:p>
+      <w:pPr>
+        <w:spacing w:after="140"/>
+      </w:pPr>
+      <w:r>
+        <w:rPr>
+          <w:sz w:val="22"/>
+          <w:szCs w:val="22"/>
+        </w:rPr>
+        <w:t xml:space="preserve">Damit wir merken, wann eine Welle besiegt ist, führen wir einen schlichten Zähler mit: Bei jedem Abschuss eins runter, und sobald er null erreicht, bauen wir eine frische Welle auf. Diese kleine Idee – mitzählen und beim Nulldurchgang reagieren – ist das Rückgrat fast jedes Fortschrittssystems in Spielen:</w:t>
       </w:r>
     </w:p>
     <w:p>
@@ -12413,7 +12983,7 @@
           <w:sz w:val="22"/>
           <w:szCs w:val="22"/>
         </w:rPr>
-        <w:t xml:space="preserve">Damit Freunde dein Spiel ohne GameBasic spielen können, exportierst du es als eigenständiges Programm:</w:t>
+        <w:t xml:space="preserve">Ein Spiel, das nur auf deinem eigenen Rechner und nur mit installiertem GameBasic läuft, ist ein bisschen wie ein selbstgebackener Kuchen, den man nicht aus der Küche tragen darf. Damit auch Freunde, Geschwister oder ahnungslose Verwandte dein Werk spielen können – ohne irgendetwas installieren zu müssen – exportierst du es als eigenständiges Programm:</w:t>
       </w:r>
     </w:p>
     <w:p>
@@ -12613,7 +13183,58 @@
           <w:sz w:val="22"/>
           <w:szCs w:val="22"/>
         </w:rPr>
-        <w:t xml:space="preserve">Du hast Schritt für Schritt ein echtes Arcade-Spiel gebaut – vom leeren Fenster bis zu einfliegenden, stürzenden, bombenwerfenden Gegnern mit Punkten, Leben und mehreren Leveln. Und ganz nebenbei hast du Variablen, Schleifen, Arrays, Klassen, Funktionen, Module und Zustands-Maschinen gelernt. Jetzt bist du dran: Bau es um, mach es zu deinem Spiel – und zeig es her. Viel Spass!</w:t>
+        <w:t xml:space="preserve">Halt einen Moment inne und sieh dir an, was du geschafft hast. Du hast bei einem komplett leeren schwarzen Fenster angefangen – und am Ende steht ein echtes Arcade-Spiel mit einfliegenden, stürzenden, bombenwerfenden Gegnern, mit Punkten, Leben, mehreren Leveln, Sound und Effekten. Das ist keine Kleinigkeit. Das ist genau das, was professionelle Spieleentwickler tun, nur eine Nummer kleiner.</w:t>
+      </w:r>
+    </w:p>
+    <w:p>
+      <w:pPr>
+        <w:spacing w:after="140"/>
+      </w:pPr>
+      <w:r>
+        <w:rPr>
+          <w:sz w:val="22"/>
+          <w:szCs w:val="22"/>
+        </w:rPr>
+        <w:t xml:space="preserve">Und das eigentlich Verblüffende: Ganz nebenbei, fast unbemerkt, hast du dabei das halbe Handwerk des Programmierens gelernt. Variablen und Schleifen, Arrays und Klassen, Funktionen und Module, Zustands-Maschinen und Kollisionsprüfungen – das sind keine Galaga-Spezialitäten, das sind die Bausteine, aus denen jede Software der Welt gebaut ist, vom Taschenrechner bis zur Raumfahrt. Du hast sie nicht auswendig gelernt, du hast sie benutzt. Das ist ein himmelweiter Unterschied.</w:t>
+      </w:r>
+    </w:p>
+    <w:p>
+      <w:pPr>
+        <w:spacing w:after="140"/>
+      </w:pPr>
+      <w:r>
+        <w:rPr>
+          <w:sz w:val="22"/>
+          <w:szCs w:val="22"/>
+        </w:rPr>
+        <w:t xml:space="preserve">Jetzt bist du dran. Verändere die Werte, bis sich das Spiel genau richtig anfühlt. Zeichne eigene Gegner. Erfinde eine neue Waffe, einen Endboss, ein zweites Spielfeld. Brich Dinge absichtlich, nur um zu sehen, was passiert – und repariere sie wieder. Genau so wird aus dem Spiel aus diesem Buch dein Spiel.</w:t>
+      </w:r>
+    </w:p>
+    <w:p>
+      <w:pPr>
+        <w:spacing w:after="140"/>
+      </w:pPr>
+      <w:r>
+        <w:rPr>
+          <w:sz w:val="22"/>
+          <w:szCs w:val="22"/>
+        </w:rPr>
+        <w:t xml:space="preserve">Es hat mir große Freude gemacht, dich auf diesem Weg zu begleiten. Wenn du dein fertiges Werk jemandem zeigst und derjenige fragt „Das hast du selbst gemacht?“, dann sag ruhig laut und deutlich: Ja. Habe ich. Viel Spaß beim Weiterbauen – und auf den nächsten Highscore.</w:t>
+      </w:r>
+    </w:p>
+    <w:p>
+      <w:pPr>
+        <w:spacing w:before="240"/>
+      </w:pPr>
+      <w:r>
+        <w:rPr>
+          <w:i/>
+          <w:iCs/>
+          <w:color w:val="6A6A6A"/>
+          <w:sz w:val="22"/>
+          <w:szCs w:val="22"/>
+        </w:rPr>
+        <w:t xml:space="preserve">— Hans Schnorrenberger</w:t>
       </w:r>
     </w:p>
     <w:sectPr>

</xml_diff>

<commit_message>
docs(buch-galaga): Inhaltsverzeichnis + "Warum so?"-Begruendungskaesten
- Echtes Inhaltsverzeichnis (Seite 2): Frontmatter + 12 Kapitel, Punkt-Leader,
  rechtsbuendige Seitenzahlen. Manuell statt Word-Feld -> sieht in Word,
  LibreOffice, PDF und Druck sofort korrekt aus (kein Feld-Update noetig).
- Seitenzahlen per Zwei-Pass-Build (make_book.py): bauen -> PDF rendern ->
  Ueberschrift-Seiten messen -> toc_pages.json -> neu bauen. Plain
  `node build_book.js` nutzt weiter den Cache toc_pages.json.
- Neue "Warum so?"-Kaesten (amber, vom blauen Tipp abgesetzt) in Kap 4/6/7/8/
  9/10/11: erklaeren die Design-Entscheidung (Object Pooling, Klasse statt
  paralleler Listen, Kontrollpunkte+Staffelung, State-Machine statt Flags,
  Aufgabenteilung, ausgelagerte Funktion+invuln, Modell/Darstellung trennen).
- 46 Seiten, 0 Leerseiten, docx valide.

Co-Authored-By: Claude Opus 4.8 <noreply@anthropic.com>
</commit_message>
<xml_diff>
--- a/buch-galaga/buch/GameBasic-Buch.docx
+++ b/buch-galaga/buch/GameBasic-Buch.docx
@@ -129,6 +129,569 @@
           <w:szCs w:val="26"/>
         </w:rPr>
         <w:t xml:space="preserve">von Hans Schnorrenberger</w:t>
+      </w:r>
+    </w:p>
+    <w:p>
+      <w:r>
+        <w:br w:type="page"/>
+      </w:r>
+    </w:p>
+    <w:p>
+      <w:pPr>
+        <w:pBdr>
+          <w:bottom w:val="single" w:color="1B6CA8" w:sz="12" w:space="4"/>
+        </w:pBdr>
+        <w:spacing w:after="220"/>
+      </w:pPr>
+      <w:r>
+        <w:rPr>
+          <w:b/>
+          <w:bCs/>
+          <w:color w:val="1B6CA8"/>
+          <w:sz w:val="36"/>
+          <w:szCs w:val="36"/>
+        </w:rPr>
+        <w:t xml:space="preserve">Inhalt</w:t>
+      </w:r>
+    </w:p>
+    <w:p>
+      <w:pPr>
+        <w:tabs>
+          <w:tab w:val="right" w:pos="9360" w:leader="dot"/>
+        </w:tabs>
+        <w:spacing w:after="90"/>
+      </w:pPr>
+      <w:r>
+        <w:rPr>
+          <w:b w:val="false"/>
+          <w:bCs w:val="false"/>
+          <w:color w:val="000000"/>
+          <w:sz w:val="22"/>
+          <w:szCs w:val="22"/>
+        </w:rPr>
+        <w:t xml:space="preserve">Vorwort</w:t>
+      </w:r>
+      <w:r>
+        <w:tab/>
+      </w:r>
+      <w:r>
+        <w:rPr>
+          <w:b w:val="false"/>
+          <w:bCs w:val="false"/>
+          <w:sz w:val="22"/>
+          <w:szCs w:val="22"/>
+        </w:rPr>
+        <w:t xml:space="preserve">3</w:t>
+      </w:r>
+    </w:p>
+    <w:p>
+      <w:pPr>
+        <w:tabs>
+          <w:tab w:val="right" w:pos="9360" w:leader="dot"/>
+        </w:tabs>
+        <w:spacing w:after="90"/>
+      </w:pPr>
+      <w:r>
+        <w:rPr>
+          <w:b w:val="false"/>
+          <w:bCs w:val="false"/>
+          <w:color w:val="000000"/>
+          <w:sz w:val="22"/>
+          <w:szCs w:val="22"/>
+        </w:rPr>
+        <w:t xml:space="preserve">Willkommen!</w:t>
+      </w:r>
+      <w:r>
+        <w:tab/>
+      </w:r>
+      <w:r>
+        <w:rPr>
+          <w:b w:val="false"/>
+          <w:bCs w:val="false"/>
+          <w:sz w:val="22"/>
+          <w:szCs w:val="22"/>
+        </w:rPr>
+        <w:t xml:space="preserve">3</w:t>
+      </w:r>
+    </w:p>
+    <w:p>
+      <w:pPr>
+        <w:tabs>
+          <w:tab w:val="right" w:pos="9360" w:leader="dot"/>
+        </w:tabs>
+        <w:spacing w:after="90"/>
+      </w:pPr>
+      <w:r>
+        <w:rPr>
+          <w:b w:val="false"/>
+          <w:bCs w:val="false"/>
+          <w:color w:val="000000"/>
+          <w:sz w:val="22"/>
+          <w:szCs w:val="22"/>
+        </w:rPr>
+        <w:t xml:space="preserve">Was ist GameBasic?</w:t>
+      </w:r>
+      <w:r>
+        <w:tab/>
+      </w:r>
+      <w:r>
+        <w:rPr>
+          <w:b w:val="false"/>
+          <w:bCs w:val="false"/>
+          <w:sz w:val="22"/>
+          <w:szCs w:val="22"/>
+        </w:rPr>
+        <w:t xml:space="preserve">4</w:t>
+      </w:r>
+    </w:p>
+    <w:p>
+      <w:pPr>
+        <w:tabs>
+          <w:tab w:val="right" w:pos="9360" w:leader="dot"/>
+        </w:tabs>
+        <w:spacing w:after="90"/>
+      </w:pPr>
+      <w:r>
+        <w:rPr>
+          <w:b w:val="false"/>
+          <w:bCs w:val="false"/>
+          <w:color w:val="000000"/>
+          <w:sz w:val="22"/>
+          <w:szCs w:val="22"/>
+        </w:rPr>
+        <w:t xml:space="preserve">Was kann GameBasic alles?</w:t>
+      </w:r>
+      <w:r>
+        <w:tab/>
+      </w:r>
+      <w:r>
+        <w:rPr>
+          <w:b w:val="false"/>
+          <w:bCs w:val="false"/>
+          <w:sz w:val="22"/>
+          <w:szCs w:val="22"/>
+        </w:rPr>
+        <w:t xml:space="preserve">5</w:t>
+      </w:r>
+    </w:p>
+    <w:p>
+      <w:pPr>
+        <w:tabs>
+          <w:tab w:val="right" w:pos="9360" w:leader="dot"/>
+        </w:tabs>
+        <w:spacing w:after="90"/>
+      </w:pPr>
+      <w:r>
+        <w:rPr>
+          <w:b w:val="false"/>
+          <w:bCs w:val="false"/>
+          <w:color w:val="000000"/>
+          <w:sz w:val="22"/>
+          <w:szCs w:val="22"/>
+        </w:rPr>
+        <w:t xml:space="preserve">Unser Projekt: ein Galaga-Clone</w:t>
+      </w:r>
+      <w:r>
+        <w:tab/>
+      </w:r>
+      <w:r>
+        <w:rPr>
+          <w:b w:val="false"/>
+          <w:bCs w:val="false"/>
+          <w:sz w:val="22"/>
+          <w:szCs w:val="22"/>
+        </w:rPr>
+        <w:t xml:space="preserve">7</w:t>
+      </w:r>
+    </w:p>
+    <w:p>
+      <w:pPr>
+        <w:tabs>
+          <w:tab w:val="right" w:pos="9360" w:leader="dot"/>
+        </w:tabs>
+        <w:spacing w:after="90"/>
+      </w:pPr>
+      <w:r>
+        <w:rPr>
+          <w:b w:val="false"/>
+          <w:bCs w:val="false"/>
+          <w:color w:val="000000"/>
+          <w:sz w:val="22"/>
+          <w:szCs w:val="22"/>
+        </w:rPr>
+        <w:t xml:space="preserve">Wie dieses Buch funktioniert</w:t>
+      </w:r>
+      <w:r>
+        <w:tab/>
+      </w:r>
+      <w:r>
+        <w:rPr>
+          <w:b w:val="false"/>
+          <w:bCs w:val="false"/>
+          <w:sz w:val="22"/>
+          <w:szCs w:val="22"/>
+        </w:rPr>
+        <w:t xml:space="preserve">9</w:t>
+      </w:r>
+    </w:p>
+    <w:p>
+      <w:pPr>
+        <w:tabs>
+          <w:tab w:val="right" w:pos="9360" w:leader="dot"/>
+        </w:tabs>
+        <w:spacing w:after="90"/>
+      </w:pPr>
+      <w:r>
+        <w:rPr>
+          <w:b/>
+          <w:bCs/>
+          <w:color w:val="1B6CA8"/>
+          <w:sz w:val="22"/>
+          <w:szCs w:val="22"/>
+        </w:rPr>
+        <w:t xml:space="preserve">Kapitel 1: Das erste Fenster</w:t>
+      </w:r>
+      <w:r>
+        <w:tab/>
+      </w:r>
+      <w:r>
+        <w:rPr>
+          <w:b/>
+          <w:bCs/>
+          <w:sz w:val="22"/>
+          <w:szCs w:val="22"/>
+        </w:rPr>
+        <w:t xml:space="preserve">10</w:t>
+      </w:r>
+    </w:p>
+    <w:p>
+      <w:pPr>
+        <w:tabs>
+          <w:tab w:val="right" w:pos="9360" w:leader="dot"/>
+        </w:tabs>
+        <w:spacing w:after="90"/>
+      </w:pPr>
+      <w:r>
+        <w:rPr>
+          <w:b/>
+          <w:bCs/>
+          <w:color w:val="1B6CA8"/>
+          <w:sz w:val="22"/>
+          <w:szCs w:val="22"/>
+        </w:rPr>
+        <w:t xml:space="preserve">Kapitel 2: Das Schiff</w:t>
+      </w:r>
+      <w:r>
+        <w:tab/>
+      </w:r>
+      <w:r>
+        <w:rPr>
+          <w:b/>
+          <w:bCs/>
+          <w:sz w:val="22"/>
+          <w:szCs w:val="22"/>
+        </w:rPr>
+        <w:t xml:space="preserve">14</w:t>
+      </w:r>
+    </w:p>
+    <w:p>
+      <w:pPr>
+        <w:tabs>
+          <w:tab w:val="right" w:pos="9360" w:leader="dot"/>
+        </w:tabs>
+        <w:spacing w:after="90"/>
+      </w:pPr>
+      <w:r>
+        <w:rPr>
+          <w:b/>
+          <w:bCs/>
+          <w:color w:val="1B6CA8"/>
+          <w:sz w:val="22"/>
+          <w:szCs w:val="22"/>
+        </w:rPr>
+        <w:t xml:space="preserve">Kapitel 3: Sprites selbst zeichnen</w:t>
+      </w:r>
+      <w:r>
+        <w:tab/>
+      </w:r>
+      <w:r>
+        <w:rPr>
+          <w:b/>
+          <w:bCs/>
+          <w:sz w:val="22"/>
+          <w:szCs w:val="22"/>
+        </w:rPr>
+        <w:t xml:space="preserve">17</w:t>
+      </w:r>
+    </w:p>
+    <w:p>
+      <w:pPr>
+        <w:tabs>
+          <w:tab w:val="right" w:pos="9360" w:leader="dot"/>
+        </w:tabs>
+        <w:spacing w:after="90"/>
+      </w:pPr>
+      <w:r>
+        <w:rPr>
+          <w:b/>
+          <w:bCs/>
+          <w:color w:val="1B6CA8"/>
+          <w:sz w:val="22"/>
+          <w:szCs w:val="22"/>
+        </w:rPr>
+        <w:t xml:space="preserve">Kapitel 4: Schiessen</w:t>
+      </w:r>
+      <w:r>
+        <w:tab/>
+      </w:r>
+      <w:r>
+        <w:rPr>
+          <w:b/>
+          <w:bCs/>
+          <w:sz w:val="22"/>
+          <w:szCs w:val="22"/>
+        </w:rPr>
+        <w:t xml:space="preserve">20</w:t>
+      </w:r>
+    </w:p>
+    <w:p>
+      <w:pPr>
+        <w:tabs>
+          <w:tab w:val="right" w:pos="9360" w:leader="dot"/>
+        </w:tabs>
+        <w:spacing w:after="90"/>
+      </w:pPr>
+      <w:r>
+        <w:rPr>
+          <w:b/>
+          <w:bCs/>
+          <w:color w:val="1B6CA8"/>
+          <w:sz w:val="22"/>
+          <w:szCs w:val="22"/>
+        </w:rPr>
+        <w:t xml:space="preserve">Kapitel 5: Sternenhimmel mit Parallax</w:t>
+      </w:r>
+      <w:r>
+        <w:tab/>
+      </w:r>
+      <w:r>
+        <w:rPr>
+          <w:b/>
+          <w:bCs/>
+          <w:sz w:val="22"/>
+          <w:szCs w:val="22"/>
+        </w:rPr>
+        <w:t xml:space="preserve">24</w:t>
+      </w:r>
+    </w:p>
+    <w:p>
+      <w:pPr>
+        <w:tabs>
+          <w:tab w:val="right" w:pos="9360" w:leader="dot"/>
+        </w:tabs>
+        <w:spacing w:after="90"/>
+      </w:pPr>
+      <w:r>
+        <w:rPr>
+          <w:b/>
+          <w:bCs/>
+          <w:color w:val="1B6CA8"/>
+          <w:sz w:val="22"/>
+          <w:szCs w:val="22"/>
+        </w:rPr>
+        <w:t xml:space="preserve">Kapitel 6: Gegner &amp; Formation</w:t>
+      </w:r>
+      <w:r>
+        <w:tab/>
+      </w:r>
+      <w:r>
+        <w:rPr>
+          <w:b/>
+          <w:bCs/>
+          <w:sz w:val="22"/>
+          <w:szCs w:val="22"/>
+        </w:rPr>
+        <w:t xml:space="preserve">27</w:t>
+      </w:r>
+    </w:p>
+    <w:p>
+      <w:pPr>
+        <w:tabs>
+          <w:tab w:val="right" w:pos="9360" w:leader="dot"/>
+        </w:tabs>
+        <w:spacing w:after="90"/>
+      </w:pPr>
+      <w:r>
+        <w:rPr>
+          <w:b/>
+          <w:bCs/>
+          <w:color w:val="1B6CA8"/>
+          <w:sz w:val="22"/>
+          <w:szCs w:val="22"/>
+        </w:rPr>
+        <w:t xml:space="preserve">Kapitel 7: Einflug-Manöver</w:t>
+      </w:r>
+      <w:r>
+        <w:tab/>
+      </w:r>
+      <w:r>
+        <w:rPr>
+          <w:b/>
+          <w:bCs/>
+          <w:sz w:val="22"/>
+          <w:szCs w:val="22"/>
+        </w:rPr>
+        <w:t xml:space="preserve">30</w:t>
+      </w:r>
+    </w:p>
+    <w:p>
+      <w:pPr>
+        <w:tabs>
+          <w:tab w:val="right" w:pos="9360" w:leader="dot"/>
+        </w:tabs>
+        <w:spacing w:after="90"/>
+      </w:pPr>
+      <w:r>
+        <w:rPr>
+          <w:b/>
+          <w:bCs/>
+          <w:color w:val="1B6CA8"/>
+          <w:sz w:val="22"/>
+          <w:szCs w:val="22"/>
+        </w:rPr>
+        <w:t xml:space="preserve">Kapitel 8: Sturzangriffe</w:t>
+      </w:r>
+      <w:r>
+        <w:tab/>
+      </w:r>
+      <w:r>
+        <w:rPr>
+          <w:b/>
+          <w:bCs/>
+          <w:sz w:val="22"/>
+          <w:szCs w:val="22"/>
+        </w:rPr>
+        <w:t xml:space="preserve">33</w:t>
+      </w:r>
+    </w:p>
+    <w:p>
+      <w:pPr>
+        <w:tabs>
+          <w:tab w:val="right" w:pos="9360" w:leader="dot"/>
+        </w:tabs>
+        <w:spacing w:after="90"/>
+      </w:pPr>
+      <w:r>
+        <w:rPr>
+          <w:b/>
+          <w:bCs/>
+          <w:color w:val="1B6CA8"/>
+          <w:sz w:val="22"/>
+          <w:szCs w:val="22"/>
+        </w:rPr>
+        <w:t xml:space="preserve">Kapitel 9: Bomben &amp; Ausweichen</w:t>
+      </w:r>
+      <w:r>
+        <w:tab/>
+      </w:r>
+      <w:r>
+        <w:rPr>
+          <w:b/>
+          <w:bCs/>
+          <w:sz w:val="22"/>
+          <w:szCs w:val="22"/>
+        </w:rPr>
+        <w:t xml:space="preserve">36</w:t>
+      </w:r>
+    </w:p>
+    <w:p>
+      <w:pPr>
+        <w:tabs>
+          <w:tab w:val="right" w:pos="9360" w:leader="dot"/>
+        </w:tabs>
+        <w:spacing w:after="90"/>
+      </w:pPr>
+      <w:r>
+        <w:rPr>
+          <w:b/>
+          <w:bCs/>
+          <w:color w:val="1B6CA8"/>
+          <w:sz w:val="22"/>
+          <w:szCs w:val="22"/>
+        </w:rPr>
+        <w:t xml:space="preserve">Kapitel 10: Treffer &amp; Punkte</w:t>
+      </w:r>
+      <w:r>
+        <w:tab/>
+      </w:r>
+      <w:r>
+        <w:rPr>
+          <w:b/>
+          <w:bCs/>
+          <w:sz w:val="22"/>
+          <w:szCs w:val="22"/>
+        </w:rPr>
+        <w:t xml:space="preserve">39</w:t>
+      </w:r>
+    </w:p>
+    <w:p>
+      <w:pPr>
+        <w:tabs>
+          <w:tab w:val="right" w:pos="9360" w:leader="dot"/>
+        </w:tabs>
+        <w:spacing w:after="90"/>
+      </w:pPr>
+      <w:r>
+        <w:rPr>
+          <w:b/>
+          <w:bCs/>
+          <w:color w:val="1B6CA8"/>
+          <w:sz w:val="22"/>
+          <w:szCs w:val="22"/>
+        </w:rPr>
+        <w:t xml:space="preserve">Kapitel 11: Vollbild &amp; Kamera</w:t>
+      </w:r>
+      <w:r>
+        <w:tab/>
+      </w:r>
+      <w:r>
+        <w:rPr>
+          <w:b/>
+          <w:bCs/>
+          <w:sz w:val="22"/>
+          <w:szCs w:val="22"/>
+        </w:rPr>
+        <w:t xml:space="preserve">42</w:t>
+      </w:r>
+    </w:p>
+    <w:p>
+      <w:pPr>
+        <w:tabs>
+          <w:tab w:val="right" w:pos="9360" w:leader="dot"/>
+        </w:tabs>
+        <w:spacing w:after="90"/>
+      </w:pPr>
+      <w:r>
+        <w:rPr>
+          <w:b/>
+          <w:bCs/>
+          <w:color w:val="1B6CA8"/>
+          <w:sz w:val="22"/>
+          <w:szCs w:val="22"/>
+        </w:rPr>
+        <w:t xml:space="preserve">Kapitel 12: Politur &amp; Ausblick</w:t>
+      </w:r>
+      <w:r>
+        <w:tab/>
+      </w:r>
+      <w:r>
+        <w:rPr>
+          <w:b/>
+          <w:bCs/>
+          <w:sz w:val="22"/>
+          <w:szCs w:val="22"/>
+        </w:rPr>
+        <w:t xml:space="preserve">44</w:t>
       </w:r>
     </w:p>
     <w:p>
@@ -5198,6 +5761,66 @@
         <w:t xml:space="preserve">). So wissen wir für jeden der 5 Plätze, ob dort gerade ein Schuss unterwegs ist. Am Anfang fliegt keiner.</w:t>
       </w:r>
     </w:p>
+    <w:tbl>
+      <w:tblPr>
+        <w:tblW w:type="dxa" w:w="9360"/>
+        <w:tblBorders>
+          <w:top w:val="single" w:color="auto" w:sz="4"/>
+          <w:left w:val="single" w:color="auto" w:sz="4"/>
+          <w:bottom w:val="single" w:color="auto" w:sz="4"/>
+          <w:right w:val="single" w:color="auto" w:sz="4"/>
+          <w:insideH w:val="single" w:color="auto" w:sz="4"/>
+          <w:insideV w:val="single" w:color="auto" w:sz="4"/>
+        </w:tblBorders>
+      </w:tblPr>
+      <w:tblGrid>
+        <w:gridCol w:w="9360"/>
+      </w:tblGrid>
+      <w:tr>
+        <w:tc>
+          <w:tcPr>
+            <w:tcW w:type="dxa" w:w="9360"/>
+            <w:tcBorders>
+              <w:top w:val="single" w:color="E0B96A" w:sz="6"/>
+              <w:left w:val="single" w:color="E0B96A" w:sz="6"/>
+              <w:bottom w:val="single" w:color="E0B96A" w:sz="6"/>
+              <w:right w:val="single" w:color="E0B96A" w:sz="6"/>
+            </w:tcBorders>
+            <w:shd w:fill="FDF3E0" w:val="clear"/>
+            <w:tcMar>
+              <w:top w:type="dxa" w:w="120"/>
+              <w:left w:type="dxa" w:w="160"/>
+              <w:bottom w:type="dxa" w:w="120"/>
+              <w:right w:type="dxa" w:w="160"/>
+            </w:tcMar>
+          </w:tcPr>
+          <w:p>
+            <w:pPr>
+              <w:spacing w:after="40"/>
+            </w:pPr>
+            <w:r>
+              <w:rPr>
+                <w:b/>
+                <w:bCs/>
+                <w:color w:val="9A6A1E"/>
+                <w:sz w:val="22"/>
+                <w:szCs w:val="22"/>
+              </w:rPr>
+              <w:t xml:space="preserve">Warum so?</w:t>
+            </w:r>
+          </w:p>
+          <w:p>
+            <w:r>
+              <w:rPr>
+                <w:sz w:val="22"/>
+                <w:szCs w:val="22"/>
+              </w:rPr>
+              <w:t xml:space="preserve">Warum legen wir den Vorrat einmal fest, statt bei jedem Schuss einen neuen zu erschaffen und ihn danach wegzuwerfen? Zwei Gründe. Erstens kostet ständiges Erzeugen und Wegwerfen Rechenzeit und kann ausgerechnet im hitzigsten Gefecht zu winzigen Rucklern führen – dann also, wenn du sie am wenigsten gebrauchen kannst. Zweitens ist ein fester Vorrat vorhersehbar: Mehr als fünf Schüsse gleichzeitig kann es nie geben, nichts gerät außer Kontrolle. Profis nennen dieses Muster „Object Pooling“, und du findest es in praktisch jeder Spiel-Engine wieder.</w:t>
+            </w:r>
+          </w:p>
+        </w:tc>
+      </w:tr>
+    </w:tbl>
     <w:p>
       <w:pPr>
         <w:pStyle w:val="Heading2"/>
@@ -7611,6 +8234,66 @@
         <w:t xml:space="preserve"> auf. So füllt sich das Gitter Zeile für Zeile.</w:t>
       </w:r>
     </w:p>
+    <w:tbl>
+      <w:tblPr>
+        <w:tblW w:type="dxa" w:w="9360"/>
+        <w:tblBorders>
+          <w:top w:val="single" w:color="auto" w:sz="4"/>
+          <w:left w:val="single" w:color="auto" w:sz="4"/>
+          <w:bottom w:val="single" w:color="auto" w:sz="4"/>
+          <w:right w:val="single" w:color="auto" w:sz="4"/>
+          <w:insideH w:val="single" w:color="auto" w:sz="4"/>
+          <w:insideV w:val="single" w:color="auto" w:sz="4"/>
+        </w:tblBorders>
+      </w:tblPr>
+      <w:tblGrid>
+        <w:gridCol w:w="9360"/>
+      </w:tblGrid>
+      <w:tr>
+        <w:tc>
+          <w:tcPr>
+            <w:tcW w:type="dxa" w:w="9360"/>
+            <w:tcBorders>
+              <w:top w:val="single" w:color="E0B96A" w:sz="6"/>
+              <w:left w:val="single" w:color="E0B96A" w:sz="6"/>
+              <w:bottom w:val="single" w:color="E0B96A" w:sz="6"/>
+              <w:right w:val="single" w:color="E0B96A" w:sz="6"/>
+            </w:tcBorders>
+            <w:shd w:fill="FDF3E0" w:val="clear"/>
+            <w:tcMar>
+              <w:top w:type="dxa" w:w="120"/>
+              <w:left w:type="dxa" w:w="160"/>
+              <w:bottom w:type="dxa" w:w="120"/>
+              <w:right w:type="dxa" w:w="160"/>
+            </w:tcMar>
+          </w:tcPr>
+          <w:p>
+            <w:pPr>
+              <w:spacing w:after="40"/>
+            </w:pPr>
+            <w:r>
+              <w:rPr>
+                <w:b/>
+                <w:bCs/>
+                <w:color w:val="9A6A1E"/>
+                <w:sz w:val="22"/>
+                <w:szCs w:val="22"/>
+              </w:rPr>
+              <w:t xml:space="preserve">Warum so?</w:t>
+            </w:r>
+          </w:p>
+          <w:p>
+            <w:r>
+              <w:rPr>
+                <w:sz w:val="22"/>
+                <w:szCs w:val="22"/>
+              </w:rPr>
+              <w:t xml:space="preserve">Bei den Sternen und Schüssen kamen wir noch mit nebeneinander laufenden Listen aus – starX, starY und so weiter. Warum jetzt der Aufwand mit einer Klasse? Weil ein Gegner bald viel mehr können wird, als nur herumzuliegen: Er bekommt eine eigene Flugbahn, einen Zustand und eine Update-Logik. Sobald ein Ding nicht nur aus Daten besteht, sondern auch aus Verhalten, lohnt sich eine Klasse – sie hält die Daten und die Funktionen, die mit ihnen arbeiten, an einem Ort zusammen. Mit einem Dutzend paralleler Listen würdest du dagegen früher oder später den Überblick verlieren – und garantiert genau eine davon beim Umbauen vergessen.</w:t>
+            </w:r>
+          </w:p>
+        </w:tc>
+      </w:tr>
+    </w:tbl>
     <w:p>
       <w:pPr>
         <w:pStyle w:val="Heading2"/>
@@ -8486,6 +9169,66 @@
         <w:t xml:space="preserve"> ist je nach Reihe -1 oder 1 – so kommen die Gegner abwechselnd von links und rechts. Start (cx0/cy0) liegt oben ausserhalb des Bildes, Ziel (cx3/cy3) ist die Formationsposition.</w:t>
       </w:r>
     </w:p>
+    <w:tbl>
+      <w:tblPr>
+        <w:tblW w:type="dxa" w:w="9360"/>
+        <w:tblBorders>
+          <w:top w:val="single" w:color="auto" w:sz="4"/>
+          <w:left w:val="single" w:color="auto" w:sz="4"/>
+          <w:bottom w:val="single" w:color="auto" w:sz="4"/>
+          <w:right w:val="single" w:color="auto" w:sz="4"/>
+          <w:insideH w:val="single" w:color="auto" w:sz="4"/>
+          <w:insideV w:val="single" w:color="auto" w:sz="4"/>
+        </w:tblBorders>
+      </w:tblPr>
+      <w:tblGrid>
+        <w:gridCol w:w="9360"/>
+      </w:tblGrid>
+      <w:tr>
+        <w:tc>
+          <w:tcPr>
+            <w:tcW w:type="dxa" w:w="9360"/>
+            <w:tcBorders>
+              <w:top w:val="single" w:color="E0B96A" w:sz="6"/>
+              <w:left w:val="single" w:color="E0B96A" w:sz="6"/>
+              <w:bottom w:val="single" w:color="E0B96A" w:sz="6"/>
+              <w:right w:val="single" w:color="E0B96A" w:sz="6"/>
+            </w:tcBorders>
+            <w:shd w:fill="FDF3E0" w:val="clear"/>
+            <w:tcMar>
+              <w:top w:type="dxa" w:w="120"/>
+              <w:left w:type="dxa" w:w="160"/>
+              <w:bottom w:type="dxa" w:w="120"/>
+              <w:right w:type="dxa" w:w="160"/>
+            </w:tcMar>
+          </w:tcPr>
+          <w:p>
+            <w:pPr>
+              <w:spacing w:after="40"/>
+            </w:pPr>
+            <w:r>
+              <w:rPr>
+                <w:b/>
+                <w:bCs/>
+                <w:color w:val="9A6A1E"/>
+                <w:sz w:val="22"/>
+                <w:szCs w:val="22"/>
+              </w:rPr>
+              <w:t xml:space="preserve">Warum so?</w:t>
+            </w:r>
+          </w:p>
+          <w:p>
+            <w:r>
+              <w:rPr>
+                <w:sz w:val="22"/>
+                <w:szCs w:val="22"/>
+              </w:rPr>
+              <w:t xml:space="preserve">Warum speichert jeder Gegner seine vier Kontrollpunkte fest ab, statt die Bahn bei Bedarf neu auszurechnen? Weil sich die Bahn während des Einflugs gar nicht ändert – einmal festgelegt, wird sie nur noch abgefahren. Das Einzige, was sich bewegt, ist der Fortschritt t. Und warum die gestaffelte Startverzögerung? Würden alle vierundzwanzig Gegner im selben Augenblick losfliegen, sähe das aus wie ein Vogelschwarm, der geschlossen gegen eine Fensterscheibe klatscht. Erst die kleinen Verzögerungen erzeugen den eleganten, tröpfelnden Strom, den man aus dem Original kennt.</w:t>
+            </w:r>
+          </w:p>
+        </w:tc>
+      </w:tr>
+    </w:tbl>
     <w:p>
       <w:pPr>
         <w:pStyle w:val="Heading2"/>
@@ -9517,6 +10260,66 @@
         <w:t xml:space="preserve"> → … Genau das ist eine Zustands-Maschine.</w:t>
       </w:r>
     </w:p>
+    <w:tbl>
+      <w:tblPr>
+        <w:tblW w:type="dxa" w:w="9360"/>
+        <w:tblBorders>
+          <w:top w:val="single" w:color="auto" w:sz="4"/>
+          <w:left w:val="single" w:color="auto" w:sz="4"/>
+          <w:bottom w:val="single" w:color="auto" w:sz="4"/>
+          <w:right w:val="single" w:color="auto" w:sz="4"/>
+          <w:insideH w:val="single" w:color="auto" w:sz="4"/>
+          <w:insideV w:val="single" w:color="auto" w:sz="4"/>
+        </w:tblBorders>
+      </w:tblPr>
+      <w:tblGrid>
+        <w:gridCol w:w="9360"/>
+      </w:tblGrid>
+      <w:tr>
+        <w:tc>
+          <w:tcPr>
+            <w:tcW w:type="dxa" w:w="9360"/>
+            <w:tcBorders>
+              <w:top w:val="single" w:color="E0B96A" w:sz="6"/>
+              <w:left w:val="single" w:color="E0B96A" w:sz="6"/>
+              <w:bottom w:val="single" w:color="E0B96A" w:sz="6"/>
+              <w:right w:val="single" w:color="E0B96A" w:sz="6"/>
+            </w:tcBorders>
+            <w:shd w:fill="FDF3E0" w:val="clear"/>
+            <w:tcMar>
+              <w:top w:type="dxa" w:w="120"/>
+              <w:left w:type="dxa" w:w="160"/>
+              <w:bottom w:type="dxa" w:w="120"/>
+              <w:right w:type="dxa" w:w="160"/>
+            </w:tcMar>
+          </w:tcPr>
+          <w:p>
+            <w:pPr>
+              <w:spacing w:after="40"/>
+            </w:pPr>
+            <w:r>
+              <w:rPr>
+                <w:b/>
+                <w:bCs/>
+                <w:color w:val="9A6A1E"/>
+                <w:sz w:val="22"/>
+                <w:szCs w:val="22"/>
+              </w:rPr>
+              <w:t xml:space="preserve">Warum so?</w:t>
+            </w:r>
+          </w:p>
+          <w:p>
+            <w:r>
+              <w:rPr>
+                <w:sz w:val="22"/>
+                <w:szCs w:val="22"/>
+              </w:rPr>
+              <w:t xml:space="preserve">Wir hätten die Zustände auch mit drei Ja/Nein-Flags lösen können: einfliegend, in Formation, stürzend. Klingt harmlos, ist aber eine Falle. Nichts würde verhindern, dass aus Versehen zwei davon gleichzeitig TRUE sind – und dann wäre ein Gegner laut Code im selben Moment am Einfliegen UND am Stürzen, was keinen Sinn ergibt und zu Fehlern führt, die man stundenlang sucht. Ein einzelnes state-Feld kann dagegen immer nur genau einen Wert haben. Es macht unmögliche Zustände schlicht unmöglich – und das ist eine der besten Eigenschaften, die Code überhaupt haben kann.</w:t>
+            </w:r>
+          </w:p>
+        </w:tc>
+      </w:tr>
+    </w:tbl>
     <w:p>
       <w:pPr>
         <w:pStyle w:val="Heading2"/>
@@ -10268,6 +11071,66 @@
         <w:t xml:space="preserve">, bis der nächste Sturz beginnt.</w:t>
       </w:r>
     </w:p>
+    <w:tbl>
+      <w:tblPr>
+        <w:tblW w:type="dxa" w:w="9360"/>
+        <w:tblBorders>
+          <w:top w:val="single" w:color="auto" w:sz="4"/>
+          <w:left w:val="single" w:color="auto" w:sz="4"/>
+          <w:bottom w:val="single" w:color="auto" w:sz="4"/>
+          <w:right w:val="single" w:color="auto" w:sz="4"/>
+          <w:insideH w:val="single" w:color="auto" w:sz="4"/>
+          <w:insideV w:val="single" w:color="auto" w:sz="4"/>
+        </w:tblBorders>
+      </w:tblPr>
+      <w:tblGrid>
+        <w:gridCol w:w="9360"/>
+      </w:tblGrid>
+      <w:tr>
+        <w:tc>
+          <w:tcPr>
+            <w:tcW w:type="dxa" w:w="9360"/>
+            <w:tcBorders>
+              <w:top w:val="single" w:color="E0B96A" w:sz="6"/>
+              <w:left w:val="single" w:color="E0B96A" w:sz="6"/>
+              <w:bottom w:val="single" w:color="E0B96A" w:sz="6"/>
+              <w:right w:val="single" w:color="E0B96A" w:sz="6"/>
+            </w:tcBorders>
+            <w:shd w:fill="FDF3E0" w:val="clear"/>
+            <w:tcMar>
+              <w:top w:type="dxa" w:w="120"/>
+              <w:left w:type="dxa" w:w="160"/>
+              <w:bottom w:type="dxa" w:w="120"/>
+              <w:right w:type="dxa" w:w="160"/>
+            </w:tcMar>
+          </w:tcPr>
+          <w:p>
+            <w:pPr>
+              <w:spacing w:after="40"/>
+            </w:pPr>
+            <w:r>
+              <w:rPr>
+                <w:b/>
+                <w:bCs/>
+                <w:color w:val="9A6A1E"/>
+                <w:sz w:val="22"/>
+                <w:szCs w:val="22"/>
+              </w:rPr>
+              <w:t xml:space="preserve">Warum so?</w:t>
+            </w:r>
+          </w:p>
+          <w:p>
+            <w:r>
+              <w:rPr>
+                <w:sz w:val="22"/>
+                <w:szCs w:val="22"/>
+              </w:rPr>
+              <w:t xml:space="preserve">Warum wirft der Gegner die Bombe nicht einfach selbst ab? Weil er gar nicht wissen muss – und soll –, wo der Bomben-Vorrat überhaupt liegt. Jeder kümmert sich um das, was er am besten weiß: Der Gegner kennt den richtigen Moment, die Spielschleife kennt die Bomben. Update meldet nur „jetzt!“ und überlässt das Wie dem Aufrufer. Diese saubere Aufgabenteilung – jeder Teil weiß möglichst wenig über die anderen – ist der Grund, warum großer Code überschaubar und änderbar bleibt, statt zu einem unentwirrbaren Knäuel zu werden.</w:t>
+            </w:r>
+          </w:p>
+        </w:tc>
+      </w:tr>
+    </w:tbl>
     <w:p>
       <w:pPr>
         <w:pStyle w:val="Heading2"/>
@@ -11150,6 +12013,66 @@
         <w:t xml:space="preserve"> zurück.</w:t>
       </w:r>
     </w:p>
+    <w:tbl>
+      <w:tblPr>
+        <w:tblW w:type="dxa" w:w="9360"/>
+        <w:tblBorders>
+          <w:top w:val="single" w:color="auto" w:sz="4"/>
+          <w:left w:val="single" w:color="auto" w:sz="4"/>
+          <w:bottom w:val="single" w:color="auto" w:sz="4"/>
+          <w:right w:val="single" w:color="auto" w:sz="4"/>
+          <w:insideH w:val="single" w:color="auto" w:sz="4"/>
+          <w:insideV w:val="single" w:color="auto" w:sz="4"/>
+        </w:tblBorders>
+      </w:tblPr>
+      <w:tblGrid>
+        <w:gridCol w:w="9360"/>
+      </w:tblGrid>
+      <w:tr>
+        <w:tc>
+          <w:tcPr>
+            <w:tcW w:type="dxa" w:w="9360"/>
+            <w:tcBorders>
+              <w:top w:val="single" w:color="E0B96A" w:sz="6"/>
+              <w:left w:val="single" w:color="E0B96A" w:sz="6"/>
+              <w:bottom w:val="single" w:color="E0B96A" w:sz="6"/>
+              <w:right w:val="single" w:color="E0B96A" w:sz="6"/>
+            </w:tcBorders>
+            <w:shd w:fill="FDF3E0" w:val="clear"/>
+            <w:tcMar>
+              <w:top w:type="dxa" w:w="120"/>
+              <w:left w:type="dxa" w:w="160"/>
+              <w:bottom w:type="dxa" w:w="120"/>
+              <w:right w:type="dxa" w:w="160"/>
+            </w:tcMar>
+          </w:tcPr>
+          <w:p>
+            <w:pPr>
+              <w:spacing w:after="40"/>
+            </w:pPr>
+            <w:r>
+              <w:rPr>
+                <w:b/>
+                <w:bCs/>
+                <w:color w:val="9A6A1E"/>
+                <w:sz w:val="22"/>
+                <w:szCs w:val="22"/>
+              </w:rPr>
+              <w:t xml:space="preserve">Warum so?</w:t>
+            </w:r>
+          </w:p>
+          <w:p>
+            <w:r>
+              <w:rPr>
+                <w:sz w:val="22"/>
+                <w:szCs w:val="22"/>
+              </w:rPr>
+              <w:t xml:space="preserve">Zwei Entscheidungen in diesem Kapitel lohnen einen zweiten Blick. Erstens: Warum die Überlappungs-Prüfung in eine eigene Funktion auslagern, statt sie an jeder der vielen Stellen frisch hinzuschreiben? Weil „einmal schreiben, überall benutzen“ heißt: ein möglicher Tippfehler statt fünf, eine Stelle zum Korrigieren statt fünf. Zweitens (gleich beim Spieler-Treffer zu sehen): Warum die kurze Unverwundbarkeit nach einem Treffer? Ohne sie könnte ein und dieselbe Bombe in mehreren aufeinanderfolgenden Frames immer wieder zählen und dir in einem Wimpernschlag alle Leben rauben – maximal unfair. invuln schenkt dir einen kurzen Moment zum Durchatmen.</w:t>
+            </w:r>
+          </w:p>
+        </w:tc>
+      </w:tr>
+    </w:tbl>
     <w:p>
       <w:pPr>
         <w:pStyle w:val="Heading2"/>
@@ -12193,6 +13116,66 @@
         <w:t xml:space="preserve"> liefern die echte (Vollbild-)Grösse, also passt sich alles jedem Monitor an.</w:t>
       </w:r>
     </w:p>
+    <w:tbl>
+      <w:tblPr>
+        <w:tblW w:type="dxa" w:w="9360"/>
+        <w:tblBorders>
+          <w:top w:val="single" w:color="auto" w:sz="4"/>
+          <w:left w:val="single" w:color="auto" w:sz="4"/>
+          <w:bottom w:val="single" w:color="auto" w:sz="4"/>
+          <w:right w:val="single" w:color="auto" w:sz="4"/>
+          <w:insideH w:val="single" w:color="auto" w:sz="4"/>
+          <w:insideV w:val="single" w:color="auto" w:sz="4"/>
+        </w:tblBorders>
+      </w:tblPr>
+      <w:tblGrid>
+        <w:gridCol w:w="9360"/>
+      </w:tblGrid>
+      <w:tr>
+        <w:tc>
+          <w:tcPr>
+            <w:tcW w:type="dxa" w:w="9360"/>
+            <w:tcBorders>
+              <w:top w:val="single" w:color="E0B96A" w:sz="6"/>
+              <w:left w:val="single" w:color="E0B96A" w:sz="6"/>
+              <w:bottom w:val="single" w:color="E0B96A" w:sz="6"/>
+              <w:right w:val="single" w:color="E0B96A" w:sz="6"/>
+            </w:tcBorders>
+            <w:shd w:fill="FDF3E0" w:val="clear"/>
+            <w:tcMar>
+              <w:top w:type="dxa" w:w="120"/>
+              <w:left w:type="dxa" w:w="160"/>
+              <w:bottom w:type="dxa" w:w="120"/>
+              <w:right w:type="dxa" w:w="160"/>
+            </w:tcMar>
+          </w:tcPr>
+          <w:p>
+            <w:pPr>
+              <w:spacing w:after="40"/>
+            </w:pPr>
+            <w:r>
+              <w:rPr>
+                <w:b/>
+                <w:bCs/>
+                <w:color w:val="9A6A1E"/>
+                <w:sz w:val="22"/>
+                <w:szCs w:val="22"/>
+              </w:rPr>
+              <w:t xml:space="preserve">Warum so?</w:t>
+            </w:r>
+          </w:p>
+          <w:p>
+            <w:r>
+              <w:rPr>
+                <w:sz w:val="22"/>
+                <w:szCs w:val="22"/>
+              </w:rPr>
+              <w:t xml:space="preserve">Warum trennen wir so streng, wie groß das Spielfeld in unserem Kopf ist, von dem, was am Ende auf dem Bildschirm erscheint? Weil sich genau dieser zweite Teil ständig ändert: heute 480×640, morgen ein breiterer Monitor, übermorgen ein winziges Vorschaufenster. Solange dein Spiel intern immer mit denselben Zahlen rechnet, läuft es überall gleich zuverlässig – nur die Kamera passt die Darstellung an. Diese Trennung von „wie die Dinge sind“ und „wie sie gezeigt werden“ ist einer der wichtigsten Grundgedanken guter Software, weit über Spiele hinaus.</w:t>
+            </w:r>
+          </w:p>
+        </w:tc>
+      </w:tr>
+    </w:tbl>
     <w:p>
       <w:pPr>
         <w:pStyle w:val="Heading2"/>

</xml_diff>